<commit_message>
docs: deepen opening report research plan
</commit_message>
<xml_diff>
--- a/Papers/output/开题报告-基于在线策略蒸馏的大语言模型后训练方法研究.docx
+++ b/Papers/output/开题报告-基于在线策略蒸馏的大语言模型后训练方法研究.docx
@@ -657,7 +657,7 @@
         <w:fldChar w:fldCharType="separate"/>
       </w:r>
       <w:r>
-        <w:t>3</w:t>
+        <w:t>4</w:t>
       </w:r>
       <w:r>
         <w:fldChar w:fldCharType="end"/>
@@ -701,7 +701,7 @@
         <w:fldChar w:fldCharType="separate"/>
       </w:r>
       <w:r>
-        <w:t>3</w:t>
+        <w:t>4</w:t>
       </w:r>
       <w:r>
         <w:fldChar w:fldCharType="end"/>
@@ -745,7 +745,7 @@
         <w:fldChar w:fldCharType="separate"/>
       </w:r>
       <w:r>
-        <w:t>3</w:t>
+        <w:t>5</w:t>
       </w:r>
       <w:r>
         <w:fldChar w:fldCharType="end"/>
@@ -789,7 +789,7 @@
         <w:fldChar w:fldCharType="separate"/>
       </w:r>
       <w:r>
-        <w:t>4</w:t>
+        <w:t>6</w:t>
       </w:r>
       <w:r>
         <w:fldChar w:fldCharType="end"/>
@@ -833,7 +833,7 @@
         <w:fldChar w:fldCharType="separate"/>
       </w:r>
       <w:r>
-        <w:t>4</w:t>
+        <w:t>7</w:t>
       </w:r>
       <w:r>
         <w:fldChar w:fldCharType="end"/>
@@ -877,7 +877,7 @@
         <w:fldChar w:fldCharType="separate"/>
       </w:r>
       <w:r>
-        <w:t>4</w:t>
+        <w:t>7</w:t>
       </w:r>
       <w:r>
         <w:fldChar w:fldCharType="end"/>
@@ -921,7 +921,7 @@
         <w:fldChar w:fldCharType="separate"/>
       </w:r>
       <w:r>
-        <w:t>6</w:t>
+        <w:t>10</w:t>
       </w:r>
       <w:r>
         <w:fldChar w:fldCharType="end"/>
@@ -965,7 +965,7 @@
         <w:fldChar w:fldCharType="separate"/>
       </w:r>
       <w:r>
-        <w:t>7</w:t>
+        <w:t>13</w:t>
       </w:r>
       <w:r>
         <w:fldChar w:fldCharType="end"/>
@@ -1009,7 +1009,7 @@
         <w:fldChar w:fldCharType="separate"/>
       </w:r>
       <w:r>
-        <w:t>9</w:t>
+        <w:t>16</w:t>
       </w:r>
       <w:r>
         <w:fldChar w:fldCharType="end"/>
@@ -1053,7 +1053,7 @@
         <w:fldChar w:fldCharType="separate"/>
       </w:r>
       <w:r>
-        <w:t>10</w:t>
+        <w:t>17</w:t>
       </w:r>
       <w:r>
         <w:fldChar w:fldCharType="end"/>
@@ -1097,7 +1097,7 @@
         <w:fldChar w:fldCharType="separate"/>
       </w:r>
       <w:r>
-        <w:t>11</w:t>
+        <w:t>20</w:t>
       </w:r>
       <w:r>
         <w:fldChar w:fldCharType="end"/>
@@ -1141,7 +1141,7 @@
         <w:fldChar w:fldCharType="separate"/>
       </w:r>
       <w:r>
-        <w:t>12</w:t>
+        <w:t>22</w:t>
       </w:r>
       <w:r>
         <w:fldChar w:fldCharType="end"/>
@@ -1185,7 +1185,7 @@
         <w:fldChar w:fldCharType="separate"/>
       </w:r>
       <w:r>
-        <w:t>12</w:t>
+        <w:t>22</w:t>
       </w:r>
       <w:r>
         <w:fldChar w:fldCharType="end"/>
@@ -1229,7 +1229,7 @@
         <w:fldChar w:fldCharType="separate"/>
       </w:r>
       <w:r>
-        <w:t>12</w:t>
+        <w:t>23</w:t>
       </w:r>
       <w:r>
         <w:fldChar w:fldCharType="end"/>
@@ -1258,7 +1258,7 @@
         <w:rPr>
           <w:rFonts w:ascii="黑体" w:hAnsi="黑体" w:eastAsia="黑体" w:cs="黑体"/>
         </w:rPr>
-        <w:t>3.3 不同散度目标的优化偏好</w:t>
+        <w:t>3.3 稀疏监督下的散度目标与尾部质量</w:t>
       </w:r>
       <w:r>
         <w:tab/>
@@ -1273,7 +1273,7 @@
         <w:fldChar w:fldCharType="separate"/>
       </w:r>
       <w:r>
-        <w:t>13</w:t>
+        <w:t>24</w:t>
       </w:r>
       <w:r>
         <w:fldChar w:fldCharType="end"/>
@@ -1302,7 +1302,7 @@
         <w:rPr>
           <w:rFonts w:ascii="黑体" w:hAnsi="黑体" w:eastAsia="黑体" w:cs="黑体"/>
         </w:rPr>
-        <w:t>3.4 监督信息粒度与资源效率</w:t>
+        <w:t>3.4 监督粒度选择与资源效率</w:t>
       </w:r>
       <w:r>
         <w:tab/>
@@ -1317,7 +1317,7 @@
         <w:fldChar w:fldCharType="separate"/>
       </w:r>
       <w:r>
-        <w:t>13</w:t>
+        <w:t>25</w:t>
       </w:r>
       <w:r>
         <w:fldChar w:fldCharType="end"/>
@@ -1346,14 +1346,14 @@
         <w:rPr>
           <w:rFonts w:ascii="黑体" w:hAnsi="黑体" w:eastAsia="黑体" w:cs="黑体"/>
         </w:rPr>
-        <w:t xml:space="preserve">3.5 </w:t>
+        <w:t>3.5 本章总结</w:t>
       </w:r>
       <w:r>
         <w:rPr>
           <w:rFonts w:hint="eastAsia" w:ascii="黑体" w:hAnsi="黑体" w:eastAsia="黑体" w:cs="黑体"/>
           <w:lang w:val="en-US" w:eastAsia="zh-CN"/>
         </w:rPr>
-        <w:t>本章总结</w:t>
+        <w:t/>
       </w:r>
       <w:r>
         <w:tab/>
@@ -1368,7 +1368,7 @@
         <w:fldChar w:fldCharType="separate"/>
       </w:r>
       <w:r>
-        <w:t>13</w:t>
+        <w:t>26</w:t>
       </w:r>
       <w:r>
         <w:fldChar w:fldCharType="end"/>
@@ -1412,7 +1412,7 @@
         <w:fldChar w:fldCharType="separate"/>
       </w:r>
       <w:r>
-        <w:t>14</w:t>
+        <w:t>27</w:t>
       </w:r>
       <w:r>
         <w:fldChar w:fldCharType="end"/>
@@ -1456,7 +1456,7 @@
         <w:fldChar w:fldCharType="separate"/>
       </w:r>
       <w:r>
-        <w:t>14</w:t>
+        <w:t>27</w:t>
       </w:r>
       <w:r>
         <w:fldChar w:fldCharType="end"/>
@@ -1500,7 +1500,7 @@
         <w:fldChar w:fldCharType="separate"/>
       </w:r>
       <w:r>
-        <w:t>15</w:t>
+        <w:t>29</w:t>
       </w:r>
       <w:r>
         <w:fldChar w:fldCharType="end"/>
@@ -1544,7 +1544,7 @@
         <w:fldChar w:fldCharType="separate"/>
       </w:r>
       <w:r>
-        <w:t>16</w:t>
+        <w:t>31</w:t>
       </w:r>
       <w:r>
         <w:fldChar w:fldCharType="end"/>
@@ -1573,7 +1573,7 @@
         <w:rPr>
           <w:rFonts w:ascii="黑体" w:hAnsi="黑体" w:eastAsia="黑体" w:cs="黑体"/>
         </w:rPr>
-        <w:t>4.4 损失与监督信息粒度/估计方式的定义原则</w:t>
+        <w:t>4.4 散度基线与稀疏反馈目标的定义</w:t>
       </w:r>
       <w:r>
         <w:tab/>
@@ -1588,7 +1588,7 @@
         <w:fldChar w:fldCharType="separate"/>
       </w:r>
       <w:r>
-        <w:t>18</w:t>
+        <w:t>34</w:t>
       </w:r>
       <w:r>
         <w:fldChar w:fldCharType="end"/>
@@ -1632,7 +1632,7 @@
         <w:fldChar w:fldCharType="separate"/>
       </w:r>
       <w:r>
-        <w:t>20</w:t>
+        <w:t>37</w:t>
       </w:r>
       <w:r>
         <w:fldChar w:fldCharType="end"/>
@@ -1676,7 +1676,7 @@
         <w:fldChar w:fldCharType="separate"/>
       </w:r>
       <w:r>
-        <w:t>22</w:t>
+        <w:t>41</w:t>
       </w:r>
       <w:r>
         <w:fldChar w:fldCharType="end"/>
@@ -1720,7 +1720,7 @@
         <w:fldChar w:fldCharType="separate"/>
       </w:r>
       <w:r>
-        <w:t>22</w:t>
+        <w:t>42</w:t>
       </w:r>
       <w:r>
         <w:fldChar w:fldCharType="end"/>
@@ -1764,7 +1764,7 @@
         <w:fldChar w:fldCharType="separate"/>
       </w:r>
       <w:r>
-        <w:t>22</w:t>
+        <w:t>42</w:t>
       </w:r>
       <w:r>
         <w:fldChar w:fldCharType="end"/>
@@ -1808,7 +1808,7 @@
         <w:fldChar w:fldCharType="separate"/>
       </w:r>
       <w:r>
-        <w:t>24</w:t>
+        <w:t>44</w:t>
       </w:r>
       <w:r>
         <w:fldChar w:fldCharType="end"/>
@@ -1852,7 +1852,7 @@
         <w:fldChar w:fldCharType="separate"/>
       </w:r>
       <w:r>
-        <w:t>24</w:t>
+        <w:t>45</w:t>
       </w:r>
       <w:r>
         <w:fldChar w:fldCharType="end"/>
@@ -1896,7 +1896,7 @@
         <w:fldChar w:fldCharType="separate"/>
       </w:r>
       <w:r>
-        <w:t>24</w:t>
+        <w:t>45</w:t>
       </w:r>
       <w:r>
         <w:fldChar w:fldCharType="end"/>
@@ -1940,7 +1940,7 @@
         <w:fldChar w:fldCharType="separate"/>
       </w:r>
       <w:r>
-        <w:t>25</w:t>
+        <w:t>45</w:t>
       </w:r>
       <w:r>
         <w:fldChar w:fldCharType="end"/>
@@ -1984,7 +1984,7 @@
         <w:fldChar w:fldCharType="separate"/>
       </w:r>
       <w:r>
-        <w:t>25</w:t>
+        <w:t>46</w:t>
       </w:r>
       <w:r>
         <w:fldChar w:fldCharType="end"/>
@@ -2028,7 +2028,7 @@
         <w:fldChar w:fldCharType="separate"/>
       </w:r>
       <w:r>
-        <w:t>26</w:t>
+        <w:t>47</w:t>
       </w:r>
       <w:r>
         <w:fldChar w:fldCharType="end"/>
@@ -2072,7 +2072,7 @@
         <w:fldChar w:fldCharType="separate"/>
       </w:r>
       <w:r>
-        <w:t>27</w:t>
+        <w:t>49</w:t>
       </w:r>
       <w:r>
         <w:fldChar w:fldCharType="end"/>
@@ -4250,7 +4250,7 @@
         <w:jc w:val="both"/>
       </w:pPr>
       <w:r>
-        <w:t>现有方法首先面临训练状态与部署状态不一致的问题。监督微调和离线蒸馏主要在参考答案或教师轨迹上优化，而学生在推理时必须沿自身预测继续生成，早期偏差会改变后续前缀并产生误差累积[3][4][5]。OPD 通过在学生到访状态上查询教师缓解这种分布偏移，但学生轨迹本身可能包含噪声、无效前缀或结构错误，教师反馈是否仍然有效取决于学生访问了哪些状态[7][10]。</w:t>
+        <w:t>最后，教师反馈的保留范围不仅影响数据量，也会改变训练目标。全词表监督保留完整分布；常规 Top-K 只选择高概率 token，若在子集内重新归一化，支持集以外的总概率质量将从目标中消失；K1 则以单样本估计替代词表求和，可能带来较大的梯度波动。已有工作给出了稀疏监督和效率优化的线索，但在具体 Function Calling 状态中，尾部质量有多大、截断目标如何影响训练、固定的 K 是否合理，仍需在统一协议下分析[11][14][15]。</w:t>
       </w:r>
     </w:p>
     <w:p>
@@ -4259,7 +4259,7 @@
         <w:jc w:val="both"/>
       </w:pPr>
       <w:r>
-        <w:t>其次，即使状态来源相同，蒸馏目标仍会改变知识传递的方向。Forward KL 强调覆盖教师分布，Reverse KL 更关注学生当前支持集，skew KL、JSD 等广义散度则在两种倾向之间调节[7][8][9]。已有研究还表明，低置信度 token、师生分布差异和目标构造方式可能造成梯度异常或多样性下降[12]，因此不能脱离具体任务和学生容量评价某一种散度。</w:t>
+        <w:t>据此，本文保留三个递进的研究问题：第一，在学生自主生成的工具调用过程中，如何识别并覆盖具有训练价值的前缀状态；第二，在稀疏教师反馈下，如何避免 Top-K 截断和重归一化掩盖尾部概率质量，并明确不同散度目标的作用；第三，在有限反馈预算下，如何按分布状态选择监督粒度。本文拟围绕这三个问题构建一个相互衔接的在线策略蒸馏方案，并通过受控实验检验其适用范围，而非预先断言性能收益。</w:t>
       </w:r>
     </w:p>
     <w:p>
@@ -4318,7 +4318,7 @@
         <w:jc w:val="both"/>
       </w:pPr>
       <w:r>
-        <w:t>本文不把模型、数据、LoRA 配置和评测脚本分别列为独立研究内容，而把它们视为统一实验条件。在此基础上，研究内容归纳为以下三个问题，并分别对应第 3.2、3.3 和 3.4 节：</w:t>
+        <w:t>本文仍以学生状态分布、散度目标和监督信息粒度为三条主线，但不将它们分别处理为互不关联的参数比较。研究先建立单轮 Function Calling 的在策略训练与状态分析流程，再针对 Top-K 截断后的目标偏差设计保留尾部质量的监督形式，最后研究如何在固定反馈预算下选择监督粒度。模型、数据、LoRA 配置和评测脚本是共同实验条件，三项研究内容分别见第 3.2、3.3 和 3.4 节。</w:t>
       </w:r>
     </w:p>
     <w:p>
@@ -4328,7 +4328,7 @@
         <w:jc w:val="both"/>
       </w:pPr>
       <w:r>
-        <w:t>1. 学生状态分布问题：教师在学生自主生成的哪些状态上提供反馈，才能真正缓解训练与推理之间的分布偏移？</w:t>
+        <w:t>1. 学生状态分布问题：学生自主生成的函数名、参数和结构化格式状态具有不同错误特征，如何组织这些状态，使教师反馈覆盖真正影响工具调用结果的位置？</w:t>
       </w:r>
     </w:p>
     <w:p>
@@ -4338,7 +4338,7 @@
         <w:jc w:val="both"/>
       </w:pPr>
       <w:r>
-        <w:t>2. 散度目标问题：Forward KL、Reverse KL 和广义散度如何改变学生的分布覆盖、模式选择与训练稳定性？</w:t>
+        <w:t>2. 散度目标问题：不同 KL 方向改变分布匹配偏好；在 Top-K 截断下，支持集外的概率质量如何影响目标定义，能否通过残余类别保留这部分信息？</w:t>
       </w:r>
     </w:p>
     <w:p>
@@ -4348,7 +4348,7 @@
         <w:jc w:val="both"/>
       </w:pPr>
       <w:r>
-        <w:t>3. 监督信息粒度问题：全词表、Top-K 和 K1 sampled-token 如何在任务效果、估计方差与教师反馈成本之间权衡？</w:t>
+        <w:t>3. 监督信息粒度问题：不同状态的教师分布集中程度并不相同，如何在反馈预算有限的条件下选择 K，并检验任务效果、训练稳定性与成本之间的权衡？</w:t>
       </w:r>
     </w:p>
     <w:p>
@@ -4373,7 +4373,25 @@
         <w:jc w:val="both"/>
       </w:pPr>
       <w:r>
-        <w:t>学生 rollout 决定教师监督所覆盖的前缀状态；状态过于接近参考答案，难以暴露部署时的真实错误，状态质量过低，又可能使教师反馈被噪声主导。研究将固定模型、数据和生成协议，分析学生前缀、格式错误与任务结果之间的关系，判断 OPD 相对于离线蒸馏是否确实改善了有效状态覆盖[7][10][11]。</w:t>
+        <w:t>学生 rollout 决定教师实际监督的前缀状态。本文先在单轮 Function Calling 场景建立可复现的在策略基线：学生按固定采样协议生成函数调用，冻结教师在同一学生前缀上提供条件分布，训练掩码只保留有效的 assistant 输出位置。与离线参考轨迹相比，学生轨迹能暴露部署时可能遇到的格式偏移、函数误选和参数错误；但这些状态是否适合监督，仍须由实际错误和训练结果判断[7][10][11]。</w:t>
+      </w:r>
+    </w:p>
+    <w:p>
+      <w:pPr>
+        <w:ind w:firstLine="420"/>
+        <w:jc w:val="both"/>
+      </w:pPr>
+      <w:r>
+        <w:t>在基线之上，本文拟根据可确定的工具调用边界，把有效生成位置划分为函数选择、参数键、参数值和结构标记等类别，并记录解析失败及无法可靠归类的位置。状态划分仅使用消息边界、工具 schema、解析规则与已有标注；对含糊的语义错误不强行指定“第一个错误 token”。这种划分使教师反馈的分布可被观察，也为后续分析不同位置的概率集中程度提供依据。</w:t>
+      </w:r>
+    </w:p>
+    <w:p>
+      <w:pPr>
+        <w:ind w:firstLine="420"/>
+        <w:jc w:val="both"/>
+      </w:pPr>
+      <w:r>
+        <w:t>研究将在相同 rollout 数量和有效训练 token 预算下比较均匀使用状态与按类别分层使用状态的结果，报告各类状态的占比、错误率、损失和工具调用指标。只有当状态分层能稳定改变关键错误的覆盖范围时，才进一步把它用于监督位置选择；否则保留统一掩码作为简洁基线。</w:t>
       </w:r>
     </w:p>
     <w:p>
@@ -4388,7 +4406,7 @@
           <w:color w:val="000000"/>
           <w:sz w:val="24"/>
         </w:rPr>
-        <w:t>3.3 不同散度目标的优化偏好</w:t>
+        <w:t>3.3 稀疏监督下的散度目标与尾部质量</w:t>
       </w:r>
       <w:bookmarkEnd w:id="19"/>
     </w:p>
@@ -4398,7 +4416,25 @@
         <w:jc w:val="both"/>
       </w:pPr>
       <w:r>
-        <w:t>在相同学生轨迹上，Forward KL、Reverse KL 与广义散度对教师分布的利用方式不同，可能分别表现为候选覆盖、模式集中或二者之间的折中。研究将通过训练稳定性、分布统计和 Function Calling 错误类型，解释不同散度产生差异的原因，而不是只比较单一的最终准确率[7][8][9][12]。</w:t>
+        <w:t>Forward KL、Reverse KL 与广义散度在完整词表上具有不同的概率加权方式，可能带来候选覆盖、模式集中或折中的优化行为。本文在相同学生轨迹、教师模型和有效位置上保留这些目标作为机制对照，结合熵、支持集重叠、梯度范数与 Function Calling 错误类型分析差异，而不以单一准确率给散度排序[7][8][9][12]。</w:t>
+      </w:r>
+    </w:p>
+    <w:p>
+      <w:pPr>
+        <w:ind w:firstLine="420"/>
+        <w:jc w:val="both"/>
+      </w:pPr>
+      <w:r>
+        <w:t>本课题的主要方法切入点是稀疏反馈的目标定义。常规 Top-K 在教师支持集内重新归一化后，舍弃了支持集外的总概率质量；若师生两侧都在子集内重新归一化，模型无法直接学习“其他 token 合计还占多少概率”。本文拟在教师 Top-K 中保留原始概率，并将其余 token 合并为一个残余类别；学生在同一支持集上计算对应概率与残余质量，由此构成共同的 K+1 类分布并计算散度。该方法保留尾部总质量，但并不恢复尾部 token 之间的相对分布。</w:t>
+      </w:r>
+    </w:p>
+    <w:p>
+      <w:pPr>
+        <w:ind w:firstLine="420"/>
+        <w:jc w:val="both"/>
+      </w:pPr>
+      <w:r>
+        <w:t>研究将比较完整词表目标、常规重归一化 Top-K 和残余类别 Top-K 的损失、梯度、分布统计及任务表现，并分别考察教师分布集中与分散的状态。若尾部质量普遍很小，或残余类别没有带来可重复的差异，就不能把这一构造写成有效改进，而应据结果收缩或调整方法。</w:t>
       </w:r>
     </w:p>
     <w:p>
@@ -4413,7 +4449,7 @@
           <w:color w:val="000000"/>
           <w:sz w:val="24"/>
         </w:rPr>
-        <w:t>3.4 监督信息粒度与资源效率</w:t>
+        <w:t>3.4 监督粒度选择与资源效率</w:t>
       </w:r>
       <w:bookmarkEnd w:id="20"/>
     </w:p>
@@ -4423,7 +4459,25 @@
         <w:jc w:val="both"/>
       </w:pPr>
       <w:r>
-        <w:t>全词表监督、Top-K 和 K1 sampled-token 逐步减少教师信息量，同时改变支持集覆盖、估计偏差和梯度方差。研究将在统一训练预算下同时报告任务表现、教师反馈量、训练时间和显存占用，从而判断稀疏监督节省的资源是否足以补偿可能的性能损失[11][14][15]。</w:t>
+        <w:t>全词表、固定 Top-K 和 K1 sampled-token 提供信息量与反馈大小不同的参照。K1 是对相应词表求和项的随机估计，不等同于保留概率最大的一个 token；Top-K 的主要风险是截断偏差与尾部信息损失，K1 则还需关注单样本估计方差。比较时要分别报告任务质量、数值稳定性和实际资源开销，不能把反馈数据量的减少直接称为教师前向计算量的减少[11][14][15]。</w:t>
+      </w:r>
+    </w:p>
+    <w:p>
+      <w:pPr>
+        <w:ind w:firstLine="420"/>
+        <w:jc w:val="both"/>
+      </w:pPr>
+      <w:r>
+        <w:t>固定 K 对所有状态使用同样数量的候选，但教师分布的集中程度可能随函数选择、参数与格式位置变化。本文拟设置累计概率质量阈值，在预先限定的最大 K 内选择达到阈值的最小支持集；达到上限后仍存在的尾部质量继续由残余类别表示。阈值和上限属于需要在验证集确定的超参数，不使用测试集调节，也不预设不同状态一定需要不同 K。</w:t>
+      </w:r>
+    </w:p>
+    <w:p>
+      <w:pPr>
+        <w:ind w:firstLine="420"/>
+        <w:jc w:val="both"/>
+      </w:pPr>
+      <w:r>
+        <w:t>研究将以相同学生更新次数、有效 token 数和可比的教师反馈字节数，对照固定 K 与自适应 K，并记录所选 K 的分布、残余概率质量、训练时间、显存和工具调用表现。若动态选择的额外开销超过收益，固定 K 仍是合理结论；研究重点是给出可复现的适用边界。</w:t>
       </w:r>
     </w:p>
     <w:p>
@@ -4462,7 +4516,7 @@
         <w:jc w:val="both"/>
       </w:pPr>
       <w:r>
-        <w:t>研究问题、研究方案和研究目的的对应与递进关系如图 1 所示。学生状态分布问题通过在策略状态采样检验有效监督，不同散度目标通过受控比较解释优化机制，监督信息粒度问题通过分层实验形成任务效果与教师成本的选择依据。三个部分在各层内均由有效性分析递进到机制解释，再递进到性能与成本权衡。</w:t>
+        <w:t>研究问题、拟采用的方法与研究目的的递进关系如图 1 所示。首先通过单轮工具调用轨迹和状态分层明确教师监督所处的位置；随后在稀疏反馈中保留 Top-K 以外的总概率质量，分析目标定义对梯度和行为的影响；最后在反馈预算下选择 K，并检验这种设计是否改善任务效果与成本之间的关系。三个部分共享同一任务、模型、数据划分和评测规则。</w:t>
       </w:r>
     </w:p>
     <w:p>
@@ -4595,8 +4649,6 @@
         <w:t>4．研究方案</w:t>
       </w:r>
       <w:bookmarkEnd w:id="23"/>
-      <w:bookmarkStart w:id="76" w:name="_GoBack"/>
-      <w:bookmarkEnd w:id="76"/>
     </w:p>
     <w:p>
       <w:pPr>
@@ -4676,17 +4728,7 @@
         <w:jc w:val="both"/>
       </w:pPr>
       <w:r>
-        <w:t>本文以学生模型在真实生成过程中访问的状态为起点，将教师反馈、分布匹配和参数更新放在</w:t>
-      </w:r>
-      <w:r>
-        <w:rPr>
-          <w:rFonts w:hint="eastAsia"/>
-          <w:lang w:val="en-US" w:eastAsia="zh-CN"/>
-        </w:rPr>
-        <w:t>一起综合计算</w:t>
-      </w:r>
-      <w:r>
-        <w:t>。具体过程是：学生先根据当前策略生成 Function Calling 轨迹，教师再在这些学生前缀上给出条件分布，最后由选定的散度和监督信息粒度形成梯度。这样处理后，状态来源、优化目标和教师信息量不再混在一个方法名称中，而可以作为三个相互独立的变量加以比较。</w:t>
+        <w:t>本文以学生在单轮 Function Calling 中真实访问的状态为起点，将教师反馈、目标构造和参数更新连接为同一训练流程。学生生成调用轨迹后，系统根据消息边界与工具结构标记有效状态；冻结教师在这些学生前缀上输出条件概率。基线实验分别使用完整分布、常规 Top-K 和单样本估计，拟研究的方法则在 Top-K 支持集外保留一个残余概率类别，并根据教师概率质量选择反馈粒度。这样，状态来源、目标定义和信息预算可以逐层分析，而不是作为九种组合的简单罗列。</w:t>
       </w:r>
     </w:p>
     <w:p>
@@ -5746,7 +5788,7 @@
         <w:jc w:val="both"/>
       </w:pPr>
       <w:r>
-        <w:t>上式中的统一估计项在全词表方案下等于完整散度，在 Top-K 方案下等于重归一化后的截断散度，在 K1 方案下等于后文给出的单样本重要性估计。每次参数更新只对师生条件分布之间的损失反向传播；学生生成的离散轨迹只作为状态序列使用，不对采样过程本身求梯度。学生生成分布决定教师看到什么状态，散度函数决定教师知识以何种偏好转化为梯度，估计方式则决定每个位置实际使用多少教师信息。学生只在 LoRA 参数子空间内更新，因此总体优化问题可写为：</w:t>
+        <w:t>上式中的统一估计项在完整词表方案下为完整散度，在常规 Top-K 方案下为支持集内重归一化目标，在 K1 方案下为后文定义的单样本估计。本文另拟构建保留尾部总质量的 Top-K 目标，作为对常规截断方案的定点改进；其中支持集由教师确定，师生均在相同支持集及同一个残余类别上计算概率。训练更新只对条件分布损失反向传播，学生离散采样轨迹仅作为状态序列，不对采样操作求梯度。学生仍只在 LoRA 参数子空间更新，因此总体优化问题可写为：</w:t>
       </w:r>
     </w:p>
     <w:tbl>
@@ -5996,7 +6038,7 @@
         <w:jc w:val="both"/>
       </w:pPr>
       <w:r>
-        <w:t>三个研究问题由此统一到同一目标中：学生轨迹决定监督状态，散度决定优化偏好，监督信息粒度与估计方式决定信息量和计算成本。整体技术路线如图 2 所示。</w:t>
+        <w:t>统一目标的作用是让三个研究问题相互衔接：学生轨迹和位置标记确定教师在哪些状态上监督；散度及残余类别构造确定教师概率如何变成训练信号；固定或自适应 K 决定每个状态保留多少显式反馈。总体技术路线如图 2 所示。</w:t>
       </w:r>
     </w:p>
     <w:p>
@@ -7459,7 +7501,7 @@
         <w:jc w:val="both"/>
       </w:pPr>
       <w:r>
-        <w:t>教师并不重新生成一条替代答案，而是在学生已经到达的前缀上评分。这样，教师监督对应的是学生部署时真正可能访问的状态。对同一前缀，师生两侧分别计算 logits，并通过 softmax 得到条件概率分布：</w:t>
+        <w:t>教师不重新生成替代答案，而是在学生已经到达的前缀上评分，使监督对应学生可能实际访问的状态。对同一前缀，师生两侧分别计算 logits 并通过 softmax 得到条件概率分布。状态另按函数选择、参数键、参数值和结构标记分类；无法根据 schema 与解析规则可靠分类的位置单独记录，不把推测的错误位置当作已验证标签。</w:t>
       </w:r>
     </w:p>
     <w:tbl>
@@ -8689,7 +8731,7 @@
         <w:jc w:val="both"/>
       </w:pPr>
       <w:r>
-        <w:t>表 4-1 给出了各环节需要固定和单独记录的变量。本文在所有对照组中使用同一批输入、同一 rollout 规则和同一有效位置掩码，使损失变化能够归因于散度类型或监督信息粒度，而不是生成长度、模板或后处理差异。训练、反馈与评测之间的关系见图 3。</w:t>
+        <w:t>表 4-1 给出各环节固定与记录的变量。所有对照组共享输入、生成协议、数据划分和有效位置定义；状态分层实验仅改变同预算下所使用的位置，损失实验则固定轨迹与位置后再切换目标。教师反馈同时记录 Top-K 累计概率、残余质量及所选 K，使后续结果能够区分状态选择、目标定义和反馈粒度的影响。训练、反馈与评测关系见图 3。</w:t>
       </w:r>
     </w:p>
     <w:p>
@@ -8807,7 +8849,7 @@
           <w:color w:val="000000"/>
           <w:sz w:val="24"/>
         </w:rPr>
-        <w:t>4.4 损失与监督信息粒度/估计方式的定义原则</w:t>
+        <w:t>4.4 散度基线与稀疏反馈目标的定义</w:t>
       </w:r>
       <w:bookmarkEnd w:id="41"/>
     </w:p>
@@ -10279,7 +10321,7 @@
         <w:jc w:val="both"/>
       </w:pPr>
       <w:r>
-        <w:t>上述散度与三种监督信息粒度组成表 4-2 的实验矩阵。每个单元格都在相同数据、学生初始化、更新步数和 rollout 预算下运行。</w:t>
+        <w:t>为把散度比较与拟研究的方法区分开，表 4-2 将实验安排为四层对照：完整词表散度基线、固定 K 下的常规截断与残余类别目标、固定 K 与自适应 K、以及 K1 低反馈量参照。每层实验只改变一个核心因素，并共享模型、数据、学生轨迹、有效位置和训练预算。</w:t>
       </w:r>
     </w:p>
     <w:p>
@@ -10345,13 +10387,13 @@
           <w:rFonts w:ascii="Times New Roman" w:hAnsi="Times New Roman" w:eastAsia="Songti SC"/>
           <w:sz w:val="21"/>
         </w:rPr>
-        <w:t xml:space="preserve">  散度目标与监督信息粒度比较矩阵</w:t>
+        <w:t xml:space="preserve">  分层对照实验设计</w:t>
       </w:r>
     </w:p>
     <w:tbl>
       <w:tblPr>
         <w:tblStyle w:val="11"/>
-        <w:tblW w:w="0" w:type="auto"/>
+        <w:tblW w:w="8306" w:type="dxa"/>
         <w:jc w:val="center"/>
         <w:tblBorders>
           <w:top w:val="single" w:color="auto" w:sz="4" w:space="0"/>
@@ -10361,7 +10403,7 @@
           <w:insideH w:val="single" w:color="auto" w:sz="4" w:space="0"/>
           <w:insideV w:val="single" w:color="auto" w:sz="4" w:space="0"/>
         </w:tblBorders>
-        <w:tblLayout w:type="autofit"/>
+        <w:tblLayout w:type="fixed"/>
         <w:tblCellMar>
           <w:top w:w="0" w:type="dxa"/>
           <w:left w:w="108" w:type="dxa"/>
@@ -10370,11 +10412,11 @@
         </w:tblCellMar>
       </w:tblPr>
       <w:tblGrid>
-        <w:gridCol w:w="2058"/>
-        <w:gridCol w:w="1761"/>
-        <w:gridCol w:w="1730"/>
-        <w:gridCol w:w="1604"/>
-        <w:gridCol w:w="1369"/>
+        <w:gridCol w:w="1150"/>
+        <w:gridCol w:w="2350"/>
+        <w:gridCol w:w="1450"/>
+        <w:gridCol w:w="1900"/>
+        <w:gridCol w:w="1456"/>
       </w:tblGrid>
       <w:tr>
         <w:trPr>
@@ -10383,7 +10425,7 @@
         </w:trPr>
         <w:tc>
           <w:tcPr>
-            <w:tcW w:w="4148" w:type="dxa"/>
+            <w:tcW w:w="1150" w:type="dxa"/>
             <w:vAlign w:val="center"/>
           </w:tcPr>
           <w:p>
@@ -10398,13 +10440,13 @@
                 <w:b/>
                 <w:sz w:val="19"/>
               </w:rPr>
-              <w:t>监督信息粒度/估计方式</w:t>
-            </w:r>
-          </w:p>
-        </w:tc>
-        <w:tc>
-          <w:tcPr>
-            <w:tcW w:w="4148" w:type="dxa"/>
+              <w:t>实验层次</w:t>
+            </w:r>
+          </w:p>
+        </w:tc>
+        <w:tc>
+          <w:tcPr>
+            <w:tcW w:w="2350" w:type="dxa"/>
             <w:vAlign w:val="center"/>
           </w:tcPr>
           <w:p>
@@ -10419,13 +10461,13 @@
                 <w:b/>
                 <w:sz w:val="19"/>
               </w:rPr>
-              <w:t>Forward KL</w:t>
-            </w:r>
-          </w:p>
-        </w:tc>
-        <w:tc>
-          <w:tcPr>
-            <w:tcW w:w="4148" w:type="dxa"/>
+              <w:t>固定条件</w:t>
+            </w:r>
+          </w:p>
+        </w:tc>
+        <w:tc>
+          <w:tcPr>
+            <w:tcW w:w="1450" w:type="dxa"/>
             <w:vAlign w:val="center"/>
           </w:tcPr>
           <w:p>
@@ -10440,13 +10482,13 @@
                 <w:b/>
                 <w:sz w:val="19"/>
               </w:rPr>
-              <w:t>Reverse KL</w:t>
-            </w:r>
-          </w:p>
-        </w:tc>
-        <w:tc>
-          <w:tcPr>
-            <w:tcW w:w="4148" w:type="dxa"/>
+              <w:t>变化因素</w:t>
+            </w:r>
+          </w:p>
+        </w:tc>
+        <w:tc>
+          <w:tcPr>
+            <w:tcW w:w="1900" w:type="dxa"/>
             <w:vAlign w:val="center"/>
           </w:tcPr>
           <w:p>
@@ -10461,13 +10503,13 @@
                 <w:b/>
                 <w:sz w:val="19"/>
               </w:rPr>
-              <w:t>广义散度</w:t>
-            </w:r>
-          </w:p>
-        </w:tc>
-        <w:tc>
-          <w:tcPr>
-            <w:tcW w:w="4148" w:type="dxa"/>
+              <w:t>主要观察</w:t>
+            </w:r>
+          </w:p>
+        </w:tc>
+        <w:tc>
+          <w:tcPr>
+            <w:tcW w:w="1456" w:type="dxa"/>
             <w:vAlign w:val="center"/>
           </w:tcPr>
           <w:p>
@@ -10482,7 +10524,7 @@
                 <w:b/>
                 <w:sz w:val="19"/>
               </w:rPr>
-              <w:t>说明</w:t>
+              <w:t>研究作用</w:t>
             </w:r>
           </w:p>
         </w:tc>
@@ -10493,7 +10535,7 @@
         </w:trPr>
         <w:tc>
           <w:tcPr>
-            <w:tcW w:w="4148" w:type="dxa"/>
+            <w:tcW w:w="1150" w:type="dxa"/>
             <w:vAlign w:val="center"/>
           </w:tcPr>
           <w:p>
@@ -10508,13 +10550,13 @@
                 <w:b w:val="0"/>
                 <w:sz w:val="19"/>
               </w:rPr>
-              <w:t>全词表</w:t>
-            </w:r>
-          </w:p>
-        </w:tc>
-        <w:tc>
-          <w:tcPr>
-            <w:tcW w:w="4148" w:type="dxa"/>
+              <w:t>完整词表散度基线</w:t>
+            </w:r>
+          </w:p>
+        </w:tc>
+        <w:tc>
+          <w:tcPr>
+            <w:tcW w:w="2350" w:type="dxa"/>
             <w:vAlign w:val="center"/>
           </w:tcPr>
           <w:p>
@@ -10529,13 +10571,13 @@
                 <w:b w:val="0"/>
                 <w:sz w:val="19"/>
               </w:rPr>
-              <w:t>全词表 FKL</w:t>
-            </w:r>
-          </w:p>
-        </w:tc>
-        <w:tc>
-          <w:tcPr>
-            <w:tcW w:w="4148" w:type="dxa"/>
+              <w:t>学生模型、教师模型、数据、rollout、训练预算、评价协议</w:t>
+            </w:r>
+          </w:p>
+        </w:tc>
+        <w:tc>
+          <w:tcPr>
+            <w:tcW w:w="1450" w:type="dxa"/>
             <w:vAlign w:val="center"/>
           </w:tcPr>
           <w:p>
@@ -10550,13 +10592,13 @@
                 <w:b w:val="0"/>
                 <w:sz w:val="19"/>
               </w:rPr>
-              <w:t>全词表 RKL</w:t>
-            </w:r>
-          </w:p>
-        </w:tc>
-        <w:tc>
-          <w:tcPr>
-            <w:tcW w:w="4148" w:type="dxa"/>
+              <w:t>Forward KL、Reverse KL、广义散度</w:t>
+            </w:r>
+          </w:p>
+        </w:tc>
+        <w:tc>
+          <w:tcPr>
+            <w:tcW w:w="1900" w:type="dxa"/>
             <w:vAlign w:val="center"/>
           </w:tcPr>
           <w:p>
@@ -10571,13 +10613,13 @@
                 <w:b w:val="0"/>
                 <w:sz w:val="19"/>
               </w:rPr>
-              <w:t>全词表广义散度</w:t>
-            </w:r>
-          </w:p>
-        </w:tc>
-        <w:tc>
-          <w:tcPr>
-            <w:tcW w:w="4148" w:type="dxa"/>
+              <w:t>分布覆盖、模式集中、训练稳定性、任务指标</w:t>
+            </w:r>
+          </w:p>
+        </w:tc>
+        <w:tc>
+          <w:tcPr>
+            <w:tcW w:w="1456" w:type="dxa"/>
             <w:vAlign w:val="center"/>
           </w:tcPr>
           <w:p>
@@ -10592,7 +10634,7 @@
                 <w:b w:val="0"/>
                 <w:sz w:val="19"/>
               </w:rPr>
-              <w:t>完整分布基线</w:t>
+              <w:t>确定散度偏好基线</w:t>
             </w:r>
           </w:p>
         </w:tc>
@@ -10603,7 +10645,7 @@
         </w:trPr>
         <w:tc>
           <w:tcPr>
-            <w:tcW w:w="4148" w:type="dxa"/>
+            <w:tcW w:w="1150" w:type="dxa"/>
             <w:vAlign w:val="center"/>
           </w:tcPr>
           <w:p>
@@ -10618,13 +10660,13 @@
                 <w:b w:val="0"/>
                 <w:sz w:val="19"/>
               </w:rPr>
-              <w:t>Top-K</w:t>
-            </w:r>
-          </w:p>
-        </w:tc>
-        <w:tc>
-          <w:tcPr>
-            <w:tcW w:w="4148" w:type="dxa"/>
+              <w:t>固定 K 的目标对照</w:t>
+            </w:r>
+          </w:p>
+        </w:tc>
+        <w:tc>
+          <w:tcPr>
+            <w:tcW w:w="2350" w:type="dxa"/>
             <w:vAlign w:val="center"/>
           </w:tcPr>
           <w:p>
@@ -10639,13 +10681,13 @@
                 <w:b w:val="0"/>
                 <w:sz w:val="19"/>
               </w:rPr>
-              <w:t>Top-K FKL</w:t>
-            </w:r>
-          </w:p>
-        </w:tc>
-        <w:tc>
-          <w:tcPr>
-            <w:tcW w:w="4148" w:type="dxa"/>
+              <w:t>学生模型、教师模型、数据、支持集来源、K、训练预算</w:t>
+            </w:r>
+          </w:p>
+        </w:tc>
+        <w:tc>
+          <w:tcPr>
+            <w:tcW w:w="1450" w:type="dxa"/>
             <w:vAlign w:val="center"/>
           </w:tcPr>
           <w:p>
@@ -10660,13 +10702,13 @@
                 <w:b w:val="0"/>
                 <w:sz w:val="19"/>
               </w:rPr>
-              <w:t>Top-K RKL</w:t>
-            </w:r>
-          </w:p>
-        </w:tc>
-        <w:tc>
-          <w:tcPr>
-            <w:tcW w:w="4148" w:type="dxa"/>
+              <w:t>常规重归一化 Top-K vs 残余类别 Top-K</w:t>
+            </w:r>
+          </w:p>
+        </w:tc>
+        <w:tc>
+          <w:tcPr>
+            <w:tcW w:w="1900" w:type="dxa"/>
             <w:vAlign w:val="center"/>
           </w:tcPr>
           <w:p>
@@ -10681,13 +10723,13 @@
                 <w:b w:val="0"/>
                 <w:sz w:val="19"/>
               </w:rPr>
-              <w:t>Top-K 广义散度</w:t>
-            </w:r>
-          </w:p>
-        </w:tc>
-        <w:tc>
-          <w:tcPr>
-            <w:tcW w:w="4148" w:type="dxa"/>
+              <w:t>尾部概率质量、损失与梯度、任务指标</w:t>
+            </w:r>
+          </w:p>
+        </w:tc>
+        <w:tc>
+          <w:tcPr>
+            <w:tcW w:w="1456" w:type="dxa"/>
             <w:vAlign w:val="center"/>
           </w:tcPr>
           <w:p>
@@ -10702,7 +10744,7 @@
                 <w:b w:val="0"/>
                 <w:sz w:val="19"/>
               </w:rPr>
-              <w:t>稀疏支持集方案</w:t>
+              <w:t>识别截断目标的尾部信息作用</w:t>
             </w:r>
           </w:p>
         </w:tc>
@@ -10713,7 +10755,7 @@
         </w:trPr>
         <w:tc>
           <w:tcPr>
-            <w:tcW w:w="4148" w:type="dxa"/>
+            <w:tcW w:w="1150" w:type="dxa"/>
             <w:vAlign w:val="center"/>
           </w:tcPr>
           <w:p>
@@ -10728,13 +10770,13 @@
                 <w:b w:val="0"/>
                 <w:sz w:val="19"/>
               </w:rPr>
-              <w:t>K1 sampled-token</w:t>
-            </w:r>
-          </w:p>
-        </w:tc>
-        <w:tc>
-          <w:tcPr>
-            <w:tcW w:w="4148" w:type="dxa"/>
+              <w:t>固定目标的反馈粒度</w:t>
+            </w:r>
+          </w:p>
+        </w:tc>
+        <w:tc>
+          <w:tcPr>
+            <w:tcW w:w="2350" w:type="dxa"/>
             <w:vAlign w:val="center"/>
           </w:tcPr>
           <w:p>
@@ -10749,13 +10791,13 @@
                 <w:b w:val="0"/>
                 <w:sz w:val="19"/>
               </w:rPr>
-              <w:t>K1-FKL 估计</w:t>
-            </w:r>
-          </w:p>
-        </w:tc>
-        <w:tc>
-          <w:tcPr>
-            <w:tcW w:w="4148" w:type="dxa"/>
+              <w:t>学生模型、教师模型、数据、目标定义、有效 token、训练预算</w:t>
+            </w:r>
+          </w:p>
+        </w:tc>
+        <w:tc>
+          <w:tcPr>
+            <w:tcW w:w="1450" w:type="dxa"/>
             <w:vAlign w:val="center"/>
           </w:tcPr>
           <w:p>
@@ -10770,13 +10812,13 @@
                 <w:b w:val="0"/>
                 <w:sz w:val="19"/>
               </w:rPr>
-              <w:t>K1-RKL 估计</w:t>
-            </w:r>
-          </w:p>
-        </w:tc>
-        <w:tc>
-          <w:tcPr>
-            <w:tcW w:w="4148" w:type="dxa"/>
+              <w:t>固定 K vs 自适应 K</w:t>
+            </w:r>
+          </w:p>
+        </w:tc>
+        <w:tc>
+          <w:tcPr>
+            <w:tcW w:w="1900" w:type="dxa"/>
             <w:vAlign w:val="center"/>
           </w:tcPr>
           <w:p>
@@ -10791,13 +10833,13 @@
                 <w:b w:val="0"/>
                 <w:sz w:val="19"/>
               </w:rPr>
-              <w:t>K1 广义散度估计</w:t>
-            </w:r>
-          </w:p>
-        </w:tc>
-        <w:tc>
-          <w:tcPr>
-            <w:tcW w:w="4148" w:type="dxa"/>
+              <w:t>所选 K、残余质量、训练时间、显存、任务指标</w:t>
+            </w:r>
+          </w:p>
+        </w:tc>
+        <w:tc>
+          <w:tcPr>
+            <w:tcW w:w="1456" w:type="dxa"/>
             <w:vAlign w:val="center"/>
           </w:tcPr>
           <w:p>
@@ -10812,7 +10854,117 @@
                 <w:b w:val="0"/>
                 <w:sz w:val="19"/>
               </w:rPr>
-              <w:t>单样本随机估计</w:t>
+              <w:t>检验反馈预算下的适用边界</w:t>
+            </w:r>
+          </w:p>
+        </w:tc>
+      </w:tr>
+      <w:tr>
+        <w:trPr>
+          <w:jc w:val="center"/>
+        </w:trPr>
+        <w:tc>
+          <w:tcPr>
+            <w:tcW w:w="1150" w:type="dxa"/>
+            <w:vAlign w:val="center"/>
+          </w:tcPr>
+          <w:p>
+            <w:pPr>
+              <w:spacing w:before="0" w:after="0" w:line="240" w:lineRule="auto"/>
+              <w:ind w:firstLine="0"/>
+              <w:jc w:val="left"/>
+            </w:pPr>
+            <w:r>
+              <w:rPr>
+                <w:rFonts w:ascii="Times New Roman" w:hAnsi="Times New Roman" w:eastAsia="宋体"/>
+                <w:b w:val="0"/>
+                <w:sz w:val="19"/>
+              </w:rPr>
+              <w:t>K1 低反馈量边界基线</w:t>
+            </w:r>
+          </w:p>
+        </w:tc>
+        <w:tc>
+          <w:tcPr>
+            <w:tcW w:w="2350" w:type="dxa"/>
+            <w:vAlign w:val="center"/>
+          </w:tcPr>
+          <w:p>
+            <w:pPr>
+              <w:spacing w:before="0" w:after="0" w:line="240" w:lineRule="auto"/>
+              <w:ind w:firstLine="0"/>
+              <w:jc w:val="left"/>
+            </w:pPr>
+            <w:r>
+              <w:rPr>
+                <w:rFonts w:ascii="Times New Roman" w:hAnsi="Times New Roman" w:eastAsia="宋体"/>
+                <w:b w:val="0"/>
+                <w:sz w:val="19"/>
+              </w:rPr>
+              <w:t>学生模型、教师模型、数据、采样分布、训练预算</w:t>
+            </w:r>
+          </w:p>
+        </w:tc>
+        <w:tc>
+          <w:tcPr>
+            <w:tcW w:w="1450" w:type="dxa"/>
+            <w:vAlign w:val="center"/>
+          </w:tcPr>
+          <w:p>
+            <w:pPr>
+              <w:spacing w:before="0" w:after="0" w:line="240" w:lineRule="auto"/>
+              <w:ind w:firstLine="0"/>
+              <w:jc w:val="left"/>
+            </w:pPr>
+            <w:r>
+              <w:rPr>
+                <w:rFonts w:ascii="Times New Roman" w:hAnsi="Times New Roman" w:eastAsia="宋体"/>
+                <w:b w:val="0"/>
+                <w:sz w:val="19"/>
+              </w:rPr>
+              <w:t>K1 sampled-token（与选定 Top-K 目标对照）</w:t>
+            </w:r>
+          </w:p>
+        </w:tc>
+        <w:tc>
+          <w:tcPr>
+            <w:tcW w:w="1900" w:type="dxa"/>
+            <w:vAlign w:val="center"/>
+          </w:tcPr>
+          <w:p>
+            <w:pPr>
+              <w:spacing w:before="0" w:after="0" w:line="240" w:lineRule="auto"/>
+              <w:ind w:firstLine="0"/>
+              <w:jc w:val="left"/>
+            </w:pPr>
+            <w:r>
+              <w:rPr>
+                <w:rFonts w:ascii="Times New Roman" w:hAnsi="Times New Roman" w:eastAsia="宋体"/>
+                <w:b w:val="0"/>
+                <w:sz w:val="19"/>
+              </w:rPr>
+              <w:t>估计方差、异常 loss、反馈字节数、任务指标</w:t>
+            </w:r>
+          </w:p>
+        </w:tc>
+        <w:tc>
+          <w:tcPr>
+            <w:tcW w:w="1456" w:type="dxa"/>
+            <w:vAlign w:val="center"/>
+          </w:tcPr>
+          <w:p>
+            <w:pPr>
+              <w:spacing w:before="0" w:after="0" w:line="240" w:lineRule="auto"/>
+              <w:ind w:firstLine="0"/>
+              <w:jc w:val="left"/>
+            </w:pPr>
+            <w:r>
+              <w:rPr>
+                <w:rFonts w:ascii="Times New Roman" w:hAnsi="Times New Roman" w:eastAsia="宋体"/>
+                <w:b w:val="0"/>
+                <w:sz w:val="19"/>
+              </w:rPr>
+              <w:t>刻画极低反馈量与单样本估计风险</w:t>
             </w:r>
           </w:p>
         </w:tc>
@@ -10824,7 +10976,7 @@
         <w:jc w:val="both"/>
       </w:pPr>
       <w:r>
-        <w:t>矩阵的作用不是穷举方法名称，而是分离两个容易混淆的因素：纵向改变教师信息的保留范围，横向改变分布差异转化为梯度的方式。由此可以判断性能变化究竟来自散度偏好，还是来自教师信息量。</w:t>
+        <w:t>散度方向与监督粒度不再被安排为全部组合的穷举矩阵。表 4-2 将实验分为三层：完整词表散度基线用于观察优化偏好；固定 K 下比较常规截断与保留残余质量的目标，用于识别尾部信息的作用；在选定目标上比较固定 K、自适应 K 与 K1，以判断反馈预算和估计波动的影响。各层均固定其余变量。</w:t>
       </w:r>
     </w:p>
     <w:p>
@@ -10833,7 +10985,7 @@
         <w:jc w:val="both"/>
       </w:pPr>
       <w:r>
-        <w:t>全词表方案以完整词表作为支持集，并直接使用师生完整概率分布计算散度，是信息最完整的基线。Top-K 方案则由教师分布确定支持集：</w:t>
+        <w:t>完整词表方案直接使用师生完整概率分布计算散度，作为信息最充分的基线。常规 Top-K 方案由教师分布选出支持集，并分别计算教师和学生在该集合内的概率质量：</w:t>
       </w:r>
     </w:p>
     <w:tbl>
@@ -11413,7 +11565,7 @@
         <w:jc w:val="both"/>
       </w:pPr>
       <w:r>
-        <w:t>在同一支持集上分别归一化师生概率，以避免把教师尾部概率无意并入某个保留 token：</w:t>
+        <w:t>常规截断基线在选定支持集内分别归一化师生概率，如式（4-18）所示。拟研究的残余类别目标不对所选概率重新归一化，而是把支持集外的教师概率总和与学生概率总和分别作为第 K+1 类，在共同支持集上计算 Forward KL；这样只保留尾部总质量，不宣称恢复尾部内部结构。训练中将单独记录残余质量与数值异常，以判断该构造是否有实际作用。</w:t>
       </w:r>
     </w:p>
     <w:tbl>
@@ -11950,7 +12102,7 @@
         <w:jc w:val="both"/>
       </w:pPr>
       <w:r>
-        <w:t>K1 sampled-token 将词表求和改写为单样本重要性估计。样本从提议分布中抽取，Forward KL 与 Reverse KL 的单样本估计分别为：</w:t>
+        <w:t>K1 sampled-token 将词表求和改写为单样本重要性估计，作为低反馈量基线。样本从提议分布抽取，Forward KL 和 Reverse KL 对应的单样本估计分别为：</w:t>
       </w:r>
     </w:p>
     <w:tbl>
@@ -12675,7 +12827,7 @@
         <w:jc w:val="both"/>
       </w:pPr>
       <w:r>
-        <w:t>为控制方差，提议分布必须覆盖被估计分布的支持集，并记录其定义、随机种子和概率下界。所有方案统一采用 log-sum-exp、有效位置归一化和有限值检查，以避免混合精度下的 NaN 或 Inf。</w:t>
+        <w:t>为控制估计方差，提议分布须覆盖被估计分布的支持集，并记录其定义、随机种子和概率下界。自适应 K 的候选规则是在最大支持集大小内选择达到预设累计教师概率质量的最小 K；仍未覆盖的概率由残余类别表示。阈值在验证集上确定，并与相同反馈预算的固定 K 比较。所有目标统一使用 log-sum-exp、有效位置归一化和有限值检查，防止混合精度下出现 NaN 或 Inf。仅保存较少概率值不等于减少教师模型前向计算，二者分别计量。</w:t>
       </w:r>
     </w:p>
     <w:p>
@@ -12703,6 +12855,14 @@
       <w:r>
         <w:t>本文从任务正确性、训练稳定性和资源成本三个层面评价方法，具体指标及其作用见表 4-3。</w:t>
       </w:r>
+    </w:p>
+    <w:p>
+      <w:pPr>
+        <w:ind w:firstLine="420"/>
+        <w:jc w:val="both"/>
+      </w:pPr>
+      <w:bookmarkStart w:id="76" w:name="_GoBack"/>
+      <w:bookmarkEnd w:id="76"/>
     </w:p>
     <w:p>
       <w:pPr>
@@ -14018,7 +14178,7 @@
         <w:jc w:val="both"/>
       </w:pPr>
       <w:r>
-        <w:t>其中“≡”依据 schema 允许的类型转换、顺序不敏感字段和等价表示判定。本文还分别报告 JSON 可解析率、schema 合法率和工具执行成功率，因为格式合法、函数选择正确与任务真正完成并不是同一个指标。BFCL 的任务划分与判定规则为这套评测提供参考[27]。</w:t>
+        <w:t>其中“≡”依据 schema 允许的类型转换、顺序不敏感字段和等价表示判定。本文分别报告 JSON 可解析率、schema 合法率、函数选择和参数正确率；只有当数据集提供可执行工具且执行环境经过验证时，才报告工具执行成功率和端到端任务完成率。否则采用结构化调用匹配评价，并明确该指标与真实工具执行的边界。BFCL 的任务划分与判定规则为评测设计提供参考[27]。</w:t>
       </w:r>
     </w:p>
     <w:p>
@@ -14628,7 +14788,7 @@
         <w:jc w:val="both"/>
       </w:pPr>
       <w:r>
-        <w:t>熵反映教师分布的集中程度，重叠率反映学生高概率区域与教师高概率区域是否一致。二者与异常损失、格式错误率和梯度范数结合后，可以区分“学生没有覆盖教师知识”和“教师在低质量学生状态上给出不稳定监督”这两类原因。</w:t>
+        <w:t>熵与支持集重叠用于观察师生概率分布是否接近；针对本研究方法，还将记录教师 Top-K 外的总概率质量、学生对应质量及二者差异，并按函数、参数和结构位置分层分析。与异常损失、梯度范数和格式错误率结合后，可判断差异来自状态选择、截断目标还是监督粒度，避免只凭最终准确率解释机制。</w:t>
       </w:r>
     </w:p>
     <w:p>
@@ -15011,7 +15171,7 @@
         <w:jc w:val="both"/>
       </w:pPr>
       <w:r>
-        <w:t>除总成本外，本文同时报告教师处理 token 数、峰值显存、墙钟时间和推理吞吐。吞吐量按生成 token 数除以墙钟时间计算，从而避免只比较最终准确率而忽略不同监督方式实际消耗的计算资源。</w:t>
+        <w:t>除总成本外，本文同时报告教师处理 token 数、教师前向墙钟时间、峰值显存、训练时间和推理吞吐，并单独统计传输或保存的教师反馈字节数与所选 K 的分布。吞吐量按生成 token 数除以墙钟时间计算。缩小反馈表示可能降低传输和存储开销，但是否节省教师计算须以实际计时为准。</w:t>
       </w:r>
     </w:p>
     <w:p>
@@ -15447,7 +15607,7 @@
         <w:jc w:val="both"/>
       </w:pPr>
       <w:r>
-        <w:t>上述方案建立在可获得的模型规模和开源工具链之上。Qwen3-4B 教师只参与前向评分，Qwen3-0.6B 学生通过 LoRA 更新，PyTorch、Transformers、PEFT 与 vLLM[20] 分别承担训练、参数高效适配和部署测量。本文先用小样本验证 tokenizer 对齐、掩码、散度数值和梯度传播，再在接口与评测规则固定后扩大实验规模。由公式定义、预算约束和分层指标共同限定实验边界，可以保证后续结果能够复现，也能够解释。</w:t>
+        <w:t>方案采用可获得的小规模同家族模型与开源工具链。冻结教师只参与前向评分，学生通过 LoRA 更新；PyTorch、Transformers、PEFT 和 vLLM[20]分别用于训练、适配与部署测量。正式实验前先以少量单轮样本检查 tokenizer、模板、状态标记、Top-K 累计质量、残余类别的概率归一化、目标数值、梯度传播和运行成本。只有这些基础检查通过，且尾部质量在实际样本中具有分析价值，才扩大训练规模；若现象不明显，则根据错误统计收缩方法范围并调整研究重点。</w:t>
       </w:r>
     </w:p>
     <w:p>
@@ -16286,7 +16446,7 @@
         <w:jc w:val="both"/>
       </w:pPr>
       <w:r>
-        <w:t>1. 建立以 Qwen3-0.6B 为学生、冻结的 Qwen3-4B 为教师的 LoRA 在线策略蒸馏流程。</w:t>
+        <w:t>1. 建立以 Qwen3-0.6B 为学生、冻结的 Qwen3-4B 为教师的单轮 Function Calling 在线策略蒸馏流程，并完成状态边界、有效位置和分层错误记录。</w:t>
       </w:r>
     </w:p>
     <w:p>
@@ -16296,7 +16456,7 @@
         <w:jc w:val="both"/>
       </w:pPr>
       <w:r>
-        <w:t>2. 在公开 Function Calling 数据上比较 Forward KL、Reverse KL、广义散度，以及全词表、Top-K 和 K1 sampled-token 三种监督方案。</w:t>
+        <w:t>2. 在统一轨迹与训练预算下完成完整分布散度基线，以及常规 Top-K 与保留尾部质量的 Top-K 目标对比；检验目标差异是否具有可重复的任务或稳定性影响。</w:t>
       </w:r>
     </w:p>
     <w:p>
@@ -16306,7 +16466,7 @@
         <w:jc w:val="both"/>
       </w:pPr>
       <w:r>
-        <w:t>3. 建立分层评测方法，分别分析输出格式、函数选择、参数生成、调用执行和端到端任务完成情况。</w:t>
+        <w:t>3. 建立固定 K、按累计概率质量选择 K 与 K1 的反馈粒度对照，并按照数据集实际条件分层评价格式、函数选择、参数生成和可验证的工具调用结果。</w:t>
       </w:r>
     </w:p>
     <w:p>
@@ -16316,7 +16476,7 @@
         <w:jc w:val="both"/>
       </w:pPr>
       <w:r>
-        <w:t>4. 系统记录各方法的训练稳定性、教师反馈量、训练资源和部署表现。</w:t>
+        <w:t>4. 同时记录损失、梯度、熵、残余概率质量、反馈字节数、教师前向时间、训练显存和任务表现，分析效果与资源开销之间的关系。</w:t>
       </w:r>
     </w:p>
     <w:p>
@@ -16326,7 +16486,7 @@
         <w:jc w:val="both"/>
       </w:pPr>
       <w:r>
-        <w:t>5. 通过 vLLM 或自建测试程序验证最终模型，形成任务性能、训练成本和推理性能的对比结果。</w:t>
+        <w:t>5. 通过 vLLM 或等效的可复现测试程序评估最终学生模型，报告适用边界与失败案例，不把尚未运行的对比写成性能结论。</w:t>
       </w:r>
     </w:p>
     <w:p>
@@ -16345,7 +16505,7 @@
         <w:jc w:val="both"/>
       </w:pPr>
       <w:r>
-        <w:t>预期成果包括一套定义清晰、能够复现的 OPD 训练流程，一份公开数据与模型版本记录，一组能够解释方法差异的实验指标，以及一套可重复运行的最终测试流程。</w:t>
+        <w:t>预期形成一套可复现的单轮工具调用 OPD 流程、一种待实验检验的尾部质量保留目标及其监督粒度选择策略，并提供完整的基线、消融、成本统计和失败案例。最终论文将以实际结果判断方法是否有效；即使未取得性能优势，也需明确其原因和适用条件。</w:t>
       </w:r>
     </w:p>
     <w:p>
@@ -17175,7 +17335,7 @@
         <w:jc w:val="both"/>
       </w:pPr>
       <w:r>
-        <w:t>实施时，先完成数据、模型、tokenizer 和消息模板审计，再通过短序列验证、小批量训练、梯度累积、混合精度、教师输出缓存和分块计算控制资源开销。全词表、Top-K 和 K1 使用统一的支持集、采样与 mask 协议，并保存异常 loss、非法结构和失败工具调用等可追溯样本。</w:t>
+        <w:t>实施时先审计数据、模型、tokenizer 和消息模板，再用少量单轮样本检查状态标记、支持集累计质量、残余概率、损失数值与梯度。训练资源通过短序列验证、小批量训练、梯度累积和必要的教师反馈缓存控制。完整分布、常规 Top-K、残余类别 Top-K 与 K1 应共享输入、mask、评测规则和记录格式，并保存异常 loss、非法结构及失败调用以便追溯。</w:t>
       </w:r>
     </w:p>
     <w:p>
@@ -17193,7 +17353,7 @@
         <w:jc w:val="both"/>
       </w:pPr>
       <w:r>
-        <w:t>完成主要比较后，将进一步考察 Top-K 支持集修复和损失截断方法，包括合并师生高概率集合、保留残余概率质量和裁剪极端概率比，用于分析截断监督的稳定性。</w:t>
+        <w:t>方法风险主要有两类：若教师分布在大多数有效位置过于集中，Top-K 外的概率质量可能很小，残余类别难以产生可测差异；若概率质量分散，自适应 K 可能频繁达到上限，未必节省反馈开销。研究先在小样本上统计这些分布，再以相同 K 或相同反馈预算做消融；若候选方法不优于简洁基线，应如实报告并据错误类型缩小改进范围。支持集并集与极端概率比裁剪仅作为后续备选，不与主方法同时改变。</w:t>
       </w:r>
     </w:p>
     <w:p>

</xml_diff>

<commit_message>
docs: refine sparse feedback research plan
</commit_message>
<xml_diff>
--- a/Papers/output/开题报告-基于在线策略蒸馏的大语言模型后训练方法研究.docx
+++ b/Papers/output/开题报告-基于在线策略蒸馏的大语言模型后训练方法研究.docx
@@ -1141,7 +1141,7 @@
         <w:fldChar w:fldCharType="separate"/>
       </w:r>
       <w:r>
-        <w:t>22</w:t>
+        <w:t>21</w:t>
       </w:r>
       <w:r>
         <w:fldChar w:fldCharType="end"/>
@@ -1185,7 +1185,7 @@
         <w:fldChar w:fldCharType="separate"/>
       </w:r>
       <w:r>
-        <w:t>22</w:t>
+        <w:t>21</w:t>
       </w:r>
       <w:r>
         <w:fldChar w:fldCharType="end"/>
@@ -1229,7 +1229,7 @@
         <w:fldChar w:fldCharType="separate"/>
       </w:r>
       <w:r>
-        <w:t>23</w:t>
+        <w:t>22</w:t>
       </w:r>
       <w:r>
         <w:fldChar w:fldCharType="end"/>
@@ -1273,7 +1273,7 @@
         <w:fldChar w:fldCharType="separate"/>
       </w:r>
       <w:r>
-        <w:t>24</w:t>
+        <w:t>23</w:t>
       </w:r>
       <w:r>
         <w:fldChar w:fldCharType="end"/>
@@ -1632,7 +1632,7 @@
         <w:fldChar w:fldCharType="separate"/>
       </w:r>
       <w:r>
-        <w:t>37</w:t>
+        <w:t>38</w:t>
       </w:r>
       <w:r>
         <w:fldChar w:fldCharType="end"/>
@@ -4250,7 +4250,7 @@
         <w:jc w:val="both"/>
       </w:pPr>
       <w:r>
-        <w:t>最后，教师反馈的保留范围不仅影响数据量，也会改变训练目标。全词表监督保留完整分布；常规 Top-K 只选择高概率 token，若在子集内重新归一化，支持集以外的总概率质量将从目标中消失；K1 则以单样本估计替代词表求和，可能带来较大的梯度波动。已有工作给出了稀疏监督和效率优化的线索，但在具体 Function Calling 状态中，尾部质量有多大、截断目标如何影响训练、固定的 K 是否合理，仍需在统一协议下分析[11][14][15]。</w:t>
+        <w:t xml:space="preserve">最后，Top-K 的压缩收益伴随明确的目标变化。已有研究发现，仅缓存高概率 token 会造成分布估计偏差[30]；在策略蒸馏的子集归一化目标会忽略尾部总概率，并可能推高学生尾部概率[31]。工具调用场景还存在另一种风险：高教师质量覆盖率仍可能遗漏决定工具入口的修正 token[33]。尾部总量与关键坐标需要分别测量，现有数学推导和其他任务的实验结果尚不足以替代本课题的 Function Calling 证据。</w:t>
       </w:r>
     </w:p>
     <w:p>
@@ -4259,25 +4259,7 @@
         <w:jc w:val="both"/>
       </w:pPr>
       <w:r>
-        <w:t>据此，本文保留三个递进的研究问题：第一，在学生自主生成的工具调用过程中，如何识别并覆盖具有训练价值的前缀状态；第二，在稀疏教师反馈下，如何避免 Top-K 截断和重归一化掩盖尾部概率质量，并明确不同散度目标的作用；第三，在有限反馈预算下，如何按分布状态选择监督粒度。本文拟围绕这三个问题构建一个相互衔接的在线策略蒸馏方案，并通过受控实验检验其适用范围，而非预先断言性能收益。</w:t>
-      </w:r>
-    </w:p>
-    <w:p>
-      <w:pPr>
-        <w:ind w:firstLine="420"/>
-        <w:jc w:val="both"/>
-      </w:pPr>
-      <w:r>
-        <w:t>最后，教师信息越完整，计算和存储成本通常越高。全词表监督保留完整分布，Top-K 和单样本估计能够压缩反馈，却会引入支持集截断、概率质量丢失与估计方差。前缀蒸馏与相关效率研究说明，更多教师信息并不必然带来等比例收益[11][14][15]。</w:t>
-      </w:r>
-    </w:p>
-    <w:p>
-      <w:pPr>
-        <w:ind w:firstLine="420"/>
-        <w:jc w:val="both"/>
-      </w:pPr>
-      <w:r>
-        <w:t>据此，本文把现有问题归纳为三个相互关联的研究问题：学生状态分布上的教师监督是否有效，不同散度如何影响优化行为，以及监督信息粒度如何在效果与资源开销之间取得平衡。Function Calling 的结构化输出和可执行评测为回答这三个问题提供了统一场景。</w:t>
+        <w:t xml:space="preserve">据此，本文保留三步递进安排：构建单轮工具调用的在策略基线；在固定前缀上诊断尾部质量、决策 token 和梯度偏差，并用短程训练核查行为影响；在相同反馈预算下研究决策感知的稀疏支持集。已有尾部类别与采样修正工作[31][32][34]构成方法基线，本文拟研究的增量集中在任务位置与训练预算的联合选择，实际收益及适用条件待实验验证。</w:t>
       </w:r>
     </w:p>
     <w:p>
@@ -4318,7 +4300,7 @@
         <w:jc w:val="both"/>
       </w:pPr>
       <w:r>
-        <w:t>本文仍以学生状态分布、散度目标和监督信息粒度为三条主线，但不将它们分别处理为互不关联的参数比较。研究先建立单轮 Function Calling 的在策略训练与状态分析流程，再针对 Top-K 截断后的目标偏差设计保留尾部质量的监督形式，最后研究如何在固定反馈预算下选择监督粒度。模型、数据、LoRA 配置和评测脚本是共同实验条件，三项研究内容分别见第 3.2、3.3 和 3.4 节。</w:t>
+        <w:t xml:space="preserve">本文围绕单轮 Function Calling 的在策略蒸馏建立一条连续的研究链：先获得可信的学生轨迹和工具调用错误记录，再判断 Top-K 稀疏反馈遗漏了哪些训练信号，最后在固定反馈预算内设计并检验针对性的支持集选择规则。完整词表的 Forward KL、Reverse KL 和其他散度仅作为受控参照，K 的选择服务于同一个尾部监督问题。第 3.2、3.3 和 3.4 节分别说明实验场景、问题诊断和拟研究的改进方案。</w:t>
       </w:r>
     </w:p>
     <w:p>
@@ -4328,7 +4310,7 @@
         <w:jc w:val="both"/>
       </w:pPr>
       <w:r>
-        <w:t>1. 学生状态分布问题：学生自主生成的函数名、参数和结构化格式状态具有不同错误特征，如何组织这些状态，使教师反馈覆盖真正影响工具调用结果的位置？</w:t>
+        <w:t xml:space="preserve">1. 场景与基线：学生自主生成的工具调用轨迹中，哪些位置决定函数选择、参数填写和结构正确性？如何保证教师在相同前缀上的反馈可用于训练与评估？</w:t>
       </w:r>
     </w:p>
     <w:p>
@@ -4338,7 +4320,7 @@
         <w:jc w:val="both"/>
       </w:pPr>
       <w:r>
-        <w:t>2. 散度目标问题：不同 KL 方向改变分布匹配偏好；在 Top-K 截断下，支持集外的概率质量如何影响目标定义，能否通过残余类别保留这部分信息？</w:t>
+        <w:t xml:space="preserve">2. 尾部信号诊断：Top-K 截断及子集归一化在这些位置遗漏了多少尾部概率质量、哪些学生高估的决策 token，以及怎样的损失和梯度变化？这些变化能否解释具体工具调用错误？</w:t>
       </w:r>
     </w:p>
     <w:p>
@@ -4348,7 +4330,7 @@
         <w:jc w:val="both"/>
       </w:pPr>
       <w:r>
-        <w:t>3. 监督信息粒度问题：不同状态的教师分布集中程度并不相同，如何在反馈预算有限的条件下选择 K，并检验任务效果、训练稳定性与成本之间的权衡？</w:t>
+        <w:t xml:space="preserve">3. 改进方案验证：在相同教师反馈预算下，能否依据尾部风险分配支持集，并保留必要的决策 token 与尾部总质量，使训练信号更接近完整词表目标？</w:t>
       </w:r>
     </w:p>
     <w:p>
@@ -4373,7 +4355,7 @@
         <w:jc w:val="both"/>
       </w:pPr>
       <w:r>
-        <w:t>学生 rollout 决定教师实际监督的前缀状态。本文先在单轮 Function Calling 场景建立可复现的在策略基线：学生按固定采样协议生成函数调用，冻结教师在同一学生前缀上提供条件分布，训练掩码只保留有效的 assistant 输出位置。与离线参考轨迹相比，学生轨迹能暴露部署时可能遇到的格式偏移、函数误选和参数错误；但这些状态是否适合监督，仍须由实际错误和训练结果判断[7][10][11]。</w:t>
+        <w:t xml:space="preserve">已有在策略蒸馏方法在学生生成的前缀上查询教师，能够直接覆盖推理时会遇到的状态[7][11]。本文以单轮 Function Calling 为统一场景：学生按固定采样协议生成输出，冻结教师在相同前缀上计算条件分布，训练掩码仅覆盖有效 assistant 位置。首先复现可运行的完整词表与固定 Top-K 基线，固定模型、数据、LoRA 配置、更新步数和评测脚本。函数名、参数键、参数值及结构标记由解析规则和工具 schema 标注；解析失败的位置单独记录。</w:t>
       </w:r>
     </w:p>
     <w:p>
@@ -4382,7 +4364,7 @@
         <w:jc w:val="both"/>
       </w:pPr>
       <w:r>
-        <w:t>在基线之上，本文拟根据可确定的工具调用边界，把有效生成位置划分为函数选择、参数键、参数值和结构标记等类别，并记录解析失败及无法可靠归类的位置。状态划分仅使用消息边界、工具 schema、解析规则与已有标注；对含糊的语义错误不强行指定“第一个错误 token”。这种划分使教师反馈的分布可被观察，也为后续分析不同位置的概率集中程度提供依据。</w:t>
+        <w:t xml:space="preserve">工具调用的错误具有位置差异。函数入口或函数名的一个错误可能使后续参数全部失效，普通参数值 token 的偏差通常局限于局部字段。本文记录各类位置的教师熵、学生与教师的支持集重叠、工具调用是否成功，以及错误在生成序列中的首次可确定位置。对无法可靠定位的语义错误，只保留整条调用的结果标签。状态划分为后续尾部分析提供可检验的条件变量。</w:t>
       </w:r>
     </w:p>
     <w:p>
@@ -4391,7 +4373,7 @@
         <w:jc w:val="both"/>
       </w:pPr>
       <w:r>
-        <w:t>研究将在相同 rollout 数量和有效训练 token 预算下比较均匀使用状态与按类别分层使用状态的结果，报告各类状态的占比、错误率、损失和工具调用指标。只有当状态分层能稳定改变关键错误的覆盖范围时，才进一步把它用于监督位置选择；否则保留统一掩码作为简洁基线。</w:t>
+        <w:t xml:space="preserve">基线阶段按相同有效 token 预算比较学生轨迹监督与既有参考轨迹监督，并给出函数选择准确率、参数匹配率、可解析率和端到端成功率。两组训练共享采样种子和评测集合；学生轨迹是否更有价值由真实结果判断。这个阶段同时确认教师与学生使用一致的 tokenizer、特殊 token 和工具调用模板，以免把协议差异误记为截断效应。</w:t>
       </w:r>
     </w:p>
     <w:p>
@@ -4416,7 +4398,7 @@
         <w:jc w:val="both"/>
       </w:pPr>
       <w:r>
-        <w:t>Forward KL、Reverse KL 与广义散度在完整词表上具有不同的概率加权方式，可能带来候选覆盖、模式集中或折中的优化行为。本文在相同学生轨迹、教师模型和有效位置上保留这些目标作为机制对照，结合熵、支持集重叠、梯度范数与 Function Calling 错误类型分析差异，而不以单一准确率给散度排序[7][8][9][12]。</w:t>
+        <w:t xml:space="preserve">Top-K 用少量教师概率替代完整词表反馈，降低存储与传输开销。已有稀疏蒸馏研究指出，截断后的概率估计可能带来偏差[30]；在策略蒸馏研究进一步发现，师生在教师 Top-K 内各自归一化时，目标丢失了支持集外的总质量，学生尾部概率及熵可能在训练中上升[31]。另一项工具调用研究显示，即使教师 Top-K 覆盖了几乎全部教师概率，仍可能漏掉学生过度偏好的工具调用入口 token，使关键决策的修正梯度缺失[33]。这些结果来自不同模型与任务，本文将在单教师、单轮 Function Calling 场景检查其适用范围。</w:t>
       </w:r>
     </w:p>
     <w:p>
@@ -4425,7 +4407,7 @@
         <w:jc w:val="both"/>
       </w:pPr>
       <w:r>
-        <w:t>本课题的主要方法切入点是稀疏反馈的目标定义。常规 Top-K 在教师支持集内重新归一化后，舍弃了支持集外的总概率质量；若师生两侧都在子集内重新归一化，模型无法直接学习“其他 token 合计还占多少概率”。本文拟在教师 Top-K 中保留原始概率，并将其余 token 合并为一个残余类别；学生在同一支持集上计算对应概率与残余质量，由此构成共同的 K+1 类分布并计算散度。该方法保留尾部总质量，但并不恢复尾部 token 之间的相对分布。</w:t>
+        <w:t xml:space="preserve">本文把尾部问题分成两类观察。第一类是总量偏差：在教师 Top-K 支持集外，比较师生尾部质量及其随训练步数的变化，并在同一前缀上对照完整词表、子集归一化 Top-K 和已有的尾部类别方法[31]。第二类是决策遗漏：检查函数入口、函数名及结构标记等关键 token 是否落在教师 Top-K 之外，计算其完整词表梯度与稀疏目标梯度的方向和幅度差异。教师质量覆盖率、决策 token 覆盖率和梯度一致性分别报告，避免用单一累计概率解释训练行为。</w:t>
       </w:r>
     </w:p>
     <w:p>
@@ -4434,7 +4416,7 @@
         <w:jc w:val="both"/>
       </w:pPr>
       <w:r>
-        <w:t>研究将比较完整词表目标、常规重归一化 Top-K 和残余类别 Top-K 的损失、梯度、分布统计及任务表现，并分别考察教师分布集中与分散的状态。若尾部质量普遍很小，或残余类别没有带来可重复的差异，就不能把这一构造写成有效改进，而应据结果收缩或调整方法。</w:t>
+        <w:t xml:space="preserve">诊断先在冻结模型和固定学生前缀上完成，再做短程训练验证。冻结诊断记录不同 K 和位置类别的尾部质量、目标差、梯度余弦相似度与关键 token 梯度；短程训练追踪尾部概率、熵、结构错误和工具调用成败。若冻结梯度差异存在而任务指标不变，需进一步检查训练步数与错误类型；若差异主要来自模板或教师不确定性，应先修正协议或缩小研究范围。Forward KL 与 Reverse KL 只在共同支持集和相同轨迹上做对照，不能把散度方向与截断方式同时改变后解释为单一因素。</w:t>
       </w:r>
     </w:p>
     <w:p>
@@ -4459,7 +4441,7 @@
         <w:jc w:val="both"/>
       </w:pPr>
       <w:r>
-        <w:t>全词表、固定 Top-K 和 K1 sampled-token 提供信息量与反馈大小不同的参照。K1 是对相应词表求和项的随机估计，不等同于保留概率最大的一个 token；Top-K 的主要风险是截断偏差与尾部信息损失，K1 则还需关注单样本估计方差。比较时要分别报告任务质量、数值稳定性和实际资源开销，不能把反馈数据量的减少直接称为教师前向计算量的减少[11][14][15]。</w:t>
+        <w:t xml:space="preserve">已有 TA-OPD 把支持集外概率并为尾部类别，TT-OPD 与 ResOPD 则利用采样残差修正稀疏估计[31][32][34]；因此，单独增加第 K+1 类不能作为本文的新方法。本文拟研究工具调用位置的预算分配：在固定平均反馈条目数下，对函数入口、函数名和结构边界等位置提高决策 token 的覆盖要求，对其余位置依教师尾部质量选择较小支持集。该设计把第 3.3 节测得的尾部风险转化为可执行的支持集规则。</w:t>
       </w:r>
     </w:p>
     <w:p>
@@ -4468,7 +4450,7 @@
         <w:jc w:val="both"/>
       </w:pPr>
       <w:r>
-        <w:t>固定 K 对所有状态使用同样数量的候选，但教师分布的集中程度可能随函数选择、参数与格式位置变化。本文拟设置累计概率质量阈值，在预先限定的最大 K 内选择达到阈值的最小支持集；达到上限后仍存在的尾部质量继续由残余类别表示。阈值和上限属于需要在验证集确定的超参数，不使用测试集调节，也不预设不同状态一定需要不同 K。</w:t>
+        <w:t xml:space="preserve">具体地，先在训练集的独立诊断子集上估计各位置类别的尾部质量差、决策 token 漏选率和完整词表梯度误差；据此确定位置权重与反馈预算。训练时从教师候选中选取满足累计质量阈值的最小 K，并在预设上限内补入可确定的工具调用决策 token；剩余概率沿用已有尾部类别目标表示[31]。若所需 token 不在教师返回的候选中，需要追加该 token 的教师 logprob 查询，并将这部分查询成本计入预算。位置权重、阈值和 K 上限仅在训练/验证集确定，测试集只用于最终评估。</w:t>
       </w:r>
     </w:p>
     <w:p>
@@ -4477,7 +4459,7 @@
         <w:jc w:val="both"/>
       </w:pPr>
       <w:r>
-        <w:t>研究将以相同学生更新次数、有效 token 数和可比的教师反馈字节数，对照固定 K 与自适应 K，并记录所选 K 的分布、残余概率质量、训练时间、显存和工具调用表现。若动态选择的额外开销超过收益，固定 K 仍是合理结论；研究重点是给出可复现的适用边界。</w:t>
+        <w:t xml:space="preserve">验证包括固定 K、相同平均 K 的质量阈值 K、已有尾部类别方法，以及拟研究的决策感知支持集规则。各方法使用同一学生起点、教师、轨迹采样设置与有效 token 预算，并分别报告反馈字节数、额外教师查询、训练耗时和峰值显存。消融实验单独移除决策 token 补入、位置预算分配和尾部类别，检验每一部分的实际贡献；同时观察函数误选、参数错误、格式错误和端到端成功率。若预算匹配后改进消失，本文将如实报告适用边界，并据诊断结果调整方案。</w:t>
       </w:r>
     </w:p>
     <w:p>
@@ -4516,7 +4498,7 @@
         <w:jc w:val="both"/>
       </w:pPr>
       <w:r>
-        <w:t>研究问题、拟采用的方法与研究目的的递进关系如图 1 所示。首先通过单轮工具调用轨迹和状态分层明确教师监督所处的位置；随后在稀疏反馈中保留 Top-K 以外的总概率质量，分析目标定义对梯度和行为的影响；最后在反馈预算下选择 K，并检验这种设计是否改善任务效果与成本之间的关系。三个部分共享同一任务、模型、数据划分和评测规则。</w:t>
+        <w:t xml:space="preserve">图 1 给出研究链条：以单轮工具调用建立学生轨迹和可执行评测，随后区分 Top-K 的尾部总量丢失与决策 token 漏选，最后检验预算受限的决策感知支持集。三阶段共享模型、数据划分和评价协议；散度方向是机制参照，监督粒度是方法设计中的预算变量。尾部类别、采样残差和学生感知支持集均已有相关工作[31][32][33][34]，本文的研究重点是分析它们在本任务上的适用性，并验证有无必要结合位置风险进行资源分配。</w:t>
       </w:r>
     </w:p>
     <w:p>
@@ -11565,7 +11547,7 @@
         <w:jc w:val="both"/>
       </w:pPr>
       <w:r>
-        <w:t>常规截断基线在选定支持集内分别归一化师生概率，如式（4-18）所示。拟研究的残余类别目标不对所选概率重新归一化，而是把支持集外的教师概率总和与学生概率总和分别作为第 K+1 类，在共同支持集上计算 Forward KL；这样只保留尾部总质量，不宣称恢复尾部内部结构。训练中将单独记录残余质量与数值异常，以判断该构造是否有实际作用。</w:t>
+        <w:t xml:space="preserve">常规截断基线在选定支持集内分别归一化师生概率，如式（4-18）所示。已有 TA-OPD 在教师 Top-K 之外引入尾部类别，保留师生各自的尾部总质量[31]。本文将该目标作为可复现的对照，记录尾部质量和关键决策 token 的梯度；后续拟研究的位置感知支持集只改变候选集合与预算分配。尾部类别无法恢复尾部 token 之间的相对关系，其作用与决策 token 补入须分开检验。</w:t>
       </w:r>
     </w:p>
     <w:tbl>
@@ -12827,7 +12809,7 @@
         <w:jc w:val="both"/>
       </w:pPr>
       <w:r>
-        <w:t>为控制估计方差，提议分布须覆盖被估计分布的支持集，并记录其定义、随机种子和概率下界。自适应 K 的候选规则是在最大支持集大小内选择达到预设累计教师概率质量的最小 K；仍未覆盖的概率由残余类别表示。阈值在验证集上确定，并与相同反馈预算的固定 K 比较。所有目标统一使用 log-sum-exp、有效位置归一化和有限值检查，防止混合精度下出现 NaN 或 Inf。仅保存较少概率值不等于减少教师模型前向计算，二者分别计量。</w:t>
+        <w:t xml:space="preserve">为控制估计方差，提议分布须覆盖被估计分布的支持集，并记录其定义、随机种子和概率下界。本文先用冻结前缀诊断确定各类位置的截断风险，再在最大支持集大小内选择满足累计教师质量阈值的最小 K；对预先定义的工具调用决策 token 检查漏选，必要时补入并计入反馈成本。阈值和位置权重在验证集确定，并与相同平均反馈预算的固定 K、已有尾部类别方法比较。所有目标统一使用 log-sum-exp、有效位置归一化和有限值检查；反馈量、教师前向计算与额外 logprob 查询分别计量。</w:t>
       </w:r>
     </w:p>
     <w:p>
@@ -17776,6 +17758,76 @@
       </w:pPr>
       <w:r>
         <w:t>舒善富, 刘超, 孙毓忠, 等. 基于自适应知识蒸馏的代码大模型轻量化[J]. 软件学报, 2026, 37(6): 2431-2454. DOI:10.13328/j.cnki.jos.007462.</w:t>
+      </w:r>
+    </w:p>
+    <w:p>
+      <w:pPr>
+        <w:pStyle w:val="17"/>
+        <w:numPr>
+          <w:ilvl w:val="0"/>
+          <w:numId w:val="1"/>
+        </w:numPr>
+        <w:ind w:firstLine="420"/>
+        <w:jc w:val="both"/>
+      </w:pPr>
+      <w:r>
+        <w:t xml:space="preserve">Anshumann, Zaidi M A, Kedia A, et al. Sparse Logit Sampling: Accelerating Knowledge Distillation in LLMs[C]//Proceedings of the 63rd Annual Meeting of the Association for Computational Linguistics (Volume 1: Long Papers). 2025: 18085-18108. DOI:10.18653/v1/2025.acl-long.885.</w:t>
+      </w:r>
+    </w:p>
+    <w:p>
+      <w:pPr>
+        <w:pStyle w:val="17"/>
+        <w:numPr>
+          <w:ilvl w:val="0"/>
+          <w:numId w:val="1"/>
+        </w:numPr>
+        <w:ind w:firstLine="420"/>
+        <w:jc w:val="both"/>
+      </w:pPr>
+      <w:r>
+        <w:t xml:space="preserve">Huang H, Wei H. Tail-Aware Top-k On-Policy Distillation[EB/OL]. arXiv:2608.14728, 2026.</w:t>
+      </w:r>
+    </w:p>
+    <w:p>
+      <w:pPr>
+        <w:pStyle w:val="17"/>
+        <w:numPr>
+          <w:ilvl w:val="0"/>
+          <w:numId w:val="1"/>
+        </w:numPr>
+        <w:ind w:firstLine="420"/>
+        <w:jc w:val="both"/>
+      </w:pPr>
+      <w:r>
+        <w:t xml:space="preserve">Meng L, Gan S, Li Y, et al. Unbiased Top-k Estimation for On-Policy Distillation[EB/OL]. arXiv:2609.34447, 2026.</w:t>
+      </w:r>
+    </w:p>
+    <w:p>
+      <w:pPr>
+        <w:pStyle w:val="17"/>
+        <w:numPr>
+          <w:ilvl w:val="0"/>
+          <w:numId w:val="1"/>
+        </w:numPr>
+        <w:ind w:firstLine="420"/>
+        <w:jc w:val="both"/>
+      </w:pPr>
+      <w:r>
+        <w:t xml:space="preserve">Shen J, Chen G, Mao C. When Top-K Misses the Decision: Tool-Call Drift in Multi-Teacher On-Policy Distillation[EB/OL]. arXiv:2607.07050, 2026.</w:t>
+      </w:r>
+    </w:p>
+    <w:p>
+      <w:pPr>
+        <w:pStyle w:val="17"/>
+        <w:numPr>
+          <w:ilvl w:val="0"/>
+          <w:numId w:val="1"/>
+        </w:numPr>
+        <w:ind w:firstLine="420"/>
+        <w:jc w:val="both"/>
+      </w:pPr>
+      <w:r>
+        <w:t xml:space="preserve">Yang P, Xing L, Dai X, et al. ResOPD: Tail Residualization for Sparse On-Policy Distillation[EB/OL]. arXiv:2610.04882, 2026.</w:t>
       </w:r>
     </w:p>
     <w:sectPr>

</xml_diff>

<commit_message>
fix: clarify Chapter 3 research headings
</commit_message>
<xml_diff>
--- a/Papers/output/开题报告-基于在线策略蒸馏的大语言模型后训练方法研究.docx
+++ b/Papers/output/开题报告-基于在线策略蒸馏的大语言模型后训练方法研究.docx
@@ -1214,7 +1214,7 @@
         <w:rPr>
           <w:rFonts w:ascii="黑体" w:hAnsi="黑体" w:eastAsia="黑体" w:cs="黑体"/>
         </w:rPr>
-        <w:t>3.2 学生状态分布上的有效教师监督</w:t>
+        <w:t xml:space="preserve">3.2 工具调用场景与在策略基线</w:t>
       </w:r>
       <w:r>
         <w:tab/>
@@ -1258,7 +1258,7 @@
         <w:rPr>
           <w:rFonts w:ascii="黑体" w:hAnsi="黑体" w:eastAsia="黑体" w:cs="黑体"/>
         </w:rPr>
-        <w:t>3.3 稀疏监督下的散度目标与尾部质量</w:t>
+        <w:t xml:space="preserve">3.3 Top-K 尾部遗漏及其训练影响</w:t>
       </w:r>
       <w:r>
         <w:tab/>
@@ -1302,7 +1302,7 @@
         <w:rPr>
           <w:rFonts w:ascii="黑体" w:hAnsi="黑体" w:eastAsia="黑体" w:cs="黑体"/>
         </w:rPr>
-        <w:t>3.4 监督粒度选择与资源效率</w:t>
+        <w:t xml:space="preserve">3.4 面向工具调用决策的稀疏监督改进</w:t>
       </w:r>
       <w:r>
         <w:tab/>
@@ -4345,7 +4345,7 @@
           <w:color w:val="000000"/>
           <w:sz w:val="24"/>
         </w:rPr>
-        <w:t>3.2 学生状态分布上的有效教师监督</w:t>
+        <w:t xml:space="preserve">3.2 工具调用场景与在策略基线</w:t>
       </w:r>
       <w:bookmarkEnd w:id="18"/>
     </w:p>
@@ -4388,7 +4388,7 @@
           <w:color w:val="000000"/>
           <w:sz w:val="24"/>
         </w:rPr>
-        <w:t>3.3 稀疏监督下的散度目标与尾部质量</w:t>
+        <w:t xml:space="preserve">3.3 Top-K 尾部遗漏及其训练影响</w:t>
       </w:r>
       <w:bookmarkEnd w:id="19"/>
     </w:p>
@@ -4431,7 +4431,7 @@
           <w:color w:val="000000"/>
           <w:sz w:val="24"/>
         </w:rPr>
-        <w:t>3.4 监督粒度选择与资源效率</w:t>
+        <w:t xml:space="preserve">3.4 面向工具调用决策的稀疏监督改进</w:t>
       </w:r>
       <w:bookmarkEnd w:id="20"/>
     </w:p>

</xml_diff>

<commit_message>
docs: focus opening report on decision-aware tail-preserving distillation
</commit_message>
<xml_diff>
--- a/Papers/output/开题报告-基于在线策略蒸馏的大语言模型后训练方法研究.docx
+++ b/Papers/output/开题报告-基于在线策略蒸馏的大语言模型后训练方法研究.docx
@@ -1170,7 +1170,7 @@
         <w:rPr>
           <w:rFonts w:ascii="黑体" w:hAnsi="黑体" w:eastAsia="黑体" w:cs="黑体"/>
         </w:rPr>
-        <w:t>3.1 研究问题概述</w:t>
+        <w:t>3.1 研究目标概述</w:t>
       </w:r>
       <w:r>
         <w:tab/>
@@ -1214,7 +1214,7 @@
         <w:rPr>
           <w:rFonts w:ascii="黑体" w:hAnsi="黑体" w:eastAsia="黑体" w:cs="黑体"/>
         </w:rPr>
-        <w:t xml:space="preserve">3.2 工具调用场景与在策略基线</w:t>
+        <w:t xml:space="preserve">3.2 拟解决的研究问题</w:t>
       </w:r>
       <w:r>
         <w:tab/>
@@ -1258,7 +1258,7 @@
         <w:rPr>
           <w:rFonts w:ascii="黑体" w:hAnsi="黑体" w:eastAsia="黑体" w:cs="黑体"/>
         </w:rPr>
-        <w:t xml:space="preserve">3.3 Top-K 尾部遗漏及其训练影响</w:t>
+        <w:t xml:space="preserve">3.3 决策感知的尾部保真蒸馏方法</w:t>
       </w:r>
       <w:r>
         <w:tab/>
@@ -1302,7 +1302,7 @@
         <w:rPr>
           <w:rFonts w:ascii="黑体" w:hAnsi="黑体" w:eastAsia="黑体" w:cs="黑体"/>
         </w:rPr>
-        <w:t xml:space="preserve">3.4 面向工具调用决策的稀疏监督改进</w:t>
+        <w:t xml:space="preserve">3.4 验证路径与预期研究产出</w:t>
       </w:r>
       <w:r>
         <w:tab/>
@@ -1317,7 +1317,7 @@
         <w:fldChar w:fldCharType="separate"/>
       </w:r>
       <w:r>
-        <w:t>25</w:t>
+        <w:t>24</w:t>
       </w:r>
       <w:r>
         <w:fldChar w:fldCharType="end"/>
@@ -1368,7 +1368,7 @@
         <w:fldChar w:fldCharType="separate"/>
       </w:r>
       <w:r>
-        <w:t>26</w:t>
+        <w:t>25</w:t>
       </w:r>
       <w:r>
         <w:fldChar w:fldCharType="end"/>
@@ -1412,7 +1412,7 @@
         <w:fldChar w:fldCharType="separate"/>
       </w:r>
       <w:r>
-        <w:t>27</w:t>
+        <w:t>25</w:t>
       </w:r>
       <w:r>
         <w:fldChar w:fldCharType="end"/>
@@ -1456,7 +1456,7 @@
         <w:fldChar w:fldCharType="separate"/>
       </w:r>
       <w:r>
-        <w:t>27</w:t>
+        <w:t>25</w:t>
       </w:r>
       <w:r>
         <w:fldChar w:fldCharType="end"/>
@@ -1500,7 +1500,7 @@
         <w:fldChar w:fldCharType="separate"/>
       </w:r>
       <w:r>
-        <w:t>29</w:t>
+        <w:t>28</w:t>
       </w:r>
       <w:r>
         <w:fldChar w:fldCharType="end"/>
@@ -1544,7 +1544,7 @@
         <w:fldChar w:fldCharType="separate"/>
       </w:r>
       <w:r>
-        <w:t>31</w:t>
+        <w:t>29</w:t>
       </w:r>
       <w:r>
         <w:fldChar w:fldCharType="end"/>
@@ -1588,7 +1588,7 @@
         <w:fldChar w:fldCharType="separate"/>
       </w:r>
       <w:r>
-        <w:t>34</w:t>
+        <w:t>32</w:t>
       </w:r>
       <w:r>
         <w:fldChar w:fldCharType="end"/>
@@ -1632,7 +1632,7 @@
         <w:fldChar w:fldCharType="separate"/>
       </w:r>
       <w:r>
-        <w:t>38</w:t>
+        <w:t>36</w:t>
       </w:r>
       <w:r>
         <w:fldChar w:fldCharType="end"/>
@@ -1676,7 +1676,7 @@
         <w:fldChar w:fldCharType="separate"/>
       </w:r>
       <w:r>
-        <w:t>41</w:t>
+        <w:t>39</w:t>
       </w:r>
       <w:r>
         <w:fldChar w:fldCharType="end"/>
@@ -1720,7 +1720,7 @@
         <w:fldChar w:fldCharType="separate"/>
       </w:r>
       <w:r>
-        <w:t>42</w:t>
+        <w:t>40</w:t>
       </w:r>
       <w:r>
         <w:fldChar w:fldCharType="end"/>
@@ -1764,7 +1764,7 @@
         <w:fldChar w:fldCharType="separate"/>
       </w:r>
       <w:r>
-        <w:t>42</w:t>
+        <w:t>40</w:t>
       </w:r>
       <w:r>
         <w:fldChar w:fldCharType="end"/>
@@ -1808,7 +1808,7 @@
         <w:fldChar w:fldCharType="separate"/>
       </w:r>
       <w:r>
-        <w:t>44</w:t>
+        <w:t>42</w:t>
       </w:r>
       <w:r>
         <w:fldChar w:fldCharType="end"/>
@@ -1852,7 +1852,7 @@
         <w:fldChar w:fldCharType="separate"/>
       </w:r>
       <w:r>
-        <w:t>45</w:t>
+        <w:t>43</w:t>
       </w:r>
       <w:r>
         <w:fldChar w:fldCharType="end"/>
@@ -1896,7 +1896,7 @@
         <w:fldChar w:fldCharType="separate"/>
       </w:r>
       <w:r>
-        <w:t>45</w:t>
+        <w:t>43</w:t>
       </w:r>
       <w:r>
         <w:fldChar w:fldCharType="end"/>
@@ -1940,7 +1940,7 @@
         <w:fldChar w:fldCharType="separate"/>
       </w:r>
       <w:r>
-        <w:t>45</w:t>
+        <w:t>43</w:t>
       </w:r>
       <w:r>
         <w:fldChar w:fldCharType="end"/>
@@ -1984,7 +1984,7 @@
         <w:fldChar w:fldCharType="separate"/>
       </w:r>
       <w:r>
-        <w:t>46</w:t>
+        <w:t>44</w:t>
       </w:r>
       <w:r>
         <w:fldChar w:fldCharType="end"/>
@@ -2028,7 +2028,7 @@
         <w:fldChar w:fldCharType="separate"/>
       </w:r>
       <w:r>
-        <w:t>47</w:t>
+        <w:t>45</w:t>
       </w:r>
       <w:r>
         <w:fldChar w:fldCharType="end"/>
@@ -2072,7 +2072,7 @@
         <w:fldChar w:fldCharType="separate"/>
       </w:r>
       <w:r>
-        <w:t>49</w:t>
+        <w:t>47</w:t>
       </w:r>
       <w:r>
         <w:fldChar w:fldCharType="end"/>
@@ -2136,7 +2136,7 @@
         <w:jc w:val="both"/>
       </w:pPr>
       <w:r>
-        <w:t>本课题面向大语言模型后训练与工具增强应用中的实际需求，研究在线策略蒸馏（On-Policy Distillation，OPD）方法。研究将在学生模型自主生成的状态上引入教师模型的密集反馈，比较不同 KL 散度方向和监督信息粒度对训练效果、稳定性及资源开销的影响，并通过可交互的测试系统检验模型的实际能力。</w:t>
+        <w:t xml:space="preserve">本课题面向大语言模型后训练中的工具调用能力，研究在线策略蒸馏在有限教师反馈下如何保留关键训练信号。学生在自身生成的前缀上接受教师监督；当反馈压缩为 Top-K 时，尾部总概率与影响函数选择的具体 token 可能被遗漏。研究将诊断这两类信息损失，并检验决策感知的尾部保真蒸馏方案在效果、稳定性和成本上的适用边界。</w:t>
       </w:r>
     </w:p>
     <w:p>
@@ -2145,7 +2145,7 @@
         <w:jc w:val="both"/>
       </w:pPr>
       <w:r>
-        <w:t>研究选用 Qwen3-0.6B 作为学生模型，以 LoRA 方式进行后训练，并使用冻结的 Qwen3-4B 作为教师模型。训练数据从公开 Function Calling 数据集中筛选，重点比较 Forward KL、Reverse KL、广义散度，以及全词表、Top-K、K1 sampled-token 三种监督方案；最终通过 vLLM 或自建测试程序验证推理性能。数据准备阶段将统一记录数据集名称、版本、许可证、划分方式和模型版本。</w:t>
+        <w:t xml:space="preserve">研究计划采用 Qwen3-0.6B 作为 LoRA 学生、冻结的 Qwen3-4B 作为教师，从公开 Function Calling 数据筛选单轮样本。完整词表与常规 Top-K 提供参照，已有尾部类别方法提供直接基线；拟研究的方法在关键位置补入学生高概率的决策候选，并按风险分配固定反馈预算。模型版本、数据来源、划分和实际硬件条件在实验前统一记录。</w:t>
       </w:r>
     </w:p>
     <w:p>
@@ -2241,7 +2241,7 @@
         <w:jc w:val="both"/>
       </w:pPr>
       <w:r>
-        <w:t>1. 梳理离线蒸馏、在线策略蒸馏、KL 散度和工具增强模型的发展脉络，明确 OPD 在 Function Calling 场景中的研究问题。</w:t>
+        <w:t xml:space="preserve">1. 梳理从离线蒸馏、在线策略蒸馏到稀疏教师反馈的研究脉络，明确 Top-K 尾部总量与决策关键 token 两类信息损失。</w:t>
       </w:r>
     </w:p>
     <w:p>
@@ -2251,7 +2251,7 @@
         <w:jc w:val="both"/>
       </w:pPr>
       <w:r>
-        <w:t>2. 在统一的 OPD 后训练流程中比较主要散度方向和监督信息粒度（或估计方式），具体实验见第 3、4 节。</w:t>
+        <w:t xml:space="preserve">2. 建立单轮 Function Calling 的在策略蒸馏流程，在学生前缀上诊断尾部遗漏及其对完整词表梯度和工具调用行为的影响。</w:t>
       </w:r>
     </w:p>
     <w:p>
@@ -2261,7 +2261,7 @@
         <w:jc w:val="both"/>
       </w:pPr>
       <w:r>
-        <w:t>3. 从任务正确率、训练稳定性、分布变化和资源开销等方面分析方法差异，并通过 vLLM 或自建测试程序测量推理吞吐、延迟与端到端调用成功率。</w:t>
+        <w:t xml:space="preserve">3. 研究决策感知的尾部保真蒸馏候选方法，以同预算对照和组件消融检验其任务效果、训练稳定性与额外资源成本。</w:t>
       </w:r>
     </w:p>
     <w:p>
@@ -2270,7 +2270,7 @@
         <w:jc w:val="both"/>
       </w:pPr>
       <w:r>
-        <w:t>在理论层面，本文把学生状态分布、散度方向和教师监督支持集作为三个独立因素，补充 Function Calling 场景下的 OPD 研究；在应用层面，考察小模型经 LoRA 后训练获得工具调用能力的可行性，并分析稀疏监督在模型效果与教师反馈开销之间的权衡，为低延迟、低成本和本地部署提供参考。</w:t>
+        <w:t xml:space="preserve">本课题的研究价值在于把稀疏教师反馈的概率误差与结构化工具调用决策联系起来，并探索在固定预算下保留关键监督的具体机制。完整词表散度、固定 Top-K 和已有尾部修正方法构成可核查的对照；候选方法能否改善小模型的函数选择、参数与格式表现，须由真实实验确定。</w:t>
       </w:r>
     </w:p>
     <w:p>
@@ -4085,7 +4085,7 @@
         <w:jc w:val="both"/>
       </w:pPr>
       <w:r>
-        <w:t>全词表监督在每个位置保留完整的教师分布，信息最充分，但词表维度也带来较高的计算、显存和传输开销。Top-K 只保留指定支持集中的高概率 token，需要明确 K 值、支持集来源、截断后的归一化方式和支持集外概率处理。K1 sampled-token 则对分布目标进行单样本估计。前缀蒸馏和蒸馏设计空间研究表明，信息覆盖、训练成本和模型容量需要联合考虑[11][14][15]，本文将在统一任务中比较三种方案的效果与成本。</w:t>
+        <w:t xml:space="preserve">在线策略蒸馏把教师监督带到学生真实访问的前缀上[7]，却也使教师需要在大量生成位置返回分布。完整词表反馈保留全部候选的相对关系，存储和传输开销随词表及序列长度增长。Top-K 只保留少量高概率候选，K1 sampled-token 则以单样本估计进一步压缩反馈。前缀蒸馏和蒸馏设计空间研究表明，反馈预算已经成为在线方法能否实施的重要约束[11][15]。</w:t>
       </w:r>
     </w:p>
     <w:p>
@@ -4094,7 +4094,7 @@
         <w:jc w:val="both"/>
       </w:pPr>
       <w:r>
-        <w:t>Qwen3 技术报告提供了所用模型家族的背景信息[16]。LoRA 通过低秩增量减少需要更新的参数量[19]，为小模型后训练提供了参数高效的实现路径。量化适配会额外引入量化精度和反量化开销等变量，因此不纳入主要比较。</w:t>
+        <w:t xml:space="preserve">稀疏反馈改变了训练目标。Sparse Logit Sampling 指出，直接缓存教师 Top-K 会产生有偏的分布估计[30]。TA-OPD 进一步发现，当师生都在教师 Top-K 内归一化时，目标忽略支持集外的总概率，学生尾部概率与熵可能在训练中上升；该工作用一个尾部类别保留剩余概率总量[31]。TT-OPD 与 ResOPD 则利用采样残差修正稀疏估计[32][34]。尾部总量的补偿已有明确先行工作。</w:t>
       </w:r>
     </w:p>
     <w:p>
@@ -4108,7 +4108,7 @@
           <w:rFonts w:ascii="Times New Roman" w:hAnsi="Times New Roman" w:eastAsia="宋体"/>
           <w:sz w:val="24"/>
         </w:rPr>
-        <w:t>监督信息粒度同时决定教师知识的表达能力和计算成本。全词表分布能够保留长尾 token 之间的相对关系，但需要传输或即时计算大量 logits；Top-K 显著降低存储与通信压力，却引入支持集选择和尾部概率质量处理问题；K1 sampled-token 把监督进一步压缩为单样本估计，开销最低，但梯度方差、proposal 分布和随机种子会直接影响稳定性。现有研究表明，缩短监督范围可以降低成本，而目标构造又会影响训练稳定性[11][12]，因此教师信息量与最终性能并不是简单的线性关系。</w:t>
+        <w:t xml:space="preserve">另一类信息损失与总概率大小无关。Shen 等在多教师工具调用蒸馏中发现，即使教师 Top-K 覆盖几乎全部教师概率，也可能漏掉学生高估的工具调用入口 token；该坐标的修正会改变完整调用行为[33]。质量覆盖率因此无法单独衡量决策梯度是否完整。尾部类别可以约束“其余 token 合计多少概率”，但无法区分尾部中哪一个函数入口或结构 token 应被单独修正。</w:t>
       </w:r>
     </w:p>
     <w:p>
@@ -4122,7 +4122,7 @@
           <w:rFonts w:ascii="Times New Roman" w:hAnsi="Times New Roman" w:eastAsia="宋体"/>
           <w:sz w:val="24"/>
         </w:rPr>
-        <w:t>参数高效微调使本科阶段开展受控实验成为可能。LoRA 通过低秩增量限制可训练参数规模[19]，在本文中用于统一学生侧的更新接口，并不替代蒸馏方法本身。教师前向、学生 rollout、损失计算和 LoRA 反向传播仍是主要成本，因此除任务指标外，还需记录单步耗时、峰值显存、有效 token 吞吐和教师调用量，以判断稀疏监督节省的资源是否抵得上可能的性能损失。</w:t>
+        <w:t xml:space="preserve">现有工作分别处理了尾部总量、估计偏差和遗漏的学生候选[31][32][33][34]。对单教师、单轮 Function Calling 而言，关键问题进一步落在资源分配上：哪些生成位置需要显式保留低教师概率、高学生概率的决策 token，哪些位置可使用较小的支持集？全局增大 K 会提高反馈成本，仅按教师累计概率选 K 仍可能漏掉学生偏好的关键坐标。本文因此把位置风险、候选保留和反馈预算放入同一个方法设计。</w:t>
       </w:r>
     </w:p>
     <w:p>
@@ -4225,7 +4225,7 @@
           <w:rFonts w:ascii="Times New Roman" w:hAnsi="Times New Roman" w:eastAsia="宋体"/>
           <w:sz w:val="24"/>
         </w:rPr>
-        <w:t>总体来看，现有研究已经形成从学生状态采样、教师分布监督到参数高效更新的完整技术链条，但不同工作常同时改变模型规模、数据来源、散度目标和教师信息预算，结果难以直接横向比较。本文将固定 Qwen3-4B 教师、Qwen3-0.6B 学生和公开 Function Calling 数据，围绕 Forward KL、Reverse KL、广义散度，以及全词表、Top-K、K1 三类监督方式开展受控比较。</w:t>
+        <w:t xml:space="preserve">Function Calling 提供了检验稀疏反馈价值的可观察结果。函数入口和函数名决定是否调用工具及调用哪一个工具，参数键、结构符号和参数值分别影响 schema 合法性、解析与执行。公开数据和 BFCL 等评测允许把这些错误分开统计[25][26][27]。本文将词表层面的尾部质量与梯度误差，最终对应到函数误选、过度调用、格式错误和端到端成功率，建立从概率压缩到实际行为的证据链。</w:t>
       </w:r>
     </w:p>
     <w:p>
@@ -4250,7 +4250,7 @@
         <w:jc w:val="both"/>
       </w:pPr>
       <w:r>
-        <w:t xml:space="preserve">最后，Top-K 的压缩收益伴随明确的目标变化。已有研究发现，仅缓存高概率 token 会造成分布估计偏差[30]；在策略蒸馏的子集归一化目标会忽略尾部总概率，并可能推高学生尾部概率[31]。工具调用场景还存在另一种风险：高教师质量覆盖率仍可能遗漏决定工具入口的修正 token[33]。尾部总量与关键坐标需要分别测量，现有数学推导和其他任务的实验结果尚不足以替代本课题的 Function Calling 证据。</w:t>
+        <w:t xml:space="preserve">相关研究呈现清晰的演进：OPD 解决教师监督与学生访问状态之间的错位[7]；Top-K 使分布反馈更易存储与传输[11][15]；随后研究指出，压缩会遗漏尾部总量，也可能遗漏改变工具调用决策的具体 token[30][31][33]。前者关系到目标分布，后者关系到行为路径。已有尾部类别和采样修正处理了总量或估计问题[31][32][34]，已有学生感知支持集揭示了关键坐标的作用[33]。它们在本课题单教师工具调用场景中的风险大小及成本边界仍需实证确定。</w:t>
       </w:r>
     </w:p>
     <w:p>
@@ -4259,7 +4259,7 @@
         <w:jc w:val="both"/>
       </w:pPr>
       <w:r>
-        <w:t xml:space="preserve">据此，本文保留三步递进安排：构建单轮工具调用的在策略基线；在固定前缀上诊断尾部质量、决策 token 和梯度偏差，并用短程训练核查行为影响；在相同反馈预算下研究决策感知的稀疏支持集。已有尾部类别与采样修正工作[31][32][34]构成方法基线，本文拟研究的增量集中在任务位置与训练预算的联合选择，实际收益及适用条件待实验验证。</w:t>
+        <w:t xml:space="preserve">本文聚焦有限反馈下的决策保真，拟研究“决策感知的尾部保真在线蒸馏”。先在学生工具调用前缀上测量尾部总量和决策 token 漏选，再把学生高概率、教师 Top-K 未覆盖的关键候选补入支持集；其余词表用尾部类别保留总概率，并按位置风险分配固定反馈预算。该联合机制相对于现有方法的价值，须由完整词表梯度、同预算训练和实际调用结果检验，目前仍是待验证假设。</w:t>
       </w:r>
     </w:p>
     <w:p>
@@ -4290,7 +4290,7 @@
           <w:color w:val="000000"/>
           <w:sz w:val="24"/>
         </w:rPr>
-        <w:t>3.1 研究问题概述</w:t>
+        <w:t xml:space="preserve">3.1 研究目标概述</w:t>
       </w:r>
       <w:bookmarkEnd w:id="17"/>
     </w:p>
@@ -4300,37 +4300,7 @@
         <w:jc w:val="both"/>
       </w:pPr>
       <w:r>
-        <w:t xml:space="preserve">本文围绕单轮 Function Calling 的在策略蒸馏建立一条连续的研究链：先获得可信的学生轨迹和工具调用错误记录，再判断 Top-K 稀疏反馈遗漏了哪些训练信号，最后在固定反馈预算内设计并检验针对性的支持集选择规则。完整词表的 Forward KL、Reverse KL 和其他散度仅作为受控参照，K 的选择服务于同一个尾部监督问题。第 3.2、3.3 和 3.4 节分别说明实验场景、问题诊断和拟研究的改进方案。</w:t>
-      </w:r>
-    </w:p>
-    <w:p>
-      <w:pPr>
-        <w:pStyle w:val="17"/>
-        <w:ind w:firstLine="420"/>
-        <w:jc w:val="both"/>
-      </w:pPr>
-      <w:r>
-        <w:t xml:space="preserve">1. 场景与基线：学生自主生成的工具调用轨迹中，哪些位置决定函数选择、参数填写和结构正确性？如何保证教师在相同前缀上的反馈可用于训练与评估？</w:t>
-      </w:r>
-    </w:p>
-    <w:p>
-      <w:pPr>
-        <w:pStyle w:val="17"/>
-        <w:ind w:firstLine="420"/>
-        <w:jc w:val="both"/>
-      </w:pPr>
-      <w:r>
-        <w:t xml:space="preserve">2. 尾部信号诊断：Top-K 截断及子集归一化在这些位置遗漏了多少尾部概率质量、哪些学生高估的决策 token，以及怎样的损失和梯度变化？这些变化能否解释具体工具调用错误？</w:t>
-      </w:r>
-    </w:p>
-    <w:p>
-      <w:pPr>
-        <w:pStyle w:val="17"/>
-        <w:ind w:firstLine="420"/>
-        <w:jc w:val="both"/>
-      </w:pPr>
-      <w:r>
-        <w:t xml:space="preserve">3. 改进方案验证：在相同教师反馈预算下，能否依据尾部风险分配支持集，并保留必要的决策 token 与尾部总质量，使训练信号更接近完整词表目标？</w:t>
+        <w:t xml:space="preserve">本课题研究一个问题：有限教师反馈能否保留真正影响工具调用的蒸馏信号？拟研究的改进是“决策感知的尾部保真在线蒸馏”——在学生真实访问的前缀上补入被教师 Top-K 漏掉的关键决策 token，保留支持集外的总概率，并将有限反馈优先分配给高风险位置。相关方法的来龙去脉已在第 2 部分交代；本部分直接给出研究问题、候选方案与验证路径。</w:t>
       </w:r>
     </w:p>
     <w:p>
@@ -4345,7 +4315,7 @@
           <w:color w:val="000000"/>
           <w:sz w:val="24"/>
         </w:rPr>
-        <w:t xml:space="preserve">3.2 工具调用场景与在策略基线</w:t>
+        <w:t xml:space="preserve">3.2 拟解决的研究问题</w:t>
       </w:r>
       <w:bookmarkEnd w:id="18"/>
     </w:p>
@@ -4355,7 +4325,7 @@
         <w:jc w:val="both"/>
       </w:pPr>
       <w:r>
-        <w:t xml:space="preserve">已有在策略蒸馏方法在学生生成的前缀上查询教师，能够直接覆盖推理时会遇到的状态[7][11]。本文以单轮 Function Calling 为统一场景：学生按固定采样协议生成输出，冻结教师在相同前缀上计算条件分布，训练掩码仅覆盖有效 assistant 位置。首先复现可运行的完整词表与固定 Top-K 基线，固定模型、数据、LoRA 配置、更新步数和评测脚本。函数名、参数键、参数值及结构标记由解析规则和工具 schema 标注；解析失败的位置单独记录。</w:t>
+        <w:t xml:space="preserve">第一，Top-K 在工具调用的什么位置丢失有效监督？本文分别测量师生尾部总概率差异，以及学生高概率决策 token 被教师 Top-K 漏掉的频率；再对照完整词表梯度和函数调用错误，判断风险是否集中于函数入口、函数名、参数键或结构边界。</w:t>
       </w:r>
     </w:p>
     <w:p>
@@ -4364,7 +4334,7 @@
         <w:jc w:val="both"/>
       </w:pPr>
       <w:r>
-        <w:t xml:space="preserve">工具调用的错误具有位置差异。函数入口或函数名的一个错误可能使后续参数全部失效，普通参数值 token 的偏差通常局限于局部字段。本文记录各类位置的教师熵、学生与教师的支持集重叠、工具调用是否成功，以及错误在生成序列中的首次可确定位置。对无法可靠定位的语义错误，只保留整条调用的结果标签。状态划分为后续尾部分析提供可检验的条件变量。</w:t>
+        <w:t xml:space="preserve">第二，哪些尾部信息值得保留？尾部类别表示剩余概率总量，显式决策 token 提供具体行为选择的修正。本文检验两种信息分别对梯度方向、训练稳定性和调用结果产生的作用，确定支持集构造所需的最小信息。</w:t>
       </w:r>
     </w:p>
     <w:p>
@@ -4373,7 +4343,7 @@
         <w:jc w:val="both"/>
       </w:pPr>
       <w:r>
-        <w:t xml:space="preserve">基线阶段按相同有效 token 预算比较学生轨迹监督与既有参考轨迹监督，并给出函数选择准确率、参数匹配率、可解析率和端到端成功率。两组训练共享采样种子和评测集合；学生轨迹是否更有价值由真实结果判断。这个阶段同时确认教师与学生使用一致的 tokenizer、特殊 token 和工具调用模板，以免把协议差异误记为截断效应。</w:t>
+        <w:t xml:space="preserve">第三，怎样在固定预算内形成改进？本文依据位置风险分配 K，在关键位置补入遗漏的学生高概率候选，在其他位置使用较小支持集；相同平均反馈量下与固定 K、质量阈值 K 和已有尾部类别方法比较。</w:t>
       </w:r>
     </w:p>
     <w:p>
@@ -4388,7 +4358,7 @@
           <w:color w:val="000000"/>
           <w:sz w:val="24"/>
         </w:rPr>
-        <w:t xml:space="preserve">3.3 Top-K 尾部遗漏及其训练影响</w:t>
+        <w:t xml:space="preserve">3.3 决策感知的尾部保真蒸馏方法</w:t>
       </w:r>
       <w:bookmarkEnd w:id="19"/>
     </w:p>
@@ -4398,7 +4368,7 @@
         <w:jc w:val="both"/>
       </w:pPr>
       <w:r>
-        <w:t xml:space="preserve">Top-K 用少量教师概率替代完整词表反馈，降低存储与传输开销。已有稀疏蒸馏研究指出，截断后的概率估计可能带来偏差[30]；在策略蒸馏研究进一步发现，师生在教师 Top-K 内各自归一化时，目标丢失了支持集外的总质量，学生尾部概率及熵可能在训练中上升[31]。另一项工具调用研究显示，即使教师 Top-K 覆盖了几乎全部教师概率，仍可能漏掉学生过度偏好的工具调用入口 token，使关键决策的修正梯度缺失[33]。这些结果来自不同模型与任务，本文将在单教师、单轮 Function Calling 场景检查其适用范围。</w:t>
+        <w:t xml:space="preserve">候选方法包含三个明确操作。其一，学生生成单轮调用后，依据工具 schema 和消息边界标记函数入口、函数名、参数键与结构位置。以教师 Top-K 为初始支持集，在这些决策位置检查学生高概率的合法候选；对教师 Top-K 漏掉、且可能改变调用路径的 token，额外取得教师概率并补入支持集。该操作使学生高估的具体候选进入损失。</w:t>
       </w:r>
     </w:p>
     <w:p>
@@ -4407,7 +4377,7 @@
         <w:jc w:val="both"/>
       </w:pPr>
       <w:r>
-        <w:t xml:space="preserve">本文把尾部问题分成两类观察。第一类是总量偏差：在教师 Top-K 支持集外，比较师生尾部质量及其随训练步数的变化，并在同一前缀上对照完整词表、子集归一化 Top-K 和已有的尾部类别方法[31]。第二类是决策遗漏：检查函数入口、函数名及结构标记等关键 token 是否落在教师 Top-K 之外，计算其完整词表梯度与稀疏目标梯度的方向和幅度差异。教师质量覆盖率、决策 token 覆盖率和梯度一致性分别报告，避免用单一累计概率解释训练行为。</w:t>
+        <w:t xml:space="preserve">其二，把补入后支持集之外的师生概率分别合并为尾部类别，与显式保留的 token 共同计算分布损失。尾部类别沿用 TA-OPD 的既有构造[31]，负责约束剩余总量；决策 token 补入负责提供具体选择的修正梯度。两者处理不同的信息缺口，实验将分别移除以检验作用。补入所需的额外教师 logprob 及计算时间单独计量。</w:t>
       </w:r>
     </w:p>
     <w:p>
@@ -4416,7 +4386,7 @@
         <w:jc w:val="both"/>
       </w:pPr>
       <w:r>
-        <w:t xml:space="preserve">诊断先在冻结模型和固定学生前缀上完成，再做短程训练验证。冻结诊断记录不同 K 和位置类别的尾部质量、目标差、梯度余弦相似度与关键 token 梯度；短程训练追踪尾部概率、熵、结构错误和工具调用成败。若冻结梯度差异存在而任务指标不变，需进一步检查训练步数与错误类型；若差异主要来自模板或教师不确定性，应先修正协议或缩小研究范围。Forward KL 与 Reverse KL 只在共同支持集和相同轨迹上做对照，不能把散度方向与截断方式同时改变后解释为单一因素。</w:t>
+        <w:t xml:space="preserve">其三，以训练集诊断子集中的尾部质量差、决策漏选率和完整词表梯度误差估计位置风险，在预设总反馈条目数内分配 K。高风险位置获得更多显式候选，其他位置选择较小 K；位置权重、质量阈值和上限只在训练集与验证集确定。三项操作合在一起构成待验证的联合方法。</w:t>
       </w:r>
     </w:p>
     <w:p>
@@ -4431,7 +4401,7 @@
           <w:color w:val="000000"/>
           <w:sz w:val="24"/>
         </w:rPr>
-        <w:t xml:space="preserve">3.4 面向工具调用决策的稀疏监督改进</w:t>
+        <w:t xml:space="preserve">3.4 验证路径与预期研究产出</w:t>
       </w:r>
       <w:bookmarkEnd w:id="20"/>
     </w:p>
@@ -4441,7 +4411,7 @@
         <w:jc w:val="both"/>
       </w:pPr>
       <w:r>
-        <w:t xml:space="preserve">已有 TA-OPD 把支持集外概率并为尾部类别，TT-OPD 与 ResOPD 则利用采样残差修正稀疏估计[31][32][34]；因此，单独增加第 K+1 类不能作为本文的新方法。本文拟研究工具调用位置的预算分配：在固定平均反馈条目数下，对函数入口、函数名和结构边界等位置提高决策 token 的覆盖要求，对其余位置依教师尾部质量选择较小支持集。该设计把第 3.3 节测得的尾部风险转化为可执行的支持集规则。</w:t>
+        <w:t xml:space="preserve">先建立单轮 Function Calling 的学生 rollout、冻结教师评分和完整词表参照。在固定前缀上对多个 K 测量尾部总量、关键 token 漏选和梯度误差；短程训练再观察这些差异是否对应函数误选、过度调用或格式错误。若尾部现象在本任务中不显著，方法范围将据实际结果收缩。</w:t>
       </w:r>
     </w:p>
     <w:p>
@@ -4450,7 +4420,7 @@
         <w:jc w:val="both"/>
       </w:pPr>
       <w:r>
-        <w:t xml:space="preserve">具体地，先在训练集的独立诊断子集上估计各位置类别的尾部质量差、决策 token 漏选率和完整词表梯度误差；据此确定位置权重与反馈预算。训练时从教师候选中选取满足累计质量阈值的最小 K，并在预设上限内补入可确定的工具调用决策 token；剩余概率沿用已有尾部类别目标表示[31]。若所需 token 不在教师返回的候选中，需要追加该 token 的教师 logprob 查询，并将这部分查询成本计入预算。位置权重、阈值和 K 上限仅在训练/验证集确定，测试集只用于最终评估。</w:t>
+        <w:t xml:space="preserve">正式比较使用同一学生起点、教师、数据、生成协议和有效训练 token 预算。主要对照为常规 Top-K、TA-OPD、仅补入决策候选、仅按位置分配 K 与完整联合方法；各组匹配平均反馈条目数，并单独报告额外查询。Forward KL、JSD 和 K1 保留为机制与低反馈量参照，主要方法结论来自固定损失方向的同预算比较。</w:t>
       </w:r>
     </w:p>
     <w:p>
@@ -4459,7 +4429,7 @@
         <w:jc w:val="both"/>
       </w:pPr>
       <w:r>
-        <w:t xml:space="preserve">验证包括固定 K、相同平均 K 的质量阈值 K、已有尾部类别方法，以及拟研究的决策感知支持集规则。各方法使用同一学生起点、教师、轨迹采样设置与有效 token 预算，并分别报告反馈字节数、额外教师查询、训练耗时和峰值显存。消融实验单独移除决策 token 补入、位置预算分配和尾部类别，检验每一部分的实际贡献；同时观察函数误选、参数错误、格式错误和端到端成功率。若预算匹配后改进消失，本文将如实报告适用边界，并据诊断结果调整方案。</w:t>
+        <w:t xml:space="preserve">研究产出包括工具调用位置上的尾部风险图谱、候选方法的组件消融、任务与训练指标，以及反馈字节数、教师查询、时间和显存记录。结果讨论会说明改进在何种位置、K 与预算下成立；若预算匹配后收益消失，也将据实解释原因。</w:t>
       </w:r>
     </w:p>
     <w:p>
@@ -4498,7 +4468,7 @@
         <w:jc w:val="both"/>
       </w:pPr>
       <w:r>
-        <w:t xml:space="preserve">图 1 给出研究链条：以单轮工具调用建立学生轨迹和可执行评测，随后区分 Top-K 的尾部总量丢失与决策 token 漏选，最后检验预算受限的决策感知支持集。三阶段共享模型、数据划分和评价协议；散度方向是机制参照，监督粒度是方法设计中的预算变量。尾部类别、采样残差和学生感知支持集均已有相关工作[31][32][33][34]，本文的研究重点是分析它们在本任务上的适用性，并验证有无必要结合位置风险进行资源分配。</w:t>
+        <w:t xml:space="preserve">图 1 概括研究主线：定位 Top-K 遗漏的尾部总量与关键决策 token，构造含显式决策候选和尾部类别的监督集合，再在固定预算下检验实际工具调用结果。尾部类别、采样修正和学生感知支持集均有先行研究[31][32][33][34]；本文检验面向工具调用决策的联合选择机制是否有独立价值。</w:t>
       </w:r>
     </w:p>
     <w:p>
@@ -4605,7 +4575,7 @@
           <w:rFonts w:ascii="Times New Roman" w:hAnsi="Times New Roman" w:eastAsia="宋体"/>
           <w:sz w:val="21"/>
         </w:rPr>
-        <w:t xml:space="preserve">  研究问题、研究方案与研究目的的</w:t>
+        <w:t xml:space="preserve">  决策感知的尾部保真蒸馏研究思路</w:t>
       </w:r>
       <w:r>
         <w:rPr>
@@ -4613,7 +4583,7 @@
           <w:sz w:val="21"/>
           <w:lang w:val="en-US" w:eastAsia="zh-CN"/>
         </w:rPr>
-        <w:t>结构关系</w:t>
+        <w:t/>
       </w:r>
     </w:p>
     <w:p>
@@ -4710,7 +4680,7 @@
         <w:jc w:val="both"/>
       </w:pPr>
       <w:r>
-        <w:t>本文以学生在单轮 Function Calling 中真实访问的状态为起点，将教师反馈、目标构造和参数更新连接为同一训练流程。学生生成调用轨迹后，系统根据消息边界与工具结构标记有效状态；冻结教师在这些学生前缀上输出条件概率。基线实验分别使用完整分布、常规 Top-K 和单样本估计，拟研究的方法则在 Top-K 支持集外保留一个残余概率类别，并根据教师概率质量选择反馈粒度。这样，状态来源、目标定义和信息预算可以逐层分析，而不是作为九种组合的简单罗列。</w:t>
+        <w:t xml:space="preserve">总体路线围绕一个候选改进展开。学生在单轮 Function Calling 中生成轨迹，冻结教师在同一前缀评分；诊断环节测量 Top-K 外的尾部总量与被漏掉的决策 token；方法环节按位置风险分配 K、补入关键候选，并以尾部类别保留剩余总概率；最后更新 LoRA 学生并开展分层工具调用评测。图 2 展示从问题定位到方法验证的完整路径。</w:t>
       </w:r>
     </w:p>
     <w:p>
@@ -5770,7 +5740,7 @@
         <w:jc w:val="both"/>
       </w:pPr>
       <w:r>
-        <w:t>上式中的统一估计项在完整词表方案下为完整散度，在常规 Top-K 方案下为支持集内重归一化目标，在 K1 方案下为后文定义的单样本估计。本文另拟构建保留尾部总质量的 Top-K 目标，作为对常规截断方案的定点改进；其中支持集由教师确定，师生均在相同支持集及同一个残余类别上计算概率。训练更新只对条件分布损失反向传播，学生离散采样轨迹仅作为状态序列，不对采样操作求梯度。学生仍只在 LoRA 参数子空间更新，因此总体优化问题可写为：</w:t>
+        <w:t xml:space="preserve">统一目标用于定义共同的训练接口。完整词表 Reverse KL 提供信息参照，常规子集归一化 Top-K 展示截断误差，已有尾部类别方法提供直接方法基线[31]。候选方法进一步改变支持集：关键位置补入学生高概率而教师 Top-K 漏掉的合法决策 token，其余概率归入尾部类别，K 的位置分配受总反馈预算约束。离散 rollout 只提供状态，损失对学生 LoRA 参数反向传播。总体优化问题写为：</w:t>
       </w:r>
     </w:p>
     <w:tbl>
@@ -6020,7 +5990,7 @@
         <w:jc w:val="both"/>
       </w:pPr>
       <w:r>
-        <w:t>统一目标的作用是让三个研究问题相互衔接：学生轨迹和位置标记确定教师在哪些状态上监督；散度及残余类别构造确定教师概率如何变成训练信号；固定或自适应 K 决定每个状态保留多少显式反馈。总体技术路线如图 2 所示。</w:t>
+        <w:t xml:space="preserve">实验顺序与方法构造一致：先确认尾部遗漏在工具调用中是否出现，再识别总量补偿和决策候选补入各自的作用，最后检验固定预算下的联合方案。散度方向作为机制参照，K 的位置分配属于候选方法本身。完整训练配置与原始指标用于追溯行为变化。</w:t>
       </w:r>
     </w:p>
     <w:p>
@@ -10294,7 +10264,7 @@
         <w:jc w:val="both"/>
       </w:pPr>
       <w:r>
-        <w:t>混合系数改变后，混合分布对教师概率和学生概率的依赖随之变化。本文不会只用“覆盖”或“模式选择”解释结果，而会结合师生熵、支持集重叠和梯度稳定性判断散度实际产生的作用[7][8][9][12]。</w:t>
+        <w:t xml:space="preserve">完整词表的 Forward KL、Reverse KL、JSD 和 skew KL 用于解释概率加权差异[7][8][9][12]。主要稀疏目标采用 Reverse KL；其他散度作为机制参照，在相同学生轨迹、温度、有效位置与支持集协议下比较梯度、熵和任务行为。</w:t>
       </w:r>
     </w:p>
     <w:p>
@@ -10303,7 +10273,7 @@
         <w:jc w:val="both"/>
       </w:pPr>
       <w:r>
-        <w:t>为把散度比较与拟研究的方法区分开，表 4-2 将实验安排为四层对照：完整词表散度基线、固定 K 下的常规截断与残余类别目标、固定 K 与自适应 K、以及 K1 低反馈量参照。每层实验只改变一个核心因素，并共享模型、数据、学生轨迹、有效位置和训练预算。</w:t>
+        <w:t xml:space="preserve">表 4-2 围绕候选方法设置四组实验：完整词表参照、稀疏监督诊断、同预算方法比较和组件消融。各组固定教师、学生起点、数据划分、生成协议和评价规则，训练比较统一有效 token 数与更新步数。</w:t>
       </w:r>
     </w:p>
     <w:p>
@@ -10422,7 +10392,7 @@
                 <w:b/>
                 <w:sz w:val="19"/>
               </w:rPr>
-              <w:t>实验层次</w:t>
+              <w:t xml:space="preserve">实验层次</w:t>
             </w:r>
           </w:p>
         </w:tc>
@@ -10443,7 +10413,7 @@
                 <w:b/>
                 <w:sz w:val="19"/>
               </w:rPr>
-              <w:t>固定条件</w:t>
+              <w:t xml:space="preserve">固定条件</w:t>
             </w:r>
           </w:p>
         </w:tc>
@@ -10464,7 +10434,7 @@
                 <w:b/>
                 <w:sz w:val="19"/>
               </w:rPr>
-              <w:t>变化因素</w:t>
+              <w:t xml:space="preserve">变化因素</w:t>
             </w:r>
           </w:p>
         </w:tc>
@@ -10485,7 +10455,7 @@
                 <w:b/>
                 <w:sz w:val="19"/>
               </w:rPr>
-              <w:t>主要观察</w:t>
+              <w:t xml:space="preserve">主要观察</w:t>
             </w:r>
           </w:p>
         </w:tc>
@@ -10506,7 +10476,7 @@
                 <w:b/>
                 <w:sz w:val="19"/>
               </w:rPr>
-              <w:t>研究作用</w:t>
+              <w:t xml:space="preserve">研究作用</w:t>
             </w:r>
           </w:p>
         </w:tc>
@@ -10532,7 +10502,7 @@
                 <w:b w:val="0"/>
                 <w:sz w:val="19"/>
               </w:rPr>
-              <w:t>完整词表散度基线</w:t>
+              <w:t xml:space="preserve">完整词表参照</w:t>
             </w:r>
           </w:p>
         </w:tc>
@@ -10553,7 +10523,7 @@
                 <w:b w:val="0"/>
                 <w:sz w:val="19"/>
               </w:rPr>
-              <w:t>学生模型、教师模型、数据、rollout、训练预算、评价协议</w:t>
+              <w:t xml:space="preserve">模型、数据、前缀与预算</w:t>
             </w:r>
           </w:p>
         </w:tc>
@@ -10574,7 +10544,7 @@
                 <w:b w:val="0"/>
                 <w:sz w:val="19"/>
               </w:rPr>
-              <w:t>Forward KL、Reverse KL、广义散度</w:t>
+              <w:t xml:space="preserve">Reverse KL 主目标；其他散度参照</w:t>
             </w:r>
           </w:p>
         </w:tc>
@@ -10595,7 +10565,7 @@
                 <w:b w:val="0"/>
                 <w:sz w:val="19"/>
               </w:rPr>
-              <w:t>分布覆盖、模式集中、训练稳定性、任务指标</w:t>
+              <w:t xml:space="preserve">分布、梯度及任务指标</w:t>
             </w:r>
           </w:p>
         </w:tc>
@@ -10616,7 +10586,7 @@
                 <w:b w:val="0"/>
                 <w:sz w:val="19"/>
               </w:rPr>
-              <w:t>确定散度偏好基线</w:t>
+              <w:t xml:space="preserve">建立信息参照</w:t>
             </w:r>
           </w:p>
         </w:tc>
@@ -10642,7 +10612,7 @@
                 <w:b w:val="0"/>
                 <w:sz w:val="19"/>
               </w:rPr>
-              <w:t>固定 K 的目标对照</w:t>
+              <w:t xml:space="preserve">稀疏监督诊断</w:t>
             </w:r>
           </w:p>
         </w:tc>
@@ -10663,7 +10633,7 @@
                 <w:b w:val="0"/>
                 <w:sz w:val="19"/>
               </w:rPr>
-              <w:t>学生模型、教师模型、数据、支持集来源、K、训练预算</w:t>
+              <w:t xml:space="preserve">前缀、教师、K 与损失方向</w:t>
             </w:r>
           </w:p>
         </w:tc>
@@ -10684,7 +10654,7 @@
                 <w:b w:val="0"/>
                 <w:sz w:val="19"/>
               </w:rPr>
-              <w:t>常规重归一化 Top-K vs 残余类别 Top-K</w:t>
+              <w:t xml:space="preserve">常规 Top-K、尾部类别、关键候选补入</w:t>
             </w:r>
           </w:p>
         </w:tc>
@@ -10705,7 +10675,7 @@
                 <w:b w:val="0"/>
                 <w:sz w:val="19"/>
               </w:rPr>
-              <w:t>尾部概率质量、损失与梯度、任务指标</w:t>
+              <w:t xml:space="preserve">尾部总量、决策坐标和梯度误差</w:t>
             </w:r>
           </w:p>
         </w:tc>
@@ -10726,7 +10696,7 @@
                 <w:b w:val="0"/>
                 <w:sz w:val="19"/>
               </w:rPr>
-              <w:t>识别截断目标的尾部信息作用</w:t>
+              <w:t xml:space="preserve">定位两类信息缺失</w:t>
             </w:r>
           </w:p>
         </w:tc>
@@ -10752,7 +10722,7 @@
                 <w:b w:val="0"/>
                 <w:sz w:val="19"/>
               </w:rPr>
-              <w:t>固定目标的反馈粒度</w:t>
+              <w:t xml:space="preserve">同预算方法比较</w:t>
             </w:r>
           </w:p>
         </w:tc>
@@ -10773,7 +10743,7 @@
                 <w:b w:val="0"/>
                 <w:sz w:val="19"/>
               </w:rPr>
-              <w:t>学生模型、教师模型、数据、目标定义、有效 token、训练预算</w:t>
+              <w:t xml:space="preserve">学生起点、教师、数据和反馈预算</w:t>
             </w:r>
           </w:p>
         </w:tc>
@@ -10794,7 +10764,7 @@
                 <w:b w:val="0"/>
                 <w:sz w:val="19"/>
               </w:rPr>
-              <w:t>固定 K vs 自适应 K</w:t>
+              <w:t xml:space="preserve">固定 K、质量阈值 K、决策感知支持集</w:t>
             </w:r>
           </w:p>
         </w:tc>
@@ -10815,7 +10785,7 @@
                 <w:b w:val="0"/>
                 <w:sz w:val="19"/>
               </w:rPr>
-              <w:t>所选 K、残余质量、训练时间、显存、任务指标</w:t>
+              <w:t xml:space="preserve">调用结果、熵、额外查询及反馈量</w:t>
             </w:r>
           </w:p>
         </w:tc>
@@ -10836,7 +10806,7 @@
                 <w:b w:val="0"/>
                 <w:sz w:val="19"/>
               </w:rPr>
-              <w:t>检验反馈预算下的适用边界</w:t>
+              <w:t xml:space="preserve">检验候选改进</w:t>
             </w:r>
           </w:p>
         </w:tc>
@@ -10862,7 +10832,7 @@
                 <w:b w:val="0"/>
                 <w:sz w:val="19"/>
               </w:rPr>
-              <w:t>K1 低反馈量边界基线</w:t>
+              <w:t xml:space="preserve">组件消融与边界</w:t>
             </w:r>
           </w:p>
         </w:tc>
@@ -10883,7 +10853,7 @@
                 <w:b w:val="0"/>
                 <w:sz w:val="19"/>
               </w:rPr>
-              <w:t>学生模型、教师模型、数据、采样分布、训练预算</w:t>
+              <w:t xml:space="preserve">训练与评价协议</w:t>
             </w:r>
           </w:p>
         </w:tc>
@@ -10904,7 +10874,7 @@
                 <w:b w:val="0"/>
                 <w:sz w:val="19"/>
               </w:rPr>
-              <w:t>K1 sampled-token（与选定 Top-K 目标对照）</w:t>
+              <w:t xml:space="preserve">移除尾部类别、候选补入、位置分配；K1 参照</w:t>
             </w:r>
           </w:p>
         </w:tc>
@@ -10925,7 +10895,7 @@
                 <w:b w:val="0"/>
                 <w:sz w:val="19"/>
               </w:rPr>
-              <w:t>估计方差、异常 loss、反馈字节数、任务指标</w:t>
+              <w:t xml:space="preserve">任务变化、估计波动、时间和显存</w:t>
             </w:r>
           </w:p>
         </w:tc>
@@ -10946,7 +10916,7 @@
                 <w:b w:val="0"/>
                 <w:sz w:val="19"/>
               </w:rPr>
-              <w:t>刻画极低反馈量与单样本估计风险</w:t>
+              <w:t xml:space="preserve">归因并确定适用条件</w:t>
             </w:r>
           </w:p>
         </w:tc>
@@ -10958,7 +10928,7 @@
         <w:jc w:val="both"/>
       </w:pPr>
       <w:r>
-        <w:t>散度方向与监督粒度不再被安排为全部组合的穷举矩阵。表 4-2 将实验分为三层：完整词表散度基线用于观察优化偏好；固定 K 下比较常规截断与保留残余质量的目标，用于识别尾部信息的作用；在选定目标上比较固定 K、自适应 K 与 K1，以判断反馈预算和估计波动的影响。各层均固定其余变量。</w:t>
+        <w:t xml:space="preserve">完整词表提供目标与梯度参照；稀疏诊断分别测量尾部总量和关键坐标；同预算比较检验决策感知支持集；组件消融辨别候选补入、尾部类别和位置预算各自的作用。K1 sampled-token 作为极低反馈量边界参照，单独报告估计波动。</w:t>
       </w:r>
     </w:p>
     <w:p>
@@ -11547,7 +11517,7 @@
         <w:jc w:val="both"/>
       </w:pPr>
       <w:r>
-        <w:t xml:space="preserve">常规截断基线在选定支持集内分别归一化师生概率，如式（4-18）所示。已有 TA-OPD 在教师 Top-K 之外引入尾部类别，保留师生各自的尾部总质量[31]。本文将该目标作为可复现的对照，记录尾部质量和关键决策 token 的梯度；后续拟研究的位置感知支持集只改变候选集合与预算分配。尾部类别无法恢复尾部 token 之间的相对关系，其作用与决策 token 补入须分开检验。</w:t>
+        <w:t xml:space="preserve">常规截断基线在教师支持集内分别归一化师生概率，如式（4-18）所示。TA-OPD 在支持集外增加尾部类别[31]，作为本课题的直接方法基线。候选方法按工具调用位置调整支持集：检查学生高概率的合法决策候选，将教师 Top-K 漏掉的关键 token 补入，再计算新的尾部总概率。尾部类别传递总量信号，补入 token 传递具体决策信号；两者分别设置消融。</w:t>
       </w:r>
     </w:p>
     <w:tbl>
@@ -12809,7 +12779,7 @@
         <w:jc w:val="both"/>
       </w:pPr>
       <w:r>
-        <w:t xml:space="preserve">为控制估计方差，提议分布须覆盖被估计分布的支持集，并记录其定义、随机种子和概率下界。本文先用冻结前缀诊断确定各类位置的截断风险，再在最大支持集大小内选择满足累计教师质量阈值的最小 K；对预先定义的工具调用决策 token 检查漏选，必要时补入并计入反馈成本。阈值和位置权重在验证集确定，并与相同平均反馈预算的固定 K、已有尾部类别方法比较。所有目标统一使用 log-sum-exp、有效位置归一化和有限值检查；反馈量、教师前向计算与额外 logprob 查询分别计量。</w:t>
+        <w:t xml:space="preserve">K1 sampled-token 使用明确记录的提议分布和随机种子，提议分布须覆盖目标支持集。候选方法的位置权重来自训练集诊断子集，质量阈值和 K 上限由验证集确定；测试集只用于最终评价。补入候选的额外教师 logprob、反馈字节数与教师前向时间分别计量。各目标使用相同的 log-sum-exp、有效位置归一化和有限值检查。</w:t>
       </w:r>
     </w:p>
     <w:p>
@@ -16428,7 +16398,7 @@
         <w:jc w:val="both"/>
       </w:pPr>
       <w:r>
-        <w:t>1. 建立以 Qwen3-0.6B 为学生、冻结的 Qwen3-4B 为教师的单轮 Function Calling 在线策略蒸馏流程，并完成状态边界、有效位置和分层错误记录。</w:t>
+        <w:t xml:space="preserve">1. 建立以 Qwen3-0.6B 为学生、冻结的 Qwen3-4B 为教师的单轮 Function Calling 在线策略蒸馏流程，形成可复现的学生轨迹、位置标注与分层错误记录。</w:t>
       </w:r>
     </w:p>
     <w:p>
@@ -16438,7 +16408,7 @@
         <w:jc w:val="both"/>
       </w:pPr>
       <w:r>
-        <w:t>2. 在统一轨迹与训练预算下完成完整分布散度基线，以及常规 Top-K 与保留尾部质量的 Top-K 目标对比；检验目标差异是否具有可重复的任务或稳定性影响。</w:t>
+        <w:t xml:space="preserve">2. 量化常规 Top-K 的尾部总量损失、决策 token 漏选和梯度误差，完成与完整词表目标及已有尾部类别方法的受控对照。</w:t>
       </w:r>
     </w:p>
     <w:p>
@@ -16448,7 +16418,7 @@
         <w:jc w:val="both"/>
       </w:pPr>
       <w:r>
-        <w:t>3. 建立固定 K、按累计概率质量选择 K 与 K1 的反馈粒度对照，并按照数据集实际条件分层评价格式、函数选择、参数生成和可验证的工具调用结果。</w:t>
+        <w:t xml:space="preserve">3. 实现并验证决策感知的尾部保真蒸馏候选方案，在相同反馈预算下比较固定 K、质量阈值 K 和组件消融，报告函数调用结果、训练稳定性、教师查询与资源成本。</w:t>
       </w:r>
     </w:p>
     <w:p>

</xml_diff>

<commit_message>
docs: restore OPD research angles and focus Top-K contribution
</commit_message>
<xml_diff>
--- a/Papers/output/开题报告-基于在线策略蒸馏的大语言模型后训练方法研究.docx
+++ b/Papers/output/开题报告-基于在线策略蒸馏的大语言模型后训练方法研究.docx
@@ -1141,7 +1141,7 @@
         <w:fldChar w:fldCharType="separate"/>
       </w:r>
       <w:r>
-        <w:t>21</w:t>
+        <w:t>22</w:t>
       </w:r>
       <w:r>
         <w:fldChar w:fldCharType="end"/>
@@ -1170,7 +1170,7 @@
         <w:rPr>
           <w:rFonts w:ascii="黑体" w:hAnsi="黑体" w:eastAsia="黑体" w:cs="黑体"/>
         </w:rPr>
-        <w:t>3.1 研究目标概述</w:t>
+        <w:t>3.1 研究思路与问题展开</w:t>
       </w:r>
       <w:r>
         <w:tab/>
@@ -1185,7 +1185,7 @@
         <w:fldChar w:fldCharType="separate"/>
       </w:r>
       <w:r>
-        <w:t>21</w:t>
+        <w:t>22</w:t>
       </w:r>
       <w:r>
         <w:fldChar w:fldCharType="end"/>
@@ -1214,7 +1214,7 @@
         <w:rPr>
           <w:rFonts w:ascii="黑体" w:hAnsi="黑体" w:eastAsia="黑体" w:cs="黑体"/>
         </w:rPr>
-        <w:t xml:space="preserve">3.2 拟解决的研究问题</w:t>
+        <w:t xml:space="preserve">3.2 在线策略蒸馏的三个研究切入点</w:t>
       </w:r>
       <w:r>
         <w:tab/>
@@ -1258,7 +1258,7 @@
         <w:rPr>
           <w:rFonts w:ascii="黑体" w:hAnsi="黑体" w:eastAsia="黑体" w:cs="黑体"/>
         </w:rPr>
-        <w:t xml:space="preserve">3.3 决策感知的尾部保真蒸馏方法</w:t>
+        <w:t xml:space="preserve">3.3 Top-K 稀疏反馈的缺陷与拟改进方法</w:t>
       </w:r>
       <w:r>
         <w:tab/>
@@ -1273,7 +1273,7 @@
         <w:fldChar w:fldCharType="separate"/>
       </w:r>
       <w:r>
-        <w:t>23</w:t>
+        <w:t>24</w:t>
       </w:r>
       <w:r>
         <w:fldChar w:fldCharType="end"/>
@@ -1317,7 +1317,7 @@
         <w:fldChar w:fldCharType="separate"/>
       </w:r>
       <w:r>
-        <w:t>24</w:t>
+        <w:t>25</w:t>
       </w:r>
       <w:r>
         <w:fldChar w:fldCharType="end"/>
@@ -1368,7 +1368,7 @@
         <w:fldChar w:fldCharType="separate"/>
       </w:r>
       <w:r>
-        <w:t>25</w:t>
+        <w:t>26</w:t>
       </w:r>
       <w:r>
         <w:fldChar w:fldCharType="end"/>
@@ -1412,7 +1412,7 @@
         <w:fldChar w:fldCharType="separate"/>
       </w:r>
       <w:r>
-        <w:t>25</w:t>
+        <w:t>27</w:t>
       </w:r>
       <w:r>
         <w:fldChar w:fldCharType="end"/>
@@ -1456,7 +1456,7 @@
         <w:fldChar w:fldCharType="separate"/>
       </w:r>
       <w:r>
-        <w:t>25</w:t>
+        <w:t>27</w:t>
       </w:r>
       <w:r>
         <w:fldChar w:fldCharType="end"/>
@@ -1500,7 +1500,7 @@
         <w:fldChar w:fldCharType="separate"/>
       </w:r>
       <w:r>
-        <w:t>28</w:t>
+        <w:t>29</w:t>
       </w:r>
       <w:r>
         <w:fldChar w:fldCharType="end"/>
@@ -1544,7 +1544,7 @@
         <w:fldChar w:fldCharType="separate"/>
       </w:r>
       <w:r>
-        <w:t>29</w:t>
+        <w:t>31</w:t>
       </w:r>
       <w:r>
         <w:fldChar w:fldCharType="end"/>
@@ -1573,7 +1573,7 @@
         <w:rPr>
           <w:rFonts w:ascii="黑体" w:hAnsi="黑体" w:eastAsia="黑体" w:cs="黑体"/>
         </w:rPr>
-        <w:t>4.4 散度基线与稀疏反馈目标的定义</w:t>
+        <w:t>4.4 散度目标分析与稀疏反馈定义</w:t>
       </w:r>
       <w:r>
         <w:tab/>
@@ -1588,7 +1588,7 @@
         <w:fldChar w:fldCharType="separate"/>
       </w:r>
       <w:r>
-        <w:t>32</w:t>
+        <w:t>34</w:t>
       </w:r>
       <w:r>
         <w:fldChar w:fldCharType="end"/>
@@ -1632,7 +1632,7 @@
         <w:fldChar w:fldCharType="separate"/>
       </w:r>
       <w:r>
-        <w:t>36</w:t>
+        <w:t>37</w:t>
       </w:r>
       <w:r>
         <w:fldChar w:fldCharType="end"/>
@@ -1676,7 +1676,7 @@
         <w:fldChar w:fldCharType="separate"/>
       </w:r>
       <w:r>
-        <w:t>39</w:t>
+        <w:t>41</w:t>
       </w:r>
       <w:r>
         <w:fldChar w:fldCharType="end"/>
@@ -1720,7 +1720,7 @@
         <w:fldChar w:fldCharType="separate"/>
       </w:r>
       <w:r>
-        <w:t>40</w:t>
+        <w:t>41</w:t>
       </w:r>
       <w:r>
         <w:fldChar w:fldCharType="end"/>
@@ -1764,7 +1764,7 @@
         <w:fldChar w:fldCharType="separate"/>
       </w:r>
       <w:r>
-        <w:t>40</w:t>
+        <w:t>41</w:t>
       </w:r>
       <w:r>
         <w:fldChar w:fldCharType="end"/>
@@ -1808,7 +1808,7 @@
         <w:fldChar w:fldCharType="separate"/>
       </w:r>
       <w:r>
-        <w:t>42</w:t>
+        <w:t>43</w:t>
       </w:r>
       <w:r>
         <w:fldChar w:fldCharType="end"/>
@@ -1852,7 +1852,7 @@
         <w:fldChar w:fldCharType="separate"/>
       </w:r>
       <w:r>
-        <w:t>43</w:t>
+        <w:t>45</w:t>
       </w:r>
       <w:r>
         <w:fldChar w:fldCharType="end"/>
@@ -1896,7 +1896,7 @@
         <w:fldChar w:fldCharType="separate"/>
       </w:r>
       <w:r>
-        <w:t>43</w:t>
+        <w:t>45</w:t>
       </w:r>
       <w:r>
         <w:fldChar w:fldCharType="end"/>
@@ -1940,7 +1940,7 @@
         <w:fldChar w:fldCharType="separate"/>
       </w:r>
       <w:r>
-        <w:t>43</w:t>
+        <w:t>45</w:t>
       </w:r>
       <w:r>
         <w:fldChar w:fldCharType="end"/>
@@ -1984,7 +1984,7 @@
         <w:fldChar w:fldCharType="separate"/>
       </w:r>
       <w:r>
-        <w:t>44</w:t>
+        <w:t>45</w:t>
       </w:r>
       <w:r>
         <w:fldChar w:fldCharType="end"/>
@@ -2028,7 +2028,7 @@
         <w:fldChar w:fldCharType="separate"/>
       </w:r>
       <w:r>
-        <w:t>45</w:t>
+        <w:t>47</w:t>
       </w:r>
       <w:r>
         <w:fldChar w:fldCharType="end"/>
@@ -2072,7 +2072,7 @@
         <w:fldChar w:fldCharType="separate"/>
       </w:r>
       <w:r>
-        <w:t>47</w:t>
+        <w:t>49</w:t>
       </w:r>
       <w:r>
         <w:fldChar w:fldCharType="end"/>
@@ -2136,7 +2136,7 @@
         <w:jc w:val="both"/>
       </w:pPr>
       <w:r>
-        <w:t xml:space="preserve">本课题面向大语言模型后训练中的工具调用能力，研究在线策略蒸馏在有限教师反馈下如何保留关键训练信号。学生在自身生成的前缀上接受教师监督；当反馈压缩为 Top-K 时，尾部总概率与影响函数选择的具体 token 可能被遗漏。研究将诊断这两类信息损失，并检验决策感知的尾部保真蒸馏方案在效果、稳定性和成本上的适用边界。</w:t>
+        <w:t xml:space="preserve">本课题面向大语言模型的工具调用后训练，考察在线策略蒸馏的三个相互关联的环节：学生实际访问的生成状态、师生分布的匹配目标，以及有限教师反馈中保留的候选 token。前两者决定在何处学习、按何种偏好更新学生；第三者决定这些偏好能否在稀疏反馈中传递。本文先建立三方面的可比分析，再针对 Top-K 反馈可能遗漏的尾部信息研究改进方法。</w:t>
       </w:r>
     </w:p>
     <w:p>
@@ -2145,7 +2145,7 @@
         <w:jc w:val="both"/>
       </w:pPr>
       <w:r>
-        <w:t xml:space="preserve">研究计划采用 Qwen3-0.6B 作为 LoRA 学生、冻结的 Qwen3-4B 作为教师，从公开 Function Calling 数据筛选单轮样本。完整词表与常规 Top-K 提供参照，已有尾部类别方法提供直接基线；拟研究的方法在关键位置补入学生高概率的决策候选，并按风险分配固定反馈预算。模型版本、数据来源、划分和实际硬件条件在实验前统一记录。</w:t>
+        <w:t xml:space="preserve">研究计划采用 Qwen3-0.6B 作为 LoRA 学生、冻结的 Qwen3-4B 作为教师，从公开 Function Calling 数据筛选单轮样本。在学生生成的前缀上比较有效监督位置和完整词表散度的行为差异，随后固定状态与主损失，诊断 Top-K 截断及其尾部信息损失。候选方法在关键位置补入学生高概率的决策 token，并检验同预算下的任务表现与成本。模型版本、数据来源、划分和硬件条件在实验前统一记录。</w:t>
       </w:r>
     </w:p>
     <w:p>
@@ -2241,7 +2241,7 @@
         <w:jc w:val="both"/>
       </w:pPr>
       <w:r>
-        <w:t xml:space="preserve">1. 梳理从离线蒸馏、在线策略蒸馏到稀疏教师反馈的研究脉络，明确 Top-K 尾部总量与决策关键 token 两类信息损失。</w:t>
+        <w:t xml:space="preserve">1. 梳理在线策略蒸馏中学生状态、散度目标与监督粒度的研究进展，建立单轮工具调用的可复现训练与分层评价流程。</w:t>
       </w:r>
     </w:p>
     <w:p>
@@ -2251,7 +2251,7 @@
         <w:jc w:val="both"/>
       </w:pPr>
       <w:r>
-        <w:t xml:space="preserve">2. 建立单轮 Function Calling 的在策略蒸馏流程，在学生前缀上诊断尾部遗漏及其对完整词表梯度和工具调用行为的影响。</w:t>
+        <w:t xml:space="preserve">2. 在统一学生轨迹上研究完整词表散度的行为偏好，并诊断 Top-K 截断对尾部总概率、关键决策 token 和梯度的影响。</w:t>
       </w:r>
     </w:p>
     <w:p>
@@ -2261,7 +2261,7 @@
         <w:jc w:val="both"/>
       </w:pPr>
       <w:r>
-        <w:t xml:space="preserve">3. 研究决策感知的尾部保真蒸馏候选方法，以同预算对照和组件消融检验其任务效果、训练稳定性与额外资源成本。</w:t>
+        <w:t xml:space="preserve">3. 研究决策感知的稀疏反馈候选方法，以同预算对照和组件消融检验其任务效果、训练稳定性与额外资源成本。</w:t>
       </w:r>
     </w:p>
     <w:p>
@@ -2270,7 +2270,7 @@
         <w:jc w:val="both"/>
       </w:pPr>
       <w:r>
-        <w:t xml:space="preserve">本课题的研究价值在于把稀疏教师反馈的概率误差与结构化工具调用决策联系起来，并探索在固定预算下保留关键监督的具体机制。完整词表散度、固定 Top-K 和已有尾部修正方法构成可核查的对照；候选方法能否改善小模型的函数选择、参数与格式表现，须由真实实验确定。</w:t>
+        <w:t xml:space="preserve">本课题从在线策略蒸馏的状态、目标和反馈三个环节逐步收束研究范围：状态分析保证教师监督落在学生会访问的前缀，散度分析说明不同分布匹配目标引导何种行为，稀疏反馈分析揭示目标在有限预算下可能发生的失真。由此提出的 Top-K 改进须与完整词表、固定 Top-K 及已有尾部修正方法比较；其实际价值由工具调用结果和资源记录共同判断。</w:t>
       </w:r>
     </w:p>
     <w:p>
@@ -4250,7 +4250,7 @@
         <w:jc w:val="both"/>
       </w:pPr>
       <w:r>
-        <w:t xml:space="preserve">相关研究呈现清晰的演进：OPD 解决教师监督与学生访问状态之间的错位[7]；Top-K 使分布反馈更易存储与传输[11][15]；随后研究指出，压缩会遗漏尾部总量，也可能遗漏改变工具调用决策的具体 token[30][31][33]。前者关系到目标分布，后者关系到行为路径。已有尾部类别和采样修正处理了总量或估计问题[31][32][34]，已有学生感知支持集揭示了关键坐标的作用[33]。它们在本课题单教师工具调用场景中的风险大小及成本边界仍需实证确定。</w:t>
+        <w:t xml:space="preserve">现有研究为在线策略蒸馏提供了三个主要切入点。首先，GKD 等方法让教师在学生实际生成的前缀上评分，缓解训练与推理状态不一致的问题[7]。其次，Forward KL、Reverse KL、JSD 与 skew KL 对概率区域赋予不同权重，影响学生的覆盖、集中程度与训练稳定性[7][8][9][12]。再次，完整词表反馈较为充分，却需要较高的存储和传输成本；Top-K 与 sampled-token 方法以较少的教师信息换取可实施性[11][15][30]。状态、目标和反馈共同决定蒸馏效果，比较其中任何一项都需要固定另外两项。</w:t>
       </w:r>
     </w:p>
     <w:p>
@@ -4259,7 +4259,7 @@
         <w:jc w:val="both"/>
       </w:pPr>
       <w:r>
-        <w:t xml:space="preserve">本文聚焦有限反馈下的决策保真，拟研究“决策感知的尾部保真在线蒸馏”。先在学生工具调用前缀上测量尾部总量和决策 token 漏选，再把学生高概率、教师 Top-K 未覆盖的关键候选补入支持集；其余词表用尾部类别保留总概率，并按位置风险分配固定反馈预算。该联合机制相对于现有方法的价值，须由完整词表梯度、同预算训练和实际调用结果检验，目前仍是待验证假设。</w:t>
+        <w:t xml:space="preserve">上述切入点中，稀疏反馈留下了值得进一步研究的具体缺陷。教师 Top-K 内重新归一化会忽略支持集外的总概率，已有尾部类别方法对此作了补偿[31]；只看教师累计概率仍可能漏掉学生高估的工具调用决策 token，已有多教师研究揭示了这种风险[33]。采样修正也已用于缓解稀疏估计偏差[32][34]。这些结果尚不能直接推出单教师、单轮 Function Calling 中的最佳做法。本文在明确学生状态和散度目标的基础上，测量尾部总量与具体决策候选的遗漏，再研究固定反馈预算下的联合选择机制。</w:t>
       </w:r>
     </w:p>
     <w:p>
@@ -4290,7 +4290,7 @@
           <w:color w:val="000000"/>
           <w:sz w:val="24"/>
         </w:rPr>
-        <w:t xml:space="preserve">3.1 研究目标概述</w:t>
+        <w:t xml:space="preserve">3.1 研究思路与问题展开</w:t>
       </w:r>
       <w:bookmarkEnd w:id="17"/>
     </w:p>
@@ -4300,7 +4300,7 @@
         <w:jc w:val="both"/>
       </w:pPr>
       <w:r>
-        <w:t xml:space="preserve">本课题研究一个问题：有限教师反馈能否保留真正影响工具调用的蒸馏信号？拟研究的改进是“决策感知的尾部保真在线蒸馏”——在学生真实访问的前缀上补入被教师 Top-K 漏掉的关键决策 token，保留支持集外的总概率，并将有限反馈优先分配给高风险位置。相关方法的来龙去脉已在第 2 部分交代；本部分直接给出研究问题、候选方案与验证路径。</w:t>
+        <w:t xml:space="preserve">本文沿着“学生在哪里学习、分布目标如何引导学习、有限反馈保留什么信号”展开研究。首先建立单轮 Function Calling 的学生生成轨迹和教师同前缀评分，明确有效监督位置及错误类型；随后在相同轨迹上分析散度目标的概率权重与工具调用行为；最后固定主要训练目标，检验稀疏反馈是否遗漏有效信号，并针对 Top-K 的具体缺陷提出候选改进。前三项研究由一般 OPD 问题逐步进入可实施的方法设计。</w:t>
       </w:r>
     </w:p>
     <w:p>
@@ -4315,7 +4315,7 @@
           <w:color w:val="000000"/>
           <w:sz w:val="24"/>
         </w:rPr>
-        <w:t xml:space="preserve">3.2 拟解决的研究问题</w:t>
+        <w:t xml:space="preserve">3.2 在线策略蒸馏的三个研究切入点</w:t>
       </w:r>
       <w:bookmarkEnd w:id="18"/>
     </w:p>
@@ -4325,7 +4325,7 @@
         <w:jc w:val="both"/>
       </w:pPr>
       <w:r>
-        <w:t xml:space="preserve">第一，Top-K 在工具调用的什么位置丢失有效监督？本文分别测量师生尾部总概率差异，以及学生高概率决策 token 被教师 Top-K 漏掉的频率；再对照完整词表梯度和函数调用错误，判断风险是否集中于函数入口、函数名、参数键或结构边界。</w:t>
+        <w:t xml:space="preserve">第一，学生状态上的监督是否有效。学生自主生成时会访问教师示例未覆盖的前缀；在这些位置评分是 OPD 相对离线蒸馏的重要变化[7]。本文建立单轮工具调用轨迹与冻结教师评分流程，按函数入口、函数名、参数键、参数值和结构边界标注可可靠识别的位置。通过统一位置掩码、分层错误统计及少量状态使用对照，确认后续散度和稀疏反馈比较所依据的状态分布。</w:t>
       </w:r>
     </w:p>
     <w:p>
@@ -4334,7 +4334,7 @@
         <w:jc w:val="both"/>
       </w:pPr>
       <w:r>
-        <w:t xml:space="preserve">第二，哪些尾部信息值得保留？尾部类别表示剩余概率总量，显式决策 token 提供具体行为选择的修正。本文检验两种信息分别对梯度方向、训练稳定性和调用结果产生的作用，确定支持集构造所需的最小信息。</w:t>
+        <w:t xml:space="preserve">第二，散度目标引导学生学习什么。Forward KL 侧重教师认为合理的候选，Reverse KL 更关注学生当前赋予较高概率的区域；JSD 和 skew KL 提供不同的混合与平滑方式[7][8][9][12]。本文在相同学生前缀、完整词表反馈和训练预算下，比较这些目标对函数选择、过度调用、熵、梯度及训练稳定性的影响，分析不同概率权重如何转化为工具调用行为，并据此确定稀疏反馈研究的主要损失方向。散度比较承担机制分析，不能仅停留在公式计算。</w:t>
       </w:r>
     </w:p>
     <w:p>
@@ -4343,7 +4343,7 @@
         <w:jc w:val="both"/>
       </w:pPr>
       <w:r>
-        <w:t xml:space="preserve">第三，怎样在固定预算内形成改进？本文依据位置风险分配 K，在关键位置补入遗漏的学生高概率候选，在其他位置使用较小支持集；相同平均反馈量下与固定 K、质量阈值 K 和已有尾部类别方法比较。</w:t>
+        <w:t xml:space="preserve">第三，有限反馈能否保留所选目标中的有效信号。在固定状态与主要散度方向后，比较完整词表、常规 Top-K 和 sampled-token 监督，定位压缩造成的目标偏差与估计波动[30][31][32]。重点检查 Top-K 外的尾部总概率，以及学生高概率而教师 Top-K 未覆盖的工具调用决策 token：前者改变概率总量约束，后者可能改变具体函数选择[31][33]。如果这些遗漏在本任务中具有可观察的梯度或行为影响，便进入第 3.3 节的方法改进。</w:t>
       </w:r>
     </w:p>
     <w:p>
@@ -4358,7 +4358,7 @@
           <w:color w:val="000000"/>
           <w:sz w:val="24"/>
         </w:rPr>
-        <w:t xml:space="preserve">3.3 决策感知的尾部保真蒸馏方法</w:t>
+        <w:t xml:space="preserve">3.3 Top-K 稀疏反馈的缺陷与拟改进方法</w:t>
       </w:r>
       <w:bookmarkEnd w:id="19"/>
     </w:p>
@@ -4368,7 +4368,7 @@
         <w:jc w:val="both"/>
       </w:pPr>
       <w:r>
-        <w:t xml:space="preserve">候选方法包含三个明确操作。其一，学生生成单轮调用后，依据工具 schema 和消息边界标记函数入口、函数名、参数键与结构位置。以教师 Top-K 为初始支持集，在这些决策位置检查学生高概率的合法候选；对教师 Top-K 漏掉、且可能改变调用路径的 token，额外取得教师概率并补入支持集。该操作使学生高估的具体候选进入损失。</w:t>
+        <w:t xml:space="preserve">现有尾部类别方法能够保留支持集外的概率总量，却无法指出尾部中哪个 token 决定工具调用；只增大教师 Top-K 虽能覆盖更多候选，也会提高反馈量，且教师概率覆盖率不保证学生关键坐标得到修正[31][33]。针对这一缺口，本文拟构造决策感知的支持集：在学生生成的单轮调用中，依据工具 schema 和消息边界标记函数入口、函数名、参数键与结构位置；以教师 Top-K 为基础，检查学生高概率的合法决策候选，将漏选且可能改变调用路径的 token 补入，并取得教师对这些 token 的概率。</w:t>
       </w:r>
     </w:p>
     <w:p>
@@ -4377,7 +4377,7 @@
         <w:jc w:val="both"/>
       </w:pPr>
       <w:r>
-        <w:t xml:space="preserve">其二，把补入后支持集之外的师生概率分别合并为尾部类别，与显式保留的 token 共同计算分布损失。尾部类别沿用 TA-OPD 的既有构造[31]，负责约束剩余总量；决策 token 补入负责提供具体选择的修正梯度。两者处理不同的信息缺口，实验将分别移除以检验作用。补入所需的额外教师 logprob 及计算时间单独计量。</w:t>
+        <w:t xml:space="preserve">补入后的显式候选与一个尾部类别共同组成蒸馏目标。尾部类别沿用已有方法表示支持集外的师生概率总量[31]；补入的决策 token 则接受单独的概率约束，使损失能够区分“尾部总量不符”和“某个具体调用候选被高估”。两项处理分别设置消融，并与已有学生感知支持集思路比较[33]。若教师接口只能返回 Top-K，额外候选的概率获取能力须先确认；反馈字节数、查询量和教师计算时间分别记录。</w:t>
       </w:r>
     </w:p>
     <w:p>
@@ -4386,7 +4386,7 @@
         <w:jc w:val="both"/>
       </w:pPr>
       <w:r>
-        <w:t xml:space="preserve">其三，以训练集诊断子集中的尾部质量差、决策漏选率和完整词表梯度误差估计位置风险，在预设总反馈条目数内分配 K。高风险位置获得更多显式候选，其他位置选择较小 K；位置权重、质量阈值和上限只在训练集与验证集确定。三项操作合在一起构成待验证的联合方法。</w:t>
+        <w:t xml:space="preserve">在反馈预算固定时，本文进一步研究候选名额的分配。根据训练集诊断子集中的尾部质量差、关键 token 漏选率和完整词表梯度误差估计位置风险，在函数入口等高风险位置保留更多显式候选，在低风险位置缩小支持集。位置权重、K 的上限及阈值只由训练集和验证集确定。最终方法是“关键候选补入、尾部总量保留、位置预算分配”的待验证组合；三个组件均有相应的单独对照，方法贡献取决于同预算实验结果。</w:t>
       </w:r>
     </w:p>
     <w:p>
@@ -4411,7 +4411,7 @@
         <w:jc w:val="both"/>
       </w:pPr>
       <w:r>
-        <w:t xml:space="preserve">先建立单轮 Function Calling 的学生 rollout、冻结教师评分和完整词表参照。在固定前缀上对多个 K 测量尾部总量、关键 token 漏选和梯度误差；短程训练再观察这些差异是否对应函数误选、过度调用或格式错误。若尾部现象在本任务中不显著，方法范围将据实际结果收缩。</w:t>
+        <w:t xml:space="preserve">验证按三个研究切入点依次展开。先检查学生 rollout、教师同前缀评分、位置标注和结构化评测是否可靠；再固定轨迹与完整词表反馈，研究散度方向对梯度、熵和工具调用行为的影响。确定主要损失方向后，在同一批前缀上测量不同 K 的尾部总量、关键 token 漏选和相对完整词表的梯度误差。若遗漏在本任务中不显著，将依据观察结果收缩方法范围。</w:t>
       </w:r>
     </w:p>
     <w:p>
@@ -4420,7 +4420,7 @@
         <w:jc w:val="both"/>
       </w:pPr>
       <w:r>
-        <w:t xml:space="preserve">正式比较使用同一学生起点、教师、数据、生成协议和有效训练 token 预算。主要对照为常规 Top-K、TA-OPD、仅补入决策候选、仅按位置分配 K 与完整联合方法；各组匹配平均反馈条目数，并单独报告额外查询。Forward KL、JSD 和 K1 保留为机制与低反馈量参照，主要方法结论来自固定损失方向的同预算比较。</w:t>
+        <w:t xml:space="preserve">方法比较使用同一学生起点、教师、数据划分、生成协议、主要散度方向和有效训练 token 预算。常规 Top-K、已有尾部类别、仅补入决策候选、仅按位置分配 K 与完整联合方案构成主对照；各组匹配平均反馈条目数，并分别报告额外教师概率获取成本。完整词表提供信息参照，其他散度与 K1 sampled-token 作为机制和低反馈量边界分析。短程实验确认信号与行为的关联后，再决定正式训练规模。</w:t>
       </w:r>
     </w:p>
     <w:p>
@@ -4429,7 +4429,7 @@
         <w:jc w:val="both"/>
       </w:pPr>
       <w:r>
-        <w:t xml:space="preserve">研究产出包括工具调用位置上的尾部风险图谱、候选方法的组件消融、任务与训练指标，以及反馈字节数、教师查询、时间和显存记录。结果讨论会说明改进在何种位置、K 与预算下成立；若预算匹配后收益消失，也将据实解释原因。</w:t>
+        <w:t xml:space="preserve">研究预期形成三个相互支撑的结果：可复现的学生状态与工具调用错误分层，散度目标对概率权重和任务行为的机制分析，以及 Top-K 信息损失的诊断与同预算改进检验。除函数、参数和格式指标外，还报告损失、梯度、熵、反馈字节数、教师查询、时间和显存。方法是否优于现有稀疏反馈方案，须由实际实验判定。</w:t>
       </w:r>
     </w:p>
     <w:p>
@@ -4468,7 +4468,7 @@
         <w:jc w:val="both"/>
       </w:pPr>
       <w:r>
-        <w:t xml:space="preserve">图 1 概括研究主线：定位 Top-K 遗漏的尾部总量与关键决策 token，构造含显式决策候选和尾部类别的监督集合，再在固定预算下检验实际工具调用结果。尾部类别、采样修正和学生感知支持集均有先行研究[31][32][33][34]；本文检验面向工具调用决策的联合选择机制是否有独立价值。</w:t>
+        <w:t xml:space="preserve">图 1 展示研究问题的递进关系：先确定学生实际访问的状态，再分析散度目标如何改变更新方向，最后考察目标在 Top-K 稀疏反馈中保留了哪些信号。研究重点落在第三环节的具体缺陷及其改进，同时保持前两环节的独立分析与公平控制。尾部类别、采样修正和学生感知支持集已有先行工作[31][32][33][34]；本文将检验面向单轮工具调用的联合选择机制是否具有额外价值。</w:t>
       </w:r>
     </w:p>
     <w:p>
@@ -4575,7 +4575,7 @@
           <w:rFonts w:ascii="Times New Roman" w:hAnsi="Times New Roman" w:eastAsia="宋体"/>
           <w:sz w:val="21"/>
         </w:rPr>
-        <w:t xml:space="preserve">  决策感知的尾部保真蒸馏研究思路</w:t>
+        <w:t xml:space="preserve">  在线策略蒸馏的研究切入点与重点改进</w:t>
       </w:r>
       <w:r>
         <w:rPr>
@@ -4680,7 +4680,7 @@
         <w:jc w:val="both"/>
       </w:pPr>
       <w:r>
-        <w:t xml:space="preserve">总体路线围绕一个候选改进展开。学生在单轮 Function Calling 中生成轨迹，冻结教师在同一前缀评分；诊断环节测量 Top-K 外的尾部总量与被漏掉的决策 token；方法环节按位置风险分配 K、补入关键候选，并以尾部类别保留剩余总概率；最后更新 LoRA 学生并开展分层工具调用评测。图 2 展示从问题定位到方法验证的完整路径。</w:t>
+        <w:t xml:space="preserve">总体路线从在线策略蒸馏的三个环节展开。学生在单轮 Function Calling 中生成轨迹，冻结教师在相同前缀评分，形成可重复的状态与位置集合；完整词表散度比较用于分析概率权重、梯度与工具调用行为，并确定主要损失方向；在该目标下诊断 Top-K 的尾部总量和决策 token 漏选；最后按位置风险分配 K、补入关键候选、保留尾部总概率，更新 LoRA 学生并进行分层评测。图 2 对应这一路径。</w:t>
       </w:r>
     </w:p>
     <w:p>
@@ -5740,7 +5740,7 @@
         <w:jc w:val="both"/>
       </w:pPr>
       <w:r>
-        <w:t xml:space="preserve">统一目标用于定义共同的训练接口。完整词表 Reverse KL 提供信息参照，常规子集归一化 Top-K 展示截断误差，已有尾部类别方法提供直接方法基线[31]。候选方法进一步改变支持集：关键位置补入学生高概率而教师 Top-K 漏掉的合法决策 token，其余概率归入尾部类别，K 的位置分配受总反馈预算约束。离散 rollout 只提供状态，损失对学生 LoRA 参数反向传播。总体优化问题写为：</w:t>
+        <w:t xml:space="preserve">统一目标使状态选择、散度类型与反馈支持集可以分别定义和控制。先在完整词表上研究 Forward KL、Reverse KL、JSD 和 skew KL 的行为差异；完整词表 Reverse KL 作为当前拟定的信息参照，实际主要损失方向仍须结合前期诊断确定。常规子集归一化 Top-K 用于展示截断误差，已有尾部类别方法作为直接基线[31]。候选方法改变支持集：在关键位置补入学生高概率而教师 Top-K 漏掉的合法决策 token，其余概率归入尾部类别，位置 K 受总反馈预算约束。离散 rollout 提供训练状态，损失对学生 LoRA 参数反向传播。总体优化问题写为：</w:t>
       </w:r>
     </w:p>
     <w:tbl>
@@ -5990,7 +5990,7 @@
         <w:jc w:val="both"/>
       </w:pPr>
       <w:r>
-        <w:t xml:space="preserve">实验顺序与方法构造一致：先确认尾部遗漏在工具调用中是否出现，再识别总量补偿和决策候选补入各自的作用，最后检验固定预算下的联合方案。散度方向作为机制参照，K 的位置分配属于候选方法本身。完整训练配置与原始指标用于追溯行为变化。</w:t>
+        <w:t xml:space="preserve">实验顺序先核实在策略状态与位置标注，再解释完整词表散度的优化偏好，随后定位固定主要散度下的稀疏反馈缺陷，并通过同预算消融检验候选方法。散度分析与反馈支持集实验分别报告，避免把损失方向变化误认为 Top-K 改进的收益。完整训练配置与原始指标用于追溯行为变化。</w:t>
       </w:r>
     </w:p>
     <w:p>
@@ -8801,7 +8801,7 @@
           <w:color w:val="000000"/>
           <w:sz w:val="24"/>
         </w:rPr>
-        <w:t>4.4 散度基线与稀疏反馈目标的定义</w:t>
+        <w:t xml:space="preserve">4.4 散度目标分析与稀疏反馈定义</w:t>
       </w:r>
       <w:bookmarkEnd w:id="41"/>
     </w:p>
@@ -10264,7 +10264,7 @@
         <w:jc w:val="both"/>
       </w:pPr>
       <w:r>
-        <w:t xml:space="preserve">完整词表的 Forward KL、Reverse KL、JSD 和 skew KL 用于解释概率加权差异[7][8][9][12]。主要稀疏目标采用 Reverse KL；其他散度作为机制参照，在相同学生轨迹、温度、有效位置与支持集协议下比较梯度、熵和任务行为。</w:t>
+        <w:t xml:space="preserve">完整词表的 Forward KL、Reverse KL、JSD 和 skew KL 用于分析不同概率区域的学习权重[7][8][9][12]。在同一学生轨迹、温度和有效位置上，本文比较各目标的梯度方向、熵变化、函数误选与过度调用，再选定稀疏反馈实验的主要散度方向。后续 Top-K 对照固定该方向与支持集协议，保证观察到的差异来自教师反馈而非目标切换。</w:t>
       </w:r>
     </w:p>
     <w:p>
@@ -10273,7 +10273,7 @@
         <w:jc w:val="both"/>
       </w:pPr>
       <w:r>
-        <w:t xml:space="preserve">表 4-2 围绕候选方法设置四组实验：完整词表参照、稀疏监督诊断、同预算方法比较和组件消融。各组固定教师、学生起点、数据划分、生成协议和评价规则，训练比较统一有效 token 数与更新步数。</w:t>
+        <w:t xml:space="preserve">表 4-2 将实验组织为完整词表散度分析、稀疏反馈诊断、同预算方法比较和组件消融。各组固定教师、学生起点、数据划分、生成协议与评价规则；散度分析固定反馈粒度，方法比较固定主要散度方向，并统一有效训练 token 数与更新步数。</w:t>
       </w:r>
     </w:p>
     <w:p>
@@ -10374,6 +10374,7 @@
         <w:trPr>
           <w:tblHeader/>
           <w:jc w:val="center"/>
+          <w:cantSplit/>
         </w:trPr>
         <w:tc>
           <w:tcPr>
@@ -10484,6 +10485,7 @@
       <w:tr>
         <w:trPr>
           <w:jc w:val="center"/>
+          <w:cantSplit/>
         </w:trPr>
         <w:tc>
           <w:tcPr>
@@ -10502,7 +10504,7 @@
                 <w:b w:val="0"/>
                 <w:sz w:val="19"/>
               </w:rPr>
-              <w:t xml:space="preserve">完整词表参照</w:t>
+              <w:t xml:space="preserve">完整词表散度</w:t>
             </w:r>
           </w:p>
         </w:tc>
@@ -10523,7 +10525,7 @@
                 <w:b w:val="0"/>
                 <w:sz w:val="19"/>
               </w:rPr>
-              <w:t xml:space="preserve">模型、数据、前缀与预算</w:t>
+              <w:t xml:space="preserve">同轨迹、同反馈</w:t>
             </w:r>
           </w:p>
         </w:tc>
@@ -10544,7 +10546,7 @@
                 <w:b w:val="0"/>
                 <w:sz w:val="19"/>
               </w:rPr>
-              <w:t xml:space="preserve">Reverse KL 主目标；其他散度参照</w:t>
+              <w:t xml:space="preserve">FKL、RKL、JSD、skew KL</w:t>
             </w:r>
           </w:p>
         </w:tc>
@@ -10565,7 +10567,7 @@
                 <w:b w:val="0"/>
                 <w:sz w:val="19"/>
               </w:rPr>
-              <w:t xml:space="preserve">分布、梯度及任务指标</w:t>
+              <w:t xml:space="preserve">梯度、熵、调用结果</w:t>
             </w:r>
           </w:p>
         </w:tc>
@@ -10586,7 +10588,7 @@
                 <w:b w:val="0"/>
                 <w:sz w:val="19"/>
               </w:rPr>
-              <w:t xml:space="preserve">建立信息参照</w:t>
+              <w:t xml:space="preserve">确定主要目标</w:t>
             </w:r>
           </w:p>
         </w:tc>
@@ -10594,6 +10596,7 @@
       <w:tr>
         <w:trPr>
           <w:jc w:val="center"/>
+          <w:cantSplit/>
         </w:trPr>
         <w:tc>
           <w:tcPr>
@@ -10612,7 +10615,7 @@
                 <w:b w:val="0"/>
                 <w:sz w:val="19"/>
               </w:rPr>
-              <w:t xml:space="preserve">稀疏监督诊断</w:t>
+              <w:t xml:space="preserve">稀疏反馈诊断</w:t>
             </w:r>
           </w:p>
         </w:tc>
@@ -10633,7 +10636,7 @@
                 <w:b w:val="0"/>
                 <w:sz w:val="19"/>
               </w:rPr>
-              <w:t xml:space="preserve">前缀、教师、K 与损失方向</w:t>
+              <w:t xml:space="preserve">同轨迹、同损失</w:t>
             </w:r>
           </w:p>
         </w:tc>
@@ -10654,7 +10657,7 @@
                 <w:b w:val="0"/>
                 <w:sz w:val="19"/>
               </w:rPr>
-              <w:t xml:space="preserve">常规 Top-K、尾部类别、关键候选补入</w:t>
+              <w:t xml:space="preserve">全词表、Top-K、K1</w:t>
             </w:r>
           </w:p>
         </w:tc>
@@ -10675,7 +10678,7 @@
                 <w:b w:val="0"/>
                 <w:sz w:val="19"/>
               </w:rPr>
-              <w:t xml:space="preserve">尾部总量、决策坐标和梯度误差</w:t>
+              <w:t xml:space="preserve">尾部与梯度误差</w:t>
             </w:r>
           </w:p>
         </w:tc>
@@ -10696,7 +10699,7 @@
                 <w:b w:val="0"/>
                 <w:sz w:val="19"/>
               </w:rPr>
-              <w:t xml:space="preserve">定位两类信息缺失</w:t>
+              <w:t xml:space="preserve">定位遗漏</w:t>
             </w:r>
           </w:p>
         </w:tc>
@@ -10704,6 +10707,7 @@
       <w:tr>
         <w:trPr>
           <w:jc w:val="center"/>
+          <w:cantSplit/>
         </w:trPr>
         <w:tc>
           <w:tcPr>
@@ -10722,7 +10726,7 @@
                 <w:b w:val="0"/>
                 <w:sz w:val="19"/>
               </w:rPr>
-              <w:t xml:space="preserve">同预算方法比较</w:t>
+              <w:t xml:space="preserve">同预算方法</w:t>
             </w:r>
           </w:p>
         </w:tc>
@@ -10743,7 +10747,7 @@
                 <w:b w:val="0"/>
                 <w:sz w:val="19"/>
               </w:rPr>
-              <w:t xml:space="preserve">学生起点、教师、数据和反馈预算</w:t>
+              <w:t xml:space="preserve">同起点、同预算</w:t>
             </w:r>
           </w:p>
         </w:tc>
@@ -10764,7 +10768,7 @@
                 <w:b w:val="0"/>
                 <w:sz w:val="19"/>
               </w:rPr>
-              <w:t xml:space="preserve">固定 K、质量阈值 K、决策感知支持集</w:t>
+              <w:t xml:space="preserve">固定 K、尾部类别、决策支持集</w:t>
             </w:r>
           </w:p>
         </w:tc>
@@ -10785,7 +10789,7 @@
                 <w:b w:val="0"/>
                 <w:sz w:val="19"/>
               </w:rPr>
-              <w:t xml:space="preserve">调用结果、熵、额外查询及反馈量</w:t>
+              <w:t xml:space="preserve">调用结果与成本</w:t>
             </w:r>
           </w:p>
         </w:tc>
@@ -10806,7 +10810,7 @@
                 <w:b w:val="0"/>
                 <w:sz w:val="19"/>
               </w:rPr>
-              <w:t xml:space="preserve">检验候选改进</w:t>
+              <w:t xml:space="preserve">检验改进</w:t>
             </w:r>
           </w:p>
         </w:tc>
@@ -10814,6 +10818,7 @@
       <w:tr>
         <w:trPr>
           <w:jc w:val="center"/>
+          <w:cantSplit/>
         </w:trPr>
         <w:tc>
           <w:tcPr>
@@ -10832,7 +10837,7 @@
                 <w:b w:val="0"/>
                 <w:sz w:val="19"/>
               </w:rPr>
-              <w:t xml:space="preserve">组件消融与边界</w:t>
+              <w:t xml:space="preserve">组件消融</w:t>
             </w:r>
           </w:p>
         </w:tc>
@@ -10853,7 +10858,7 @@
                 <w:b w:val="0"/>
                 <w:sz w:val="19"/>
               </w:rPr>
-              <w:t xml:space="preserve">训练与评价协议</w:t>
+              <w:t xml:space="preserve">同训练协议</w:t>
             </w:r>
           </w:p>
         </w:tc>
@@ -10874,7 +10879,7 @@
                 <w:b w:val="0"/>
                 <w:sz w:val="19"/>
               </w:rPr>
-              <w:t xml:space="preserve">移除尾部类别、候选补入、位置分配；K1 参照</w:t>
+              <w:t xml:space="preserve">去尾部类、去补入、去分配</w:t>
             </w:r>
           </w:p>
         </w:tc>
@@ -10895,7 +10900,7 @@
                 <w:b w:val="0"/>
                 <w:sz w:val="19"/>
               </w:rPr>
-              <w:t xml:space="preserve">任务变化、估计波动、时间和显存</w:t>
+              <w:t xml:space="preserve">任务、时间、显存</w:t>
             </w:r>
           </w:p>
         </w:tc>
@@ -10916,7 +10921,7 @@
                 <w:b w:val="0"/>
                 <w:sz w:val="19"/>
               </w:rPr>
-              <w:t xml:space="preserve">归因并确定适用条件</w:t>
+              <w:t xml:space="preserve">判定各组件作用</w:t>
             </w:r>
           </w:p>
         </w:tc>
@@ -10928,7 +10933,7 @@
         <w:jc w:val="both"/>
       </w:pPr>
       <w:r>
-        <w:t xml:space="preserve">完整词表提供目标与梯度参照；稀疏诊断分别测量尾部总量和关键坐标；同预算比较检验决策感知支持集；组件消融辨别候选补入、尾部类别和位置预算各自的作用。K1 sampled-token 作为极低反馈量边界参照，单独报告估计波动。</w:t>
+        <w:t xml:space="preserve">完整词表散度实验解释优化偏好并确定主要目标；稀疏诊断分别测量尾部总量、决策坐标与梯度误差；同预算比较检验决策感知支持集；组件消融辨别关键候选补入、尾部类别和位置预算各自的作用。K1 sampled-token 作为极低反馈量边界参照，单独报告估计波动。</w:t>
       </w:r>
     </w:p>
     <w:p>
@@ -15559,7 +15564,7 @@
         <w:jc w:val="both"/>
       </w:pPr>
       <w:r>
-        <w:t>方案采用可获得的小规模同家族模型与开源工具链。冻结教师只参与前向评分，学生通过 LoRA 更新；PyTorch、Transformers、PEFT 和 vLLM[20]分别用于训练、适配与部署测量。正式实验前先以少量单轮样本检查 tokenizer、模板、状态标记、Top-K 累计质量、残余类别的概率归一化、目标数值、梯度传播和运行成本。只有这些基础检查通过，且尾部质量在实际样本中具有分析价值，才扩大训练规模；若现象不明显，则根据错误统计收缩方法范围并调整研究重点。</w:t>
+        <w:t xml:space="preserve">方案采用可获得的小规模同家族模型与开源工具链。冻结教师参与前向评分，学生通过 LoRA 更新；PyTorch、Transformers、PEFT 和 vLLM[20]分别支持训练、适配与部署测量。正式实验前以少量单轮样本检查 tokenizer、模板、状态标记、完整词表散度实现、Top-K 累计质量、尾部类别概率归一化、梯度传播和运行成本。若某一研究环节的现象不明显，就依据真实错误统计调整分析重点，不预写方法收益。</w:t>
       </w:r>
     </w:p>
     <w:p>
@@ -16408,7 +16413,7 @@
         <w:jc w:val="both"/>
       </w:pPr>
       <w:r>
-        <w:t xml:space="preserve">2. 量化常规 Top-K 的尾部总量损失、决策 token 漏选和梯度误差，完成与完整词表目标及已有尾部类别方法的受控对照。</w:t>
+        <w:t xml:space="preserve">2. 在统一学生轨迹与完整词表反馈下，分析代表性散度目标的梯度、熵和工具调用行为；随后量化 Top-K 的尾部总量损失、关键决策 token 漏选与梯度误差。</w:t>
       </w:r>
     </w:p>
     <w:p>
@@ -16457,7 +16462,7 @@
         <w:jc w:val="both"/>
       </w:pPr>
       <w:r>
-        <w:t>预期形成一套可复现的单轮工具调用 OPD 流程、一种待实验检验的尾部质量保留目标及其监督粒度选择策略，并提供完整的基线、消融、成本统计和失败案例。最终论文将以实际结果判断方法是否有效；即使未取得性能优势，也需明确其原因和适用条件。</w:t>
+        <w:t xml:space="preserve">预期形成可复现的单轮工具调用 OPD 流程、完整词表散度的行为分析，以及待实验检验的决策感知稀疏反馈方法，提供相应基线、消融、成本统计和失败案例。最终论文将依据实际结果判断方法的价值及适用边界。</w:t>
       </w:r>
     </w:p>
     <w:p>

</xml_diff>

<commit_message>
docs: align opening report with three-part research plan
</commit_message>
<xml_diff>
--- a/Papers/output/开题报告-基于在线策略蒸馏的大语言模型后训练方法研究.docx
+++ b/Papers/output/开题报告-基于在线策略蒸馏的大语言模型后训练方法研究.docx
@@ -1053,7 +1053,7 @@
         <w:fldChar w:fldCharType="separate"/>
       </w:r>
       <w:r>
-        <w:t>17</w:t>
+        <w:t>18</w:t>
       </w:r>
       <w:r>
         <w:fldChar w:fldCharType="end"/>
@@ -1097,7 +1097,7 @@
         <w:fldChar w:fldCharType="separate"/>
       </w:r>
       <w:r>
-        <w:t>20</w:t>
+        <w:t>21</w:t>
       </w:r>
       <w:r>
         <w:fldChar w:fldCharType="end"/>
@@ -1214,7 +1214,7 @@
         <w:rPr>
           <w:rFonts w:ascii="黑体" w:hAnsi="黑体" w:eastAsia="黑体" w:cs="黑体"/>
         </w:rPr>
-        <w:t xml:space="preserve">3.2 在线策略蒸馏的三个研究切入点</w:t>
+        <w:t>3.2 在线策略蒸馏的三个研究切入点</w:t>
       </w:r>
       <w:r>
         <w:tab/>
@@ -1258,7 +1258,7 @@
         <w:rPr>
           <w:rFonts w:ascii="黑体" w:hAnsi="黑体" w:eastAsia="黑体" w:cs="黑体"/>
         </w:rPr>
-        <w:t xml:space="preserve">3.3 Top-K 稀疏反馈的缺陷与拟改进方法</w:t>
+        <w:t>3.3 Top-K 稀疏反馈的缺陷与拟改进方法</w:t>
       </w:r>
       <w:r>
         <w:tab/>
@@ -1302,7 +1302,7 @@
         <w:rPr>
           <w:rFonts w:ascii="黑体" w:hAnsi="黑体" w:eastAsia="黑体" w:cs="黑体"/>
         </w:rPr>
-        <w:t xml:space="preserve">3.4 验证路径与预期研究产出</w:t>
+        <w:t>3.4 验证路径与预期研究产出</w:t>
       </w:r>
       <w:r>
         <w:tab/>
@@ -1349,13 +1349,6 @@
         <w:t>3.5 本章总结</w:t>
       </w:r>
       <w:r>
-        <w:rPr>
-          <w:rFonts w:hint="eastAsia" w:ascii="黑体" w:hAnsi="黑体" w:eastAsia="黑体" w:cs="黑体"/>
-          <w:lang w:val="en-US" w:eastAsia="zh-CN"/>
-        </w:rPr>
-        <w:t/>
-      </w:r>
-      <w:r>
         <w:tab/>
       </w:r>
       <w:r>
@@ -1632,7 +1625,7 @@
         <w:fldChar w:fldCharType="separate"/>
       </w:r>
       <w:r>
-        <w:t>37</w:t>
+        <w:t>38</w:t>
       </w:r>
       <w:r>
         <w:fldChar w:fldCharType="end"/>
@@ -1676,7 +1669,7 @@
         <w:fldChar w:fldCharType="separate"/>
       </w:r>
       <w:r>
-        <w:t>41</w:t>
+        <w:t>42</w:t>
       </w:r>
       <w:r>
         <w:fldChar w:fldCharType="end"/>
@@ -1720,7 +1713,7 @@
         <w:fldChar w:fldCharType="separate"/>
       </w:r>
       <w:r>
-        <w:t>41</w:t>
+        <w:t>43</w:t>
       </w:r>
       <w:r>
         <w:fldChar w:fldCharType="end"/>
@@ -1764,7 +1757,7 @@
         <w:fldChar w:fldCharType="separate"/>
       </w:r>
       <w:r>
-        <w:t>41</w:t>
+        <w:t>43</w:t>
       </w:r>
       <w:r>
         <w:fldChar w:fldCharType="end"/>
@@ -1808,7 +1801,7 @@
         <w:fldChar w:fldCharType="separate"/>
       </w:r>
       <w:r>
-        <w:t>43</w:t>
+        <w:t>45</w:t>
       </w:r>
       <w:r>
         <w:fldChar w:fldCharType="end"/>
@@ -1852,7 +1845,7 @@
         <w:fldChar w:fldCharType="separate"/>
       </w:r>
       <w:r>
-        <w:t>45</w:t>
+        <w:t>46</w:t>
       </w:r>
       <w:r>
         <w:fldChar w:fldCharType="end"/>
@@ -1896,7 +1889,7 @@
         <w:fldChar w:fldCharType="separate"/>
       </w:r>
       <w:r>
-        <w:t>45</w:t>
+        <w:t>46</w:t>
       </w:r>
       <w:r>
         <w:fldChar w:fldCharType="end"/>
@@ -1940,7 +1933,7 @@
         <w:fldChar w:fldCharType="separate"/>
       </w:r>
       <w:r>
-        <w:t>45</w:t>
+        <w:t>46</w:t>
       </w:r>
       <w:r>
         <w:fldChar w:fldCharType="end"/>
@@ -1984,7 +1977,7 @@
         <w:fldChar w:fldCharType="separate"/>
       </w:r>
       <w:r>
-        <w:t>45</w:t>
+        <w:t>47</w:t>
       </w:r>
       <w:r>
         <w:fldChar w:fldCharType="end"/>
@@ -2028,7 +2021,7 @@
         <w:fldChar w:fldCharType="separate"/>
       </w:r>
       <w:r>
-        <w:t>47</w:t>
+        <w:t>48</w:t>
       </w:r>
       <w:r>
         <w:fldChar w:fldCharType="end"/>
@@ -2072,7 +2065,7 @@
         <w:fldChar w:fldCharType="separate"/>
       </w:r>
       <w:r>
-        <w:t>49</w:t>
+        <w:t>50</w:t>
       </w:r>
       <w:r>
         <w:fldChar w:fldCharType="end"/>
@@ -2136,7 +2129,7 @@
         <w:jc w:val="both"/>
       </w:pPr>
       <w:r>
-        <w:t xml:space="preserve">本课题面向大语言模型的工具调用后训练，考察在线策略蒸馏的三个相互关联的环节：学生实际访问的生成状态、师生分布的匹配目标，以及有限教师反馈中保留的候选 token。前两者决定在何处学习、按何种偏好更新学生；第三者决定这些偏好能否在稀疏反馈中传递。本文先建立三方面的可比分析，再针对 Top-K 反馈可能遗漏的尾部信息研究改进方法。</w:t>
+        <w:t>本课题面向大语言模型的工具调用后训练，考察在线策略蒸馏的三个相互关联的环节：学生实际访问的生成状态、师生分布的匹配目标，以及有限教师反馈中保留的候选 token。前两者决定在何处学习、按何种偏好更新学生；第三者决定这些偏好能否在稀疏反馈中传递。本文先建立三方面的可比分析，再针对 Top-K 反馈可能遗漏的尾部信息研究改进方法。</w:t>
       </w:r>
     </w:p>
     <w:p>
@@ -2145,7 +2138,7 @@
         <w:jc w:val="both"/>
       </w:pPr>
       <w:r>
-        <w:t xml:space="preserve">研究计划采用 Qwen3-0.6B 作为 LoRA 学生、冻结的 Qwen3-4B 作为教师，从公开 Function Calling 数据筛选单轮样本。在学生生成的前缀上比较有效监督位置和完整词表散度的行为差异，随后固定状态与主损失，诊断 Top-K 截断及其尾部信息损失。候选方法在关键位置补入学生高概率的决策 token，并检验同预算下的任务表现与成本。模型版本、数据来源、划分和硬件条件在实验前统一记录。</w:t>
+        <w:t>研究计划采用 Qwen3-0.6B 作为 LoRA 学生、冻结的 Qwen3-4B 作为教师，从公开 Function Calling 数据筛选单轮样本。在学生生成的前缀上比较有效监督位置和完整词表散度的行为差异，随后固定状态与主损失，诊断 Top-K 截断及其尾部信息损失。候选方法在关键位置补入学生高概率的决策 token，并检验同预算下的任务表现与成本。模型版本、数据来源、划分和硬件条件在实验前统一记录。</w:t>
       </w:r>
     </w:p>
     <w:p>
@@ -2206,7 +2199,7 @@
         <w:jc w:val="both"/>
       </w:pPr>
       <w:r>
-        <w:t>数据准备阶段将依据公开数据的实际字段，统计单轮调用、多工具候选、并行调用、多轮工具结果和无适用工具等任务类型。训练集、验证集与测试集按工具 schema、问题模板和数据来源进行隔离，尽量减少相似样本造成的信息泄漏。</w:t>
+        <w:t>数据准备阶段将依据公开数据的实际字段，统计单轮调用、多工具候选、并行调用、多轮工具结果和无适用工具等任务类型。核心实验先限定可统一解析与评价的单轮调用；训练集、验证集与测试集按工具 schema、问题模板和数据来源隔离，减少相似样本造成的信息泄漏。这样才能在同一任务条件下追踪学生到访状态、散度目标和教师反馈粒度各自带来的变化。</w:t>
       </w:r>
     </w:p>
     <w:p>
@@ -2241,7 +2234,7 @@
         <w:jc w:val="both"/>
       </w:pPr>
       <w:r>
-        <w:t xml:space="preserve">1. 梳理在线策略蒸馏中学生状态、散度目标与监督粒度的研究进展，建立单轮工具调用的可复现训练与分层评价流程。</w:t>
+        <w:t>1. 梳理在线策略蒸馏中学生状态、散度目标与监督粒度的研究进展，建立单轮工具调用的可复现训练与分层评价流程。</w:t>
       </w:r>
     </w:p>
     <w:p>
@@ -2251,7 +2244,7 @@
         <w:jc w:val="both"/>
       </w:pPr>
       <w:r>
-        <w:t xml:space="preserve">2. 在统一学生轨迹上研究完整词表散度的行为偏好，并诊断 Top-K 截断对尾部总概率、关键决策 token 和梯度的影响。</w:t>
+        <w:t>2. 在统一学生轨迹上研究完整词表散度的行为偏好，并诊断 Top-K 截断对尾部总概率、关键决策 token 和梯度的影响。</w:t>
       </w:r>
     </w:p>
     <w:p>
@@ -2261,7 +2254,7 @@
         <w:jc w:val="both"/>
       </w:pPr>
       <w:r>
-        <w:t xml:space="preserve">3. 研究决策感知的稀疏反馈候选方法，以同预算对照和组件消融检验其任务效果、训练稳定性与额外资源成本。</w:t>
+        <w:t>3. 研究决策感知的稀疏反馈候选方法，以同预算对照和组件消融检验其任务效果、训练稳定性与额外资源成本。</w:t>
       </w:r>
     </w:p>
     <w:p>
@@ -2270,7 +2263,7 @@
         <w:jc w:val="both"/>
       </w:pPr>
       <w:r>
-        <w:t xml:space="preserve">本课题从在线策略蒸馏的状态、目标和反馈三个环节逐步收束研究范围：状态分析保证教师监督落在学生会访问的前缀，散度分析说明不同分布匹配目标引导何种行为，稀疏反馈分析揭示目标在有限预算下可能发生的失真。由此提出的 Top-K 改进须与完整词表、固定 Top-K 及已有尾部修正方法比较；其实际价值由工具调用结果和资源记录共同判断。</w:t>
+        <w:t>本课题从在线策略蒸馏的状态、目标和反馈三个环节逐步收束研究范围：状态分析保证教师监督落在学生会访问的前缀，散度分析说明不同分布匹配目标引导何种行为，稀疏反馈分析揭示目标在有限预算下可能发生的失真。由此提出的 Top-K 改进须与完整词表、固定 Top-K 及已有尾部修正方法比较；其实际价值由工具调用结果和资源记录共同判断。</w:t>
       </w:r>
     </w:p>
     <w:p>
@@ -2752,7 +2745,7 @@
         <w:jc w:val="both"/>
       </w:pPr>
       <w:r>
-        <w:t>实际系统既可以先进行 SFT、再实施 OPD，也可以同时引入教师反馈与任务奖励。本文聚焦 LoRA-OPD 路线，主要研究学生策略采样、教师分布反馈、散度方向和监督信息粒度；RLHF、DPO 等方法仅用于说明相关背景。</w:t>
+        <w:t>实际系统既可以先进行 SFT、再实施 OPD，也可以同时引入教师反馈与任务奖励。本文聚焦 LoRA-OPD 路线，将学生策略采样对应的到访状态、教师与学生的分布匹配目标、有限教师反馈的监督粒度作为三个研究变量；RLHF、DPO 等方法用于说明后训练背景。</w:t>
       </w:r>
     </w:p>
     <w:p>
@@ -2832,7 +2825,7 @@
         <w:jc w:val="both"/>
       </w:pPr>
       <w:r>
-        <w:t>为形成可比较的实验框架，本文从三个层面描述 OPD：训练状态是否由学生生成，教师是否在学生前缀上评分，以及蒸馏目标如何把采样结果转化为训练信号。GKD 的 token 级比较、MiniLLM 的序列级目标和 DistiLLM 的样本复用机制在这些层面上各有侧重，因此实验记录将分别说明散度定义及其估计方式。</w:t>
+        <w:t>为形成可比较的实验框架，本文从三个层面描述 OPD：学生生成哪些训练状态，教师分布通过何种散度转化为梯度，以及教师在每个状态返回多少词表信息。GKD 的散度比较、MiniLLM 的序列级目标和 DistiLLM 的反馈复用在这些层面各有侧重。后续实验将分别记录状态来源、目标定义与反馈支持集，避免把三个环节的作用混为一谈。</w:t>
       </w:r>
     </w:p>
     <w:p>
@@ -4014,7 +4007,7 @@
         <w:jc w:val="both"/>
       </w:pPr>
       <w:r>
-        <w:t>本文选取 JSD、skew KL 等代表性目标，比较它们在教师分布覆盖、学生高概率区域和训练稳定性方面的差异。实验配置将完整记录目标函数、混合参数、支持集以及 K1 估计方式。</w:t>
+        <w:t>本文选取 JSD、skew KL 等代表性目标，与 Forward KL、Reverse KL 一起在完整词表上比较。分析不仅记录最终准确率，还跟踪不同目标在函数入口、参数与结构 token 上产生的梯度、熵变化和错误类型；目标函数、混合参数、温度、有效位置及估计方式均保持可追溯。</w:t>
       </w:r>
     </w:p>
     <w:p>
@@ -4085,7 +4078,7 @@
         <w:jc w:val="both"/>
       </w:pPr>
       <w:r>
-        <w:t xml:space="preserve">在线策略蒸馏把教师监督带到学生真实访问的前缀上[7]，却也使教师需要在大量生成位置返回分布。完整词表反馈保留全部候选的相对关系，存储和传输开销随词表及序列长度增长。Top-K 只保留少量高概率候选，K1 sampled-token 则以单样本估计进一步压缩反馈。前缀蒸馏和蒸馏设计空间研究表明，反馈预算已经成为在线方法能否实施的重要约束[11][15]。</w:t>
+        <w:t>在线策略蒸馏把教师监督带到学生真实访问的前缀上[7]，却也使教师需要在大量生成位置返回分布。完整词表反馈保留全部候选的相对关系，存储和传输开销随词表及序列长度增长。Top-K 只保留少量高概率候选，K1 sampled-token 则以单样本估计进一步压缩反馈。前缀蒸馏和蒸馏设计空间研究表明，反馈预算已经成为在线方法能否实施的重要约束[11][15]。</w:t>
       </w:r>
     </w:p>
     <w:p>
@@ -4094,7 +4087,7 @@
         <w:jc w:val="both"/>
       </w:pPr>
       <w:r>
-        <w:t xml:space="preserve">稀疏反馈改变了训练目标。Sparse Logit Sampling 指出，直接缓存教师 Top-K 会产生有偏的分布估计[30]。TA-OPD 进一步发现，当师生都在教师 Top-K 内归一化时，目标忽略支持集外的总概率，学生尾部概率与熵可能在训练中上升；该工作用一个尾部类别保留剩余概率总量[31]。TT-OPD 与 ResOPD 则利用采样残差修正稀疏估计[32][34]。尾部总量的补偿已有明确先行工作。</w:t>
+        <w:t>稀疏反馈改变了训练目标。Sparse Logit Sampling 指出，直接缓存教师 Top-K 会产生有偏的分布估计[30]。TA-OPD 进一步发现，当师生都在教师 Top-K 内归一化时，目标忽略支持集外的总概率，学生尾部概率与熵可能在训练中上升；该工作用一个尾部类别保留剩余概率总量[31]。TT-OPD 与 ResOPD 则利用采样残差修正稀疏估计[32][34]。尾部总量的补偿已有明确先行工作。</w:t>
       </w:r>
     </w:p>
     <w:p>
@@ -4108,7 +4101,7 @@
           <w:rFonts w:ascii="Times New Roman" w:hAnsi="Times New Roman" w:eastAsia="宋体"/>
           <w:sz w:val="24"/>
         </w:rPr>
-        <w:t xml:space="preserve">另一类信息损失与总概率大小无关。Shen 等在多教师工具调用蒸馏中发现，即使教师 Top-K 覆盖几乎全部教师概率，也可能漏掉学生高估的工具调用入口 token；该坐标的修正会改变完整调用行为[33]。质量覆盖率因此无法单独衡量决策梯度是否完整。尾部类别可以约束“其余 token 合计多少概率”，但无法区分尾部中哪一个函数入口或结构 token 应被单独修正。</w:t>
+        <w:t>另一类信息损失与总概率大小无关。Shen 等在多教师工具调用蒸馏中发现，即使教师 Top-K 覆盖几乎全部教师概率，也可能漏掉学生高估的工具调用入口 token；该坐标的修正会改变完整调用行为[33]。质量覆盖率因此无法单独衡量决策梯度是否完整。尾部类别可以约束“其余 token 合计多少概率”，但无法区分尾部中哪一个函数入口或结构 token 应被单独修正。</w:t>
       </w:r>
     </w:p>
     <w:p>
@@ -4122,7 +4115,7 @@
           <w:rFonts w:ascii="Times New Roman" w:hAnsi="Times New Roman" w:eastAsia="宋体"/>
           <w:sz w:val="24"/>
         </w:rPr>
-        <w:t xml:space="preserve">现有工作分别处理了尾部总量、估计偏差和遗漏的学生候选[31][32][33][34]。对单教师、单轮 Function Calling 而言，关键问题进一步落在资源分配上：哪些生成位置需要显式保留低教师概率、高学生概率的决策 token，哪些位置可使用较小的支持集？全局增大 K 会提高反馈成本，仅按教师累计概率选 K 仍可能漏掉学生偏好的关键坐标。本文因此把位置风险、候选保留和反馈预算放入同一个方法设计。</w:t>
+        <w:t>现有工作分别处理了尾部总量、估计偏差和遗漏的学生候选[31][32][33][34]。对单教师、单轮 Function Calling 而言，关键问题进一步落在资源分配上：哪些生成位置需要显式保留低教师概率、高学生概率的决策 token，哪些位置可使用较小的支持集？全局增大 K 会提高反馈成本，仅按教师累计概率选 K 仍可能漏掉学生偏好的关键坐标。本文因此把位置风险、候选保留和反馈预算放入同一个方法设计。</w:t>
       </w:r>
     </w:p>
     <w:p>
@@ -4225,7 +4218,7 @@
           <w:rFonts w:ascii="Times New Roman" w:hAnsi="Times New Roman" w:eastAsia="宋体"/>
           <w:sz w:val="24"/>
         </w:rPr>
-        <w:t xml:space="preserve">Function Calling 提供了检验稀疏反馈价值的可观察结果。函数入口和函数名决定是否调用工具及调用哪一个工具，参数键、结构符号和参数值分别影响 schema 合法性、解析与执行。公开数据和 BFCL 等评测允许把这些错误分开统计[25][26][27]。本文将词表层面的尾部质量与梯度误差，最终对应到函数误选、过度调用、格式错误和端到端成功率，建立从概率压缩到实际行为的证据链。</w:t>
+        <w:t>Function Calling 提供了检验三个研究环节的可观察结果。函数入口和函数名决定是否调用工具及调用哪一个工具，参数键、结构符号和参数值影响 schema 合法性、解析与执行。公开数据和 BFCL 等评测允许把这些错误分开统计[25][26][27]。本文将学生状态的分层错误、完整词表散度的行为差异，以及稀疏反馈下的尾部质量与决策坐标遗漏，分别对应到函数误选、过度调用、格式错误和任务成功率。</w:t>
       </w:r>
     </w:p>
     <w:p>
@@ -4250,7 +4243,7 @@
         <w:jc w:val="both"/>
       </w:pPr>
       <w:r>
-        <w:t xml:space="preserve">现有研究为在线策略蒸馏提供了三个主要切入点。首先，GKD 等方法让教师在学生实际生成的前缀上评分，缓解训练与推理状态不一致的问题[7]。其次，Forward KL、Reverse KL、JSD 与 skew KL 对概率区域赋予不同权重，影响学生的覆盖、集中程度与训练稳定性[7][8][9][12]。再次，完整词表反馈较为充分，却需要较高的存储和传输成本；Top-K 与 sampled-token 方法以较少的教师信息换取可实施性[11][15][30]。状态、目标和反馈共同决定蒸馏效果，比较其中任何一项都需要固定另外两项。</w:t>
+        <w:t>现有研究为在线策略蒸馏提供了三个主要切入点。首先，GKD 等方法让教师在学生实际生成的前缀上评分，缓解训练与推理状态不一致的问题[7]。其次，Forward KL、Reverse KL、JSD 与 skew KL 对概率区域赋予不同权重，影响学生的覆盖、集中程度与训练稳定性[7][8][9][12]。再次，完整词表反馈较为充分，却需要较高的存储和传输成本；Top-K 与 sampled-token 方法以较少的教师信息换取可实施性[11][15][30]。状态、目标和反馈共同决定蒸馏效果，比较其中任何一项都需要固定另外两项。</w:t>
       </w:r>
     </w:p>
     <w:p>
@@ -4259,7 +4252,7 @@
         <w:jc w:val="both"/>
       </w:pPr>
       <w:r>
-        <w:t xml:space="preserve">上述切入点中，稀疏反馈留下了值得进一步研究的具体缺陷。教师 Top-K 内重新归一化会忽略支持集外的总概率，已有尾部类别方法对此作了补偿[31]；只看教师累计概率仍可能漏掉学生高估的工具调用决策 token，已有多教师研究揭示了这种风险[33]。采样修正也已用于缓解稀疏估计偏差[32][34]。这些结果尚不能直接推出单教师、单轮 Function Calling 中的最佳做法。本文在明确学生状态和散度目标的基础上，测量尾部总量与具体决策候选的遗漏，再研究固定反馈预算下的联合选择机制。</w:t>
+        <w:t>上述切入点中，稀疏反馈留下了值得进一步研究的具体缺陷。教师 Top-K 内重新归一化会忽略支持集外的总概率，已有尾部类别方法对此作了补偿[31]；只看教师累计概率仍可能漏掉学生高估的工具调用决策 token，已有多教师研究揭示了这种风险[33]。采样修正也已用于缓解稀疏估计偏差[32][34]。这些结果尚不能直接推出单教师、单轮 Function Calling 中的最佳做法。本文在明确学生状态和散度目标的基础上，测量尾部总量与具体决策候选的遗漏，再研究固定反馈预算下的联合选择机制。</w:t>
       </w:r>
     </w:p>
     <w:p>
@@ -4290,7 +4283,7 @@
           <w:color w:val="000000"/>
           <w:sz w:val="24"/>
         </w:rPr>
-        <w:t xml:space="preserve">3.1 研究思路与问题展开</w:t>
+        <w:t>3.1 研究思路与问题展开</w:t>
       </w:r>
       <w:bookmarkEnd w:id="17"/>
     </w:p>
@@ -4300,7 +4293,7 @@
         <w:jc w:val="both"/>
       </w:pPr>
       <w:r>
-        <w:t xml:space="preserve">本文沿着“学生在哪里学习、分布目标如何引导学习、有限反馈保留什么信号”展开研究。首先建立单轮 Function Calling 的学生生成轨迹和教师同前缀评分，明确有效监督位置及错误类型；随后在相同轨迹上分析散度目标的概率权重与工具调用行为；最后固定主要训练目标，检验稀疏反馈是否遗漏有效信号，并针对 Top-K 的具体缺陷提出候选改进。前三项研究由一般 OPD 问题逐步进入可实施的方法设计。</w:t>
+        <w:t>本文沿着“学生在哪里学习、分布目标如何引导学习、有限反馈保留什么信号”展开研究。首先建立单轮 Function Calling 的学生生成轨迹和教师同前缀评分，明确有效监督位置及错误类型；随后在相同轨迹上分析散度目标的概率权重与工具调用行为；最后固定主要训练目标，检验稀疏反馈是否遗漏有效信号，并针对 Top-K 的具体缺陷提出候选改进。前三项研究由一般 OPD 问题逐步进入可实施的方法设计。</w:t>
       </w:r>
     </w:p>
     <w:p>
@@ -4315,7 +4308,7 @@
           <w:color w:val="000000"/>
           <w:sz w:val="24"/>
         </w:rPr>
-        <w:t xml:space="preserve">3.2 在线策略蒸馏的三个研究切入点</w:t>
+        <w:t>3.2 在线策略蒸馏的三个研究切入点</w:t>
       </w:r>
       <w:bookmarkEnd w:id="18"/>
     </w:p>
@@ -4325,7 +4318,7 @@
         <w:jc w:val="both"/>
       </w:pPr>
       <w:r>
-        <w:t xml:space="preserve">第一，学生状态上的监督是否有效。学生自主生成时会访问教师示例未覆盖的前缀；在这些位置评分是 OPD 相对离线蒸馏的重要变化[7]。本文建立单轮工具调用轨迹与冻结教师评分流程，按函数入口、函数名、参数键、参数值和结构边界标注可可靠识别的位置。通过统一位置掩码、分层错误统计及少量状态使用对照，确认后续散度和稀疏反馈比较所依据的状态分布。</w:t>
+        <w:t>第一，学生状态上的监督是否有效。学生自主生成时会访问教师示例未覆盖的前缀；在这些位置评分是 OPD 相对离线蒸馏的重要变化[7]。本文建立单轮工具调用轨迹与冻结教师评分流程，按函数入口、函数名、参数键、参数值和结构边界标注可可靠识别的位置。通过统一位置掩码、分层错误统计及少量状态使用对照，确认后续散度和稀疏反馈比较所依据的状态分布。</w:t>
       </w:r>
     </w:p>
     <w:p>
@@ -4334,7 +4327,7 @@
         <w:jc w:val="both"/>
       </w:pPr>
       <w:r>
-        <w:t xml:space="preserve">第二，散度目标引导学生学习什么。Forward KL 侧重教师认为合理的候选，Reverse KL 更关注学生当前赋予较高概率的区域；JSD 和 skew KL 提供不同的混合与平滑方式[7][8][9][12]。本文在相同学生前缀、完整词表反馈和训练预算下，比较这些目标对函数选择、过度调用、熵、梯度及训练稳定性的影响，分析不同概率权重如何转化为工具调用行为，并据此确定稀疏反馈研究的主要损失方向。散度比较承担机制分析，不能仅停留在公式计算。</w:t>
+        <w:t>第二，散度目标引导学生学习什么。Forward KL 侧重教师认为合理的候选，Reverse KL 更关注学生当前赋予较高概率的区域；JSD 和 skew KL 提供不同的混合与平滑方式[7][8][9][12]。本文在相同学生前缀、完整词表反馈和训练预算下，比较这些目标对函数选择、过度调用、熵、梯度及训练稳定性的影响，分析不同概率权重如何转化为工具调用行为，并据此确定稀疏反馈研究的主要损失方向。</w:t>
       </w:r>
     </w:p>
     <w:p>
@@ -4343,7 +4336,7 @@
         <w:jc w:val="both"/>
       </w:pPr>
       <w:r>
-        <w:t xml:space="preserve">第三，有限反馈能否保留所选目标中的有效信号。在固定状态与主要散度方向后，比较完整词表、常规 Top-K 和 sampled-token 监督，定位压缩造成的目标偏差与估计波动[30][31][32]。重点检查 Top-K 外的尾部总概率，以及学生高概率而教师 Top-K 未覆盖的工具调用决策 token：前者改变概率总量约束，后者可能改变具体函数选择[31][33]。如果这些遗漏在本任务中具有可观察的梯度或行为影响，便进入第 3.3 节的方法改进。</w:t>
+        <w:t>第三，有限反馈能否保留所选目标中的有效信号。在固定状态与主要散度方向后，比较完整词表、常规 Top-K 和 sampled-token 监督，定位压缩造成的目标偏差与估计波动[30][31][32]。重点检查 Top-K 外的尾部总概率，以及学生高概率而教师 Top-K 未覆盖的工具调用决策 token：前者改变概率总量约束，后者可能改变具体函数选择[31][33]。如果这些遗漏在本任务中具有可观察的梯度或行为影响，便进入第 3.3 节的方法改进。</w:t>
       </w:r>
     </w:p>
     <w:p>
@@ -4358,7 +4351,7 @@
           <w:color w:val="000000"/>
           <w:sz w:val="24"/>
         </w:rPr>
-        <w:t xml:space="preserve">3.3 Top-K 稀疏反馈的缺陷与拟改进方法</w:t>
+        <w:t>3.3 Top-K 稀疏反馈的缺陷与拟改进方法</w:t>
       </w:r>
       <w:bookmarkEnd w:id="19"/>
     </w:p>
@@ -4368,7 +4361,7 @@
         <w:jc w:val="both"/>
       </w:pPr>
       <w:r>
-        <w:t xml:space="preserve">现有尾部类别方法能够保留支持集外的概率总量，却无法指出尾部中哪个 token 决定工具调用；只增大教师 Top-K 虽能覆盖更多候选，也会提高反馈量，且教师概率覆盖率不保证学生关键坐标得到修正[31][33]。针对这一缺口，本文拟构造决策感知的支持集：在学生生成的单轮调用中，依据工具 schema 和消息边界标记函数入口、函数名、参数键与结构位置；以教师 Top-K 为基础，检查学生高概率的合法决策候选，将漏选且可能改变调用路径的 token 补入，并取得教师对这些 token 的概率。</w:t>
+        <w:t>现有尾部类别方法能够保留支持集外的概率总量，却无法指出尾部中哪个 token 决定工具调用；只增大教师 Top-K 虽能覆盖更多候选，也会提高反馈量，且教师概率覆盖率不保证学生关键坐标得到修正[31][33]。针对这一缺口，本文拟构造决策感知的支持集：在学生生成的单轮调用中，依据工具 schema 和消息边界标记函数入口、函数名、参数键与结构位置；以教师 Top-K 为基础，检查学生高概率的合法决策候选，将漏选且可能改变调用路径的 token 补入，并取得教师对这些 token 的概率。</w:t>
       </w:r>
     </w:p>
     <w:p>
@@ -4377,7 +4370,7 @@
         <w:jc w:val="both"/>
       </w:pPr>
       <w:r>
-        <w:t xml:space="preserve">补入后的显式候选与一个尾部类别共同组成蒸馏目标。尾部类别沿用已有方法表示支持集外的师生概率总量[31]；补入的决策 token 则接受单独的概率约束，使损失能够区分“尾部总量不符”和“某个具体调用候选被高估”。两项处理分别设置消融，并与已有学生感知支持集思路比较[33]。若教师接口只能返回 Top-K，额外候选的概率获取能力须先确认；反馈字节数、查询量和教师计算时间分别记录。</w:t>
+        <w:t>补入后的显式候选与一个尾部类别共同组成蒸馏目标。尾部类别沿用已有方法表示支持集外的师生概率总量[31]；补入的决策 token 则接受单独的概率约束，使损失能够区分“尾部总量不符”和“某个具体调用候选被高估”。两项处理分别设置消融，并与已有学生感知支持集思路比较[33]。若教师接口只能返回 Top-K，额外候选的概率获取能力须先确认；反馈字节数、查询量和教师计算时间分别记录。</w:t>
       </w:r>
     </w:p>
     <w:p>
@@ -4386,7 +4379,7 @@
         <w:jc w:val="both"/>
       </w:pPr>
       <w:r>
-        <w:t xml:space="preserve">在反馈预算固定时，本文进一步研究候选名额的分配。根据训练集诊断子集中的尾部质量差、关键 token 漏选率和完整词表梯度误差估计位置风险，在函数入口等高风险位置保留更多显式候选，在低风险位置缩小支持集。位置权重、K 的上限及阈值只由训练集和验证集确定。最终方法是“关键候选补入、尾部总量保留、位置预算分配”的待验证组合；三个组件均有相应的单独对照，方法贡献取决于同预算实验结果。</w:t>
+        <w:t>在反馈预算固定时，本文进一步研究候选名额的分配。根据训练集诊断子集中的尾部质量差、关键 token 漏选率和完整词表梯度误差估计位置风险，在函数入口等高风险位置保留更多显式候选，在低风险位置缩小支持集。位置权重、K 的上限及阈值只由训练集和验证集确定。最终方法是“关键候选补入、尾部总量保留、位置预算分配”的待验证组合；三个组件均有相应的单独对照，方法贡献取决于同预算实验结果。</w:t>
       </w:r>
     </w:p>
     <w:p>
@@ -4401,7 +4394,7 @@
           <w:color w:val="000000"/>
           <w:sz w:val="24"/>
         </w:rPr>
-        <w:t xml:space="preserve">3.4 验证路径与预期研究产出</w:t>
+        <w:t>3.4 验证路径与预期研究产出</w:t>
       </w:r>
       <w:bookmarkEnd w:id="20"/>
     </w:p>
@@ -4411,7 +4404,7 @@
         <w:jc w:val="both"/>
       </w:pPr>
       <w:r>
-        <w:t xml:space="preserve">验证按三个研究切入点依次展开。先检查学生 rollout、教师同前缀评分、位置标注和结构化评测是否可靠；再固定轨迹与完整词表反馈，研究散度方向对梯度、熵和工具调用行为的影响。确定主要损失方向后，在同一批前缀上测量不同 K 的尾部总量、关键 token 漏选和相对完整词表的梯度误差。若遗漏在本任务中不显著，将依据观察结果收缩方法范围。</w:t>
+        <w:t>验证按三个研究切入点依次展开。先检查学生 rollout、教师同前缀评分、位置标注和结构化评测是否可靠；再固定轨迹与完整词表反馈，研究散度方向对梯度、熵和工具调用行为的影响。确定主要损失方向后，在同一批前缀上测量不同 K 的尾部总量、关键 token 漏选和相对完整词表的梯度误差。若遗漏在本任务中不显著，将依据观察结果收缩方法范围。</w:t>
       </w:r>
     </w:p>
     <w:p>
@@ -4420,7 +4413,7 @@
         <w:jc w:val="both"/>
       </w:pPr>
       <w:r>
-        <w:t xml:space="preserve">方法比较使用同一学生起点、教师、数据划分、生成协议、主要散度方向和有效训练 token 预算。常规 Top-K、已有尾部类别、仅补入决策候选、仅按位置分配 K 与完整联合方案构成主对照；各组匹配平均反馈条目数，并分别报告额外教师概率获取成本。完整词表提供信息参照，其他散度与 K1 sampled-token 作为机制和低反馈量边界分析。短程实验确认信号与行为的关联后，再决定正式训练规模。</w:t>
+        <w:t>方法比较使用同一学生起点、教师、数据划分、生成协议、主要散度方向和有效训练 token 预算。常规 Top-K、已有尾部类别、仅补入决策候选、仅按位置分配 K 与完整联合方案构成主对照；各组匹配平均反馈条目数，并分别报告额外教师概率获取成本。完整词表提供信息参照，其他散度与 K1 sampled-token 作为机制和低反馈量边界分析。短程实验确认信号与行为的关联后，再决定正式训练规模。</w:t>
       </w:r>
     </w:p>
     <w:p>
@@ -4429,7 +4422,7 @@
         <w:jc w:val="both"/>
       </w:pPr>
       <w:r>
-        <w:t xml:space="preserve">研究预期形成三个相互支撑的结果：可复现的学生状态与工具调用错误分层，散度目标对概率权重和任务行为的机制分析，以及 Top-K 信息损失的诊断与同预算改进检验。除函数、参数和格式指标外，还报告损失、梯度、熵、反馈字节数、教师查询、时间和显存。方法是否优于现有稀疏反馈方案，须由实际实验判定。</w:t>
+        <w:t>研究预期形成三个相互支撑的结果：可复现的学生状态与工具调用错误分层，散度目标对概率权重和任务行为的机制分析，以及 Top-K 信息损失的诊断与同预算改进检验。除函数、参数和格式指标外，还报告损失、梯度、熵、反馈字节数、教师查询、时间和显存。方法是否优于现有稀疏反馈方案，须由实际实验判定。</w:t>
       </w:r>
     </w:p>
     <w:p>
@@ -4468,7 +4461,7 @@
         <w:jc w:val="both"/>
       </w:pPr>
       <w:r>
-        <w:t xml:space="preserve">图 1 展示研究问题的递进关系：先确定学生实际访问的状态，再分析散度目标如何改变更新方向，最后考察目标在 Top-K 稀疏反馈中保留了哪些信号。研究重点落在第三环节的具体缺陷及其改进，同时保持前两环节的独立分析与公平控制。尾部类别、采样修正和学生感知支持集已有先行工作[31][32][33][34]；本文将检验面向单轮工具调用的联合选择机制是否具有额外价值。</w:t>
+        <w:t>图 1 展示研究问题的递进关系：先确定学生实际访问的状态，再分析散度目标如何改变更新方向，最后考察目标在 Top-K 稀疏反馈中保留了哪些信号。研究重点落在第三环节的具体缺陷及其改进，同时保持前两环节的独立分析与公平控制。尾部类别、采样修正和学生感知支持集已有先行工作[31][32][33][34]；本文将检验面向单轮工具调用的联合选择机制是否具有额外价值。</w:t>
       </w:r>
     </w:p>
     <w:p>
@@ -4577,14 +4570,6 @@
         </w:rPr>
         <w:t xml:space="preserve">  在线策略蒸馏的研究切入点与重点改进</w:t>
       </w:r>
-      <w:r>
-        <w:rPr>
-          <w:rFonts w:hint="eastAsia"/>
-          <w:sz w:val="21"/>
-          <w:lang w:val="en-US" w:eastAsia="zh-CN"/>
-        </w:rPr>
-        <w:t/>
-      </w:r>
     </w:p>
     <w:p>
       <w:pPr>
@@ -4680,7 +4665,7 @@
         <w:jc w:val="both"/>
       </w:pPr>
       <w:r>
-        <w:t xml:space="preserve">总体路线从在线策略蒸馏的三个环节展开。学生在单轮 Function Calling 中生成轨迹，冻结教师在相同前缀评分，形成可重复的状态与位置集合；完整词表散度比较用于分析概率权重、梯度与工具调用行为，并确定主要损失方向；在该目标下诊断 Top-K 的尾部总量和决策 token 漏选；最后按位置风险分配 K、补入关键候选、保留尾部总概率，更新 LoRA 学生并进行分层评测。图 2 对应这一路径。</w:t>
+        <w:t>总体路线从在线策略蒸馏的三个环节展开。学生在单轮 Function Calling 中生成轨迹，冻结教师在相同前缀评分，形成可重复的状态与位置集合；完整词表散度比较用于分析概率权重、梯度与工具调用行为，并确定主要损失方向；在该目标下诊断 Top-K 的尾部总量和决策 token 漏选；最后按位置风险分配 K、补入关键候选、保留尾部总概率，更新 LoRA 学生并进行分层评测。图 2 对应这一路径。</w:t>
       </w:r>
     </w:p>
     <w:p>
@@ -5740,7 +5725,18 @@
         <w:jc w:val="both"/>
       </w:pPr>
       <w:r>
-        <w:t xml:space="preserve">统一目标使状态选择、散度类型与反馈支持集可以分别定义和控制。先在完整词表上研究 Forward KL、Reverse KL、JSD 和 skew KL 的行为差异；完整词表 Reverse KL 作为当前拟定的信息参照，实际主要损失方向仍须结合前期诊断确定。常规子集归一化 Top-K 用于展示截断误差，已有尾部类别方法作为直接基线[31]。候选方法改变支持集：在关键位置补入学生高概率而教师 Top-K 漏掉的合法决策 token，其余概率归入尾部类别，位置 K 受总反馈预算约束。离散 rollout 提供训练状态，损失对学生 LoRA 参数反向传播。总体优化问题写为：</w:t>
+        <w:t>统一目标使状态选择、散度类型与反馈支持集可以分别定义和控制。先在完整词表上研究 Forward KL、Reverse KL、JSD 和 skew KL 的行为差异；完整词表 Reverse KL 作为当前拟定的信息参照，实际主要损失方向仍须结合前期诊断确定。常规子集归一化 Top-K 用于展示截断误差，已有尾部类别方法作为直接基线[31]。候选方法改变支持集：在关键位置补入学生高概率而教师 Top-K 漏掉的合法决策 token，其余概率归入尾部类别，位置 K 受总反馈预算约束。离散 rollout 提供训练状态，损失对学生 LoRA 参数反向传播。总体优化问题写为：</w:t>
+      </w:r>
+      <w:r>
+        <w:rPr>
+          <w:rFonts w:hint="eastAsia"/>
+          <w:lang w:val="en-US" w:eastAsia="zh-CN"/>
+        </w:rPr>
+      </w:r>
+      <w:bookmarkStart w:id="76" w:name="_GoBack"/>
+      <w:bookmarkEnd w:id="76"/>
+      <w:r>
+        <w:t/>
       </w:r>
     </w:p>
     <w:tbl>
@@ -5990,7 +5986,7 @@
         <w:jc w:val="both"/>
       </w:pPr>
       <w:r>
-        <w:t xml:space="preserve">实验顺序先核实在策略状态与位置标注，再解释完整词表散度的优化偏好，随后定位固定主要散度下的稀疏反馈缺陷，并通过同预算消融检验候选方法。散度分析与反馈支持集实验分别报告，避免把损失方向变化误认为 Top-K 改进的收益。完整训练配置与原始指标用于追溯行为变化。</w:t>
+        <w:t>实验顺序先核实在策略状态与位置标注，再解释完整词表散度的优化偏好，随后定位固定主要散度下的稀疏反馈缺陷，并通过同预算消融检验候选方法。散度分析与反馈支持集实验分别报告，避免把损失方向变化误认为 Top-K 改进的收益。完整训练配置与原始指标用于追溯行为变化。</w:t>
       </w:r>
     </w:p>
     <w:p>
@@ -6463,7 +6459,7 @@
         <w:jc w:val="both"/>
       </w:pPr>
       <w:r>
-        <w:t>上式依次将用户请求、工具 schema、已有对话与工具返回作为模板输入。训练集、验证集和测试集采用独立划分，并满足以下互斥关系：</w:t>
+        <w:t>上式依次将用户请求与工具 schema 作为单轮核心输入；若样本原本含有可验证的对话历史或工具返回，则保留为单独标记的扩展情形，不与单轮主实验混合。训练集、验证集和测试集采用独立划分，并满足以下互斥关系：</w:t>
       </w:r>
     </w:p>
     <w:tbl>
@@ -6757,7 +6753,7 @@
         <w:jc w:val="both"/>
       </w:pPr>
       <w:r>
-        <w:t>数据审计围绕结构、语义和执行三层展开。结构层检查 JSON 与 schema 约束，语义层核对用户意图和目标函数，执行层在本地模拟工具中验证参数能否产生有效返回。只有同时通过三层检查的样本才进入正式训练；无法自动判定的样本保留原始内容和失败原因，并进行人工抽查。</w:t>
+        <w:t>数据审计围绕结构、语义和执行三层展开。结构层检查 JSON 与 schema 约束，语义层核对用户意图和目标函数；对于具备可用工具或模拟环境的样本，再检验参数能否产生有效返回。单轮主实验要求结构可解析、目标调用可核对；执行验证覆盖的样本另作标记，只在相应子集报告执行成功率。无法自动判定的样本保留失败原因并进行人工抽查。</w:t>
       </w:r>
     </w:p>
     <w:p>
@@ -8683,7 +8679,7 @@
         <w:jc w:val="both"/>
       </w:pPr>
       <w:r>
-        <w:t>表 4-1 给出各环节固定与记录的变量。所有对照组共享输入、生成协议、数据划分和有效位置定义；状态分层实验仅改变同预算下所使用的位置，损失实验则固定轨迹与位置后再切换目标。教师反馈同时记录 Top-K 累计概率、残余质量及所选 K，使后续结果能够区分状态选择、目标定义和反馈粒度的影响。训练、反馈与评测关系见图 3。</w:t>
+        <w:t>表 4-1 给出各环节固定与记录的变量。所有对照组共享输入、生成协议、数据划分和有效位置定义。状态实验比较同预算下不同位置的监督，散度实验固定轨迹与完整词表反馈，稀疏反馈实验再固定主要散度方向。教师反馈记录 Top-K 累计概率、残余质量、决策 token 是否被保留及实际 K，以便分别归因于状态、目标和反馈支持集。训练、反馈与评测关系见图 3。</w:t>
       </w:r>
     </w:p>
     <w:p>
@@ -8801,7 +8797,7 @@
           <w:color w:val="000000"/>
           <w:sz w:val="24"/>
         </w:rPr>
-        <w:t xml:space="preserve">4.4 散度目标分析与稀疏反馈定义</w:t>
+        <w:t>4.4 散度目标分析与稀疏反馈定义</w:t>
       </w:r>
       <w:bookmarkEnd w:id="41"/>
     </w:p>
@@ -10264,7 +10260,7 @@
         <w:jc w:val="both"/>
       </w:pPr>
       <w:r>
-        <w:t xml:space="preserve">完整词表的 Forward KL、Reverse KL、JSD 和 skew KL 用于分析不同概率区域的学习权重[7][8][9][12]。在同一学生轨迹、温度和有效位置上，本文比较各目标的梯度方向、熵变化、函数误选与过度调用，再选定稀疏反馈实验的主要散度方向。后续 Top-K 对照固定该方向与支持集协议，保证观察到的差异来自教师反馈而非目标切换。</w:t>
+        <w:t>完整词表的 Forward KL、Reverse KL、JSD 和 skew KL 用于分析不同概率区域的学习权重[7][8][9][12]。在同一学生轨迹、温度和有效位置上，本文比较各目标的梯度方向、熵变化、函数误选与过度调用，再选定稀疏反馈实验的主要散度方向。后续 Top-K 对照固定该方向与支持集协议，保证观察到的差异来自教师反馈而非目标切换。</w:t>
       </w:r>
     </w:p>
     <w:p>
@@ -10273,7 +10269,7 @@
         <w:jc w:val="both"/>
       </w:pPr>
       <w:r>
-        <w:t xml:space="preserve">表 4-2 将实验组织为完整词表散度分析、稀疏反馈诊断、同预算方法比较和组件消融。各组固定教师、学生起点、数据划分、生成协议与评价规则；散度分析固定反馈粒度，方法比较固定主要散度方向，并统一有效训练 token 数与更新步数。</w:t>
+        <w:t>表 4-2 将实验组织为完整词表散度分析、稀疏反馈诊断、同预算方法比较和组件消融。各组固定教师、学生起点、数据划分、生成协议与评价规则；散度分析固定反馈粒度，方法比较固定主要散度方向，并统一有效训练 token 数与更新步数。</w:t>
       </w:r>
     </w:p>
     <w:p>
@@ -10372,9 +10368,9 @@
       </w:tblGrid>
       <w:tr>
         <w:trPr>
+          <w:cantSplit/>
           <w:tblHeader/>
           <w:jc w:val="center"/>
-          <w:cantSplit/>
         </w:trPr>
         <w:tc>
           <w:tcPr>
@@ -10393,7 +10389,7 @@
                 <w:b/>
                 <w:sz w:val="19"/>
               </w:rPr>
-              <w:t xml:space="preserve">实验层次</w:t>
+              <w:t>实验层次</w:t>
             </w:r>
           </w:p>
         </w:tc>
@@ -10414,7 +10410,7 @@
                 <w:b/>
                 <w:sz w:val="19"/>
               </w:rPr>
-              <w:t xml:space="preserve">固定条件</w:t>
+              <w:t>固定条件</w:t>
             </w:r>
           </w:p>
         </w:tc>
@@ -10435,7 +10431,7 @@
                 <w:b/>
                 <w:sz w:val="19"/>
               </w:rPr>
-              <w:t xml:space="preserve">变化因素</w:t>
+              <w:t>变化因素</w:t>
             </w:r>
           </w:p>
         </w:tc>
@@ -10456,7 +10452,7 @@
                 <w:b/>
                 <w:sz w:val="19"/>
               </w:rPr>
-              <w:t xml:space="preserve">主要观察</w:t>
+              <w:t>主要观察</w:t>
             </w:r>
           </w:p>
         </w:tc>
@@ -10477,15 +10473,15 @@
                 <w:b/>
                 <w:sz w:val="19"/>
               </w:rPr>
-              <w:t xml:space="preserve">研究作用</w:t>
+              <w:t>研究作用</w:t>
             </w:r>
           </w:p>
         </w:tc>
       </w:tr>
       <w:tr>
         <w:trPr>
+          <w:cantSplit/>
           <w:jc w:val="center"/>
-          <w:cantSplit/>
         </w:trPr>
         <w:tc>
           <w:tcPr>
@@ -10504,7 +10500,7 @@
                 <w:b w:val="0"/>
                 <w:sz w:val="19"/>
               </w:rPr>
-              <w:t xml:space="preserve">完整词表散度</w:t>
+              <w:t>完整词表散度</w:t>
             </w:r>
           </w:p>
         </w:tc>
@@ -10525,7 +10521,7 @@
                 <w:b w:val="0"/>
                 <w:sz w:val="19"/>
               </w:rPr>
-              <w:t xml:space="preserve">同轨迹、同反馈</w:t>
+              <w:t>同轨迹、同反馈</w:t>
             </w:r>
           </w:p>
         </w:tc>
@@ -10546,7 +10542,7 @@
                 <w:b w:val="0"/>
                 <w:sz w:val="19"/>
               </w:rPr>
-              <w:t xml:space="preserve">FKL、RKL、JSD、skew KL</w:t>
+              <w:t>FKL、RKL、JSD、skew KL</w:t>
             </w:r>
           </w:p>
         </w:tc>
@@ -10567,7 +10563,7 @@
                 <w:b w:val="0"/>
                 <w:sz w:val="19"/>
               </w:rPr>
-              <w:t xml:space="preserve">梯度、熵、调用结果</w:t>
+              <w:t>梯度、熵、调用结果</w:t>
             </w:r>
           </w:p>
         </w:tc>
@@ -10588,15 +10584,15 @@
                 <w:b w:val="0"/>
                 <w:sz w:val="19"/>
               </w:rPr>
-              <w:t xml:space="preserve">确定主要目标</w:t>
+              <w:t>确定主要目标</w:t>
             </w:r>
           </w:p>
         </w:tc>
       </w:tr>
       <w:tr>
         <w:trPr>
+          <w:cantSplit/>
           <w:jc w:val="center"/>
-          <w:cantSplit/>
         </w:trPr>
         <w:tc>
           <w:tcPr>
@@ -10615,7 +10611,7 @@
                 <w:b w:val="0"/>
                 <w:sz w:val="19"/>
               </w:rPr>
-              <w:t xml:space="preserve">稀疏反馈诊断</w:t>
+              <w:t>稀疏反馈诊断</w:t>
             </w:r>
           </w:p>
         </w:tc>
@@ -10636,7 +10632,7 @@
                 <w:b w:val="0"/>
                 <w:sz w:val="19"/>
               </w:rPr>
-              <w:t xml:space="preserve">同轨迹、同损失</w:t>
+              <w:t>同轨迹、同损失</w:t>
             </w:r>
           </w:p>
         </w:tc>
@@ -10657,7 +10653,7 @@
                 <w:b w:val="0"/>
                 <w:sz w:val="19"/>
               </w:rPr>
-              <w:t xml:space="preserve">全词表、Top-K、K1</w:t>
+              <w:t>全词表、Top-K、K1</w:t>
             </w:r>
           </w:p>
         </w:tc>
@@ -10678,7 +10674,7 @@
                 <w:b w:val="0"/>
                 <w:sz w:val="19"/>
               </w:rPr>
-              <w:t xml:space="preserve">尾部与梯度误差</w:t>
+              <w:t>尾部与梯度误差</w:t>
             </w:r>
           </w:p>
         </w:tc>
@@ -10699,15 +10695,15 @@
                 <w:b w:val="0"/>
                 <w:sz w:val="19"/>
               </w:rPr>
-              <w:t xml:space="preserve">定位遗漏</w:t>
+              <w:t>定位遗漏</w:t>
             </w:r>
           </w:p>
         </w:tc>
       </w:tr>
       <w:tr>
         <w:trPr>
+          <w:cantSplit/>
           <w:jc w:val="center"/>
-          <w:cantSplit/>
         </w:trPr>
         <w:tc>
           <w:tcPr>
@@ -10726,7 +10722,7 @@
                 <w:b w:val="0"/>
                 <w:sz w:val="19"/>
               </w:rPr>
-              <w:t xml:space="preserve">同预算方法</w:t>
+              <w:t>同预算方法</w:t>
             </w:r>
           </w:p>
         </w:tc>
@@ -10747,7 +10743,7 @@
                 <w:b w:val="0"/>
                 <w:sz w:val="19"/>
               </w:rPr>
-              <w:t xml:space="preserve">同起点、同预算</w:t>
+              <w:t>同起点、同预算</w:t>
             </w:r>
           </w:p>
         </w:tc>
@@ -10768,7 +10764,7 @@
                 <w:b w:val="0"/>
                 <w:sz w:val="19"/>
               </w:rPr>
-              <w:t xml:space="preserve">固定 K、尾部类别、决策支持集</w:t>
+              <w:t>固定 K、尾部类别、决策支持集</w:t>
             </w:r>
           </w:p>
         </w:tc>
@@ -10789,7 +10785,7 @@
                 <w:b w:val="0"/>
                 <w:sz w:val="19"/>
               </w:rPr>
-              <w:t xml:space="preserve">调用结果与成本</w:t>
+              <w:t>调用结果与成本</w:t>
             </w:r>
           </w:p>
         </w:tc>
@@ -10810,15 +10806,15 @@
                 <w:b w:val="0"/>
                 <w:sz w:val="19"/>
               </w:rPr>
-              <w:t xml:space="preserve">检验改进</w:t>
+              <w:t>检验改进</w:t>
             </w:r>
           </w:p>
         </w:tc>
       </w:tr>
       <w:tr>
         <w:trPr>
+          <w:cantSplit/>
           <w:jc w:val="center"/>
-          <w:cantSplit/>
         </w:trPr>
         <w:tc>
           <w:tcPr>
@@ -10837,7 +10833,7 @@
                 <w:b w:val="0"/>
                 <w:sz w:val="19"/>
               </w:rPr>
-              <w:t xml:space="preserve">组件消融</w:t>
+              <w:t>组件消融</w:t>
             </w:r>
           </w:p>
         </w:tc>
@@ -10858,7 +10854,7 @@
                 <w:b w:val="0"/>
                 <w:sz w:val="19"/>
               </w:rPr>
-              <w:t xml:space="preserve">同训练协议</w:t>
+              <w:t>同训练协议</w:t>
             </w:r>
           </w:p>
         </w:tc>
@@ -10879,7 +10875,7 @@
                 <w:b w:val="0"/>
                 <w:sz w:val="19"/>
               </w:rPr>
-              <w:t xml:space="preserve">去尾部类、去补入、去分配</w:t>
+              <w:t>去尾部类、去补入、去分配</w:t>
             </w:r>
           </w:p>
         </w:tc>
@@ -10900,7 +10896,7 @@
                 <w:b w:val="0"/>
                 <w:sz w:val="19"/>
               </w:rPr>
-              <w:t xml:space="preserve">任务、时间、显存</w:t>
+              <w:t>任务、时间、显存</w:t>
             </w:r>
           </w:p>
         </w:tc>
@@ -10921,7 +10917,7 @@
                 <w:b w:val="0"/>
                 <w:sz w:val="19"/>
               </w:rPr>
-              <w:t xml:space="preserve">判定各组件作用</w:t>
+              <w:t>判定各组件作用</w:t>
             </w:r>
           </w:p>
         </w:tc>
@@ -10933,7 +10929,7 @@
         <w:jc w:val="both"/>
       </w:pPr>
       <w:r>
-        <w:t xml:space="preserve">完整词表散度实验解释优化偏好并确定主要目标；稀疏诊断分别测量尾部总量、决策坐标与梯度误差；同预算比较检验决策感知支持集；组件消融辨别关键候选补入、尾部类别和位置预算各自的作用。K1 sampled-token 作为极低反馈量边界参照，单独报告估计波动。</w:t>
+        <w:t>完整词表散度实验解释优化偏好并确定主要目标；稀疏诊断分别测量尾部总量、决策坐标与梯度误差；同预算比较检验决策感知支持集；组件消融辨别关键候选补入、尾部类别和位置预算各自的作用。K1 sampled-token 作为极低反馈量边界参照，单独报告估计波动。</w:t>
       </w:r>
     </w:p>
     <w:p>
@@ -11522,7 +11518,7 @@
         <w:jc w:val="both"/>
       </w:pPr>
       <w:r>
-        <w:t xml:space="preserve">常规截断基线在教师支持集内分别归一化师生概率，如式（4-18）所示。TA-OPD 在支持集外增加尾部类别[31]，作为本课题的直接方法基线。候选方法按工具调用位置调整支持集：检查学生高概率的合法决策候选，将教师 Top-K 漏掉的关键 token 补入，再计算新的尾部总概率。尾部类别传递总量信号，补入 token 传递具体决策信号；两者分别设置消融。</w:t>
+        <w:t>常规截断基线在教师支持集内分别归一化师生概率，如式（4-18）所示。TA-OPD 在支持集外增加尾部类别[31]，作为本课题的直接方法基线。候选方法按工具调用位置调整支持集：检查学生高概率的合法决策候选，将教师 Top-K 漏掉的关键 token 补入，再计算新的尾部总概率。尾部类别传递总量信号，补入 token 传递具体决策信号；两者分别设置消融。</w:t>
       </w:r>
     </w:p>
     <w:tbl>
@@ -12784,7 +12780,7 @@
         <w:jc w:val="both"/>
       </w:pPr>
       <w:r>
-        <w:t xml:space="preserve">K1 sampled-token 使用明确记录的提议分布和随机种子，提议分布须覆盖目标支持集。候选方法的位置权重来自训练集诊断子集，质量阈值和 K 上限由验证集确定；测试集只用于最终评价。补入候选的额外教师 logprob、反馈字节数与教师前向时间分别计量。各目标使用相同的 log-sum-exp、有效位置归一化和有限值检查。</w:t>
+        <w:t>K1 sampled-token 使用明确记录的提议分布和随机种子，提议分布须覆盖目标支持集。候选方法的位置权重来自训练集诊断子集，质量阈值和 K 上限由验证集确定；测试集只用于最终评价。补入候选的额外教师 logprob、反馈字节数与教师前向时间分别计量。各目标使用相同的 log-sum-exp、有效位置归一化和有限值检查。</w:t>
       </w:r>
     </w:p>
     <w:p>
@@ -12810,7 +12806,7 @@
         <w:jc w:val="both"/>
       </w:pPr>
       <w:r>
-        <w:t>本文从任务正确性、训练稳定性和资源成本三个层面评价方法，具体指标及其作用见表 4-3。</w:t>
+        <w:t>评价首先对应三个研究问题：按工具调用位置分析状态覆盖与错误，按完整词表散度分析梯度和生成行为，按稀疏支持集分析尾部质量、决策 token 漏选及预算。最终再从任务正确性、训练稳定性和资源成本三个层面判断方法的实际价值，具体指标见表 4-3。</w:t>
       </w:r>
     </w:p>
     <w:p>
@@ -12818,8 +12814,6 @@
         <w:ind w:firstLine="420"/>
         <w:jc w:val="both"/>
       </w:pPr>
-      <w:bookmarkStart w:id="76" w:name="_GoBack"/>
-      <w:bookmarkEnd w:id="76"/>
     </w:p>
     <w:p>
       <w:pPr>
@@ -14745,7 +14739,7 @@
         <w:jc w:val="both"/>
       </w:pPr>
       <w:r>
-        <w:t>熵与支持集重叠用于观察师生概率分布是否接近；针对本研究方法，还将记录教师 Top-K 外的总概率质量、学生对应质量及二者差异，并按函数、参数和结构位置分层分析。与异常损失、梯度范数和格式错误率结合后，可判断差异来自状态选择、截断目标还是监督粒度，避免只凭最终准确率解释机制。</w:t>
+        <w:t>熵与支持集重叠用于观察师生概率分布是否接近。状态研究按函数、参数和结构位置记录有效 token 数及错误；散度研究比较这些位置的梯度范数、方向与熵变化；稀疏反馈研究记录教师 Top-K 外的总概率质量、学生对应质量、关键决策 token 的漏选率，以及相对于完整词表目标的梯度差异。最终将这些诊断与异常损失、格式错误和函数误选相互核对。</w:t>
       </w:r>
     </w:p>
     <w:p>
@@ -15538,7 +15532,7 @@
         <w:jc w:val="both"/>
       </w:pPr>
       <w:r>
-        <w:t>结果讨论以完整训练曲线、测试集统计和资源消耗为依据，失败案例再按工具选择、结构解析、参数字段、参数值、上下文和执行环节分类。</w:t>
+        <w:t>结果讨论以完整训练曲线、测试集统计和资源消耗为依据。失败案例按工具选择、结构解析、参数字段、参数值和可验证的执行环节分类，并回溯其学生到访位置、所用散度目标与教师支持集；无法确定错误成因时，只报告观察到的关联。</w:t>
       </w:r>
     </w:p>
     <w:p>
@@ -15564,7 +15558,7 @@
         <w:jc w:val="both"/>
       </w:pPr>
       <w:r>
-        <w:t xml:space="preserve">方案采用可获得的小规模同家族模型与开源工具链。冻结教师参与前向评分，学生通过 LoRA 更新；PyTorch、Transformers、PEFT 和 vLLM[20]分别支持训练、适配与部署测量。正式实验前以少量单轮样本检查 tokenizer、模板、状态标记、完整词表散度实现、Top-K 累计质量、尾部类别概率归一化、梯度传播和运行成本。若某一研究环节的现象不明显，就依据真实错误统计调整分析重点，不预写方法收益。</w:t>
+        <w:t>方案采用小规模同家族模型与开源工具链。冻结教师参与前向评分，学生通过 LoRA 更新；PyTorch、Transformers、PEFT 和 vLLM[20]分别支持训练、适配与部署测量。正式实验前先用少量单轮样本核对 tokenizer、模板、状态分类和完整词表散度的数值与梯度，再检查 Top-K 累计质量、尾部类别归一化及关键候选的教师概率能否取得。若接口无法返回补入候选的可靠概率，需改用本地教师前向计算或缩小候选方法的适用范围，并如实计入成本。各环节的继续条件取决于实际错误与资源记录。</w:t>
       </w:r>
     </w:p>
     <w:p>
@@ -15968,7 +15962,7 @@
                 <w:b w:val="0"/>
                 <w:sz w:val="17"/>
               </w:rPr>
-              <w:t>继续调研文献；筛选公开 Function Calling 数据，完成去重、划分和字段映射；审计 tokenizer、消息模板、工具 schema、特殊 token 与模型版本。</w:t>
+              <w:t>继续核对 OPD 与稀疏蒸馏文献；筛选单轮 Function Calling 数据，完成去重、划分、字段映射与位置标记规则；审计 tokenizer、消息模板、工具 schema、特殊 token 和模型版本。</w:t>
             </w:r>
           </w:p>
         </w:tc>
@@ -16036,7 +16030,7 @@
                 <w:b w:val="0"/>
                 <w:sz w:val="17"/>
               </w:rPr>
-              <w:t>实现 LoRA 训练、学生 rollout、教师评分、全词表／Top-K／K1 接口和统一评测脚本；通过小规模试运行确定上下文长度、批量大小与数值精度。</w:t>
+              <w:t>实现 LoRA 训练、学生 rollout、教师评分、完整词表散度和 Top-K／K1 反馈接口；建立状态分层、梯度检查与统一评测脚本，用小规模试运行核定模型、精度及资源配置。</w:t>
             </w:r>
           </w:p>
         </w:tc>
@@ -16104,7 +16098,7 @@
                 <w:b w:val="0"/>
                 <w:sz w:val="17"/>
               </w:rPr>
-              <w:t>在统一数据、训练预算和生成协议下开展主要对照实验；形成阶段性结果和资源记录，并于 2027 年 3 月提交中期申请。</w:t>
+              <w:t>按相同数据和训练预算，先分析学生到访状态，再比较完整词表散度，随后诊断 Top-K 尾部质量与决策 token 漏选；形成可复查的阶段性结果，2027 年 3 月提交中期申请。</w:t>
             </w:r>
           </w:p>
         </w:tc>
@@ -16172,7 +16166,7 @@
                 <w:b w:val="0"/>
                 <w:sz w:val="17"/>
               </w:rPr>
-              <w:t>完成主要组合、必要的重复实验与消融实验；搭建 Function Calling／Agent 测试环境，统计任务正确性、训练稳定性、显存、吞吐、延迟和训练耗时。</w:t>
+              <w:t>完成决策感知候选方法与固定 K、质量阈值 K、尾部类别基线的同预算比较及组件消融；开展必要的多种子重复、部署评测、成本统计与失败案例分析。</w:t>
             </w:r>
           </w:p>
         </w:tc>
@@ -16261,7 +16255,7 @@
                 <w:b w:val="0"/>
                 <w:sz w:val="17"/>
               </w:rPr>
-              <w:t>论文定稿、复现说明、结题材料与答辩材料</w:t>
+              <w:t>论文定稿、三项研究的证据链、复现说明、结题材料与答辩材料</w:t>
             </w:r>
           </w:p>
         </w:tc>
@@ -16377,7 +16371,7 @@
         <w:jc w:val="both"/>
       </w:pPr>
       <w:r>
-        <w:t>整个研究周期为 2026 年 9 月至 2027 年 5 月。2026 年内重点完成开题、数据准备、兼容性审计和训练管线实现；2027 年 2 月起开展正式实验，并在 3 月中期申请前形成阶段性结果；随后完成补充实验、部署评测与统计分析，4—5 月集中完成论文、结题和答辩材料。</w:t>
+        <w:t>整个研究周期为 2026 年 9 月至 2027 年 5 月。2026 年内完成开题修改、数据与模型兼容性审计及训练管线；2027 年 2 月起依次形成学生状态分层、完整词表散度分析和稀疏反馈诊断的阶段性结果，3 月中期申请前提交可复查的配置与原始记录。随后开展候选方法的同预算比较、消融、部署评测与统计分析，4—5 月完成论文、结题和答辩材料。</w:t>
       </w:r>
     </w:p>
     <w:p>
@@ -16403,7 +16397,7 @@
         <w:jc w:val="both"/>
       </w:pPr>
       <w:r>
-        <w:t xml:space="preserve">1. 建立以 Qwen3-0.6B 为学生、冻结的 Qwen3-4B 为教师的单轮 Function Calling 在线策略蒸馏流程，形成可复现的学生轨迹、位置标注与分层错误记录。</w:t>
+        <w:t>1. 建立以 Qwen3-0.6B 为学生、冻结的 Qwen3-4B 为教师的单轮 Function Calling 在线策略蒸馏流程，形成可复现的学生轨迹、位置标注与分层错误记录。</w:t>
       </w:r>
     </w:p>
     <w:p>
@@ -16413,7 +16407,7 @@
         <w:jc w:val="both"/>
       </w:pPr>
       <w:r>
-        <w:t xml:space="preserve">2. 在统一学生轨迹与完整词表反馈下，分析代表性散度目标的梯度、熵和工具调用行为；随后量化 Top-K 的尾部总量损失、关键决策 token 漏选与梯度误差。</w:t>
+        <w:t>2. 在统一学生轨迹与完整词表反馈下，分析代表性散度目标的梯度、熵和工具调用行为；随后量化 Top-K 的尾部总量损失、关键决策 token 漏选与梯度误差。</w:t>
       </w:r>
     </w:p>
     <w:p>
@@ -16423,7 +16417,7 @@
         <w:jc w:val="both"/>
       </w:pPr>
       <w:r>
-        <w:t xml:space="preserve">3. 实现并验证决策感知的尾部保真蒸馏候选方案，在相同反馈预算下比较固定 K、质量阈值 K 和组件消融，报告函数调用结果、训练稳定性、教师查询与资源成本。</w:t>
+        <w:t>3. 实现并验证决策感知的尾部保真蒸馏候选方案，在相同反馈预算下比较固定 K、质量阈值 K 和组件消融，报告函数调用结果、训练稳定性、教师查询与资源成本。</w:t>
       </w:r>
     </w:p>
     <w:p>
@@ -16462,7 +16456,7 @@
         <w:jc w:val="both"/>
       </w:pPr>
       <w:r>
-        <w:t xml:space="preserve">预期形成可复现的单轮工具调用 OPD 流程、完整词表散度的行为分析，以及待实验检验的决策感知稀疏反馈方法，提供相应基线、消融、成本统计和失败案例。最终论文将依据实际结果判断方法的价值及适用边界。</w:t>
+        <w:t>预期形成可复现的单轮工具调用 OPD 流程、完整词表散度的行为分析，以及待实验检验的决策感知稀疏反馈方法，提供相应基线、消融、成本统计和失败案例。最终论文将依据实际结果判断方法的价值及适用边界。</w:t>
       </w:r>
     </w:p>
     <w:p>
@@ -16503,7 +16497,7 @@
         <w:jc w:val="both"/>
       </w:pPr>
       <w:r>
-        <w:t>目前已经明确研究方向、模型组合、LoRA 后训练路线和 Function Calling 应用场景，并完成相关文献与模型资料调研。PyTorch、Transformers、PEFT、Datasets 和 vLLM 等开源工具可支持后续的数据处理、模型训练与部署评测。</w:t>
+        <w:t>目前已确定在线策略蒸馏与单轮 Function Calling 的研究范围，并完成相关文献和候选模型资料调研。Qwen3-0.6B 学生、Qwen3-4B 教师及 LoRA 后训练是当前拟采用的组合，具体版本、tokenizer、模板与可用硬件仍须在实验前核定。PyTorch、Transformers、PEFT、Datasets 和 vLLM 等开源工具可支持数据处理、模型训练与部署评测。</w:t>
       </w:r>
     </w:p>
     <w:p>
@@ -16528,7 +16522,7 @@
         <w:jc w:val="both"/>
       </w:pPr>
       <w:r>
-        <w:t>软件环境包括 Python、PyTorch、Transformers、PEFT、Datasets 和 vLLM；硬件需要支持 Qwen3-4B 教师推理、Qwen3-0.6B 学生 rollout 与 LoRA 更新。实验将依据可用显存设置序列长度、批量大小、梯度累积、混合精度和教师输出缓存。</w:t>
+        <w:t>软件环境包括 Python、PyTorch、Transformers、PEFT、Datasets 和 vLLM；硬件应支持教师在学生前缀上评分、必要位置的完整词表诊断，以及学生 rollout 与 LoRA 更新。方法实验还需取得补入决策 token 的教师概率，并记录相应计算和反馈量。实验将依据可用显存设置序列长度、批量大小、梯度累积、混合精度和教师输出缓存。</w:t>
       </w:r>
     </w:p>
     <w:p>
@@ -16576,7 +16570,7 @@
           <w:rFonts w:ascii="Times New Roman" w:hAnsi="Times New Roman" w:eastAsia="宋体"/>
           <w:sz w:val="24"/>
         </w:rPr>
-        <w:t>为避免无效支出，正式训练前先在小规模数据上完成 tokenizer、模板、schema 和损失实现审计。实验统一记录 GPU 型号、计费时长、失败重跑原因和有效训练时长，以便把资源消耗与性能收益对应起来。</w:t>
+        <w:t>正式训练前先以少量单轮样本核对模板、状态标记和完整词表损失，再统计尾部质量、决策 token 漏选及额外评分成本。诊断成立且数值稳定后扩大实验；统一记录 GPU 型号、有效运行时长和失败重跑原因。</w:t>
       </w:r>
     </w:p>
     <w:p>
@@ -16842,7 +16836,7 @@
                 <w:b w:val="0"/>
                 <w:sz w:val="17"/>
               </w:rPr>
-              <w:t>教师在线推理、学生 rollout、LoRA 训练、多组对照和必要的重复实验；计划使用 NVIDIA GeForce RTX 5090 32 GB</w:t>
+              <w:t>教师评分、学生 rollout、LoRA 更新和三阶段对照；拟用 RTX 5090 32 GB。</w:t>
             </w:r>
           </w:p>
         </w:tc>
@@ -17005,7 +16999,7 @@
         <w:jc w:val="both"/>
       </w:pPr>
       <w:r>
-        <w:t>研究中可能遇到的问题主要集中在数据与接口、蒸馏估计、训练资源和部署评测四个方面，相应措施如下：</w:t>
+        <w:t>研究风险分别对应学生状态识别、散度目标解释和稀疏反馈改进，另需控制教师评分、训练资源及评测环境的限制。表 7-1 列出主要困难与应对措施。</w:t>
       </w:r>
     </w:p>
     <w:p>
@@ -17102,6 +17096,7 @@
       <w:tr>
         <w:trPr>
           <w:tblHeader/>
+          <w:cantSplit/>
         </w:trPr>
         <w:tc>
           <w:tcPr>
@@ -17136,6 +17131,9 @@
         </w:tc>
       </w:tr>
       <w:tr>
+        <w:trPr>
+          <w:cantSplit/>
+        </w:trPr>
         <w:tc>
           <w:tcPr>
             <w:tcW w:w="4148" w:type="dxa"/>
@@ -17166,6 +17164,9 @@
         </w:tc>
       </w:tr>
       <w:tr>
+        <w:trPr>
+          <w:cantSplit/>
+        </w:trPr>
         <w:tc>
           <w:tcPr>
             <w:tcW w:w="4148" w:type="dxa"/>
@@ -17176,7 +17177,7 @@
               <w:jc w:val="left"/>
             </w:pPr>
             <w:r>
-              <w:t>教师全词表反馈开销过高</w:t>
+              <w:t>学生到访状态和工具调用位置难以可靠标记</w:t>
             </w:r>
           </w:p>
         </w:tc>
@@ -17190,12 +17191,15 @@
               <w:jc w:val="left"/>
             </w:pPr>
             <w:r>
-              <w:t>比较全词表、Top-K 和 K1 的反馈量，并采用分块计算、缓存与梯度累积控制资源开销。</w:t>
+              <w:t>以消息边界、schema 和解析规则标记明确位置；无法确认的状态单列，不用推测的首错 token 充当真值。</w:t>
             </w:r>
           </w:p>
         </w:tc>
       </w:tr>
       <w:tr>
+        <w:trPr>
+          <w:cantSplit/>
+        </w:trPr>
         <w:tc>
           <w:tcPr>
             <w:tcW w:w="4148" w:type="dxa"/>
@@ -17206,7 +17210,7 @@
               <w:jc w:val="left"/>
             </w:pPr>
             <w:r>
-              <w:t>Top-K/K1 估计不稳定</w:t>
+              <w:t>散度差异受支持集或数值实现干扰</w:t>
             </w:r>
           </w:p>
         </w:tc>
@@ -17220,12 +17224,15 @@
               <w:jc w:val="left"/>
             </w:pPr>
             <w:r>
-              <w:t>记录支持集外概率、熵和异常损失；在主方案稳定运行后，再评估额外的稳定化方法。</w:t>
+              <w:t>先在完整词表和同一轨迹上核对目标、梯度及有限值；固定温度、mask 和支持集后再解释行为差异。</w:t>
             </w:r>
           </w:p>
         </w:tc>
       </w:tr>
       <w:tr>
+        <w:trPr>
+          <w:cantSplit/>
+        </w:trPr>
         <w:tc>
           <w:tcPr>
             <w:tcW w:w="4148" w:type="dxa"/>
@@ -17236,7 +17243,7 @@
               <w:jc w:val="left"/>
             </w:pPr>
             <w:r>
-              <w:t>离线 token 指标与端到端调用结果不一致</w:t>
+              <w:t>Top-K 尾部质量小，或遗漏决策 token 的频率低</w:t>
             </w:r>
           </w:p>
         </w:tc>
@@ -17250,12 +17257,15 @@
               <w:jc w:val="left"/>
             </w:pPr>
             <w:r>
-              <w:t>分层报告格式、函数、参数、执行和端到端任务指标，并保留失败轨迹。</w:t>
+              <w:t>分别测量尾部总量、漏选率和梯度偏差；若现象不显著，收缩方法主张，不以个别案例代替总体证据。</w:t>
             </w:r>
           </w:p>
         </w:tc>
       </w:tr>
       <w:tr>
+        <w:trPr>
+          <w:cantSplit/>
+        </w:trPr>
         <w:tc>
           <w:tcPr>
             <w:tcW w:w="4148" w:type="dxa"/>
@@ -17266,7 +17276,7 @@
               <w:jc w:val="left"/>
             </w:pPr>
             <w:r>
-              <w:t>推理后端兼容性问题</w:t>
+              <w:t>候选补入带来额外教师评分，收益与成本不匹配</w:t>
             </w:r>
           </w:p>
         </w:tc>
@@ -17280,7 +17290,7 @@
               <w:jc w:val="left"/>
             </w:pPr>
             <w:r>
-              <w:t>先完成最小推理验证，再固定 vLLM 或自建测试程序的版本、加载方式与测量参数。</w:t>
+              <w:t>在同 K、同反馈量及同训练预算下与固定 K、尾部类别方法比较，单独记录教师前向时间与反馈字节数。</w:t>
             </w:r>
           </w:p>
         </w:tc>
@@ -17292,7 +17302,7 @@
         <w:jc w:val="both"/>
       </w:pPr>
       <w:r>
-        <w:t>实施时先审计数据、模型、tokenizer 和消息模板，再用少量单轮样本检查状态标记、支持集累计质量、残余概率、损失数值与梯度。训练资源通过短序列验证、小批量训练、梯度累积和必要的教师反馈缓存控制。完整分布、常规 Top-K、残余类别 Top-K 与 K1 应共享输入、mask、评测规则和记录格式，并保存异常 loss、非法结构及失败调用以便追溯。</w:t>
+        <w:t>实施时先审计数据、模型、tokenizer 和消息模板，用少量单轮样本检查状态标记与调用解析；再在固定轨迹上核对完整词表散度的数值、梯度和异常值；最后统计 Top-K 外质量、关键决策 token 漏选与额外教师评分。各阶段保留输入、mask、支持集、loss、梯度和失败调用。正式比较共享学生起点、训练预算、评测规则及记录格式，训练资源通过短序列试运行、小批量和梯度累积控制。</w:t>
       </w:r>
     </w:p>
     <w:p>
@@ -17301,7 +17311,7 @@
         <w:jc w:val="both"/>
       </w:pPr>
       <w:r>
-        <w:t>实验日志按数据与接口、蒸馏估计、训练资源和部署评测四类记录问题。评测结果分层报告格式解析、函数选择、参数生成、工具执行和端到端任务完成情况，以便分别分析算法效果、资源成本与系统性能。</w:t>
+        <w:t>实验日志按状态与数据、目标与梯度、稀疏反馈与资源、部署与评测四类记录问题。评测结果分层报告格式解析、函数选择、参数生成，以及具备可执行环境时的工具执行和端到端结果。若不同散度的表现相近，仍报告其梯度与错误分布；若候选支持集的收益不足以抵消成本，则保留完整诊断和失败案例，不预设改进结论。</w:t>
       </w:r>
     </w:p>
     <w:p>
@@ -17310,7 +17320,7 @@
         <w:jc w:val="both"/>
       </w:pPr>
       <w:r>
-        <w:t>方法风险主要有两类：若教师分布在大多数有效位置过于集中，Top-K 外的概率质量可能很小，残余类别难以产生可测差异；若概率质量分散，自适应 K 可能频繁达到上限，未必节省反馈开销。研究先在小样本上统计这些分布，再以相同 K 或相同反馈预算做消融；若候选方法不优于简洁基线，应如实报告并据错误类型缩小改进范围。支持集并集与极端概率比裁剪仅作为后续备选，不与主方法同时改变。</w:t>
+        <w:t>候选方法面临两类关键风险。其一，教师 Top-K 外的总概率可能很小，但仍需检查是否遗漏学生高估的函数入口等决策 token；尾部质量与决策漏选应分别统计。其二，补入候选和按位置分配 K 可能增加教师评分与反馈字节数，即使任务指标改善，也未必优于相同预算下的固定 K 或已有尾部类别方法。本文先用小样本确定问题规模，再以同 K、同反馈量和同训练预算的对照分开评价准确率与成本。若诊断未发现稳定的决策漏选，或收益无法重复，将收缩方法主张并依据真实错误重新确定重点。</w:t>
       </w:r>
     </w:p>
     <w:p>
@@ -17746,7 +17756,7 @@
         <w:jc w:val="both"/>
       </w:pPr>
       <w:r>
-        <w:t xml:space="preserve">Anshumann, Zaidi M A, Kedia A, et al. Sparse Logit Sampling: Accelerating Knowledge Distillation in LLMs[C]//Proceedings of the 63rd Annual Meeting of the Association for Computational Linguistics (Volume 1: Long Papers). 2025: 18085-18108. DOI:10.18653/v1/2025.acl-long.885.</w:t>
+        <w:t>Anshumann, Zaidi M A, Kedia A, et al. Sparse Logit Sampling: Accelerating Knowledge Distillation in LLMs[C]//Proceedings of the 63rd Annual Meeting of the Association for Computational Linguistics (Volume 1: Long Papers). 2025: 18085-18108. DOI:10.18653/v1/2025.acl-long.885.</w:t>
       </w:r>
     </w:p>
     <w:p>
@@ -17760,7 +17770,7 @@
         <w:jc w:val="both"/>
       </w:pPr>
       <w:r>
-        <w:t xml:space="preserve">Huang H, Wei H. Tail-Aware Top-k On-Policy Distillation[EB/OL]. arXiv:2608.14728, 2026.</w:t>
+        <w:t>Huang H, Wei H. Tail-Aware Top-k On-Policy Distillation[EB/OL]. arXiv:2608.14728, 2026.</w:t>
       </w:r>
     </w:p>
     <w:p>
@@ -17774,7 +17784,7 @@
         <w:jc w:val="both"/>
       </w:pPr>
       <w:r>
-        <w:t xml:space="preserve">Meng L, Gan S, Li Y, et al. Unbiased Top-k Estimation for On-Policy Distillation[EB/OL]. arXiv:2609.34447, 2026.</w:t>
+        <w:t>Meng L, Gan S, Li Y, et al. Unbiased Top-k Estimation for On-Policy Distillation[EB/OL]. arXiv:2609.34447, 2026.</w:t>
       </w:r>
     </w:p>
     <w:p>
@@ -17788,7 +17798,7 @@
         <w:jc w:val="both"/>
       </w:pPr>
       <w:r>
-        <w:t xml:space="preserve">Shen J, Chen G, Mao C. When Top-K Misses the Decision: Tool-Call Drift in Multi-Teacher On-Policy Distillation[EB/OL]. arXiv:2607.07050, 2026.</w:t>
+        <w:t>Shen J, Chen G, Mao C. When Top-K Misses the Decision: Tool-Call Drift in Multi-Teacher On-Policy Distillation[EB/OL]. arXiv:2607.07050, 2026.</w:t>
       </w:r>
     </w:p>
     <w:p>
@@ -17802,7 +17812,7 @@
         <w:jc w:val="both"/>
       </w:pPr>
       <w:r>
-        <w:t xml:space="preserve">Yang P, Xing L, Dai X, et al. ResOPD: Tail Residualization for Sparse On-Policy Distillation[EB/OL]. arXiv:2610.04882, 2026.</w:t>
+        <w:t>Yang P, Xing L, Dai X, et al. ResOPD: Tail Residualization for Sparse On-Policy Distillation[EB/OL]. arXiv:2610.04882, 2026.</w:t>
       </w:r>
     </w:p>
     <w:sectPr>

</xml_diff>

<commit_message>
docs: polish opening report and formalize sparse feedback
</commit_message>
<xml_diff>
--- a/Papers/output/开题报告-基于在线策略蒸馏的大语言模型后训练方法研究.docx
+++ b/Papers/output/开题报告-基于在线策略蒸馏的大语言模型后训练方法研究.docx
@@ -1009,7 +1009,7 @@
         <w:fldChar w:fldCharType="separate"/>
       </w:r>
       <w:r>
-        <w:t>16</w:t>
+        <w:t>15</w:t>
       </w:r>
       <w:r>
         <w:fldChar w:fldCharType="end"/>
@@ -1053,7 +1053,7 @@
         <w:fldChar w:fldCharType="separate"/>
       </w:r>
       <w:r>
-        <w:t>18</w:t>
+        <w:t>16</w:t>
       </w:r>
       <w:r>
         <w:fldChar w:fldCharType="end"/>
@@ -1097,7 +1097,7 @@
         <w:fldChar w:fldCharType="separate"/>
       </w:r>
       <w:r>
-        <w:t>21</w:t>
+        <w:t>19</w:t>
       </w:r>
       <w:r>
         <w:fldChar w:fldCharType="end"/>
@@ -1141,7 +1141,7 @@
         <w:fldChar w:fldCharType="separate"/>
       </w:r>
       <w:r>
-        <w:t>22</w:t>
+        <w:t>20</w:t>
       </w:r>
       <w:r>
         <w:fldChar w:fldCharType="end"/>
@@ -1185,7 +1185,7 @@
         <w:fldChar w:fldCharType="separate"/>
       </w:r>
       <w:r>
-        <w:t>22</w:t>
+        <w:t>20</w:t>
       </w:r>
       <w:r>
         <w:fldChar w:fldCharType="end"/>
@@ -1229,7 +1229,7 @@
         <w:fldChar w:fldCharType="separate"/>
       </w:r>
       <w:r>
-        <w:t>22</w:t>
+        <w:t>21</w:t>
       </w:r>
       <w:r>
         <w:fldChar w:fldCharType="end"/>
@@ -1273,7 +1273,7 @@
         <w:fldChar w:fldCharType="separate"/>
       </w:r>
       <w:r>
-        <w:t>24</w:t>
+        <w:t>22</w:t>
       </w:r>
       <w:r>
         <w:fldChar w:fldCharType="end"/>
@@ -1317,7 +1317,7 @@
         <w:fldChar w:fldCharType="separate"/>
       </w:r>
       <w:r>
-        <w:t>25</w:t>
+        <w:t>23</w:t>
       </w:r>
       <w:r>
         <w:fldChar w:fldCharType="end"/>
@@ -1361,7 +1361,7 @@
         <w:fldChar w:fldCharType="separate"/>
       </w:r>
       <w:r>
-        <w:t>26</w:t>
+        <w:t>24</w:t>
       </w:r>
       <w:r>
         <w:fldChar w:fldCharType="end"/>
@@ -1405,7 +1405,7 @@
         <w:fldChar w:fldCharType="separate"/>
       </w:r>
       <w:r>
-        <w:t>27</w:t>
+        <w:t>25</w:t>
       </w:r>
       <w:r>
         <w:fldChar w:fldCharType="end"/>
@@ -1449,7 +1449,7 @@
         <w:fldChar w:fldCharType="separate"/>
       </w:r>
       <w:r>
-        <w:t>27</w:t>
+        <w:t>25</w:t>
       </w:r>
       <w:r>
         <w:fldChar w:fldCharType="end"/>
@@ -1493,7 +1493,7 @@
         <w:fldChar w:fldCharType="separate"/>
       </w:r>
       <w:r>
-        <w:t>29</w:t>
+        <w:t>27</w:t>
       </w:r>
       <w:r>
         <w:fldChar w:fldCharType="end"/>
@@ -1537,7 +1537,7 @@
         <w:fldChar w:fldCharType="separate"/>
       </w:r>
       <w:r>
-        <w:t>31</w:t>
+        <w:t>29</w:t>
       </w:r>
       <w:r>
         <w:fldChar w:fldCharType="end"/>
@@ -1581,7 +1581,7 @@
         <w:fldChar w:fldCharType="separate"/>
       </w:r>
       <w:r>
-        <w:t>34</w:t>
+        <w:t>32</w:t>
       </w:r>
       <w:r>
         <w:fldChar w:fldCharType="end"/>
@@ -1625,7 +1625,7 @@
         <w:fldChar w:fldCharType="separate"/>
       </w:r>
       <w:r>
-        <w:t>38</w:t>
+        <w:t>36</w:t>
       </w:r>
       <w:r>
         <w:fldChar w:fldCharType="end"/>
@@ -1669,7 +1669,7 @@
         <w:fldChar w:fldCharType="separate"/>
       </w:r>
       <w:r>
-        <w:t>42</w:t>
+        <w:t>40</w:t>
       </w:r>
       <w:r>
         <w:fldChar w:fldCharType="end"/>
@@ -1713,7 +1713,7 @@
         <w:fldChar w:fldCharType="separate"/>
       </w:r>
       <w:r>
-        <w:t>43</w:t>
+        <w:t>41</w:t>
       </w:r>
       <w:r>
         <w:fldChar w:fldCharType="end"/>
@@ -1757,7 +1757,7 @@
         <w:fldChar w:fldCharType="separate"/>
       </w:r>
       <w:r>
-        <w:t>43</w:t>
+        <w:t>41</w:t>
       </w:r>
       <w:r>
         <w:fldChar w:fldCharType="end"/>
@@ -1801,7 +1801,7 @@
         <w:fldChar w:fldCharType="separate"/>
       </w:r>
       <w:r>
-        <w:t>45</w:t>
+        <w:t>43</w:t>
       </w:r>
       <w:r>
         <w:fldChar w:fldCharType="end"/>
@@ -1845,7 +1845,7 @@
         <w:fldChar w:fldCharType="separate"/>
       </w:r>
       <w:r>
-        <w:t>46</w:t>
+        <w:t>44</w:t>
       </w:r>
       <w:r>
         <w:fldChar w:fldCharType="end"/>
@@ -1889,7 +1889,7 @@
         <w:fldChar w:fldCharType="separate"/>
       </w:r>
       <w:r>
-        <w:t>46</w:t>
+        <w:t>44</w:t>
       </w:r>
       <w:r>
         <w:fldChar w:fldCharType="end"/>
@@ -1933,7 +1933,7 @@
         <w:fldChar w:fldCharType="separate"/>
       </w:r>
       <w:r>
-        <w:t>46</w:t>
+        <w:t>44</w:t>
       </w:r>
       <w:r>
         <w:fldChar w:fldCharType="end"/>
@@ -1977,7 +1977,7 @@
         <w:fldChar w:fldCharType="separate"/>
       </w:r>
       <w:r>
-        <w:t>47</w:t>
+        <w:t>45</w:t>
       </w:r>
       <w:r>
         <w:fldChar w:fldCharType="end"/>
@@ -2021,7 +2021,7 @@
         <w:fldChar w:fldCharType="separate"/>
       </w:r>
       <w:r>
-        <w:t>48</w:t>
+        <w:t>46</w:t>
       </w:r>
       <w:r>
         <w:fldChar w:fldCharType="end"/>
@@ -2065,7 +2065,7 @@
         <w:fldChar w:fldCharType="separate"/>
       </w:r>
       <w:r>
-        <w:t>50</w:t>
+        <w:t>48</w:t>
       </w:r>
       <w:r>
         <w:fldChar w:fldCharType="end"/>
@@ -2129,7 +2129,7 @@
         <w:jc w:val="both"/>
       </w:pPr>
       <w:r>
-        <w:t>本课题面向大语言模型的工具调用后训练，考察在线策略蒸馏的三个相互关联的环节：学生实际访问的生成状态、师生分布的匹配目标，以及有限教师反馈中保留的候选 token。前两者决定在何处学习、按何种偏好更新学生；第三者决定这些偏好能否在稀疏反馈中传递。本文先建立三方面的可比分析，再针对 Top-K 反馈可能遗漏的尾部信息研究改进方法。</w:t>
+        <w:t>本课题研究大语言模型在工具调用任务中的在线策略蒸馏。研究从三个相互关联的环节展开：学生生成并实际访问的状态、师生分布的匹配目标，以及有限教师反馈所保留的 token 信息。学生状态决定教师在何处指导，散度目标决定学生如何更新，反馈粒度则影响目标信息的传递。本文分别分析这三个环节，并进一步研究 Top-K 反馈中尾部概率和关键决策候选的遗漏。</w:t>
       </w:r>
     </w:p>
     <w:p>
@@ -2138,7 +2138,7 @@
         <w:jc w:val="both"/>
       </w:pPr>
       <w:r>
-        <w:t>研究计划采用 Qwen3-0.6B 作为 LoRA 学生、冻结的 Qwen3-4B 作为教师，从公开 Function Calling 数据筛选单轮样本。在学生生成的前缀上比较有效监督位置和完整词表散度的行为差异，随后固定状态与主损失，诊断 Top-K 截断及其尾部信息损失。候选方法在关键位置补入学生高概率的决策 token，并检验同预算下的任务表现与成本。模型版本、数据来源、划分和硬件条件在实验前统一记录。</w:t>
+        <w:t>计划采用 Qwen3-0.6B LoRA 学生和冻结的 Qwen3-4B 教师，从公开 Function Calling 数据中筛选单轮调用样本。研究先在学生生成的前缀上比较监督位置与完整词表散度，再固定主要目标，测量 Top-K 截断造成的信息损失。候选方法尝试在关键位置补入被教师 Top-K 漏掉的学生高概率决策 token，并通过同预算实验评价任务效果与计算成本。模型版本、数据划分和硬件条件将在实验前核定。</w:t>
       </w:r>
     </w:p>
     <w:p>
@@ -2163,7 +2163,7 @@
         <w:jc w:val="both"/>
       </w:pPr>
       <w:r>
-        <w:t>大语言模型通过大规模预训练获得语言规律和知识表示，再借助后训练形成指令遵循、结构化输出、推理与工具使用能力。知识蒸馏利用教师模型的软分布，为学生提供比硬标签更丰富的训练信号。Hinton 等人阐述了温度缩放与软目标的基本思想[1]，序列级知识蒸馏则进一步使用教师生成的序列训练学生[2]。不过，蒸馏收益取决于具体任务、师生模型和训练协议；当训练数据或教师轨迹与学生推理时实际访问的状态不一致时，监督效果也会受到限制。</w:t>
+        <w:t>大语言模型经预训练获得语言规律和知识表示，后训练则进一步塑造指令遵循、结构化输出和工具使用能力。知识蒸馏借助教师的软分布传递候选之间的相对偏好。Hinton 等人提出温度缩放与软目标的基本思想[1]，序列级蒸馏随后将教师生成的序列用于学生训练[2]。在自回归生成中，学生一旦沿自身预测继续生成，后续前缀便可能偏离训练数据；蒸馏效果因此还取决于教师反馈是否覆盖这些实际到访的状态。</w:t>
       </w:r>
     </w:p>
     <w:p>
@@ -2172,7 +2172,7 @@
         <w:jc w:val="both"/>
       </w:pPr>
       <w:r>
-        <w:t>Function Calling 要求大语言模型按照给定接口生成结构化的函数调用。Gorilla/APIBench 关注 API 文档理解、函数选择和参数正确性[22]，API-Bank 则将工具检索、调用规划与执行结果纳入统一基准[23]。这些研究将 Function Calling 能力细分为函数选择、结构化参数生成、调用顺序和结果利用等环节，也为分析不同后训练方法提供了清晰的任务载体。</w:t>
+        <w:t>Function Calling 要求模型依据用户请求和接口说明，生成符合 schema 的函数调用。Gorilla/APIBench 检验 API 文档理解、函数选择和参数正确性[22]；API-Bank 将工具检索、调用规划与执行结果纳入评测[23]。这类任务具有清楚的决策节点：模型既要选择是否调用工具及调用哪个函数，也要生成可解析、可执行的参数。因此，工具调用适合观察 token 级蒸馏信号如何影响完整任务。</w:t>
       </w:r>
     </w:p>
     <w:p>
@@ -2190,7 +2190,7 @@
         <w:jc w:val="both"/>
       </w:pPr>
       <w:r>
-        <w:t>为便于评测，本文将 Function Calling 拆分为意图与工具选择、结构化参数生成、schema 约束、工具执行和多轮任务完成等环节。同一条样本可能在不同层面出错：模型可以理解用户意图却选错函数，也可能选对函数但遗漏参数，或生成结构正确但取值不符合约束的参数；单次调用正确，也不意味着多轮任务一定完成。这样的拆分与现有工具调用基准的评测维度基本一致[23][27]。</w:t>
+        <w:t>工具调用错误可按函数选择、结构合法性、参数键值和执行结果分层识别。例如，模型可能选对函数却遗漏必需参数，也可能输出合法 JSON，但参数取值不满足约束。多轮任务还涉及调用顺序和工具结果利用[23][27]。本文的主要训练实验先聚焦单轮调用；多轮及并行场景用于说明应用范围，并在具备相应数据和评测环境时另行分析。</w:t>
       </w:r>
     </w:p>
     <w:p>
@@ -2199,7 +2199,7 @@
         <w:jc w:val="both"/>
       </w:pPr>
       <w:r>
-        <w:t>数据准备阶段将依据公开数据的实际字段，统计单轮调用、多工具候选、并行调用、多轮工具结果和无适用工具等任务类型。核心实验先限定可统一解析与评价的单轮调用；训练集、验证集与测试集按工具 schema、问题模板和数据来源隔离，减少相似样本造成的信息泄漏。这样才能在同一任务条件下追踪学生到访状态、散度目标和教师反馈粒度各自带来的变化。</w:t>
+        <w:t>数据准备时，将统计单轮、多工具候选、并行调用、多轮工具结果和无适用工具等样本类型。核心实验选取能够统一解析与评价的单轮调用，并按工具 schema、问题模板和数据来源隔离训练、验证与测试集。明确任务边界后，学生状态、散度目标和反馈粒度的影响才能在可比条件下分析。</w:t>
       </w:r>
     </w:p>
     <w:p>
@@ -2234,7 +2234,7 @@
         <w:jc w:val="both"/>
       </w:pPr>
       <w:r>
-        <w:t>1. 梳理在线策略蒸馏中学生状态、散度目标与监督粒度的研究进展，建立单轮工具调用的可复现训练与分层评价流程。</w:t>
+        <w:t>1. 建立单轮工具调用的在线策略蒸馏流程，识别学生实际访问的监督位置，形成可复现的轨迹与分层评价记录。</w:t>
       </w:r>
     </w:p>
     <w:p>
@@ -2244,7 +2244,7 @@
         <w:jc w:val="both"/>
       </w:pPr>
       <w:r>
-        <w:t>2. 在统一学生轨迹上研究完整词表散度的行为偏好，并诊断 Top-K 截断对尾部总概率、关键决策 token 和梯度的影响。</w:t>
+        <w:t>2. 在相同学生轨迹上研究完整词表散度对梯度、熵和工具调用行为的影响，并测量 Top-K 截断对尾部总量及关键决策 token 的影响。</w:t>
       </w:r>
     </w:p>
     <w:p>
@@ -2254,7 +2254,7 @@
         <w:jc w:val="both"/>
       </w:pPr>
       <w:r>
-        <w:t>3. 研究决策感知的稀疏反馈候选方法，以同预算对照和组件消融检验其任务效果、训练稳定性与额外资源成本。</w:t>
+        <w:t>3. 提出决策感知的稀疏反馈候选方案，通过同预算对照与组件消融评价任务效果、稳定性和额外资源成本。</w:t>
       </w:r>
     </w:p>
     <w:p>
@@ -2263,7 +2263,7 @@
         <w:jc w:val="both"/>
       </w:pPr>
       <w:r>
-        <w:t>本课题从在线策略蒸馏的状态、目标和反馈三个环节逐步收束研究范围：状态分析保证教师监督落在学生会访问的前缀，散度分析说明不同分布匹配目标引导何种行为，稀疏反馈分析揭示目标在有限预算下可能发生的失真。由此提出的 Top-K 改进须与完整词表、固定 Top-K 及已有尾部修正方法比较；其实际价值由工具调用结果和资源记录共同判断。</w:t>
+        <w:t>上述目标形成由分析到改进的研究链条。学生状态实验确定教师监督的落点，散度实验解释概率匹配如何改变更新方向，稀疏反馈实验检验有限预算下保留了多少有效信号。Top-K 候选方案将与完整词表、固定 Top-K 和已有尾部类别方法比较；其价值最终由工具调用表现与成本记录共同判断。</w:t>
       </w:r>
     </w:p>
     <w:p>
@@ -2304,7 +2304,7 @@
         <w:jc w:val="both"/>
       </w:pPr>
       <w:r>
-        <w:t>为便于比较，本文按训练信号将相关后训练方法划分为监督微调、知识蒸馏、偏好优化和强化学习。监督微调依赖人工或教师构造的目标序列，知识蒸馏利用教师软分布，偏好优化使用回答之间的偏好关系，强化学习则依据环境或任务奖励更新策略。SFT 和序列级蒸馏容易构造结构化数据，但学生推理状态与训练前缀之间仍可能出现偏移[1][2][5]。下文据此分别讨论各类方法的监督来源与优化对象。</w:t>
+        <w:t>相关后训练方法可按监督来源区分。监督微调学习给定目标序列，知识蒸馏利用教师的软分布，偏好优化使用回答之间的偏好关系，强化学习依据任务或环境奖励更新策略。SFT 和序列级蒸馏容易组织结构化样本，但固定前缀与学生推理时的状态可能存在差距[1][2][5]。后文据此比较各类方法的状态来源与优化信号。</w:t>
       </w:r>
     </w:p>
     <w:p>
@@ -2313,7 +2313,7 @@
         <w:jc w:val="both"/>
       </w:pPr>
       <w:r>
-        <w:t>知识蒸馏的核心是利用教师输出中的软信息。设教师在某一位置给出分布 p，学生给出分布 q，蒸馏目标可由两者之间的距离定义。与 one-hot 标签相比，软目标保留了教师对多个候选 token 的相对偏好；但在自回归任务中，分布匹配还会受到前缀状态、采样方式和序列长度的影响。f-divergence 视角把多种分布距离纳入统一框架，可用于解释序列级蒸馏目标[6]。</w:t>
+        <w:t>知识蒸馏的有效信息来自教师对多个候选的概率分配。在给定生成位置，软目标比 one-hot 标签提供更多相对偏好；进入自回归任务后，前缀来源、采样协议和序列长度也会影响这一偏好的作用。f-divergence 视角将若干分布匹配目标纳入同一框架，为分析序列级蒸馏提供了工具[6]。</w:t>
       </w:r>
     </w:p>
     <w:p>
@@ -2322,7 +2322,7 @@
         <w:jc w:val="both"/>
       </w:pPr>
       <w:r>
-        <w:t>国内近期研究已经将讨论推进到大模型的具体后训练与轻量化环节。吴春志等系统比较了全参数、部分参数、新增参数与无参数微调方法在训练开销和任务适配能力上的差异[28]；舒善富等则直接面向代码大模型，采用自适应知识蒸馏协调正向与反向KL散度，以缓解单一散度在不同概率区域的学习偏差[29]。</w:t>
+        <w:t>国内研究已将大模型后训练与轻量化方案作为具体对象。吴春志等比较了全参数、部分参数、新增参数和无参数微调的训练开销及适配方式[28]；舒善富等面向代码大模型，以自适应知识蒸馏协调正向与反向 KL 散度，讨论单一散度对不同概率区域的学习偏好[29]。这些工作为本课题选择 LoRA 学生和分析散度目标提供了参照。</w:t>
       </w:r>
     </w:p>
     <w:p>
@@ -2745,7 +2745,7 @@
         <w:jc w:val="both"/>
       </w:pPr>
       <w:r>
-        <w:t>实际系统既可以先进行 SFT、再实施 OPD，也可以同时引入教师反馈与任务奖励。本文聚焦 LoRA-OPD 路线，将学生策略采样对应的到访状态、教师与学生的分布匹配目标、有限教师反馈的监督粒度作为三个研究变量；RLHF、DPO 等方法用于说明后训练背景。</w:t>
+        <w:t>实际系统可以在 SFT 后继续进行 OPD，也可能同时引入教师反馈和任务奖励。本文选择 LoRA-OPD 路线，将学生到访状态、师生分布匹配目标和教师反馈粒度作为主要变量；RLHF 与 DPO 用于交代相关后训练背景。</w:t>
       </w:r>
     </w:p>
     <w:p>
@@ -2759,7 +2759,7 @@
           <w:rFonts w:ascii="Times New Roman" w:hAnsi="Times New Roman" w:eastAsia="宋体"/>
           <w:sz w:val="24"/>
         </w:rPr>
-        <w:t>经典知识蒸馏通过温度缩放揭示教师分布中类别之间的相对关系[1]。Kim 和 Rush 随后把蒸馏扩展到序列级目标，用教师生成的序列替代或补充原始标签[2]。这些工作奠定了生成模型蒸馏的基本范式，但其训练样本通常来自固定语料或教师轨迹，学生在实际推理中产生的前缀仍未充分进入训练分布。</w:t>
+        <w:t>经典知识蒸馏通过温度缩放呈现教师分布中类别之间的相对关系[1]。Kim 和 Rush 将蒸馏扩展到序列级，用教师生成结果替代或补充原始目标[2]。固定语料和教师轨迹为学生提供了稳定样本，但学生推理时产生的偏离前缀仍可能缺少直接监督。</w:t>
       </w:r>
     </w:p>
     <w:p>
@@ -2773,7 +2773,7 @@
           <w:rFonts w:ascii="Times New Roman" w:hAnsi="Times New Roman" w:eastAsia="宋体"/>
           <w:sz w:val="24"/>
         </w:rPr>
-        <w:t>DAgger 揭示了模仿学习中与语言生成高度相关的误差累积问题：学习器在部署时依据自身预测不断推进状态，早期错误会改变后续输入分布，使离线监督逐步失效[3]。ImitKD 将这一思想引入神经机器翻译，在学生生成的状态上查询教师并开展交互式蒸馏[4]。因此，在线策略蒸馏的关键并非单纯使用更强的教师，而是让教师在学生真正会访问的序列状态上提供监督。</w:t>
+        <w:t>DAgger 研究模仿学习中的误差累积：学习器依据自身预测推进状态，早期错误会改变后续输入分布，使固定数据上的监督逐渐失配[3]。ImitKD 将交互式蒸馏用于神经机器翻译，在学生生成的状态上查询教师[4]。沿着这一思路，在线策略蒸馏让教师在学生实际访问的前缀上评分，从而使训练状态更接近推理过程。</w:t>
       </w:r>
     </w:p>
     <w:p>
@@ -2798,7 +2798,7 @@
         <w:jc w:val="both"/>
       </w:pPr>
       <w:r>
-        <w:t>自回归模型训练时通常读取参考序列前缀，推理时却只能依赖自身生成的前缀。DAgger 在学生到访状态上查询专家标签[3]，ImitKD 将这一思路用于自回归知识蒸馏[4]。OPD 延续了相同的基本动机，并把专家反馈从离散动作扩展为教师模型的 token 分布或对数概率。</w:t>
+        <w:t>自回归模型在训练中常读取参考序列前缀，推理时则依赖自身生成结果。DAgger 在学习器到访状态上查询专家[3]，ImitKD 将这一做法用于自回归蒸馏[4]。OPD 继承了学生状态上的监督方式，并进一步利用教师的 token 分布或对数概率提供软反馈。</w:t>
       </w:r>
     </w:p>
     <w:p>
@@ -2807,7 +2807,7 @@
         <w:jc w:val="both"/>
       </w:pPr>
       <w:r>
-        <w:t>GKD 在学生自生成的错误上进行蒸馏，并比较不同生成方式和散度设置[7]；MiniLLM 从序列级目标出发讨论 Reverse KL 的模式选择特性[8]；DistiLLM 通过 skew KL 与样本复用探索效果和成本之间的平衡[9]。SWITCH 进一步指出，学生生成序列可能包含噪声或偏差，并通过选择性教师介入改善长序列蒸馏[10]。</w:t>
+        <w:t>GKD 使学生在自生成轨迹上接受教师指导，并比较生成方式与散度设置[7]。MiniLLM 从序列级目标讨论 Reverse KL 的模式选择倾向[8]；DistiLLM 则结合 skew KL 和样本复用，权衡效果与开销[9]。SWITCH 注意到学生生成序列中的噪声，通过选择性教师介入改善长序列蒸馏[10]。这些研究分别触及状态来源、匹配目标和教师反馈成本。</w:t>
       </w:r>
     </w:p>
     <w:p>
@@ -2816,7 +2816,7 @@
         <w:jc w:val="both"/>
       </w:pPr>
       <w:r>
-        <w:t>近期研究把 OPD 的关注点推进到效率、稳定性和监督适配。前缀蒸馏表明，较短的学生生成前缀可以保留主要训练信号并显著降低计算量[11]；Veto 通过重构目标分布抑制低置信度 token 上的有害梯度，并在性能与多样性之间进行调节[12]；PromptKD 则从学生友好监督的角度改善教师知识的可学习性[13]。TACL 的模型压缩综述和 ACL 的蒸馏设计空间研究进一步说明，知识蒸馏需要同时考虑目标函数、师生能力差距和计算预算[14][15]。</w:t>
+        <w:t>近期 OPD 研究进一步关注效率、稳定性和监督适配。前缀蒸馏发现，较短的学生前缀在其设置下保留了主要训练信号，并降低计算量[11]；Veto 通过重构目标分布调节低置信度 token 的梯度及生成多样性[12]；PromptKD 从学生可学习性出发调整教师监督[13]。模型压缩综述与蒸馏设计空间研究也指出，目标函数、师生能力差距和计算预算需要共同考虑[14][15]。</w:t>
       </w:r>
     </w:p>
     <w:p>
@@ -2825,7 +2825,7 @@
         <w:jc w:val="both"/>
       </w:pPr>
       <w:r>
-        <w:t>为形成可比较的实验框架，本文从三个层面描述 OPD：学生生成哪些训练状态，教师分布通过何种散度转化为梯度，以及教师在每个状态返回多少词表信息。GKD 的散度比较、MiniLLM 的序列级目标和 DistiLLM 的反馈复用在这些层面各有侧重。后续实验将分别记录状态来源、目标定义与反馈支持集，避免把三个环节的作用混为一谈。</w:t>
+        <w:t>比较 OPD 方法时，需要同时交代学生生成了哪些训练状态、教师分布通过什么目标产生梯度，以及每个状态保留了多少词表信息。GKD 的散度比较、MiniLLM 的序列目标和 DistiLLM 的反馈复用侧重点各异。本文分别记录状态来源、目标定义和反馈支持集，以便解释各环节对工具调用结果的影响。</w:t>
       </w:r>
     </w:p>
     <w:p>
@@ -2834,7 +2834,7 @@
         <w:jc w:val="both"/>
       </w:pPr>
       <w:r>
-        <w:t>教师能力能否有效传递，还取决于师生模型的兼容程度。推理模式、输出格式或工具调用习惯的差异会改变教师在学生状态上提供的信号，学生容量也会限制其吸收完整教师分布的能力。SWITCH、PromptKD 与稳定化 OPD 的研究分别从学生轨迹噪声、学生友好监督和目标重构角度说明，教师更强并不等于监督天然有效[10][12][13]。这些结论为本文分析师生分布重叠与格式错误提供了依据。</w:t>
+        <w:t>师生兼容性也影响知识传递。推理模式、输出格式和工具调用习惯的差异，会改变教师在学生前缀上给出的概率分布；学生容量则限制其拟合能力。SWITCH、PromptKD 和稳定化 OPD 分别讨论学生轨迹噪声、学生友好监督与目标重构[10][12][13]。本文将在实验中记录格式错误与师生支持集重叠，检查这些因素是否干扰散度和稀疏反馈的比较。</w:t>
       </w:r>
     </w:p>
     <w:p>
@@ -2848,7 +2848,7 @@
           <w:rFonts w:ascii="Times New Roman" w:hAnsi="Times New Roman" w:eastAsia="宋体"/>
           <w:sz w:val="24"/>
         </w:rPr>
-        <w:t>在线策略蒸馏改变的不只是教师 logits 所对应的数据批次，更重要的是训练状态的来源。GKD 允许学生在训练过程中生成序列，并在这些到访状态上接受教师分布监督，同时把传统 Forward KL 扩展为可配置的散度族[7]。MiniLLM 采用 Reverse KL 的序列级目标，使学生更集中地拟合与自身轨迹相容的教师高概率区域[8]。DistiLLM 进一步利用 skew KL 和自适应采样缓和纯 Reverse KL 的模式选择倾向，并讨论教师反馈的复用效率[9]。这些工作表明，状态分布、散度方向和教师信息获取方式是彼此关联但不可互相替代的设计变量。</w:t>
+        <w:t>OPD 的关键变化是训练状态来自学生生成。GKD 在学生到访前缀上施加教师分布监督，并比较多种散度[7]；MiniLLM 的序列级 Reverse KL 更强调学生轨迹附近的教师高概率区域[8]；DistiLLM 通过 skew KL 和样本复用研究训练效果及反馈效率[9]。文献中的差异同时涉及状态、目标和信息获取方式，后续比较需要把这些变量分别固定或记录。</w:t>
       </w:r>
     </w:p>
     <w:p>
@@ -2862,7 +2862,7 @@
           <w:rFonts w:ascii="Times New Roman" w:hAnsi="Times New Roman" w:eastAsia="宋体"/>
           <w:sz w:val="24"/>
         </w:rPr>
-        <w:t>研究重点也逐渐从“是否使用学生生成数据”转向“哪些学生状态值得接受教师监督”。前缀蒸馏通过缩短学生轨迹降低在线采样成本[11]，稳定化 OPD 则针对早期训练中的噪声反馈和异常梯度重新构造目标[12]。PromptKD 说明教师输出是否适合学生学习同样会影响蒸馏效果[13]。因此，本文不把 OPD 视为单一算法，而把它作为一个受控实验框架，在相同数据、模型、预算和评测协议下分别考察状态分布、散度目标和监督粒度。</w:t>
+        <w:t>随着学生生成数据进入训练，研究进一步追问哪些到访位置值得监督。前缀蒸馏以较短轨迹降低采样成本[11]；稳定化 OPD 处理早期噪声反馈与异常梯度[12]；PromptKD 关注教师信号能否被学生有效吸收[13]。本文据此建立受控实验：共享模型、数据、预算和评测协议，分别考察状态位置、散度目标及反馈粒度。</w:t>
       </w:r>
     </w:p>
     <w:p>
@@ -3557,7 +3557,7 @@
         <w:jc w:val="both"/>
       </w:pPr>
       <w:r>
-        <w:t>Forward KL 以教师概率加权，倾向于要求学生覆盖教师分布中的多个高质量区域；Reverse KL 以学生概率加权，更关注学生自身可能生成的区域。文献常用 mode-covering 和 mode-seeking 概括两者的倾向，但这只是解释生成行为的启发式描述，实际训练结果还取决于模型容量、温度、采样策略和支持集[7][8]。</w:t>
+        <w:t>Forward KL 以教师概率加权，鼓励学生覆盖教师认为合理的区域；Reverse KL 以学生概率加权，更关注当前学生容易生成的候选。mode-covering 与 mode-seeking 概括了两种倾向[7][8]，但模型容量、温度、采样协议和支持集都会影响实际梯度与生成行为。本文将从函数选择和参数生成等具体位置观察这些差异。</w:t>
       </w:r>
     </w:p>
     <w:p>
@@ -4007,7 +4007,7 @@
         <w:jc w:val="both"/>
       </w:pPr>
       <w:r>
-        <w:t>本文选取 JSD、skew KL 等代表性目标，与 Forward KL、Reverse KL 一起在完整词表上比较。分析不仅记录最终准确率，还跟踪不同目标在函数入口、参数与结构 token 上产生的梯度、熵变化和错误类型；目标函数、混合参数、温度、有效位置及估计方式均保持可追溯。</w:t>
+        <w:t>研究选择 JSD 和 skew KL 作为广义散度代表，与 Forward KL、Reverse KL 一起在完整词表上比较。除最终调用准确率外，还分析函数入口、参数和结构 token 上的梯度、熵变化及错误分布。目标函数、混合参数、温度、有效位置和估计方式均随实验配置记录。</w:t>
       </w:r>
     </w:p>
     <w:p>
@@ -4016,7 +4016,7 @@
         <w:jc w:val="both"/>
       </w:pPr>
       <w:r>
-        <w:t>散度方向在 Function Calling 中可能对应不同的生成行为。面对同一用户请求，教师可能为多个函数或不同参数表达赋予合理概率；Forward KL 更强调覆盖这些候选区域，Reverse KL 更关注学生已经形成的高概率选择，广义散度则在二者之间调节。实验将从工具选择、参数生成、格式正确性和拒答行为四个方面分析这种差异。</w:t>
+        <w:t>散度偏好可能在 Function Calling 中表现为不同决策。面对同一请求，教师可能同时认可多个函数或参数表达；学生则可能过早集中到某个调用路径。本文比较各目标下的函数误选、过度调用、参数错误和格式错误，结合相同位置的概率与梯度，判断分布匹配目标如何影响完整调用。</w:t>
       </w:r>
     </w:p>
     <w:p>
@@ -4025,7 +4025,7 @@
         <w:jc w:val="both"/>
       </w:pPr>
       <w:r>
-        <w:t>教师信息的保留范围和估计方式会改变实际优化的对象。全词表方案保留有效位置上的完整教师分布；Top-K 方案仅保留指定支持集中的高概率信息，并明确截断后的重归一化与支持集外概率处理；K1 sampled-token 则用单个采样 token 估计相应期望。比较时将同时记录信息覆盖范围、教师前向次数、学生生成量、训练资源与任务指标。</w:t>
+        <w:t>教师反馈的范围与估计方式同样改变训练目标。完整词表保留有效位置上的全部概率；Top-K 只返回选定支持集，需要明确截断后的归一化及支持集外质量处理；K1 sampled-token 用单次采样估计相应期望。比较时将一并记录信息覆盖范围、教师评分时间、学生生成量、反馈字节数和任务结果。</w:t>
       </w:r>
     </w:p>
     <w:p>
@@ -4039,7 +4039,7 @@
           <w:rFonts w:ascii="Times New Roman" w:hAnsi="Times New Roman" w:eastAsia="宋体"/>
           <w:sz w:val="24"/>
         </w:rPr>
-        <w:t>从分布几何看，只要教师对某个 token 赋予不可忽略的概率，Forward KL 就会对学生过低的概率施加较大惩罚，因此具有覆盖倾向；Reverse KL 更强调学生当前支持集中的概率质量，更新容易集中到少数高概率模式。前者有利于保留教师分布中次优但合理的候选，后者在学生容量有限时可能更符合“优先学会最可能答案”的资源分配方式[8][9]。不过，温度、序列长度、有效 token mask 和支持集截断方式都会影响这种差异，不能只根据损失名称推断最终表现。</w:t>
+        <w:t>从目标的加权方式看，教师赋予某个 token 较高概率时，Forward KL 会惩罚学生在该 token 上过低的概率；Reverse KL 更强调学生当前高概率区域的匹配。前者可能保留多种合理候选，后者可能帮助容量有限的学生优先学习主要调用路径[8][9]。这些倾向还受温度、有效位置、序列长度与支持集处理影响，需要结合实际梯度和调用结果判断。</w:t>
       </w:r>
     </w:p>
     <w:p>
@@ -4053,7 +4053,7 @@
           <w:rFonts w:ascii="Times New Roman" w:hAnsi="Times New Roman" w:eastAsia="宋体"/>
           <w:sz w:val="24"/>
         </w:rPr>
-        <w:t>广义散度为分布覆盖与模式选择提供了连续的折中空间。GKD 用可调散度族统一若干常见目标[7]，DistiLLM 通过 skew KL 调节两种偏好[9]，稳定化 OPD 则说明目标分布的构造会直接影响低置信度 token 上的梯度和生成多样性[12]。对小模型而言，Top-K 截断后的重归一化、教师概率下界、混合精度下的 log-sum-exp 和序列 mask 都会改变梯度尺度。本文将散度定义、支持集协议和稳定化实现一并记录，使结论能够追溯到具体计算过程。</w:t>
+        <w:t>广义散度提供了调节覆盖与集中程度的目标族。GKD 比较可配置的散度[7]，DistiLLM 使用 skew KL[9]，稳定化 OPD 则显示目标分布的构造会影响低置信度 token 的梯度[12]。在小模型上，Top-K 归一化、教师概率下界、混合精度计算和序列 mask 还可能改变数值尺度。因此，本课题将同时记录数学定义与具体实现协议。</w:t>
       </w:r>
     </w:p>
     <w:p>
@@ -4078,7 +4078,7 @@
         <w:jc w:val="both"/>
       </w:pPr>
       <w:r>
-        <w:t>在线策略蒸馏把教师监督带到学生真实访问的前缀上[7]，却也使教师需要在大量生成位置返回分布。完整词表反馈保留全部候选的相对关系，存储和传输开销随词表及序列长度增长。Top-K 只保留少量高概率候选，K1 sampled-token 则以单样本估计进一步压缩反馈。前缀蒸馏和蒸馏设计空间研究表明，反馈预算已经成为在线方法能否实施的重要约束[11][15]。</w:t>
+        <w:t>OPD 需要教师在学生访问的大量位置返回反馈[7]。完整词表保存候选之间的细粒度关系，其存储和传输量随词表与序列长度增长；Top-K 减少显式候选，K1 sampled-token 进一步压缩为单点估计。前缀蒸馏和蒸馏设计空间研究显示，反馈预算是在线方法的重要工程条件[11][15]。</w:t>
       </w:r>
     </w:p>
     <w:p>
@@ -4087,7 +4087,7 @@
         <w:jc w:val="both"/>
       </w:pPr>
       <w:r>
-        <w:t>稀疏反馈改变了训练目标。Sparse Logit Sampling 指出，直接缓存教师 Top-K 会产生有偏的分布估计[30]。TA-OPD 进一步发现，当师生都在教师 Top-K 内归一化时，目标忽略支持集外的总概率，学生尾部概率与熵可能在训练中上升；该工作用一个尾部类别保留剩余概率总量[31]。TT-OPD 与 ResOPD 则利用采样残差修正稀疏估计[32][34]。尾部总量的补偿已有明确先行工作。</w:t>
+        <w:t>稀疏化同时改变了优化对象。Sparse Logit Sampling 指出，直接缓存教师 Top-K 会使分布估计产生偏差[30]。TA-OPD 发现，师生分布若都在教师 Top-K 内归一化，训练目标便失去支持集外总概率的约束；该工作加入尾部类别保留剩余质量[31]。TT-OPD 与 ResOPD 利用采样残差修正稀疏估计[32][34]。因此，尾部总量补偿已有明确的先行方案。</w:t>
       </w:r>
     </w:p>
     <w:p>
@@ -4101,7 +4101,7 @@
           <w:rFonts w:ascii="Times New Roman" w:hAnsi="Times New Roman" w:eastAsia="宋体"/>
           <w:sz w:val="24"/>
         </w:rPr>
-        <w:t>另一类信息损失与总概率大小无关。Shen 等在多教师工具调用蒸馏中发现，即使教师 Top-K 覆盖几乎全部教师概率，也可能漏掉学生高估的工具调用入口 token；该坐标的修正会改变完整调用行为[33]。质量覆盖率因此无法单独衡量决策梯度是否完整。尾部类别可以约束“其余 token 合计多少概率”，但无法区分尾部中哪一个函数入口或结构 token 应被单独修正。</w:t>
+        <w:t>总概率之外，还可能遗漏具体决策坐标。Shen 等在多教师工具调用蒸馏中观察到，教师 Top-K 即便覆盖几乎全部教师质量，也可能漏掉学生高估的工具调用入口 token；修正该 token 会改变后续调用行为[33]。教师质量覆盖率因此不足以说明决策梯度是否得到保留。尾部类别约束剩余概率之和，却无法逐一纠正尾部函数入口或结构 token。</w:t>
       </w:r>
     </w:p>
     <w:p>
@@ -4115,7 +4115,7 @@
           <w:rFonts w:ascii="Times New Roman" w:hAnsi="Times New Roman" w:eastAsia="宋体"/>
           <w:sz w:val="24"/>
         </w:rPr>
-        <w:t>现有工作分别处理了尾部总量、估计偏差和遗漏的学生候选[31][32][33][34]。对单教师、单轮 Function Calling 而言，关键问题进一步落在资源分配上：哪些生成位置需要显式保留低教师概率、高学生概率的决策 token，哪些位置可使用较小的支持集？全局增大 K 会提高反馈成本，仅按教师累计概率选 K 仍可能漏掉学生偏好的关键坐标。本文因此把位置风险、候选保留和反馈预算放入同一个方法设计。</w:t>
+        <w:t>已有研究分别处理尾部总量、稀疏估计偏差和学生候选遗漏[31][32][33][34]。在单教师、单轮 Function Calling 中，还需要决定有限反馈应分配到哪些位置和候选。全局增大 K 会增加传输成本；只按教师累计质量选 K，也可能保留了许多普通 token，却错过学生高估的调用入口。本文据此研究位置风险、显式候选与反馈预算的联合选择。</w:t>
       </w:r>
     </w:p>
     <w:p>
@@ -4140,7 +4140,7 @@
         <w:jc w:val="both"/>
       </w:pPr>
       <w:r>
-        <w:t>ReAct 将语言模型的推理过程与外部行动交替组织，为工具增强模型提供了通用范式[21]。围绕 Function Calling，现有研究又形成了从 API 文档理解、函数检索和调用规划到执行评测的多条路线：Gorilla/APIBench 关注 API 文档与调用正确性[22]；API-Bank 覆盖工具规划、API 检索和调用[23]；ToolLLM/ToolBench 构造了大量与真实 API 相关的任务，并讨论多工具与多步调用[24]；APIGen 强调可执行 API、格式检查和语义验证[25]；ToolACE 则利用 API 池和多层检查生成多样化的函数调用数据[26]。</w:t>
+        <w:t>ReAct 将模型推理与外部行动交替组织，为工具增强生成提供了基础形式[21]。Function Calling 数据随后覆盖 API 文档理解、函数检索、调用规划和执行验证：Gorilla/APIBench 侧重文档与调用正确性[22]，API-Bank 扩展到工具规划和检索[23]，ToolLLM/ToolBench 提供多工具任务[24]，APIGen 与 ToolACE 则重视调用数据的构造及质量检查[25][26]。这些数据的任务范围与标注方式各不相同，需要先明确本课题可统一使用的单轮样本。</w:t>
       </w:r>
     </w:p>
     <w:p>
@@ -4149,7 +4149,7 @@
         <w:jc w:val="both"/>
       </w:pPr>
       <w:r>
-        <w:t>本文将从公开 Function Calling 数据中筛选训练样本。APIGen、ToolACE、API-Bank 和 ToolBench 可为数据来源选择、任务分类和评测设计提供参考。数据准备阶段将记录数据快照、许可证、字段映射、过滤规则、重复样本处理方式，以及与独立测试集的重叠检查结果。</w:t>
+        <w:t>训练样本拟从公开 Function Calling 数据中筛选。APIGen、ToolACE、API-Bank 和 ToolBench 的数据构造方式可作为来源选择与任务分类的参考。每个来源将记录数据快照、许可证、字段映射、过滤规则、去重过程，以及与独立测试集的重叠情况。</w:t>
       </w:r>
     </w:p>
     <w:p>
@@ -4158,7 +4158,7 @@
         <w:jc w:val="both"/>
       </w:pPr>
       <w:r>
-        <w:t>公开数据进入训练流程前，需要通过结构、语义和执行三类检查。结构检查关注工具 schema、函数名、参数类型和目标调用能否统一解析；语义检查判断用户问题与目标工具、目标参数是否一致；执行检查验证调用能否在本地模拟环境中运行，并产生可供后续对话使用的结果。APIGen 和 ToolACE 的多层检查方法为这一审计流程提供了参考[25][26]。</w:t>
+        <w:t>公开样本进入训练流程前，需依次检查结构、语义和可执行性。结构检查核对 schema、函数名、参数类型及目标调用的解析结果；语义检查判断用户请求与目标函数、参数之间的关系；对具备本地工具环境的样本，执行检查进一步验证参数能否产生有效返回。APIGen 和 ToolACE 的多层验证方式为数据审计提供了参考[25][26]。</w:t>
       </w:r>
     </w:p>
     <w:p>
@@ -4167,7 +4167,7 @@
         <w:jc w:val="both"/>
       </w:pPr>
       <w:r>
-        <w:t>训练集与测试集还应避免工具 schema、用户问题模板和目标调用的重复。如果训练数据与 BFCL 或其他独立测试集共享相同的 API 定义，模型表现可能来自记忆而非泛化；即使工具名称不同，只要参数结构高度相似，也应在分析中说明潜在泄漏。最终的数据审计报告将保存字段统计、异常类别、去重规则和版本指纹。</w:t>
+        <w:t>训练集与测试集还须检查工具 schema、问题模板和目标调用的相似性。若两个集合共享 API 定义或高度相近的参数结构，模型可能依赖样本记忆，评价时应标注这一风险。数据审计报告将保存字段统计、异常类别、去重规则及版本指纹，使划分方式可以复查。</w:t>
       </w:r>
     </w:p>
     <w:p>
@@ -4176,7 +4176,7 @@
         <w:jc w:val="both"/>
       </w:pPr>
       <w:r>
-        <w:t>BFCL 覆盖结构化调用、并行调用、串行调用和拒答等场景[27]。本文将结合公开 Function Calling 测试规范与自建模拟函数，分别评估格式合法率、函数选择准确率、参数准确率、调用执行成功率和端到端任务成功率。</w:t>
+        <w:t>BFCL 覆盖结构化调用、并行与串行调用以及拒答场景[27]。本课题结合公开基准和可用的模拟函数，分别评价格式合法率、函数选择准确率与参数正确率；执行成功率和端到端成功率仅用于具有可靠执行环境的样本。</w:t>
       </w:r>
     </w:p>
     <w:p>
@@ -4190,7 +4190,7 @@
           <w:rFonts w:ascii="Times New Roman" w:hAnsi="Times New Roman" w:eastAsia="宋体"/>
           <w:sz w:val="24"/>
         </w:rPr>
-        <w:t>Function Calling 数据经历了从少量人工接口描述到大规模合成、执行校验和难例生成的发展。Gorilla 关注 API 检索与调用生成[22]；API-Bank 与 ToolLLM/ToolBench 将多工具、多轮交互和工具学习过程纳入数据构造[23][24]；APIGen 强调可验证的数据生成流程[25]；ToolACE 进一步扩展了工具类型和调用模式[26]。这些数据集在 schema 形式、参数约束、对话模板和可执行性上并不完全一致，直接拼接容易把模板差异误判为模型能力差异。因此，字段映射、去重、可解析性检查和 schema 一致性审计是方法比较的必要前提。</w:t>
+        <w:t>Function Calling 数据从接口描述与人工样例，发展到大规模构造、执行校验和难例设计。Gorilla 强调 API 检索与调用生成[22]；API-Bank 和 ToolLLM/ToolBench 引入多工具与多轮交互[23][24]；APIGen、ToolACE 则扩展可验证的数据生成流程和工具类型[25][26]。不同来源在 schema 形式、参数约束、消息模板和可执行性上存在差异。字段映射与一致性审计因此是后续蒸馏比较的前提。</w:t>
       </w:r>
     </w:p>
     <w:p>
@@ -4204,7 +4204,7 @@
           <w:rFonts w:ascii="Times New Roman" w:hAnsi="Times New Roman" w:eastAsia="宋体"/>
           <w:sz w:val="24"/>
         </w:rPr>
-        <w:t>在评测方面，Berkeley Function Calling Leaderboard 通过真实与合成场景检验函数选择、参数生成及多轮调用能力，为统一测试提供了较成熟的任务划分[27]。但总体准确率会掩盖具体错误来源：模型可能选错函数、遗漏必需参数、生成无法解析的 JSON，或在无需调用时过度调用。本文将在统一解码协议下分层统计结构合法率、函数选择正确率、参数级正确性和端到端成功率，并把训练效率、推理吞吐与显存占用纳入分析。这样既能对应公开评测，也能解释不同蒸馏目标和监督粒度产生差异的原因。</w:t>
+        <w:t>BFCL 为函数选择、参数生成和多轮调用提供了统一测试框架[27]。总体准确率之外，还需区分函数误选、必需参数遗漏、JSON 解析失败及无需调用时的过度调用。本文在统一解码协议下分层报告结构合法性、函数和参数正确率；具备执行条件时再加入执行与端到端结果，并结合训练效率、推理吞吐及显存解释方法差异。</w:t>
       </w:r>
     </w:p>
     <w:p>
@@ -4218,7 +4218,7 @@
           <w:rFonts w:ascii="Times New Roman" w:hAnsi="Times New Roman" w:eastAsia="宋体"/>
           <w:sz w:val="24"/>
         </w:rPr>
-        <w:t>Function Calling 提供了检验三个研究环节的可观察结果。函数入口和函数名决定是否调用工具及调用哪一个工具，参数键、结构符号和参数值影响 schema 合法性、解析与执行。公开数据和 BFCL 等评测允许把这些错误分开统计[25][26][27]。本文将学生状态的分层错误、完整词表散度的行为差异，以及稀疏反馈下的尾部质量与决策坐标遗漏，分别对应到函数误选、过度调用、格式错误和任务成功率。</w:t>
+        <w:t>Function Calling 为三个研究环节提供了分层观察点。函数入口及函数名决定调用路径，参数键、结构符号和参数值影响解析与执行。公开数据和 BFCL 等基准支持分别统计这些错误[25][26][27]。本文把学生状态上的错误分布、完整词表散度的行为差异，以及稀疏反馈的尾部质量与决策候选遗漏，对应到函数误选、过度调用、格式错误和可验证的任务结果。</w:t>
       </w:r>
     </w:p>
     <w:p>
@@ -4243,7 +4243,7 @@
         <w:jc w:val="both"/>
       </w:pPr>
       <w:r>
-        <w:t>现有研究为在线策略蒸馏提供了三个主要切入点。首先，GKD 等方法让教师在学生实际生成的前缀上评分，缓解训练与推理状态不一致的问题[7]。其次，Forward KL、Reverse KL、JSD 与 skew KL 对概率区域赋予不同权重，影响学生的覆盖、集中程度与训练稳定性[7][8][9][12]。再次，完整词表反馈较为充分，却需要较高的存储和传输成本；Top-K 与 sampled-token 方法以较少的教师信息换取可实施性[11][15][30]。状态、目标和反馈共同决定蒸馏效果，比较其中任何一项都需要固定另外两项。</w:t>
+        <w:t>现有 OPD 研究形成了三个相互关联的方向。GKD 等方法在学生生成的前缀上获取教师反馈，缓解状态分布偏移[7]；Forward KL、Reverse KL、JSD 和 skew KL 改变不同概率区域的学习权重[7][8][9][12]；完整词表、Top-K 与 sampled-token 反馈则提供不同的信息量与成本选择[11][15][30]。本课题以相同模型、任务和训练预算分别考察三者，逐步定位值得改进的环节。</w:t>
       </w:r>
     </w:p>
     <w:p>
@@ -4252,7 +4252,7 @@
         <w:jc w:val="both"/>
       </w:pPr>
       <w:r>
-        <w:t>上述切入点中，稀疏反馈留下了值得进一步研究的具体缺陷。教师 Top-K 内重新归一化会忽略支持集外的总概率，已有尾部类别方法对此作了补偿[31]；只看教师累计概率仍可能漏掉学生高估的工具调用决策 token，已有多教师研究揭示了这种风险[33]。采样修正也已用于缓解稀疏估计偏差[32][34]。这些结果尚不能直接推出单教师、单轮 Function Calling 中的最佳做法。本文在明确学生状态和散度目标的基础上，测量尾部总量与具体决策候选的遗漏，再研究固定反馈预算下的联合选择机制。</w:t>
+        <w:t>稀疏反馈暴露出两个具体问题。教师 Top-K 内归一化丢失支持集外的总量信息，已有尾部类别方法能够补偿[31]；按教师累计概率选择候选时，学生高估的工具调用决策 token 仍可能落在支持集外，多教师研究已有相关观察[33]。采样残差修正则提供另一类稀疏估计方案[32][34]。单教师、单轮调用中的问题规模及方法收益尚需测量。本文先确认学生状态与散度目标，再检验尾部总量和决策候选遗漏，最后比较固定反馈预算下的联合选择机制。</w:t>
       </w:r>
     </w:p>
     <w:p>
@@ -4293,7 +4293,7 @@
         <w:jc w:val="both"/>
       </w:pPr>
       <w:r>
-        <w:t>本文沿着“学生在哪里学习、分布目标如何引导学习、有限反馈保留什么信号”展开研究。首先建立单轮 Function Calling 的学生生成轨迹和教师同前缀评分，明确有效监督位置及错误类型；随后在相同轨迹上分析散度目标的概率权重与工具调用行为；最后固定主要训练目标，检验稀疏反馈是否遗漏有效信号，并针对 Top-K 的具体缺陷提出候选改进。前三项研究由一般 OPD 问题逐步进入可实施的方法设计。</w:t>
+        <w:t>研究依次回答三个问题：教师应在学生的哪些生成状态上提供反馈；不同散度如何影响小模型的更新与调用行为；有限的教师反馈又保留了多少有效信号。围绕单轮 Function Calling，先建立学生轨迹和同前缀评分，再在完整词表上分析散度，最后诊断 Top-K 截断并提出候选改进。前两个问题提供方法设计所需的状态与目标依据，第三个问题进入有限预算下的支持集选择。</w:t>
       </w:r>
     </w:p>
     <w:p>
@@ -4318,7 +4318,7 @@
         <w:jc w:val="both"/>
       </w:pPr>
       <w:r>
-        <w:t>第一，学生状态上的监督是否有效。学生自主生成时会访问教师示例未覆盖的前缀；在这些位置评分是 OPD 相对离线蒸馏的重要变化[7]。本文建立单轮工具调用轨迹与冻结教师评分流程，按函数入口、函数名、参数键、参数值和结构边界标注可可靠识别的位置。通过统一位置掩码、分层错误统计及少量状态使用对照，确认后续散度和稀疏反馈比较所依据的状态分布。</w:t>
+        <w:t>第一，研究学生状态上的监督。学生自主生成会进入教师示例未覆盖的前缀；OPD 在这些位置获取教师反馈[7]。本文建立单轮工具调用轨迹与冻结教师评分流程，依据消息边界和工具 schema 标注函数入口、函数名、参数键、参数值与结构位置。统一位置掩码后，比较各类位置的错误分布和监督使用情况，为散度与稀疏反馈实验提供可靠的状态基础。</w:t>
       </w:r>
     </w:p>
     <w:p>
@@ -4327,7 +4327,7 @@
         <w:jc w:val="both"/>
       </w:pPr>
       <w:r>
-        <w:t>第二，散度目标引导学生学习什么。Forward KL 侧重教师认为合理的候选，Reverse KL 更关注学生当前赋予较高概率的区域；JSD 和 skew KL 提供不同的混合与平滑方式[7][8][9][12]。本文在相同学生前缀、完整词表反馈和训练预算下，比较这些目标对函数选择、过度调用、熵、梯度及训练稳定性的影响，分析不同概率权重如何转化为工具调用行为，并据此确定稀疏反馈研究的主要损失方向。</w:t>
+        <w:t>第二，研究散度目标的学习偏好。Forward KL 重视教师认可的候选，Reverse KL 更关注学生当前容易生成的区域；JSD 与 skew KL 进一步调节两种分布的混合方式[7][8][9][12]。在相同学生前缀、完整词表反馈和训练预算下，本文比较函数选择、过度调用、熵、梯度与训练稳定性，分析概率权重如何作用于工具调用，并据此确定稀疏反馈实验的主要目标。</w:t>
       </w:r>
     </w:p>
     <w:p>
@@ -4336,7 +4336,7 @@
         <w:jc w:val="both"/>
       </w:pPr>
       <w:r>
-        <w:t>第三，有限反馈能否保留所选目标中的有效信号。在固定状态与主要散度方向后，比较完整词表、常规 Top-K 和 sampled-token 监督，定位压缩造成的目标偏差与估计波动[30][31][32]。重点检查 Top-K 外的尾部总概率，以及学生高概率而教师 Top-K 未覆盖的工具调用决策 token：前者改变概率总量约束，后者可能改变具体函数选择[31][33]。如果这些遗漏在本任务中具有可观察的梯度或行为影响，便进入第 3.3 节的方法改进。</w:t>
+        <w:t>第三，研究有限反馈的信息保真程度。在状态和主要散度方向固定后，比较完整词表、常规 Top-K 与 sampled-token 监督，测量目标偏差和估计波动[30][31][32]。分析重点是 Top-K 外的尾部总概率，以及学生高概率、教师 Top-K 未覆盖的决策 token：前者关系到概率质量约束，后者可能影响函数入口和调用路径[31][33]。若这些遗漏在本任务中产生可测的梯度或行为差异，再进入方法改进。</w:t>
       </w:r>
     </w:p>
     <w:p>
@@ -4361,7 +4361,7 @@
         <w:jc w:val="both"/>
       </w:pPr>
       <w:r>
-        <w:t>现有尾部类别方法能够保留支持集外的概率总量，却无法指出尾部中哪个 token 决定工具调用；只增大教师 Top-K 虽能覆盖更多候选，也会提高反馈量，且教师概率覆盖率不保证学生关键坐标得到修正[31][33]。针对这一缺口，本文拟构造决策感知的支持集：在学生生成的单轮调用中，依据工具 schema 和消息边界标记函数入口、函数名、参数键与结构位置；以教师 Top-K 为基础，检查学生高概率的合法决策候选，将漏选且可能改变调用路径的 token 补入，并取得教师对这些 token 的概率。</w:t>
+        <w:t>已有尾部类别方法保留支持集外的概率总量，却难以指出尾部中哪一个 token 影响工具调用；增大教师 Top-K 会提高反馈量，学生高估的关键候选仍可能遗漏[31][33]。本文拟在单轮调用中建立决策感知支持集：先依据 schema 与消息边界识别函数入口、函数名、参数键和结构位置，再从学生高概率的合法决策候选中找出教师 Top-K 漏掉的 token，补入支持集并取得相应教师概率。</w:t>
       </w:r>
     </w:p>
     <w:p>
@@ -4370,7 +4370,7 @@
         <w:jc w:val="both"/>
       </w:pPr>
       <w:r>
-        <w:t>补入后的显式候选与一个尾部类别共同组成蒸馏目标。尾部类别沿用已有方法表示支持集外的师生概率总量[31]；补入的决策 token 则接受单独的概率约束，使损失能够区分“尾部总量不符”和“某个具体调用候选被高估”。两项处理分别设置消融，并与已有学生感知支持集思路比较[33]。若教师接口只能返回 Top-K，额外候选的概率获取能力须先确认；反馈字节数、查询量和教师计算时间分别记录。</w:t>
+        <w:t>显式候选与一个尾部类别共同形成粗粒度目标。尾部类别沿用已有工作，保存支持集外的师生概率总量[31]；补入的决策 token 接受单独约束，使目标能够区分总体质量偏差与具体调用候选的高估。实验分别移除两项处理，并与已有学生感知支持集方法比较[33]。实现前需确认教师能否返回补入 token 的概率，训练记录则分别统计反馈字节数、额外查询量与教师计算时间。</w:t>
       </w:r>
     </w:p>
     <w:p>
@@ -4379,7 +4379,7 @@
         <w:jc w:val="both"/>
       </w:pPr>
       <w:r>
-        <w:t>在反馈预算固定时，本文进一步研究候选名额的分配。根据训练集诊断子集中的尾部质量差、关键 token 漏选率和完整词表梯度误差估计位置风险，在函数入口等高风险位置保留更多显式候选，在低风险位置缩小支持集。位置权重、K 的上限及阈值只由训练集和验证集确定。最终方法是“关键候选补入、尾部总量保留、位置预算分配”的待验证组合；三个组件均有相应的单独对照，方法贡献取决于同预算实验结果。</w:t>
+        <w:t>固定反馈预算下，还需确定各位置获得多少候选名额。本文利用训练集诊断子集的尾部质量差、关键 token 漏选率及完整词表梯度误差估计位置风险，在函数入口等位置保留更多显式候选，在风险较低的位置缩小支持集。位置权重、K 上限和阈值由训练集及验证集确定。关键候选补入、尾部总量保留与位置预算分配分别设置对照；联合方案的收益和适用范围由实验决定。</w:t>
       </w:r>
     </w:p>
     <w:p>
@@ -4404,7 +4404,7 @@
         <w:jc w:val="both"/>
       </w:pPr>
       <w:r>
-        <w:t>验证按三个研究切入点依次展开。先检查学生 rollout、教师同前缀评分、位置标注和结构化评测是否可靠；再固定轨迹与完整词表反馈，研究散度方向对梯度、熵和工具调用行为的影响。确定主要损失方向后，在同一批前缀上测量不同 K 的尾部总量、关键 token 漏选和相对完整词表的梯度误差。若遗漏在本任务中不显著，将依据观察结果收缩方法范围。</w:t>
+        <w:t>验证按研究链条推进。首先检查学生 rollout、教师同前缀评分、位置标注和结构化评测的可靠性；随后在固定轨迹与完整词表反馈下，分析散度对梯度、熵及工具调用行为的影响。主要目标确定后，再在相同前缀上测量不同 K 的尾部质量、关键 token 漏选率及相对完整词表的梯度误差。诊断结果决定候选方法的适用范围。</w:t>
       </w:r>
     </w:p>
     <w:p>
@@ -4413,7 +4413,7 @@
         <w:jc w:val="both"/>
       </w:pPr>
       <w:r>
-        <w:t>方法比较使用同一学生起点、教师、数据划分、生成协议、主要散度方向和有效训练 token 预算。常规 Top-K、已有尾部类别、仅补入决策候选、仅按位置分配 K 与完整联合方案构成主对照；各组匹配平均反馈条目数，并分别报告额外教师概率获取成本。完整词表提供信息参照，其他散度与 K1 sampled-token 作为机制和低反馈量边界分析。短程实验确认信号与行为的关联后，再决定正式训练规模。</w:t>
+        <w:t>方法比较共享学生起点、教师、数据划分、生成协议、主要散度和有效训练 token 预算。常规 Top-K、已有尾部类别、单独补入决策候选、单独分配位置 K 与完整方案构成主要对照；各组匹配平均反馈条目数，另行报告教师概率获取成本。完整词表提供信息参照，其他散度和 K1 sampled-token 分别用于机制与低反馈量分析。短程实验先检查信号与行为的联系，再决定正式训练规模。</w:t>
       </w:r>
     </w:p>
     <w:p>
@@ -4422,7 +4422,7 @@
         <w:jc w:val="both"/>
       </w:pPr>
       <w:r>
-        <w:t>研究预期形成三个相互支撑的结果：可复现的学生状态与工具调用错误分层，散度目标对概率权重和任务行为的机制分析，以及 Top-K 信息损失的诊断与同预算改进检验。除函数、参数和格式指标外，还报告损失、梯度、熵、反馈字节数、教师查询、时间和显存。方法是否优于现有稀疏反馈方案，须由实际实验判定。</w:t>
+        <w:t>预期形成三类可核查的研究材料：学生到访状态与工具调用错误的分层记录，散度目标的梯度和行为分析，以及 Top-K 信息损失与同预算改进的比较。函数、参数和格式指标将与损失、梯度、熵、反馈字节数、教师查询、时间和显存一起报告。最终根据实测结果判断候选方法相对已有稀疏反馈方案的价值。</w:t>
       </w:r>
     </w:p>
     <w:p>
@@ -4461,7 +4461,7 @@
         <w:jc w:val="both"/>
       </w:pPr>
       <w:r>
-        <w:t>图 1 展示研究问题的递进关系：先确定学生实际访问的状态，再分析散度目标如何改变更新方向，最后考察目标在 Top-K 稀疏反馈中保留了哪些信号。研究重点落在第三环节的具体缺陷及其改进，同时保持前两环节的独立分析与公平控制。尾部类别、采样修正和学生感知支持集已有先行工作[31][32][33][34]；本文将检验面向单轮工具调用的联合选择机制是否具有额外价值。</w:t>
+        <w:t>图 1 概括研究问题的递进关系：先确认学生访问的状态，再分析散度目标如何改变更新，最后考察 Top-K 反馈中丢失了哪些信号。第三环节承接前两个环节的诊断结果，聚焦尾部总量、决策候选和反馈预算。尾部类别、采样修正及学生感知支持集均有先行研究[31][32][33][34]；本课题将检验这些思路在单轮工具调用中联合使用的收益与边界。</w:t>
       </w:r>
     </w:p>
     <w:p>
@@ -4665,7 +4665,7 @@
         <w:jc w:val="both"/>
       </w:pPr>
       <w:r>
-        <w:t>总体路线从在线策略蒸馏的三个环节展开。学生在单轮 Function Calling 中生成轨迹，冻结教师在相同前缀评分，形成可重复的状态与位置集合；完整词表散度比较用于分析概率权重、梯度与工具调用行为，并确定主要损失方向；在该目标下诊断 Top-K 的尾部总量和决策 token 漏选；最后按位置风险分配 K、补入关键候选、保留尾部总概率，更新 LoRA 学生并进行分层评测。图 2 对应这一路径。</w:t>
+        <w:t>图 2 展示总体技术路线。学生在单轮工具调用中生成轨迹，冻结教师在同一前缀上给出反馈；据此获得可复查的状态和位置。研究先用完整词表比较散度对梯度与调用行为的影响，再固定主要目标，测量 Top-K 的尾部质量与决策 token 漏选。候选方法依据位置风险分配支持集名额，显式补入关键 token，并保留其余概率总量。最终以 LoRA 更新学生，通过分层任务指标和资源记录检验方法。</w:t>
       </w:r>
     </w:p>
     <w:p>
@@ -4674,7 +4674,7 @@
         <w:jc w:val="both"/>
       </w:pPr>
       <w:r>
-        <w:t>为使后续实验具有统一含义，本文先给出基本符号。任务输入来自既定的数据分布，学生策略负责生成响应序列，冻结的教师策略在相同学生前缀上给出条件分布。序列中的监督位置由二值掩码确定，具体符号和关系见下式。</w:t>
+        <w:t>下面统一记号。输入从数据分布中抽取，学生策略生成响应，冻结教师在相同学生前缀上给出条件分布。二值掩码标记接受监督的位置；师生使用一致的 tokenizer、模板与位置对齐规则。</w:t>
       </w:r>
     </w:p>
     <w:p>
@@ -5212,7 +5212,7 @@
         <w:jc w:val="both"/>
       </w:pPr>
       <w:r>
-        <w:t>在监督信息粒度和散度类型给定时，本文采用统一的在线策略蒸馏目标：</w:t>
+        <w:t>令上标 g 表示教师反馈方案，包括完整词表、常规 Top-K 及候选支持集。给定监督掩码和散度目标，统一蒸馏目标写为下式。每次更新将离散生成轨迹视为已采样数据，梯度沿学生分布和 LoRA 参数传播。</w:t>
       </w:r>
     </w:p>
     <w:tbl>
@@ -5725,7 +5725,7 @@
         <w:jc w:val="both"/>
       </w:pPr>
       <w:r>
-        <w:t>统一目标使状态选择、散度类型与反馈支持集可以分别定义和控制。先在完整词表上研究 Forward KL、Reverse KL、JSD 和 skew KL 的行为差异；完整词表 Reverse KL 作为当前拟定的信息参照，实际主要损失方向仍须结合前期诊断确定。常规子集归一化 Top-K 用于展示截断误差，已有尾部类别方法作为直接基线[31]。候选方法改变支持集：在关键位置补入学生高概率而教师 Top-K 漏掉的合法决策 token，其余概率归入尾部类别，位置 K 受总反馈预算约束。离散 rollout 提供训练状态，损失对学生 LoRA 参数反向传播。总体优化问题写为：</w:t>
+        <w:t>式（4-2）分别容纳状态选择、散度类型和反馈支持集。本文先在完整词表上比较 Forward KL、Reverse KL、JSD 与 skew KL，并从梯度及工具调用行为确定主要目标；Reverse KL 暂作信息参照。稀疏实验在固定目标下比较常规 Top-K、已有尾部类别方法[31]与决策感知候选方案。候选方案通过补入学生高概率的合法决策 token 扩展支持集，余下概率并为尾部类别；位置 K 的分配受反馈预算约束。总体优化问题为：</w:t>
       </w:r>
       <w:r>
         <w:rPr>
@@ -5986,7 +5986,7 @@
         <w:jc w:val="both"/>
       </w:pPr>
       <w:r>
-        <w:t>实验顺序先核实在策略状态与位置标注，再解释完整词表散度的优化偏好，随后定位固定主要散度下的稀疏反馈缺陷，并通过同预算消融检验候选方法。散度分析与反馈支持集实验分别报告，避免把损失方向变化误认为 Top-K 改进的收益。完整训练配置与原始指标用于追溯行为变化。</w:t>
+        <w:t>实验依次核实学生状态与位置标注、分析完整词表散度、诊断固定主要目标下的稀疏反馈，最后开展同预算方法对照及组件消融。散度实验与支持集实验分别报告，训练配置和原始指标保留到每个对照组，以便追溯调用行为的变化。</w:t>
       </w:r>
     </w:p>
     <w:p>
@@ -6114,7 +6114,7 @@
         <w:jc w:val="both"/>
       </w:pPr>
       <w:r>
-        <w:t>本文选择 Qwen3-0.6B 作为学生模型、Qwen3-4B 作为教师模型。二者属于同一模型家族，便于统一 tokenizer、特殊 token、消息模板和函数调用格式；教师参数始终冻结，学生仅更新低秩适配参数。对任一线性层的基础权重，LoRA 更新写为：</w:t>
+        <w:t>计划选用 Qwen3-0.6B 学生和 Qwen3-4B 教师。相同模型家族便于统一 tokenizer、特殊 token、消息模板和函数调用格式；教师冻结，学生仅更新低秩适配参数。具体版本与模板将在兼容性审计后确定。线性层采用以下 LoRA 参数化：</w:t>
       </w:r>
     </w:p>
     <w:tbl>
@@ -6287,7 +6287,7 @@
         <w:jc w:val="both"/>
       </w:pPr>
       <w:r>
-        <w:t>式中的两个可训练矩阵均为低秩矩阵；前者的行数等于低秩维度，后者的列数等于低秩维度，且该维度远小于原线性层的输入、输出维度。该参数化减少了显存占用，也使不同散度和监督粒度能够共享同一学生初始化与优化器设置[19]。模型家族及模板约定以 Qwen3 技术报告为依据[16]。</w:t>
+        <w:t>式（4-4）中，两个可训练矩阵的中间维度为低秩维度，远小于原线性层的输入和输出维度。LoRA 降低学生更新参数量，使各组散度和反馈实验能够共享同一初始化与优化器协议[19]。Qwen3 模型家族及模板约定以其技术报告为参考[16]。</w:t>
       </w:r>
     </w:p>
     <w:p>
@@ -6459,7 +6459,7 @@
         <w:jc w:val="both"/>
       </w:pPr>
       <w:r>
-        <w:t>上式依次将用户请求与工具 schema 作为单轮核心输入；若样本原本含有可验证的对话历史或工具返回，则保留为单独标记的扩展情形，不与单轮主实验混合。训练集、验证集和测试集采用独立划分，并满足以下互斥关系：</w:t>
+        <w:t>式（4-5）中的用户请求与工具 schema 构成单轮实验的主要输入；有可靠对话历史或工具返回的样本单独标记，在扩展分析中使用。训练、验证和测试集独立划分，满足下列互斥关系：</w:t>
       </w:r>
     </w:p>
     <w:tbl>
@@ -6744,7 +6744,7 @@
         <w:jc w:val="both"/>
       </w:pPr>
       <w:r>
-        <w:t>本文按照数据来源、接口模板和目标调用联合去重，避免同一工具定义或问题模板跨集合泄漏。API-Bank、ToolLLM/ToolBench、APIGen 和 ToolACE 为字段统一与样本筛选提供参考[23][24][25][26]。</w:t>
+        <w:t>数据按来源、接口模板和目标调用进行联合去重，并检查相似问题与工具定义跨集合出现的情况。API-Bank、ToolLLM/ToolBench、APIGen 和 ToolACE 为字段统一、样本筛选与质量审计提供了参考[23][24][25][26]。</w:t>
       </w:r>
     </w:p>
     <w:p>
@@ -6753,7 +6753,7 @@
         <w:jc w:val="both"/>
       </w:pPr>
       <w:r>
-        <w:t>数据审计围绕结构、语义和执行三层展开。结构层检查 JSON 与 schema 约束，语义层核对用户意图和目标函数；对于具备可用工具或模拟环境的样本，再检验参数能否产生有效返回。单轮主实验要求结构可解析、目标调用可核对；执行验证覆盖的样本另作标记，只在相应子集报告执行成功率。无法自动判定的样本保留失败原因并进行人工抽查。</w:t>
+        <w:t>数据审计分为结构、语义和执行三个层次。结构检查覆盖 JSON 解析与 schema 约束，语义检查核对用户意图和目标调用；具备本地工具或模拟环境的样本再接受执行验证。单轮主实验使用结构可解析、目标调用可核对的样本，执行成功率只在经过验证的子集上报告。自动规则难以判断的样本保留原因，并通过人工抽查确定处理方式。</w:t>
       </w:r>
     </w:p>
     <w:p>
@@ -6834,7 +6834,7 @@
         <w:jc w:val="both"/>
       </w:pPr>
       <w:r>
-        <w:t>对每个输入，学生按照固定温度、最大长度和停止条件进行 rollout。将当前生成位置的未归一化输出经过温度缩放后，实际采样策略写为：</w:t>
+        <w:t>学生 rollout 使用预先固定的温度、长度上限和停止规则。当前位置的 logits 经温度缩放后给出采样分布，整条生成序列的概率由各位置条件概率相乘得到：</w:t>
       </w:r>
     </w:p>
     <w:tbl>
@@ -7449,7 +7449,7 @@
         <w:jc w:val="both"/>
       </w:pPr>
       <w:r>
-        <w:t>教师不重新生成替代答案，而是在学生已经到达的前缀上评分，使监督对应学生可能实际访问的状态。对同一前缀，师生两侧分别计算 logits 并通过 softmax 得到条件概率分布。状态另按函数选择、参数键、参数值和结构标记分类；无法根据 schema 与解析规则可靠分类的位置单独记录，不把推测的错误位置当作已验证标签。</w:t>
+        <w:t>教师沿学生已生成的前缀评分，师生 logits 在同一 token 位置对齐，再由各自设定的温度得到条件分布。位置标注依据函数选择、参数键、参数值和结构标记的解析规则完成；无法可靠归类的 token 单列，错误成因留待轨迹分析确认。</w:t>
       </w:r>
     </w:p>
     <w:tbl>
@@ -7804,7 +7804,7 @@
         <w:jc w:val="both"/>
       </w:pPr>
       <w:r>
-        <w:t>有效位置由消息边界和工具调用边界共同确定。监督掩码同时检查当前位置是否属于 assistant 或 function-call 区域，以及该位置是否未被 padding 或截断排除，定义如下：</w:t>
+        <w:t>监督位置由消息边界、工具调用区域和序列截断共同确定。掩码筛选 assistant 或 function-call 区域中的有效 token，损失按有效位置数归一化：</w:t>
       </w:r>
     </w:p>
     <w:tbl>
@@ -8679,7 +8679,7 @@
         <w:jc w:val="both"/>
       </w:pPr>
       <w:r>
-        <w:t>表 4-1 给出各环节固定与记录的变量。所有对照组共享输入、生成协议、数据划分和有效位置定义。状态实验比较同预算下不同位置的监督，散度实验固定轨迹与完整词表反馈，稀疏反馈实验再固定主要散度方向。教师反馈记录 Top-K 累计概率、残余质量、决策 token 是否被保留及实际 K，以便分别归因于状态、目标和反馈支持集。训练、反馈与评测关系见图 3。</w:t>
+        <w:t>表 4-1 列出各环节需固定和记录的变量。所有对照组使用相同输入、生成协议、数据划分和有效位置定义。状态实验改变同预算下使用的位置；散度实验固定轨迹并提供完整词表反馈；稀疏实验进一步固定主要散度。教师反馈额外记录 Top-K 累计概率、尾部质量、决策 token 覆盖情况和实际 K，使结果能够对应具体研究变量。图 3 展示训练与评测流程。</w:t>
       </w:r>
     </w:p>
     <w:p>
@@ -8807,7 +8807,7 @@
         <w:jc w:val="both"/>
       </w:pPr>
       <w:r>
-        <w:t>在完整词表上，Forward KL 以教师概率作为权重，衡量学生是否覆盖教师认为合理的 token；其单位置形式为：</w:t>
+        <w:t>在完整词表上，Forward KL 按教师概率加权。当学生低估教师认可的 token 时，该目标会产生相应惩罚；单位置定义为：</w:t>
       </w:r>
     </w:p>
     <w:tbl>
@@ -9129,7 +9129,7 @@
         <w:jc w:val="both"/>
       </w:pPr>
       <w:r>
-        <w:t>Reverse KL 以学生概率作为权重，更集中地约束学生当前愿意生成的区域：</w:t>
+        <w:t>Reverse KL 按学生概率加权，更关注学生当前容易生成的区域，其单位置定义为：</w:t>
       </w:r>
     </w:p>
     <w:tbl>
@@ -9921,7 +9921,7 @@
         <w:jc w:val="both"/>
       </w:pPr>
       <w:r>
-        <w:t>当混合系数取零到一之间的值时，本文采用的教师侧 skew KL 写为：</w:t>
+        <w:t>skew KL 使用教师分布与学生分布的混合项，本文采用的教师侧形式为：</w:t>
       </w:r>
     </w:p>
     <w:tbl>
@@ -10260,7 +10260,7 @@
         <w:jc w:val="both"/>
       </w:pPr>
       <w:r>
-        <w:t>完整词表的 Forward KL、Reverse KL、JSD 和 skew KL 用于分析不同概率区域的学习权重[7][8][9][12]。在同一学生轨迹、温度和有效位置上，本文比较各目标的梯度方向、熵变化、函数误选与过度调用，再选定稀疏反馈实验的主要散度方向。后续 Top-K 对照固定该方向与支持集协议，保证观察到的差异来自教师反馈而非目标切换。</w:t>
+        <w:t>完整词表的 Forward KL、Reverse KL、JSD 和 skew KL 用于研究不同概率区域受到的学习权重[7][8][9][12]。在相同学生轨迹、温度和有效位置上，比较各目标的梯度、熵变化、函数误选与过度调用。确定稀疏实验的主要散度后，Top-K 对照保持该目标及其支持集协议一致。</w:t>
       </w:r>
     </w:p>
     <w:p>
@@ -10269,7 +10269,7 @@
         <w:jc w:val="both"/>
       </w:pPr>
       <w:r>
-        <w:t>表 4-2 将实验组织为完整词表散度分析、稀疏反馈诊断、同预算方法比较和组件消融。各组固定教师、学生起点、数据划分、生成协议与评价规则；散度分析固定反馈粒度，方法比较固定主要散度方向，并统一有效训练 token 数与更新步数。</w:t>
+        <w:t>表 4-2 按研究顺序组织完整词表散度分析、稀疏反馈诊断、同预算方法比较和组件消融。教师、学生起点、数据划分、生成协议与评价规则在各组保持一致；散度比较固定反馈粒度，方法比较固定主要散度，并统一有效训练 token 数及更新步数。</w:t>
       </w:r>
     </w:p>
     <w:p>
@@ -10929,7 +10929,7 @@
         <w:jc w:val="both"/>
       </w:pPr>
       <w:r>
-        <w:t>完整词表散度实验解释优化偏好并确定主要目标；稀疏诊断分别测量尾部总量、决策坐标与梯度误差；同预算比较检验决策感知支持集；组件消融辨别关键候选补入、尾部类别和位置预算各自的作用。K1 sampled-token 作为极低反馈量边界参照，单独报告估计波动。</w:t>
+        <w:t>完整词表实验分析优化偏好；稀疏诊断分别测量尾部总量、决策候选漏选和梯度误差；同预算比较检验扩展支持集的效果；组件消融评估候选补入、尾部类别与位置分配的作用。K1 sampled-token 作为低反馈量边界参照，单独统计估计波动。</w:t>
       </w:r>
     </w:p>
     <w:p>
@@ -10938,7 +10938,7 @@
         <w:jc w:val="both"/>
       </w:pPr>
       <w:r>
-        <w:t>完整词表方案直接使用师生完整概率分布计算散度，作为信息最充分的基线。常规 Top-K 方案由教师分布选出支持集，并分别计算教师和学生在该集合内的概率质量：</w:t>
+        <w:t>完整词表散度提供信息最充分的参照。常规 Top-K 由教师分布选出显式支持集，随后分别计算教师与学生在该集合内的概率质量：</w:t>
       </w:r>
     </w:p>
     <w:tbl>
@@ -11518,7 +11518,7 @@
         <w:jc w:val="both"/>
       </w:pPr>
       <w:r>
-        <w:t>常规截断基线在教师支持集内分别归一化师生概率，如式（4-18）所示。TA-OPD 在支持集外增加尾部类别[31]，作为本课题的直接方法基线。候选方法按工具调用位置调整支持集：检查学生高概率的合法决策候选，将教师 Top-K 漏掉的关键 token 补入，再计算新的尾部总概率。尾部类别传递总量信号，补入 token 传递具体决策信号；两者分别设置消融。</w:t>
+        <w:t>常规截断基线将师生概率分别限制在教师支持集内归一化，见式（4-18）。TA-OPD 在该集合外设置尾部类别[31]，是本课题的直接方法基线。候选方案在此基础上增加学生高概率的合法决策 token；补入坐标与尾部总量分别接受监督，并通过消融分析各自的作用。</w:t>
       </w:r>
     </w:p>
     <w:tbl>
@@ -12055,7 +12055,44 @@
         <w:jc w:val="both"/>
       </w:pPr>
       <w:r>
-        <w:t>K1 sampled-token 将词表求和改写为单样本重要性估计，作为低反馈量基线。样本从提议分布抽取，Forward KL 和 Reverse KL 对应的单样本估计分别为：</w:t>
+        <w:t xml:space="preserve">由 schema 确定且未进入教师 Top-K 的合法决策 token 组成候选集合 </w:t>
+      </w:r>
+      <m:oMath>
+        <m:sSubSup>
+          <m:e>
+            <m:r>
+              <m:t>V</m:t>
+            </m:r>
+          </m:e>
+          <m:sub>
+            <m:r>
+              <m:t>t</m:t>
+            </m:r>
+          </m:sub>
+          <m:sup>
+            <m:r>
+              <m:rPr>
+                <m:sty m:val="p"/>
+              </m:rPr>
+              <m:t>d</m:t>
+            </m:r>
+            <m:r>
+              <m:rPr>
+                <m:sty m:val="p"/>
+              </m:rPr>
+              <m:t>e</m:t>
+            </m:r>
+            <m:r>
+              <m:rPr>
+                <m:sty m:val="p"/>
+              </m:rPr>
+              <m:t>c</m:t>
+            </m:r>
+          </m:sup>
+        </m:sSubSup>
+      </m:oMath>
+      <w:r>
+        <w:t>。式（4-17）中的 K 随位置调整；从候选集合选出学生高概率 token，与教师支持集取并集：</w:t>
       </w:r>
     </w:p>
     <w:tbl>
@@ -12128,29 +12165,16 @@
               </w:rPr>
             </w:pPr>
             <m:oMathPara>
-              <m:oMathParaPr>
-                <m:jc m:val="center"/>
-              </m:oMathParaPr>
               <m:oMath>
                 <m:sSub>
-                  <m:sSubPr/>
                   <m:e>
-                    <m:acc>
-                      <m:accPr/>
-                      <m:e>
-                        <m:r>
-                          <m:rPr/>
-                          <m:t>D</m:t>
-                        </m:r>
-                      </m:e>
-                    </m:acc>
+                    <m:r>
+                      <m:t>C</m:t>
+                    </m:r>
                   </m:e>
                   <m:sub>
                     <m:r>
-                      <m:rPr>
-                        <m:sty m:val="p"/>
-                      </m:rPr>
-                      <m:t>FKL</m:t>
+                      <m:t>t</m:t>
                     </m:r>
                   </m:sub>
                 </m:sSub>
@@ -12160,125 +12184,143 @@
                   </m:rPr>
                   <m:t>=</m:t>
                 </m:r>
-                <m:f>
-                  <m:fPr/>
-                  <m:num>
-                    <m:sSub>
-                      <m:sSubPr/>
-                      <m:e>
-                        <m:r>
-                          <m:rPr/>
-                          <m:t>p</m:t>
-                        </m:r>
-                      </m:e>
-                      <m:sub>
-                        <m:r>
-                          <m:rPr/>
-                          <m:t>T</m:t>
-                        </m:r>
-                        <m:r>
-                          <m:rPr>
-                            <m:sty m:val="p"/>
-                          </m:rPr>
-                          <m:t>,</m:t>
-                        </m:r>
-                        <m:r>
-                          <m:rPr/>
-                          <m:t>t</m:t>
-                        </m:r>
-                      </m:sub>
-                    </m:sSub>
+                <m:sSub>
+                  <m:e>
                     <m:r>
                       <m:rPr>
                         <m:sty m:val="p"/>
                       </m:rPr>
-                      <m:t>(</m:t>
-                    </m:r>
-                    <m:acc>
-                      <m:accPr/>
+                      <m:t>Top</m:t>
+                    </m:r>
+                  </m:e>
+                  <m:sub>
+                    <m:sSub>
                       <m:e>
                         <m:r>
-                          <m:rPr/>
-                          <m:t>v</m:t>
+                          <m:t>b</m:t>
                         </m:r>
                       </m:e>
-                    </m:acc>
+                      <m:sub>
+                        <m:r>
+                          <m:t>t</m:t>
+                        </m:r>
+                      </m:sub>
+                    </m:sSub>
+                  </m:sub>
+                </m:sSub>
+                <m:r>
+                  <m:rPr>
+                    <m:sty m:val="p"/>
+                  </m:rPr>
+                  <m:t>(</m:t>
+                </m:r>
+                <m:sSub>
+                  <m:e>
+                    <m:r>
+                      <m:t>p</m:t>
+                    </m:r>
+                  </m:e>
+                  <m:sub>
+                    <m:r>
+                      <m:t>S</m:t>
+                    </m:r>
                     <m:r>
                       <m:rPr>
                         <m:sty m:val="p"/>
                       </m:rPr>
-                      <m:t>)</m:t>
-                    </m:r>
-                  </m:num>
-                  <m:den>
-                    <m:sSub>
-                      <m:sSubPr/>
-                      <m:e>
-                        <m:r>
-                          <m:rPr/>
-                          <m:t>q</m:t>
-                        </m:r>
-                      </m:e>
-                      <m:sub>
-                        <m:r>
-                          <m:rPr/>
-                          <m:t>t</m:t>
-                        </m:r>
-                      </m:sub>
-                    </m:sSub>
+                      <m:t>,</m:t>
+                    </m:r>
+                    <m:r>
+                      <m:t>t</m:t>
+                    </m:r>
+                  </m:sub>
+                </m:sSub>
+                <m:r>
+                  <m:rPr>
+                    <m:sty m:val="p"/>
+                  </m:rPr>
+                  <m:t>;</m:t>
+                </m:r>
+                <m:sSubSup>
+                  <m:e>
+                    <m:r>
+                      <m:t>V</m:t>
+                    </m:r>
+                  </m:e>
+                  <m:sub>
+                    <m:r>
+                      <m:t>t</m:t>
+                    </m:r>
+                  </m:sub>
+                  <m:sup>
                     <m:r>
                       <m:rPr>
                         <m:sty m:val="p"/>
                       </m:rPr>
-                      <m:t>(</m:t>
-                    </m:r>
-                    <m:acc>
-                      <m:accPr/>
-                      <m:e>
-                        <m:r>
-                          <m:rPr/>
-                          <m:t>v</m:t>
-                        </m:r>
-                      </m:e>
-                    </m:acc>
+                      <m:t>d</m:t>
+                    </m:r>
                     <m:r>
                       <m:rPr>
                         <m:sty m:val="p"/>
                       </m:rPr>
-                      <m:t>)</m:t>
-                    </m:r>
-                  </m:den>
-                </m:f>
+                      <m:t>e</m:t>
+                    </m:r>
+                    <m:r>
+                      <m:rPr>
+                        <m:sty m:val="p"/>
+                      </m:rPr>
+                      <m:t>c</m:t>
+                    </m:r>
+                  </m:sup>
+                </m:sSubSup>
                 <m:r>
                   <m:rPr>
                     <m:sty m:val="p"/>
                   </m:rPr>
-                  <m:t>log</m:t>
-                </m:r>
-                <m:f>
-                  <m:fPr/>
-                  <m:num>
+                  <m:t>)</m:t>
+                </m:r>
+                <m:r>
+                  <m:rPr>
+                    <m:sty m:val="p"/>
+                  </m:rPr>
+                  <m:t>,</m:t>
+                </m:r>
+                <m:r>
+                  <m:t>  </m:t>
+                </m:r>
+                <m:sSub>
+                  <m:e>
+                    <m:r>
+                      <m:t>A</m:t>
+                    </m:r>
+                  </m:e>
+                  <m:sub>
+                    <m:r>
+                      <m:t>t</m:t>
+                    </m:r>
+                  </m:sub>
+                </m:sSub>
+                <m:r>
+                  <m:rPr>
+                    <m:sty m:val="p"/>
+                  </m:rPr>
+                  <m:t>=</m:t>
+                </m:r>
+                <m:sSub>
+                  <m:e>
+                    <m:r>
+                      <m:t>S</m:t>
+                    </m:r>
+                  </m:e>
+                  <m:sub>
                     <m:sSub>
-                      <m:sSubPr/>
                       <m:e>
                         <m:r>
-                          <m:rPr/>
-                          <m:t>p</m:t>
+                          <m:t>K</m:t>
                         </m:r>
                       </m:e>
                       <m:sub>
                         <m:r>
-                          <m:rPr/>
-                          <m:t>T</m:t>
-                        </m:r>
-                        <m:r>
-                          <m:rPr>
-                            <m:sty m:val="p"/>
-                          </m:rPr>
-                          <m:t>,</m:t>
-                        </m:r>
-                        <m:r>
-                          <m:rPr/>
                           <m:t>t</m:t>
                         </m:r>
                       </m:sub>
@@ -12287,113 +12329,37 @@
                       <m:rPr>
                         <m:sty m:val="p"/>
                       </m:rPr>
-                      <m:t>(</m:t>
-                    </m:r>
-                    <m:acc>
-                      <m:accPr/>
-                      <m:e>
-                        <m:r>
-                          <m:rPr/>
-                          <m:t>v</m:t>
-                        </m:r>
-                      </m:e>
-                    </m:acc>
-                    <m:r>
-                      <m:rPr>
-                        <m:sty m:val="p"/>
-                      </m:rPr>
-                      <m:t>)</m:t>
-                    </m:r>
-                  </m:num>
-                  <m:den>
-                    <m:sSub>
-                      <m:sSubPr/>
-                      <m:e>
-                        <m:r>
-                          <m:rPr/>
-                          <m:t>p</m:t>
-                        </m:r>
-                      </m:e>
-                      <m:sub>
-                        <m:r>
-                          <m:rPr/>
-                          <m:t>S</m:t>
-                        </m:r>
-                        <m:r>
-                          <m:rPr>
-                            <m:sty m:val="p"/>
-                          </m:rPr>
-                          <m:t>,</m:t>
-                        </m:r>
-                        <m:r>
-                          <m:rPr/>
-                          <m:t>t</m:t>
-                        </m:r>
-                      </m:sub>
-                    </m:sSub>
-                    <m:r>
-                      <m:rPr>
-                        <m:sty m:val="p"/>
-                      </m:rPr>
-                      <m:t>(</m:t>
-                    </m:r>
-                    <m:acc>
-                      <m:accPr/>
-                      <m:e>
-                        <m:r>
-                          <m:rPr/>
-                          <m:t>v</m:t>
-                        </m:r>
-                      </m:e>
-                    </m:acc>
-                    <m:r>
-                      <m:rPr>
-                        <m:sty m:val="p"/>
-                      </m:rPr>
-                      <m:t>)</m:t>
-                    </m:r>
-                  </m:den>
-                </m:f>
+                      <m:t>,</m:t>
+                    </m:r>
+                    <m:r>
+                      <m:t>t</m:t>
+                    </m:r>
+                  </m:sub>
+                </m:sSub>
                 <m:r>
                   <m:rPr>
                     <m:sty m:val="p"/>
                   </m:rPr>
-                  <w:rPr>
-                    <w:rFonts w:hint="default"/>
-                    <w:lang w:val="en-US"/>
-                  </w:rPr>
-                  <m:t>,</m:t>
-                </m:r>
-                <m:acc>
-                  <m:accPr/>
+                  <m:t>∪</m:t>
+                </m:r>
+                <m:sSub>
                   <m:e>
                     <m:r>
-                      <m:rPr/>
-                      <m:t>v</m:t>
+                      <m:t>C</m:t>
                     </m:r>
                   </m:e>
-                </m:acc>
+                  <m:sub>
+                    <m:r>
+                      <m:t>t</m:t>
+                    </m:r>
+                  </m:sub>
+                </m:sSub>
                 <m:r>
                   <m:rPr>
                     <m:sty m:val="p"/>
                   </m:rPr>
-                  <m:t>∼</m:t>
-                </m:r>
-                <m:sSub>
-                  <m:sSubPr/>
-                  <m:e>
-                    <m:r>
-                      <m:rPr/>
-                      <m:t>q</m:t>
-                    </m:r>
-                  </m:e>
-                  <m:sub>
-                    <m:r>
-                      <m:rPr/>
-                      <m:t>t</m:t>
-                    </m:r>
-                  </m:sub>
-                </m:sSub>
+                  <m:t>.</m:t>
+                </m:r>
               </m:oMath>
             </m:oMathPara>
           </w:p>
@@ -12414,7 +12380,7 @@
               <w:spacing w:before="0" w:after="0"/>
               <w:jc w:val="right"/>
             </w:pPr>
-            <w:bookmarkStart w:id="50" w:name="_RefEq4_29"/>
+            <w:bookmarkStart w:id="77" w:name="_RefEq4_41"/>
             <w:r>
               <w:t>(4-</w:t>
             </w:r>
@@ -12436,340 +12402,7 @@
             <w:r>
               <w:t>)</w:t>
             </w:r>
-            <w:bookmarkEnd w:id="50"/>
-          </w:p>
-        </w:tc>
-      </w:tr>
-      <w:tr>
-        <w:trPr>
-          <w:cantSplit/>
-          <w:jc w:val="center"/>
-        </w:trPr>
-        <w:tc>
-          <w:tcPr>
-            <w:tcW w:w="650" w:type="dxa"/>
-            <w:tcMar>
-              <w:top w:w="0" w:type="dxa"/>
-              <w:left w:w="0" w:type="dxa"/>
-              <w:bottom w:w="0" w:type="dxa"/>
-              <w:right w:w="0" w:type="dxa"/>
-            </w:tcMar>
-            <w:vAlign w:val="center"/>
-          </w:tcPr>
-          <w:p>
-            <w:pPr>
-              <w:spacing w:before="0" w:after="0"/>
-              <w:jc w:val="left"/>
-            </w:pPr>
-          </w:p>
-        </w:tc>
-        <w:tc>
-          <w:tcPr>
-            <w:tcW w:w="7006" w:type="dxa"/>
-            <w:tcMar>
-              <w:top w:w="0" w:type="dxa"/>
-              <w:left w:w="0" w:type="dxa"/>
-              <w:bottom w:w="0" w:type="dxa"/>
-              <w:right w:w="0" w:type="dxa"/>
-            </w:tcMar>
-            <w:vAlign w:val="center"/>
-          </w:tcPr>
-          <w:p>
-            <w:pPr>
-              <w:spacing w:before="0" w:after="0"/>
-              <w:jc w:val="center"/>
-              <w:rPr>
-                <w:rFonts w:hint="default"/>
-                <w:lang w:val="en-US"/>
-              </w:rPr>
-            </w:pPr>
-            <m:oMathPara>
-              <m:oMathParaPr>
-                <m:jc m:val="center"/>
-              </m:oMathParaPr>
-              <m:oMath>
-                <m:sSub>
-                  <m:sSubPr/>
-                  <m:e>
-                    <m:acc>
-                      <m:accPr/>
-                      <m:e>
-                        <m:r>
-                          <m:rPr/>
-                          <m:t>D</m:t>
-                        </m:r>
-                      </m:e>
-                    </m:acc>
-                  </m:e>
-                  <m:sub>
-                    <m:r>
-                      <m:rPr>
-                        <m:sty m:val="p"/>
-                      </m:rPr>
-                      <m:t>RKL</m:t>
-                    </m:r>
-                  </m:sub>
-                </m:sSub>
-                <m:r>
-                  <m:rPr>
-                    <m:sty m:val="p"/>
-                  </m:rPr>
-                  <m:t>=</m:t>
-                </m:r>
-                <m:f>
-                  <m:fPr/>
-                  <m:num>
-                    <m:sSub>
-                      <m:sSubPr/>
-                      <m:e>
-                        <m:r>
-                          <m:rPr/>
-                          <m:t>p</m:t>
-                        </m:r>
-                      </m:e>
-                      <m:sub>
-                        <m:r>
-                          <m:rPr/>
-                          <m:t>S</m:t>
-                        </m:r>
-                        <m:r>
-                          <m:rPr>
-                            <m:sty m:val="p"/>
-                          </m:rPr>
-                          <m:t>,</m:t>
-                        </m:r>
-                        <m:r>
-                          <m:rPr/>
-                          <m:t>t</m:t>
-                        </m:r>
-                      </m:sub>
-                    </m:sSub>
-                    <m:r>
-                      <m:rPr>
-                        <m:sty m:val="p"/>
-                      </m:rPr>
-                      <m:t>(</m:t>
-                    </m:r>
-                    <m:acc>
-                      <m:accPr/>
-                      <m:e>
-                        <m:r>
-                          <m:rPr/>
-                          <m:t>v</m:t>
-                        </m:r>
-                      </m:e>
-                    </m:acc>
-                    <m:r>
-                      <m:rPr>
-                        <m:sty m:val="p"/>
-                      </m:rPr>
-                      <m:t>)</m:t>
-                    </m:r>
-                  </m:num>
-                  <m:den>
-                    <m:sSub>
-                      <m:sSubPr/>
-                      <m:e>
-                        <m:r>
-                          <m:rPr/>
-                          <m:t>q</m:t>
-                        </m:r>
-                      </m:e>
-                      <m:sub>
-                        <m:r>
-                          <m:rPr/>
-                          <m:t>t</m:t>
-                        </m:r>
-                      </m:sub>
-                    </m:sSub>
-                    <m:r>
-                      <m:rPr>
-                        <m:sty m:val="p"/>
-                      </m:rPr>
-                      <m:t>(</m:t>
-                    </m:r>
-                    <m:acc>
-                      <m:accPr/>
-                      <m:e>
-                        <m:r>
-                          <m:rPr/>
-                          <m:t>v</m:t>
-                        </m:r>
-                      </m:e>
-                    </m:acc>
-                    <m:r>
-                      <m:rPr>
-                        <m:sty m:val="p"/>
-                      </m:rPr>
-                      <m:t>)</m:t>
-                    </m:r>
-                  </m:den>
-                </m:f>
-                <m:r>
-                  <m:rPr>
-                    <m:sty m:val="p"/>
-                  </m:rPr>
-                  <m:t>log</m:t>
-                </m:r>
-                <m:f>
-                  <m:fPr/>
-                  <m:num>
-                    <m:sSub>
-                      <m:sSubPr/>
-                      <m:e>
-                        <m:r>
-                          <m:rPr/>
-                          <m:t>p</m:t>
-                        </m:r>
-                      </m:e>
-                      <m:sub>
-                        <m:r>
-                          <m:rPr/>
-                          <m:t>S</m:t>
-                        </m:r>
-                        <m:r>
-                          <m:rPr>
-                            <m:sty m:val="p"/>
-                          </m:rPr>
-                          <m:t>,</m:t>
-                        </m:r>
-                        <m:r>
-                          <m:rPr/>
-                          <m:t>t</m:t>
-                        </m:r>
-                      </m:sub>
-                    </m:sSub>
-                    <m:r>
-                      <m:rPr>
-                        <m:sty m:val="p"/>
-                      </m:rPr>
-                      <m:t>(</m:t>
-                    </m:r>
-                    <m:acc>
-                      <m:accPr/>
-                      <m:e>
-                        <m:r>
-                          <m:rPr/>
-                          <m:t>v</m:t>
-                        </m:r>
-                      </m:e>
-                    </m:acc>
-                    <m:r>
-                      <m:rPr>
-                        <m:sty m:val="p"/>
-                      </m:rPr>
-                      <m:t>)</m:t>
-                    </m:r>
-                  </m:num>
-                  <m:den>
-                    <m:sSub>
-                      <m:sSubPr/>
-                      <m:e>
-                        <m:r>
-                          <m:rPr/>
-                          <m:t>p</m:t>
-                        </m:r>
-                      </m:e>
-                      <m:sub>
-                        <m:r>
-                          <m:rPr/>
-                          <m:t>T</m:t>
-                        </m:r>
-                        <m:r>
-                          <m:rPr>
-                            <m:sty m:val="p"/>
-                          </m:rPr>
-                          <m:t>,</m:t>
-                        </m:r>
-                        <m:r>
-                          <m:rPr/>
-                          <m:t>t</m:t>
-                        </m:r>
-                      </m:sub>
-                    </m:sSub>
-                    <m:r>
-                      <m:rPr>
-                        <m:sty m:val="p"/>
-                      </m:rPr>
-                      <m:t>(</m:t>
-                    </m:r>
-                    <m:acc>
-                      <m:accPr/>
-                      <m:e>
-                        <m:r>
-                          <m:rPr/>
-                          <m:t>v</m:t>
-                        </m:r>
-                      </m:e>
-                    </m:acc>
-                    <m:r>
-                      <m:rPr>
-                        <m:sty m:val="p"/>
-                      </m:rPr>
-                      <m:t>)</m:t>
-                    </m:r>
-                  </m:den>
-                </m:f>
-                <m:r>
-                  <m:rPr>
-                    <m:sty m:val="p"/>
-                  </m:rPr>
-                  <w:rPr>
-                    <w:rFonts w:hint="default"/>
-                    <w:lang w:val="en-US"/>
-                  </w:rPr>
-                  <m:t>,</m:t>
-                </m:r>
-                <m:acc>
-                  <m:accPr/>
-                  <m:e>
-                    <m:r>
-                      <m:rPr/>
-                      <m:t>v</m:t>
-                    </m:r>
-                  </m:e>
-                </m:acc>
-                <m:r>
-                  <m:rPr>
-                    <m:sty m:val="p"/>
-                  </m:rPr>
-                  <m:t>∼</m:t>
-                </m:r>
-                <m:sSub>
-                  <m:sSubPr/>
-                  <m:e>
-                    <m:r>
-                      <m:rPr/>
-                      <m:t>q</m:t>
-                    </m:r>
-                  </m:e>
-                  <m:sub>
-                    <m:r>
-                      <m:rPr/>
-                      <m:t>t</m:t>
-                    </m:r>
-                  </m:sub>
-                </m:sSub>
-              </m:oMath>
-            </m:oMathPara>
-          </w:p>
-        </w:tc>
-        <w:tc>
-          <w:tcPr>
-            <w:tcW w:w="650" w:type="dxa"/>
-            <w:tcMar>
-              <w:top w:w="0" w:type="dxa"/>
-              <w:left w:w="0" w:type="dxa"/>
-              <w:bottom w:w="0" w:type="dxa"/>
-              <w:right w:w="0" w:type="dxa"/>
-            </w:tcMar>
-            <w:vAlign w:val="center"/>
-          </w:tcPr>
-          <w:p>
-            <w:pPr>
-              <w:spacing w:before="0" w:after="0"/>
-              <w:jc w:val="right"/>
-            </w:pPr>
+            <w:bookmarkEnd w:id="77"/>
           </w:p>
         </w:tc>
       </w:tr>
@@ -12780,299 +12413,7 @@
         <w:jc w:val="both"/>
       </w:pPr>
       <w:r>
-        <w:t>K1 sampled-token 使用明确记录的提议分布和随机种子，提议分布须覆盖目标支持集。候选方法的位置权重来自训练集诊断子集，质量阈值和 K 上限由验证集确定；测试集只用于最终评价。补入候选的额外教师 logprob、反馈字节数与教师前向时间分别计量。各目标使用相同的 log-sum-exp、有效位置归一化和有限值检查。</w:t>
-      </w:r>
-    </w:p>
-    <w:p>
-      <w:pPr>
-        <w:pStyle w:val="3"/>
-        <w:jc w:val="left"/>
-      </w:pPr>
-      <w:bookmarkStart w:id="51" w:name="_Toc534757053"/>
-      <w:r>
-        <w:rPr>
-          <w:rFonts w:ascii="黑体" w:hAnsi="黑体" w:eastAsia="黑体" w:cs="黑体"/>
-          <w:b/>
-          <w:color w:val="000000"/>
-          <w:sz w:val="24"/>
-        </w:rPr>
-        <w:t>4.5 评价指标和公平性</w:t>
-      </w:r>
-      <w:bookmarkEnd w:id="51"/>
-    </w:p>
-    <w:p>
-      <w:pPr>
-        <w:ind w:firstLine="420"/>
-        <w:jc w:val="both"/>
-      </w:pPr>
-      <w:r>
-        <w:t>评价首先对应三个研究问题：按工具调用位置分析状态覆盖与错误，按完整词表散度分析梯度和生成行为，按稀疏支持集分析尾部质量、决策 token 漏选及预算。最终再从任务正确性、训练稳定性和资源成本三个层面判断方法的实际价值，具体指标见表 4-3。</w:t>
-      </w:r>
-    </w:p>
-    <w:p>
-      <w:pPr>
-        <w:ind w:firstLine="420"/>
-        <w:jc w:val="both"/>
-      </w:pPr>
-    </w:p>
-    <w:p>
-      <w:pPr>
-        <w:keepNext/>
-        <w:spacing w:before="80" w:after="80" w:line="240" w:lineRule="auto"/>
-        <w:ind w:left="0" w:right="0" w:firstLine="0"/>
-        <w:jc w:val="center"/>
-      </w:pPr>
-      <w:r>
-        <w:rPr>
-          <w:rFonts w:ascii="Times New Roman" w:hAnsi="Times New Roman" w:eastAsia="Songti SC"/>
-          <w:sz w:val="21"/>
-        </w:rPr>
-        <w:t xml:space="preserve">表 </w:t>
-      </w:r>
-      <w:bookmarkStart w:id="52" w:name="_RefTable4_3"/>
-      <w:r>
-        <w:rPr>
-          <w:rFonts w:ascii="Times New Roman" w:hAnsi="Times New Roman" w:eastAsia="Songti SC"/>
-          <w:sz w:val="21"/>
-        </w:rPr>
-        <w:t>4-</w:t>
-      </w:r>
-      <w:r>
-        <w:rPr>
-          <w:rFonts w:ascii="Times New Roman" w:hAnsi="Times New Roman" w:eastAsia="Songti SC"/>
-          <w:sz w:val="21"/>
-        </w:rPr>
-        <w:fldChar w:fldCharType="begin"/>
-      </w:r>
-      <w:r>
-        <w:rPr>
-          <w:rFonts w:ascii="Times New Roman" w:hAnsi="Times New Roman" w:eastAsia="Songti SC"/>
-          <w:sz w:val="21"/>
-        </w:rPr>
-        <w:instrText xml:space="preserve"> SEQ TableCh4 \* ARABIC </w:instrText>
-      </w:r>
-      <w:r>
-        <w:rPr>
-          <w:rFonts w:ascii="Times New Roman" w:hAnsi="Times New Roman" w:eastAsia="Songti SC"/>
-          <w:sz w:val="21"/>
-        </w:rPr>
-        <w:fldChar w:fldCharType="separate"/>
-      </w:r>
-      <w:r>
-        <w:rPr>
-          <w:rFonts w:ascii="Times New Roman" w:hAnsi="Times New Roman" w:eastAsia="Songti SC"/>
-          <w:sz w:val="21"/>
-        </w:rPr>
-        <w:t>3</w:t>
-      </w:r>
-      <w:r>
-        <w:rPr>
-          <w:rFonts w:ascii="Times New Roman" w:hAnsi="Times New Roman" w:eastAsia="Songti SC"/>
-          <w:sz w:val="21"/>
-        </w:rPr>
-        <w:fldChar w:fldCharType="end"/>
-      </w:r>
-      <w:bookmarkEnd w:id="52"/>
-      <w:r>
-        <w:rPr>
-          <w:rFonts w:ascii="Times New Roman" w:hAnsi="Times New Roman" w:eastAsia="Songti SC"/>
-          <w:sz w:val="21"/>
-        </w:rPr>
-        <w:t xml:space="preserve">  评价指标体系</w:t>
-      </w:r>
-    </w:p>
-    <w:tbl>
-      <w:tblPr>
-        <w:tblStyle w:val="11"/>
-        <w:tblW w:w="0" w:type="auto"/>
-        <w:tblInd w:w="0" w:type="dxa"/>
-        <w:tblBorders>
-          <w:top w:val="single" w:color="auto" w:sz="4" w:space="0"/>
-          <w:left w:val="single" w:color="auto" w:sz="4" w:space="0"/>
-          <w:bottom w:val="single" w:color="auto" w:sz="4" w:space="0"/>
-          <w:right w:val="single" w:color="auto" w:sz="4" w:space="0"/>
-          <w:insideH w:val="single" w:color="auto" w:sz="4" w:space="0"/>
-          <w:insideV w:val="single" w:color="auto" w:sz="4" w:space="0"/>
-        </w:tblBorders>
-        <w:tblLayout w:type="autofit"/>
-        <w:tblCellMar>
-          <w:top w:w="0" w:type="dxa"/>
-          <w:left w:w="108" w:type="dxa"/>
-          <w:bottom w:w="0" w:type="dxa"/>
-          <w:right w:w="108" w:type="dxa"/>
-        </w:tblCellMar>
-      </w:tblPr>
-      <w:tblGrid>
-        <w:gridCol w:w="4148"/>
-        <w:gridCol w:w="4148"/>
-      </w:tblGrid>
-      <w:tr>
-        <w:trPr>
-          <w:tblHeader/>
-        </w:trPr>
-        <w:tc>
-          <w:tcPr>
-            <w:tcW w:w="4148" w:type="dxa"/>
-          </w:tcPr>
-          <w:p>
-            <w:pPr>
-              <w:ind w:firstLine="0"/>
-              <w:jc w:val="left"/>
-            </w:pPr>
-            <w:r>
-              <w:rPr>
-                <w:b/>
-              </w:rPr>
-              <w:t>类别</w:t>
-            </w:r>
-          </w:p>
-        </w:tc>
-        <w:tc>
-          <w:tcPr>
-            <w:tcW w:w="4148" w:type="dxa"/>
-          </w:tcPr>
-          <w:p>
-            <w:pPr>
-              <w:ind w:firstLine="0"/>
-              <w:jc w:val="left"/>
-            </w:pPr>
-            <w:r>
-              <w:rPr>
-                <w:b/>
-              </w:rPr>
-              <w:t>关注内容</w:t>
-            </w:r>
-          </w:p>
-        </w:tc>
-      </w:tr>
-      <w:tr>
-        <w:tc>
-          <w:tcPr>
-            <w:tcW w:w="4148" w:type="dxa"/>
-          </w:tcPr>
-          <w:p>
-            <w:pPr>
-              <w:ind w:firstLine="0"/>
-              <w:jc w:val="left"/>
-            </w:pPr>
-            <w:r>
-              <w:t>核心任务效果</w:t>
-            </w:r>
-          </w:p>
-        </w:tc>
-        <w:tc>
-          <w:tcPr>
-            <w:tcW w:w="4148" w:type="dxa"/>
-          </w:tcPr>
-          <w:p>
-            <w:pPr>
-              <w:ind w:firstLine="0"/>
-              <w:jc w:val="left"/>
-            </w:pPr>
-            <w:r>
-              <w:t>JSON／结构化格式合法性、函数名、参数键值、schema 通过率、调用执行成功率和端到端任务完成率</w:t>
-            </w:r>
-          </w:p>
-        </w:tc>
-      </w:tr>
-      <w:tr>
-        <w:tc>
-          <w:tcPr>
-            <w:tcW w:w="4148" w:type="dxa"/>
-          </w:tcPr>
-          <w:p>
-            <w:pPr>
-              <w:ind w:firstLine="0"/>
-              <w:jc w:val="left"/>
-            </w:pPr>
-            <w:r>
-              <w:t>核心稳定性与分布</w:t>
-            </w:r>
-          </w:p>
-        </w:tc>
-        <w:tc>
-          <w:tcPr>
-            <w:tcW w:w="4148" w:type="dxa"/>
-          </w:tcPr>
-          <w:p>
-            <w:pPr>
-              <w:ind w:firstLine="0"/>
-              <w:jc w:val="left"/>
-            </w:pPr>
-            <w:r>
-              <w:t>蒸馏损失、熵变化、师生分布差异、Top-K overlap、支持集外概率、非法输出率和重复率</w:t>
-            </w:r>
-          </w:p>
-        </w:tc>
-      </w:tr>
-      <w:tr>
-        <w:tc>
-          <w:tcPr>
-            <w:tcW w:w="4148" w:type="dxa"/>
-          </w:tcPr>
-          <w:p>
-            <w:pPr>
-              <w:ind w:firstLine="0"/>
-              <w:jc w:val="left"/>
-            </w:pPr>
-            <w:r>
-              <w:t>核心训练资源</w:t>
-            </w:r>
-          </w:p>
-        </w:tc>
-        <w:tc>
-          <w:tcPr>
-            <w:tcW w:w="4148" w:type="dxa"/>
-          </w:tcPr>
-          <w:p>
-            <w:pPr>
-              <w:ind w:firstLine="0"/>
-              <w:jc w:val="left"/>
-            </w:pPr>
-            <w:r>
-              <w:t>教师反馈量、教师推理开销、学生 rollout 开销、训练时间和峰值显存</w:t>
-            </w:r>
-          </w:p>
-        </w:tc>
-      </w:tr>
-      <w:tr>
-        <w:tc>
-          <w:tcPr>
-            <w:tcW w:w="4148" w:type="dxa"/>
-          </w:tcPr>
-          <w:p>
-            <w:pPr>
-              <w:ind w:firstLine="0"/>
-              <w:jc w:val="left"/>
-            </w:pPr>
-            <w:r>
-              <w:t>扩展服务评测</w:t>
-            </w:r>
-          </w:p>
-        </w:tc>
-        <w:tc>
-          <w:tcPr>
-            <w:tcW w:w="4148" w:type="dxa"/>
-          </w:tcPr>
-          <w:p>
-            <w:pPr>
-              <w:ind w:firstLine="0"/>
-              <w:jc w:val="left"/>
-            </w:pPr>
-            <w:r>
-              <w:t>吞吐、首 token 延迟、完整响应延迟和端到端任务成功率</w:t>
-            </w:r>
-          </w:p>
-        </w:tc>
-      </w:tr>
-    </w:tbl>
-    <w:p>
-      <w:pPr>
-        <w:ind w:firstLine="420"/>
-        <w:jc w:val="both"/>
-      </w:pPr>
-      <w:r>
-        <w:t>设测试集包含若干样本，并分别记录预测函数、目标函数和端到端任务是否完成，则函数选择准确率和端到端成功率定义为：</w:t>
+        <w:t>式（4-19）的 Top 算子按学生概率选择候选，额外名额依据位置风险分配；名额为零或候选集合为空时，补入集合为空。教师对补入 token 的概率须通过可靠接口或本地前向计算取得。对扩展后的同一支持集，师生各保留显式 token 的原始概率，并将其余概率并入尾部类别：</w:t>
       </w:r>
     </w:p>
     <w:tbl>
@@ -13139,6 +12480,1425 @@
             <w:pPr>
               <w:spacing w:before="0" w:after="0"/>
               <w:jc w:val="center"/>
+              <w:rPr>
+                <w:rFonts w:hint="default"/>
+                <w:lang w:val="en-US"/>
+              </w:rPr>
+            </w:pPr>
+            <m:oMathPara>
+              <m:oMath>
+                <m:sSubSup>
+                  <m:e>
+                    <m:r>
+                      <m:t>p</m:t>
+                    </m:r>
+                  </m:e>
+                  <m:sub>
+                    <m:r>
+                      <m:t>j</m:t>
+                    </m:r>
+                    <m:r>
+                      <m:rPr>
+                        <m:sty m:val="p"/>
+                      </m:rPr>
+                      <m:t>,</m:t>
+                    </m:r>
+                    <m:r>
+                      <m:t>t</m:t>
+                    </m:r>
+                  </m:sub>
+                  <m:sup>
+                    <m:sSub>
+                      <m:e>
+                        <m:r>
+                          <m:t>A</m:t>
+                        </m:r>
+                      </m:e>
+                      <m:sub>
+                        <m:r>
+                          <m:t>t</m:t>
+                        </m:r>
+                      </m:sub>
+                    </m:sSub>
+                  </m:sup>
+                </m:sSubSup>
+                <m:r>
+                  <m:rPr>
+                    <m:sty m:val="p"/>
+                  </m:rPr>
+                  <m:t>=</m:t>
+                </m:r>
+                <m:d>
+                  <m:dPr>
+                    <m:begChr m:val="("/>
+                    <m:sepChr m:val=""/>
+                    <m:endChr m:val=")"/>
+                    <m:grow/>
+                  </m:dPr>
+                  <m:e>
+                    <m:r>
+                      <m:rPr>
+                        <m:sty m:val="p"/>
+                      </m:rPr>
+                      <m:t>{</m:t>
+                    </m:r>
+                    <m:sSub>
+                      <m:e>
+                        <m:r>
+                          <m:t>p</m:t>
+                        </m:r>
+                      </m:e>
+                      <m:sub>
+                        <m:r>
+                          <m:t>j</m:t>
+                        </m:r>
+                        <m:r>
+                          <m:rPr>
+                            <m:sty m:val="p"/>
+                          </m:rPr>
+                          <m:t>,</m:t>
+                        </m:r>
+                        <m:r>
+                          <m:t>t</m:t>
+                        </m:r>
+                      </m:sub>
+                    </m:sSub>
+                    <m:r>
+                      <m:rPr>
+                        <m:sty m:val="p"/>
+                      </m:rPr>
+                      <m:t>(</m:t>
+                    </m:r>
+                    <m:r>
+                      <m:t>v</m:t>
+                    </m:r>
+                    <m:r>
+                      <m:rPr>
+                        <m:sty m:val="p"/>
+                      </m:rPr>
+                      <m:t>)</m:t>
+                    </m:r>
+                    <m:sSub>
+                      <m:e>
+                        <m:r>
+                          <m:rPr>
+                            <m:sty m:val="p"/>
+                          </m:rPr>
+                          <m:t>}</m:t>
+                        </m:r>
+                      </m:e>
+                      <m:sub>
+                        <m:r>
+                          <m:t>v</m:t>
+                        </m:r>
+                        <m:r>
+                          <m:rPr>
+                            <m:sty m:val="p"/>
+                          </m:rPr>
+                          <m:t>∈</m:t>
+                        </m:r>
+                        <m:sSub>
+                          <m:e>
+                            <m:r>
+                              <m:t>A</m:t>
+                            </m:r>
+                          </m:e>
+                          <m:sub>
+                            <m:r>
+                              <m:t>t</m:t>
+                            </m:r>
+                          </m:sub>
+                        </m:sSub>
+                      </m:sub>
+                    </m:sSub>
+                    <m:r>
+                      <m:rPr>
+                        <m:sty m:val="p"/>
+                      </m:rPr>
+                      <m:t>,</m:t>
+                    </m:r>
+                    <m:r>
+                      <m:t> </m:t>
+                    </m:r>
+                    <m:r>
+                      <m:t>1</m:t>
+                    </m:r>
+                    <m:r>
+                      <m:rPr>
+                        <m:sty m:val="p"/>
+                      </m:rPr>
+                      <m:t>−</m:t>
+                    </m:r>
+                    <m:nary>
+                      <m:naryPr>
+                        <m:chr m:val="∑"/>
+                        <m:limLoc m:val="undOvr"/>
+                        <m:subHide m:val="off"/>
+                        <m:supHide m:val="on"/>
+                      </m:naryPr>
+                      <m:sub>
+                        <m:r>
+                          <m:t>v</m:t>
+                        </m:r>
+                        <m:r>
+                          <m:rPr>
+                            <m:sty m:val="p"/>
+                          </m:rPr>
+                          <m:t>∈</m:t>
+                        </m:r>
+                        <m:sSub>
+                          <m:e>
+                            <m:r>
+                              <m:t>A</m:t>
+                            </m:r>
+                          </m:e>
+                          <m:sub>
+                            <m:r>
+                              <m:t>t</m:t>
+                            </m:r>
+                          </m:sub>
+                        </m:sSub>
+                      </m:sub>
+                      <m:sup>
+                        <m:r>
+                          <m:t>​</m:t>
+                        </m:r>
+                      </m:sup>
+                      <m:e>
+                        <m:sSub>
+                          <m:e>
+                            <m:r>
+                              <m:t>p</m:t>
+                            </m:r>
+                          </m:e>
+                          <m:sub>
+                            <m:r>
+                              <m:t>j</m:t>
+                            </m:r>
+                            <m:r>
+                              <m:rPr>
+                                <m:sty m:val="p"/>
+                              </m:rPr>
+                              <m:t>,</m:t>
+                            </m:r>
+                            <m:r>
+                              <m:t>t</m:t>
+                            </m:r>
+                          </m:sub>
+                        </m:sSub>
+                      </m:e>
+                    </m:nary>
+                    <m:r>
+                      <m:rPr>
+                        <m:sty m:val="p"/>
+                      </m:rPr>
+                      <m:t>(</m:t>
+                    </m:r>
+                    <m:r>
+                      <m:t>v</m:t>
+                    </m:r>
+                    <m:r>
+                      <m:rPr>
+                        <m:sty m:val="p"/>
+                      </m:rPr>
+                      <m:t>)</m:t>
+                    </m:r>
+                  </m:e>
+                </m:d>
+                <m:r>
+                  <m:rPr>
+                    <m:sty m:val="p"/>
+                  </m:rPr>
+                  <m:t>,</m:t>
+                </m:r>
+                <m:r>
+                  <m:t>  </m:t>
+                </m:r>
+                <m:r>
+                  <m:t>j</m:t>
+                </m:r>
+                <m:r>
+                  <m:rPr>
+                    <m:sty m:val="p"/>
+                  </m:rPr>
+                  <m:t>∈</m:t>
+                </m:r>
+                <m:r>
+                  <m:rPr>
+                    <m:sty m:val="p"/>
+                  </m:rPr>
+                  <m:t>{</m:t>
+                </m:r>
+                <m:r>
+                  <m:t>T</m:t>
+                </m:r>
+                <m:r>
+                  <m:rPr>
+                    <m:sty m:val="p"/>
+                  </m:rPr>
+                  <m:t>,</m:t>
+                </m:r>
+                <m:r>
+                  <m:t>S</m:t>
+                </m:r>
+                <m:r>
+                  <m:rPr>
+                    <m:sty m:val="p"/>
+                  </m:rPr>
+                  <m:t>}</m:t>
+                </m:r>
+                <m:r>
+                  <m:rPr>
+                    <m:sty m:val="p"/>
+                  </m:rPr>
+                  <m:t>.</m:t>
+                </m:r>
+              </m:oMath>
+            </m:oMathPara>
+          </w:p>
+        </w:tc>
+        <w:tc>
+          <w:tcPr>
+            <w:tcW w:w="650" w:type="dxa"/>
+            <w:tcMar>
+              <w:top w:w="0" w:type="dxa"/>
+              <w:left w:w="0" w:type="dxa"/>
+              <w:bottom w:w="0" w:type="dxa"/>
+              <w:right w:w="0" w:type="dxa"/>
+            </w:tcMar>
+            <w:vAlign w:val="center"/>
+          </w:tcPr>
+          <w:p>
+            <w:pPr>
+              <w:spacing w:before="0" w:after="0"/>
+              <w:jc w:val="right"/>
+            </w:pPr>
+            <w:bookmarkStart w:id="78" w:name="_RefEq4_42"/>
+            <w:r>
+              <w:t>(4-</w:t>
+            </w:r>
+            <w:r>
+              <w:fldChar w:fldCharType="begin"/>
+            </w:r>
+            <w:r>
+              <w:instrText xml:space="preserve"> SEQ Eq4 \* ARABIC </w:instrText>
+            </w:r>
+            <w:r>
+              <w:fldChar w:fldCharType="separate"/>
+            </w:r>
+            <w:r>
+              <w:t>20</w:t>
+            </w:r>
+            <w:r>
+              <w:fldChar w:fldCharType="end"/>
+            </w:r>
+            <w:r>
+              <w:t>)</w:t>
+            </w:r>
+            <w:bookmarkEnd w:id="78"/>
+          </w:p>
+        </w:tc>
+      </w:tr>
+    </w:tbl>
+    <w:p>
+      <w:pPr>
+        <w:ind w:firstLine="420"/>
+        <w:jc w:val="both"/>
+      </w:pPr>
+      <w:r>
+        <w:t>式（4-20）中的显式 token 按统一词表顺序排列，使师生粗粒度分布逐项对应；尾部类别仅表示剩余总量。将这两个分布代入式（4-2），即可在主要散度下训练学生。各组匹配平均显式候选数，补入 token 的教师评分另行计时；仅使用教师 Top-K 时，式（4-20）退化为已有的尾部类别基线[31]。</w:t>
+      </w:r>
+    </w:p>
+    <w:p>
+      <w:pPr>
+        <w:ind w:firstLine="420"/>
+        <w:jc w:val="both"/>
+      </w:pPr>
+      <w:r>
+        <w:t>K1 sampled-token 使用从提议分布抽取的单个 token 估计词表求和，作为极低反馈量基线。下式给出 Forward KL 和 Reverse KL 对应的单样本重要性估计：</w:t>
+      </w:r>
+    </w:p>
+    <w:tbl>
+      <w:tblPr>
+        <w:tblStyle w:val="10"/>
+        <w:tblW w:w="8306" w:type="dxa"/>
+        <w:jc w:val="center"/>
+        <w:tblBorders>
+          <w:top w:val="none" w:color="auto" w:sz="0" w:space="0"/>
+          <w:left w:val="none" w:color="auto" w:sz="0" w:space="0"/>
+          <w:bottom w:val="none" w:color="auto" w:sz="0" w:space="0"/>
+          <w:right w:val="none" w:color="auto" w:sz="0" w:space="0"/>
+          <w:insideH w:val="none" w:color="auto" w:sz="0" w:space="0"/>
+          <w:insideV w:val="none" w:color="auto" w:sz="0" w:space="0"/>
+        </w:tblBorders>
+        <w:tblLayout w:type="fixed"/>
+        <w:tblCellMar>
+          <w:top w:w="0" w:type="dxa"/>
+          <w:left w:w="108" w:type="dxa"/>
+          <w:bottom w:w="0" w:type="dxa"/>
+          <w:right w:w="108" w:type="dxa"/>
+        </w:tblCellMar>
+      </w:tblPr>
+      <w:tblGrid>
+        <w:gridCol w:w="650"/>
+        <w:gridCol w:w="7006"/>
+        <w:gridCol w:w="650"/>
+      </w:tblGrid>
+      <w:tr>
+        <w:trPr>
+          <w:cantSplit/>
+          <w:jc w:val="center"/>
+        </w:trPr>
+        <w:tc>
+          <w:tcPr>
+            <w:tcW w:w="650" w:type="dxa"/>
+            <w:tcMar>
+              <w:top w:w="0" w:type="dxa"/>
+              <w:left w:w="0" w:type="dxa"/>
+              <w:bottom w:w="0" w:type="dxa"/>
+              <w:right w:w="0" w:type="dxa"/>
+            </w:tcMar>
+            <w:vAlign w:val="center"/>
+          </w:tcPr>
+          <w:p>
+            <w:pPr>
+              <w:spacing w:before="0" w:after="0"/>
+              <w:jc w:val="left"/>
+            </w:pPr>
+          </w:p>
+        </w:tc>
+        <w:tc>
+          <w:tcPr>
+            <w:tcW w:w="7006" w:type="dxa"/>
+            <w:tcMar>
+              <w:top w:w="0" w:type="dxa"/>
+              <w:left w:w="0" w:type="dxa"/>
+              <w:bottom w:w="0" w:type="dxa"/>
+              <w:right w:w="0" w:type="dxa"/>
+            </w:tcMar>
+            <w:vAlign w:val="center"/>
+          </w:tcPr>
+          <w:p>
+            <w:pPr>
+              <w:spacing w:before="0" w:after="0"/>
+              <w:jc w:val="center"/>
+              <w:rPr>
+                <w:rFonts w:hint="default"/>
+                <w:lang w:val="en-US"/>
+              </w:rPr>
+            </w:pPr>
+            <m:oMathPara>
+              <m:oMathParaPr>
+                <m:jc m:val="center"/>
+              </m:oMathParaPr>
+              <m:oMath>
+                <m:sSub>
+                  <m:sSubPr/>
+                  <m:e>
+                    <m:acc>
+                      <m:accPr/>
+                      <m:e>
+                        <m:r>
+                          <m:rPr/>
+                          <m:t>D</m:t>
+                        </m:r>
+                      </m:e>
+                    </m:acc>
+                  </m:e>
+                  <m:sub>
+                    <m:r>
+                      <m:rPr>
+                        <m:sty m:val="p"/>
+                      </m:rPr>
+                      <m:t>FKL</m:t>
+                    </m:r>
+                  </m:sub>
+                </m:sSub>
+                <m:r>
+                  <m:rPr>
+                    <m:sty m:val="p"/>
+                  </m:rPr>
+                  <m:t>=</m:t>
+                </m:r>
+                <m:f>
+                  <m:fPr/>
+                  <m:num>
+                    <m:sSub>
+                      <m:sSubPr/>
+                      <m:e>
+                        <m:r>
+                          <m:rPr/>
+                          <m:t>p</m:t>
+                        </m:r>
+                      </m:e>
+                      <m:sub>
+                        <m:r>
+                          <m:rPr/>
+                          <m:t>T</m:t>
+                        </m:r>
+                        <m:r>
+                          <m:rPr>
+                            <m:sty m:val="p"/>
+                          </m:rPr>
+                          <m:t>,</m:t>
+                        </m:r>
+                        <m:r>
+                          <m:rPr/>
+                          <m:t>t</m:t>
+                        </m:r>
+                      </m:sub>
+                    </m:sSub>
+                    <m:r>
+                      <m:rPr>
+                        <m:sty m:val="p"/>
+                      </m:rPr>
+                      <m:t>(</m:t>
+                    </m:r>
+                    <m:acc>
+                      <m:accPr/>
+                      <m:e>
+                        <m:r>
+                          <m:rPr/>
+                          <m:t>v</m:t>
+                        </m:r>
+                      </m:e>
+                    </m:acc>
+                    <m:r>
+                      <m:rPr>
+                        <m:sty m:val="p"/>
+                      </m:rPr>
+                      <m:t>)</m:t>
+                    </m:r>
+                  </m:num>
+                  <m:den>
+                    <m:sSub>
+                      <m:sSubPr/>
+                      <m:e>
+                        <m:r>
+                          <m:rPr/>
+                          <m:t>q</m:t>
+                        </m:r>
+                      </m:e>
+                      <m:sub>
+                        <m:r>
+                          <m:rPr/>
+                          <m:t>t</m:t>
+                        </m:r>
+                      </m:sub>
+                    </m:sSub>
+                    <m:r>
+                      <m:rPr>
+                        <m:sty m:val="p"/>
+                      </m:rPr>
+                      <m:t>(</m:t>
+                    </m:r>
+                    <m:acc>
+                      <m:accPr/>
+                      <m:e>
+                        <m:r>
+                          <m:rPr/>
+                          <m:t>v</m:t>
+                        </m:r>
+                      </m:e>
+                    </m:acc>
+                    <m:r>
+                      <m:rPr>
+                        <m:sty m:val="p"/>
+                      </m:rPr>
+                      <m:t>)</m:t>
+                    </m:r>
+                  </m:den>
+                </m:f>
+                <m:r>
+                  <m:rPr>
+                    <m:sty m:val="p"/>
+                  </m:rPr>
+                  <m:t>log</m:t>
+                </m:r>
+                <m:f>
+                  <m:fPr/>
+                  <m:num>
+                    <m:sSub>
+                      <m:sSubPr/>
+                      <m:e>
+                        <m:r>
+                          <m:rPr/>
+                          <m:t>p</m:t>
+                        </m:r>
+                      </m:e>
+                      <m:sub>
+                        <m:r>
+                          <m:rPr/>
+                          <m:t>T</m:t>
+                        </m:r>
+                        <m:r>
+                          <m:rPr>
+                            <m:sty m:val="p"/>
+                          </m:rPr>
+                          <m:t>,</m:t>
+                        </m:r>
+                        <m:r>
+                          <m:rPr/>
+                          <m:t>t</m:t>
+                        </m:r>
+                      </m:sub>
+                    </m:sSub>
+                    <m:r>
+                      <m:rPr>
+                        <m:sty m:val="p"/>
+                      </m:rPr>
+                      <m:t>(</m:t>
+                    </m:r>
+                    <m:acc>
+                      <m:accPr/>
+                      <m:e>
+                        <m:r>
+                          <m:rPr/>
+                          <m:t>v</m:t>
+                        </m:r>
+                      </m:e>
+                    </m:acc>
+                    <m:r>
+                      <m:rPr>
+                        <m:sty m:val="p"/>
+                      </m:rPr>
+                      <m:t>)</m:t>
+                    </m:r>
+                  </m:num>
+                  <m:den>
+                    <m:sSub>
+                      <m:sSubPr/>
+                      <m:e>
+                        <m:r>
+                          <m:rPr/>
+                          <m:t>p</m:t>
+                        </m:r>
+                      </m:e>
+                      <m:sub>
+                        <m:r>
+                          <m:rPr/>
+                          <m:t>S</m:t>
+                        </m:r>
+                        <m:r>
+                          <m:rPr>
+                            <m:sty m:val="p"/>
+                          </m:rPr>
+                          <m:t>,</m:t>
+                        </m:r>
+                        <m:r>
+                          <m:rPr/>
+                          <m:t>t</m:t>
+                        </m:r>
+                      </m:sub>
+                    </m:sSub>
+                    <m:r>
+                      <m:rPr>
+                        <m:sty m:val="p"/>
+                      </m:rPr>
+                      <m:t>(</m:t>
+                    </m:r>
+                    <m:acc>
+                      <m:accPr/>
+                      <m:e>
+                        <m:r>
+                          <m:rPr/>
+                          <m:t>v</m:t>
+                        </m:r>
+                      </m:e>
+                    </m:acc>
+                    <m:r>
+                      <m:rPr>
+                        <m:sty m:val="p"/>
+                      </m:rPr>
+                      <m:t>)</m:t>
+                    </m:r>
+                  </m:den>
+                </m:f>
+                <m:r>
+                  <m:rPr>
+                    <m:sty m:val="p"/>
+                  </m:rPr>
+                  <w:rPr>
+                    <w:rFonts w:hint="default"/>
+                    <w:lang w:val="en-US"/>
+                  </w:rPr>
+                  <m:t>,</m:t>
+                </m:r>
+                <m:acc>
+                  <m:accPr/>
+                  <m:e>
+                    <m:r>
+                      <m:rPr/>
+                      <m:t>v</m:t>
+                    </m:r>
+                  </m:e>
+                </m:acc>
+                <m:r>
+                  <m:rPr>
+                    <m:sty m:val="p"/>
+                  </m:rPr>
+                  <m:t>∼</m:t>
+                </m:r>
+                <m:sSub>
+                  <m:sSubPr/>
+                  <m:e>
+                    <m:r>
+                      <m:rPr/>
+                      <m:t>q</m:t>
+                    </m:r>
+                  </m:e>
+                  <m:sub>
+                    <m:r>
+                      <m:rPr/>
+                      <m:t>t</m:t>
+                    </m:r>
+                  </m:sub>
+                </m:sSub>
+              </m:oMath>
+            </m:oMathPara>
+          </w:p>
+        </w:tc>
+        <w:tc>
+          <w:tcPr>
+            <w:tcW w:w="650" w:type="dxa"/>
+            <w:tcMar>
+              <w:top w:w="0" w:type="dxa"/>
+              <w:left w:w="0" w:type="dxa"/>
+              <w:bottom w:w="0" w:type="dxa"/>
+              <w:right w:w="0" w:type="dxa"/>
+            </w:tcMar>
+            <w:vAlign w:val="center"/>
+          </w:tcPr>
+          <w:p>
+            <w:pPr>
+              <w:spacing w:before="0" w:after="0"/>
+              <w:jc w:val="right"/>
+            </w:pPr>
+            <w:bookmarkStart w:id="50" w:name="_RefEq4_29"/>
+            <w:r>
+              <w:t>(4-</w:t>
+            </w:r>
+            <w:r>
+              <w:fldChar w:fldCharType="begin"/>
+            </w:r>
+            <w:r>
+              <w:instrText xml:space="preserve"> SEQ Eq4 \* ARABIC </w:instrText>
+            </w:r>
+            <w:r>
+              <w:fldChar w:fldCharType="separate"/>
+            </w:r>
+            <w:r>
+              <w:t>21</w:t>
+            </w:r>
+            <w:r>
+              <w:fldChar w:fldCharType="end"/>
+            </w:r>
+            <w:r>
+              <w:t>)</w:t>
+            </w:r>
+            <w:bookmarkEnd w:id="50"/>
+          </w:p>
+        </w:tc>
+      </w:tr>
+      <w:tr>
+        <w:trPr>
+          <w:cantSplit/>
+          <w:jc w:val="center"/>
+        </w:trPr>
+        <w:tc>
+          <w:tcPr>
+            <w:tcW w:w="650" w:type="dxa"/>
+            <w:tcMar>
+              <w:top w:w="0" w:type="dxa"/>
+              <w:left w:w="0" w:type="dxa"/>
+              <w:bottom w:w="0" w:type="dxa"/>
+              <w:right w:w="0" w:type="dxa"/>
+            </w:tcMar>
+            <w:vAlign w:val="center"/>
+          </w:tcPr>
+          <w:p>
+            <w:pPr>
+              <w:spacing w:before="0" w:after="0"/>
+              <w:jc w:val="left"/>
+            </w:pPr>
+          </w:p>
+        </w:tc>
+        <w:tc>
+          <w:tcPr>
+            <w:tcW w:w="7006" w:type="dxa"/>
+            <w:tcMar>
+              <w:top w:w="0" w:type="dxa"/>
+              <w:left w:w="0" w:type="dxa"/>
+              <w:bottom w:w="0" w:type="dxa"/>
+              <w:right w:w="0" w:type="dxa"/>
+            </w:tcMar>
+            <w:vAlign w:val="center"/>
+          </w:tcPr>
+          <w:p>
+            <w:pPr>
+              <w:spacing w:before="0" w:after="0"/>
+              <w:jc w:val="center"/>
+              <w:rPr>
+                <w:rFonts w:hint="default"/>
+                <w:lang w:val="en-US"/>
+              </w:rPr>
+            </w:pPr>
+            <m:oMathPara>
+              <m:oMathParaPr>
+                <m:jc m:val="center"/>
+              </m:oMathParaPr>
+              <m:oMath>
+                <m:sSub>
+                  <m:sSubPr/>
+                  <m:e>
+                    <m:acc>
+                      <m:accPr/>
+                      <m:e>
+                        <m:r>
+                          <m:rPr/>
+                          <m:t>D</m:t>
+                        </m:r>
+                      </m:e>
+                    </m:acc>
+                  </m:e>
+                  <m:sub>
+                    <m:r>
+                      <m:rPr>
+                        <m:sty m:val="p"/>
+                      </m:rPr>
+                      <m:t>RKL</m:t>
+                    </m:r>
+                  </m:sub>
+                </m:sSub>
+                <m:r>
+                  <m:rPr>
+                    <m:sty m:val="p"/>
+                  </m:rPr>
+                  <m:t>=</m:t>
+                </m:r>
+                <m:f>
+                  <m:fPr/>
+                  <m:num>
+                    <m:sSub>
+                      <m:sSubPr/>
+                      <m:e>
+                        <m:r>
+                          <m:rPr/>
+                          <m:t>p</m:t>
+                        </m:r>
+                      </m:e>
+                      <m:sub>
+                        <m:r>
+                          <m:rPr/>
+                          <m:t>S</m:t>
+                        </m:r>
+                        <m:r>
+                          <m:rPr>
+                            <m:sty m:val="p"/>
+                          </m:rPr>
+                          <m:t>,</m:t>
+                        </m:r>
+                        <m:r>
+                          <m:rPr/>
+                          <m:t>t</m:t>
+                        </m:r>
+                      </m:sub>
+                    </m:sSub>
+                    <m:r>
+                      <m:rPr>
+                        <m:sty m:val="p"/>
+                      </m:rPr>
+                      <m:t>(</m:t>
+                    </m:r>
+                    <m:acc>
+                      <m:accPr/>
+                      <m:e>
+                        <m:r>
+                          <m:rPr/>
+                          <m:t>v</m:t>
+                        </m:r>
+                      </m:e>
+                    </m:acc>
+                    <m:r>
+                      <m:rPr>
+                        <m:sty m:val="p"/>
+                      </m:rPr>
+                      <m:t>)</m:t>
+                    </m:r>
+                  </m:num>
+                  <m:den>
+                    <m:sSub>
+                      <m:sSubPr/>
+                      <m:e>
+                        <m:r>
+                          <m:rPr/>
+                          <m:t>q</m:t>
+                        </m:r>
+                      </m:e>
+                      <m:sub>
+                        <m:r>
+                          <m:rPr/>
+                          <m:t>t</m:t>
+                        </m:r>
+                      </m:sub>
+                    </m:sSub>
+                    <m:r>
+                      <m:rPr>
+                        <m:sty m:val="p"/>
+                      </m:rPr>
+                      <m:t>(</m:t>
+                    </m:r>
+                    <m:acc>
+                      <m:accPr/>
+                      <m:e>
+                        <m:r>
+                          <m:rPr/>
+                          <m:t>v</m:t>
+                        </m:r>
+                      </m:e>
+                    </m:acc>
+                    <m:r>
+                      <m:rPr>
+                        <m:sty m:val="p"/>
+                      </m:rPr>
+                      <m:t>)</m:t>
+                    </m:r>
+                  </m:den>
+                </m:f>
+                <m:r>
+                  <m:rPr>
+                    <m:sty m:val="p"/>
+                  </m:rPr>
+                  <m:t>log</m:t>
+                </m:r>
+                <m:f>
+                  <m:fPr/>
+                  <m:num>
+                    <m:sSub>
+                      <m:sSubPr/>
+                      <m:e>
+                        <m:r>
+                          <m:rPr/>
+                          <m:t>p</m:t>
+                        </m:r>
+                      </m:e>
+                      <m:sub>
+                        <m:r>
+                          <m:rPr/>
+                          <m:t>S</m:t>
+                        </m:r>
+                        <m:r>
+                          <m:rPr>
+                            <m:sty m:val="p"/>
+                          </m:rPr>
+                          <m:t>,</m:t>
+                        </m:r>
+                        <m:r>
+                          <m:rPr/>
+                          <m:t>t</m:t>
+                        </m:r>
+                      </m:sub>
+                    </m:sSub>
+                    <m:r>
+                      <m:rPr>
+                        <m:sty m:val="p"/>
+                      </m:rPr>
+                      <m:t>(</m:t>
+                    </m:r>
+                    <m:acc>
+                      <m:accPr/>
+                      <m:e>
+                        <m:r>
+                          <m:rPr/>
+                          <m:t>v</m:t>
+                        </m:r>
+                      </m:e>
+                    </m:acc>
+                    <m:r>
+                      <m:rPr>
+                        <m:sty m:val="p"/>
+                      </m:rPr>
+                      <m:t>)</m:t>
+                    </m:r>
+                  </m:num>
+                  <m:den>
+                    <m:sSub>
+                      <m:sSubPr/>
+                      <m:e>
+                        <m:r>
+                          <m:rPr/>
+                          <m:t>p</m:t>
+                        </m:r>
+                      </m:e>
+                      <m:sub>
+                        <m:r>
+                          <m:rPr/>
+                          <m:t>T</m:t>
+                        </m:r>
+                        <m:r>
+                          <m:rPr>
+                            <m:sty m:val="p"/>
+                          </m:rPr>
+                          <m:t>,</m:t>
+                        </m:r>
+                        <m:r>
+                          <m:rPr/>
+                          <m:t>t</m:t>
+                        </m:r>
+                      </m:sub>
+                    </m:sSub>
+                    <m:r>
+                      <m:rPr>
+                        <m:sty m:val="p"/>
+                      </m:rPr>
+                      <m:t>(</m:t>
+                    </m:r>
+                    <m:acc>
+                      <m:accPr/>
+                      <m:e>
+                        <m:r>
+                          <m:rPr/>
+                          <m:t>v</m:t>
+                        </m:r>
+                      </m:e>
+                    </m:acc>
+                    <m:r>
+                      <m:rPr>
+                        <m:sty m:val="p"/>
+                      </m:rPr>
+                      <m:t>)</m:t>
+                    </m:r>
+                  </m:den>
+                </m:f>
+                <m:r>
+                  <m:rPr>
+                    <m:sty m:val="p"/>
+                  </m:rPr>
+                  <w:rPr>
+                    <w:rFonts w:hint="default"/>
+                    <w:lang w:val="en-US"/>
+                  </w:rPr>
+                  <m:t>,</m:t>
+                </m:r>
+                <m:acc>
+                  <m:accPr/>
+                  <m:e>
+                    <m:r>
+                      <m:rPr/>
+                      <m:t>v</m:t>
+                    </m:r>
+                  </m:e>
+                </m:acc>
+                <m:r>
+                  <m:rPr>
+                    <m:sty m:val="p"/>
+                  </m:rPr>
+                  <m:t>∼</m:t>
+                </m:r>
+                <m:sSub>
+                  <m:sSubPr/>
+                  <m:e>
+                    <m:r>
+                      <m:rPr/>
+                      <m:t>q</m:t>
+                    </m:r>
+                  </m:e>
+                  <m:sub>
+                    <m:r>
+                      <m:rPr/>
+                      <m:t>t</m:t>
+                    </m:r>
+                  </m:sub>
+                </m:sSub>
+              </m:oMath>
+            </m:oMathPara>
+          </w:p>
+        </w:tc>
+        <w:tc>
+          <w:tcPr>
+            <w:tcW w:w="650" w:type="dxa"/>
+            <w:tcMar>
+              <w:top w:w="0" w:type="dxa"/>
+              <w:left w:w="0" w:type="dxa"/>
+              <w:bottom w:w="0" w:type="dxa"/>
+              <w:right w:w="0" w:type="dxa"/>
+            </w:tcMar>
+            <w:vAlign w:val="center"/>
+          </w:tcPr>
+          <w:p>
+            <w:pPr>
+              <w:spacing w:before="0" w:after="0"/>
+              <w:jc w:val="right"/>
+            </w:pPr>
+          </w:p>
+        </w:tc>
+      </w:tr>
+    </w:tbl>
+    <w:p>
+      <w:pPr>
+        <w:ind w:firstLine="420"/>
+        <w:jc w:val="both"/>
+      </w:pPr>
+      <w:r>
+        <w:t>K1 的提议分布及随机种子均需记录，提议分布应覆盖被估计目标的支持集。位置风险在训练集诊断子集估计，质量阈值、候选名额和 K 上限由验证集确定，测试集只用于最终评价。额外教师概率查询、反馈字节数与教师前向时间分别计量。所有目标采用一致的数值稳定处理、有效位置归一化和有限值检查。</w:t>
+      </w:r>
+    </w:p>
+    <w:p>
+      <w:pPr>
+        <w:pStyle w:val="3"/>
+        <w:jc w:val="left"/>
+      </w:pPr>
+      <w:bookmarkStart w:id="51" w:name="_Toc534757053"/>
+      <w:r>
+        <w:rPr>
+          <w:rFonts w:ascii="黑体" w:hAnsi="黑体" w:eastAsia="黑体" w:cs="黑体"/>
+          <w:b/>
+          <w:color w:val="000000"/>
+          <w:sz w:val="24"/>
+        </w:rPr>
+        <w:t>4.5 评价指标和公平性</w:t>
+      </w:r>
+      <w:bookmarkEnd w:id="51"/>
+    </w:p>
+    <w:p>
+      <w:pPr>
+        <w:ind w:firstLine="420"/>
+        <w:jc w:val="both"/>
+      </w:pPr>
+      <w:r>
+        <w:t>评价指标对应三个研究问题：状态覆盖与错误分布、完整词表散度的梯度和调用行为，以及稀疏支持集的尾部质量、决策 token 漏选与反馈成本。方法的实际价值还需由任务正确性、训练稳定性和资源消耗共同判断，指标汇总见表 4-3。</w:t>
+      </w:r>
+    </w:p>
+    <w:p>
+      <w:pPr>
+        <w:ind w:firstLine="420"/>
+        <w:jc w:val="both"/>
+      </w:pPr>
+    </w:p>
+    <w:p>
+      <w:pPr>
+        <w:keepNext/>
+        <w:spacing w:before="80" w:after="80" w:line="240" w:lineRule="auto"/>
+        <w:ind w:left="0" w:right="0" w:firstLine="0"/>
+        <w:jc w:val="center"/>
+      </w:pPr>
+      <w:r>
+        <w:rPr>
+          <w:rFonts w:ascii="Times New Roman" w:hAnsi="Times New Roman" w:eastAsia="Songti SC"/>
+          <w:sz w:val="21"/>
+        </w:rPr>
+        <w:t xml:space="preserve">表 </w:t>
+      </w:r>
+      <w:bookmarkStart w:id="52" w:name="_RefTable4_3"/>
+      <w:r>
+        <w:rPr>
+          <w:rFonts w:ascii="Times New Roman" w:hAnsi="Times New Roman" w:eastAsia="Songti SC"/>
+          <w:sz w:val="21"/>
+        </w:rPr>
+        <w:t>4-</w:t>
+      </w:r>
+      <w:r>
+        <w:rPr>
+          <w:rFonts w:ascii="Times New Roman" w:hAnsi="Times New Roman" w:eastAsia="Songti SC"/>
+          <w:sz w:val="21"/>
+        </w:rPr>
+        <w:fldChar w:fldCharType="begin"/>
+      </w:r>
+      <w:r>
+        <w:rPr>
+          <w:rFonts w:ascii="Times New Roman" w:hAnsi="Times New Roman" w:eastAsia="Songti SC"/>
+          <w:sz w:val="21"/>
+        </w:rPr>
+        <w:instrText xml:space="preserve"> SEQ TableCh4 \* ARABIC </w:instrText>
+      </w:r>
+      <w:r>
+        <w:rPr>
+          <w:rFonts w:ascii="Times New Roman" w:hAnsi="Times New Roman" w:eastAsia="Songti SC"/>
+          <w:sz w:val="21"/>
+        </w:rPr>
+        <w:fldChar w:fldCharType="separate"/>
+      </w:r>
+      <w:r>
+        <w:rPr>
+          <w:rFonts w:ascii="Times New Roman" w:hAnsi="Times New Roman" w:eastAsia="Songti SC"/>
+          <w:sz w:val="21"/>
+        </w:rPr>
+        <w:t>3</w:t>
+      </w:r>
+      <w:r>
+        <w:rPr>
+          <w:rFonts w:ascii="Times New Roman" w:hAnsi="Times New Roman" w:eastAsia="Songti SC"/>
+          <w:sz w:val="21"/>
+        </w:rPr>
+        <w:fldChar w:fldCharType="end"/>
+      </w:r>
+      <w:bookmarkEnd w:id="52"/>
+      <w:r>
+        <w:rPr>
+          <w:rFonts w:ascii="Times New Roman" w:hAnsi="Times New Roman" w:eastAsia="Songti SC"/>
+          <w:sz w:val="21"/>
+        </w:rPr>
+        <w:t xml:space="preserve">  评价指标体系</w:t>
+      </w:r>
+    </w:p>
+    <w:tbl>
+      <w:tblPr>
+        <w:tblStyle w:val="11"/>
+        <w:tblW w:w="0" w:type="auto"/>
+        <w:tblInd w:w="0" w:type="dxa"/>
+        <w:tblBorders>
+          <w:top w:val="single" w:color="auto" w:sz="4" w:space="0"/>
+          <w:left w:val="single" w:color="auto" w:sz="4" w:space="0"/>
+          <w:bottom w:val="single" w:color="auto" w:sz="4" w:space="0"/>
+          <w:right w:val="single" w:color="auto" w:sz="4" w:space="0"/>
+          <w:insideH w:val="single" w:color="auto" w:sz="4" w:space="0"/>
+          <w:insideV w:val="single" w:color="auto" w:sz="4" w:space="0"/>
+        </w:tblBorders>
+        <w:tblLayout w:type="autofit"/>
+        <w:tblCellMar>
+          <w:top w:w="0" w:type="dxa"/>
+          <w:left w:w="108" w:type="dxa"/>
+          <w:bottom w:w="0" w:type="dxa"/>
+          <w:right w:w="108" w:type="dxa"/>
+        </w:tblCellMar>
+      </w:tblPr>
+      <w:tblGrid>
+        <w:gridCol w:w="4148"/>
+        <w:gridCol w:w="4148"/>
+      </w:tblGrid>
+      <w:tr>
+        <w:trPr>
+          <w:tblHeader/>
+        </w:trPr>
+        <w:tc>
+          <w:tcPr>
+            <w:tcW w:w="4148" w:type="dxa"/>
+          </w:tcPr>
+          <w:p>
+            <w:pPr>
+              <w:ind w:firstLine="0"/>
+              <w:jc w:val="left"/>
+            </w:pPr>
+            <w:r>
+              <w:rPr>
+                <w:b/>
+              </w:rPr>
+              <w:t>类别</w:t>
+            </w:r>
+          </w:p>
+        </w:tc>
+        <w:tc>
+          <w:tcPr>
+            <w:tcW w:w="4148" w:type="dxa"/>
+          </w:tcPr>
+          <w:p>
+            <w:pPr>
+              <w:ind w:firstLine="0"/>
+              <w:jc w:val="left"/>
+            </w:pPr>
+            <w:r>
+              <w:rPr>
+                <w:b/>
+              </w:rPr>
+              <w:t>关注内容</w:t>
+            </w:r>
+          </w:p>
+        </w:tc>
+      </w:tr>
+      <w:tr>
+        <w:tc>
+          <w:tcPr>
+            <w:tcW w:w="4148" w:type="dxa"/>
+          </w:tcPr>
+          <w:p>
+            <w:pPr>
+              <w:ind w:firstLine="0"/>
+              <w:jc w:val="left"/>
+            </w:pPr>
+            <w:r>
+              <w:t>核心任务效果</w:t>
+            </w:r>
+          </w:p>
+        </w:tc>
+        <w:tc>
+          <w:tcPr>
+            <w:tcW w:w="4148" w:type="dxa"/>
+          </w:tcPr>
+          <w:p>
+            <w:pPr>
+              <w:ind w:firstLine="0"/>
+              <w:jc w:val="left"/>
+            </w:pPr>
+            <w:r>
+              <w:t>JSON／结构化格式合法性、函数名、参数键值、schema 通过率、调用执行成功率和端到端任务完成率</w:t>
+            </w:r>
+          </w:p>
+        </w:tc>
+      </w:tr>
+      <w:tr>
+        <w:tc>
+          <w:tcPr>
+            <w:tcW w:w="4148" w:type="dxa"/>
+          </w:tcPr>
+          <w:p>
+            <w:pPr>
+              <w:ind w:firstLine="0"/>
+              <w:jc w:val="left"/>
+            </w:pPr>
+            <w:r>
+              <w:t>核心稳定性与分布</w:t>
+            </w:r>
+          </w:p>
+        </w:tc>
+        <w:tc>
+          <w:tcPr>
+            <w:tcW w:w="4148" w:type="dxa"/>
+          </w:tcPr>
+          <w:p>
+            <w:pPr>
+              <w:ind w:firstLine="0"/>
+              <w:jc w:val="left"/>
+            </w:pPr>
+            <w:r>
+              <w:t>蒸馏损失、熵变化、师生分布差异、Top-K overlap、支持集外概率、非法输出率和重复率</w:t>
+            </w:r>
+          </w:p>
+        </w:tc>
+      </w:tr>
+      <w:tr>
+        <w:tc>
+          <w:tcPr>
+            <w:tcW w:w="4148" w:type="dxa"/>
+          </w:tcPr>
+          <w:p>
+            <w:pPr>
+              <w:ind w:firstLine="0"/>
+              <w:jc w:val="left"/>
+            </w:pPr>
+            <w:r>
+              <w:t>核心训练资源</w:t>
+            </w:r>
+          </w:p>
+        </w:tc>
+        <w:tc>
+          <w:tcPr>
+            <w:tcW w:w="4148" w:type="dxa"/>
+          </w:tcPr>
+          <w:p>
+            <w:pPr>
+              <w:ind w:firstLine="0"/>
+              <w:jc w:val="left"/>
+            </w:pPr>
+            <w:r>
+              <w:t>教师反馈量、教师推理开销、学生 rollout 开销、训练时间和峰值显存</w:t>
+            </w:r>
+          </w:p>
+        </w:tc>
+      </w:tr>
+      <w:tr>
+        <w:tc>
+          <w:tcPr>
+            <w:tcW w:w="4148" w:type="dxa"/>
+          </w:tcPr>
+          <w:p>
+            <w:pPr>
+              <w:ind w:firstLine="0"/>
+              <w:jc w:val="left"/>
+            </w:pPr>
+            <w:r>
+              <w:t>扩展服务评测</w:t>
+            </w:r>
+          </w:p>
+        </w:tc>
+        <w:tc>
+          <w:tcPr>
+            <w:tcW w:w="4148" w:type="dxa"/>
+          </w:tcPr>
+          <w:p>
+            <w:pPr>
+              <w:ind w:firstLine="0"/>
+              <w:jc w:val="left"/>
+            </w:pPr>
+            <w:r>
+              <w:t>吞吐、首 token 延迟、完整响应延迟和端到端任务成功率</w:t>
+            </w:r>
+          </w:p>
+        </w:tc>
+      </w:tr>
+    </w:tbl>
+    <w:p>
+      <w:pPr>
+        <w:ind w:firstLine="420"/>
+        <w:jc w:val="both"/>
+      </w:pPr>
+      <w:r>
+        <w:t>设测试集包含若干样本，并分别记录预测函数、目标函数和端到端任务是否完成，则函数选择准确率和端到端成功率定义为：</w:t>
+      </w:r>
+    </w:p>
+    <w:tbl>
+      <w:tblPr>
+        <w:tblStyle w:val="10"/>
+        <w:tblW w:w="8306" w:type="dxa"/>
+        <w:jc w:val="center"/>
+        <w:tblBorders>
+          <w:top w:val="none" w:color="auto" w:sz="0" w:space="0"/>
+          <w:left w:val="none" w:color="auto" w:sz="0" w:space="0"/>
+          <w:bottom w:val="none" w:color="auto" w:sz="0" w:space="0"/>
+          <w:right w:val="none" w:color="auto" w:sz="0" w:space="0"/>
+          <w:insideH w:val="none" w:color="auto" w:sz="0" w:space="0"/>
+          <w:insideV w:val="none" w:color="auto" w:sz="0" w:space="0"/>
+        </w:tblBorders>
+        <w:tblLayout w:type="fixed"/>
+        <w:tblCellMar>
+          <w:top w:w="0" w:type="dxa"/>
+          <w:left w:w="108" w:type="dxa"/>
+          <w:bottom w:w="0" w:type="dxa"/>
+          <w:right w:w="108" w:type="dxa"/>
+        </w:tblCellMar>
+      </w:tblPr>
+      <w:tblGrid>
+        <w:gridCol w:w="650"/>
+        <w:gridCol w:w="7006"/>
+        <w:gridCol w:w="650"/>
+      </w:tblGrid>
+      <w:tr>
+        <w:trPr>
+          <w:cantSplit/>
+          <w:jc w:val="center"/>
+        </w:trPr>
+        <w:tc>
+          <w:tcPr>
+            <w:tcW w:w="650" w:type="dxa"/>
+            <w:tcMar>
+              <w:top w:w="0" w:type="dxa"/>
+              <w:left w:w="0" w:type="dxa"/>
+              <w:bottom w:w="0" w:type="dxa"/>
+              <w:right w:w="0" w:type="dxa"/>
+            </w:tcMar>
+            <w:vAlign w:val="center"/>
+          </w:tcPr>
+          <w:p>
+            <w:pPr>
+              <w:spacing w:before="0" w:after="0"/>
+              <w:jc w:val="left"/>
+            </w:pPr>
+          </w:p>
+        </w:tc>
+        <w:tc>
+          <w:tcPr>
+            <w:tcW w:w="7006" w:type="dxa"/>
+            <w:tcMar>
+              <w:top w:w="0" w:type="dxa"/>
+              <w:left w:w="0" w:type="dxa"/>
+              <w:bottom w:w="0" w:type="dxa"/>
+              <w:right w:w="0" w:type="dxa"/>
+            </w:tcMar>
+            <w:vAlign w:val="center"/>
+          </w:tcPr>
+          <w:p>
+            <w:pPr>
+              <w:spacing w:before="0" w:after="0"/>
+              <w:jc w:val="center"/>
             </w:pPr>
             <m:oMathPara>
               <m:oMath>
@@ -13451,7 +14211,7 @@
               <w:fldChar w:fldCharType="separate"/>
             </w:r>
             <w:r>
-              <w:t>20</w:t>
+              <w:t>22</w:t>
             </w:r>
             <w:r>
               <w:fldChar w:fldCharType="end"/>
@@ -13767,7 +14527,7 @@
               <w:fldChar w:fldCharType="separate"/>
             </w:r>
             <w:r>
-              <w:t>21</w:t>
+              <w:t>23</w:t>
             </w:r>
             <w:r>
               <w:fldChar w:fldCharType="end"/>
@@ -14110,7 +14870,7 @@
               <w:fldChar w:fldCharType="separate"/>
             </w:r>
             <w:r>
-              <w:t>22</w:t>
+              <w:t>24</w:t>
             </w:r>
             <w:r>
               <w:fldChar w:fldCharType="end"/>
@@ -14129,7 +14889,7 @@
         <w:jc w:val="both"/>
       </w:pPr>
       <w:r>
-        <w:t>其中“≡”依据 schema 允许的类型转换、顺序不敏感字段和等价表示判定。本文分别报告 JSON 可解析率、schema 合法率、函数选择和参数正确率；只有当数据集提供可执行工具且执行环境经过验证时，才报告工具执行成功率和端到端任务完成率。否则采用结构化调用匹配评价，并明确该指标与真实工具执行的边界。BFCL 的任务划分与判定规则为评测设计提供参考[27]。</w:t>
+        <w:t>式（4-24）中的“≡”按 schema 允许的类型转换、无序字段和等价表示判定。结果分别报告 JSON 可解析率、schema 合法率、函数选择及参数正确率。具备可执行工具和经过核验的环境时，另报告执行成功率与端到端任务成功率；其余样本采用结构化调用匹配，并说明评价边界。BFCL 的任务划分和判定规则提供评测参考[27]。</w:t>
       </w:r>
     </w:p>
     <w:p>
@@ -14459,7 +15219,7 @@
               <w:fldChar w:fldCharType="separate"/>
             </w:r>
             <w:r>
-              <w:t>23</w:t>
+              <w:t>25</w:t>
             </w:r>
             <w:r>
               <w:fldChar w:fldCharType="end"/>
@@ -14720,7 +15480,7 @@
               <w:fldChar w:fldCharType="separate"/>
             </w:r>
             <w:r>
-              <w:t>24</w:t>
+              <w:t>26</w:t>
             </w:r>
             <w:r>
               <w:fldChar w:fldCharType="end"/>
@@ -14739,7 +15499,7 @@
         <w:jc w:val="both"/>
       </w:pPr>
       <w:r>
-        <w:t>熵与支持集重叠用于观察师生概率分布是否接近。状态研究按函数、参数和结构位置记录有效 token 数及错误；散度研究比较这些位置的梯度范数、方向与熵变化；稀疏反馈研究记录教师 Top-K 外的总概率质量、学生对应质量、关键决策 token 的漏选率，以及相对于完整词表目标的梯度差异。最终将这些诊断与异常损失、格式错误和函数误选相互核对。</w:t>
+        <w:t>熵与支持集重叠反映师生分布的变化。状态实验按函数、参数和结构位置统计有效 token 与错误；散度实验比较对应位置的梯度范数、方向和熵；稀疏实验记录师生支持集外的概率质量、决策 token 漏选率及相对完整词表目标的梯度差异。异常损失、格式错误和函数误选与上述诊断一同分析。</w:t>
       </w:r>
     </w:p>
     <w:p>
@@ -14930,7 +15690,7 @@
               <w:fldChar w:fldCharType="separate"/>
             </w:r>
             <w:r>
-              <w:t>25</w:t>
+              <w:t>27</w:t>
             </w:r>
             <w:r>
               <w:fldChar w:fldCharType="end"/>
@@ -15103,7 +15863,7 @@
               <w:fldChar w:fldCharType="separate"/>
             </w:r>
             <w:r>
-              <w:t>26</w:t>
+              <w:t>28</w:t>
             </w:r>
             <w:r>
               <w:fldChar w:fldCharType="end"/>
@@ -15122,7 +15882,7 @@
         <w:jc w:val="both"/>
       </w:pPr>
       <w:r>
-        <w:t>除总成本外，本文同时报告教师处理 token 数、教师前向墙钟时间、峰值显存、训练时间和推理吞吐，并单独统计传输或保存的教师反馈字节数与所选 K 的分布。吞吐量按生成 token 数除以墙钟时间计算。缩小反馈表示可能降低传输和存储开销，但是否节省教师计算须以实际计时为准。</w:t>
+        <w:t>资源分析同时报告教师处理 token 数、前向墙钟时间、峰值显存、训练时间和推理吞吐，并统计教师反馈字节数及 K 的分布。吞吐按生成 token 数与墙钟时间计算。稀疏反馈有望减少传输或存储，但教师计算是否同步下降，需要分别计时验证。</w:t>
       </w:r>
     </w:p>
     <w:p>
@@ -15305,7 +16065,7 @@
               <w:fldChar w:fldCharType="separate"/>
             </w:r>
             <w:r>
-              <w:t>27</w:t>
+              <w:t>29</w:t>
             </w:r>
             <w:r>
               <w:fldChar w:fldCharType="end"/>
@@ -15513,7 +16273,7 @@
               <w:fldChar w:fldCharType="separate"/>
             </w:r>
             <w:r>
-              <w:t>28</w:t>
+              <w:t>30</w:t>
             </w:r>
             <w:r>
               <w:fldChar w:fldCharType="end"/>
@@ -15532,7 +16292,7 @@
         <w:jc w:val="both"/>
       </w:pPr>
       <w:r>
-        <w:t>结果讨论以完整训练曲线、测试集统计和资源消耗为依据。失败案例按工具选择、结构解析、参数字段、参数值和可验证的执行环节分类，并回溯其学生到访位置、所用散度目标与教师支持集；无法确定错误成因时，只报告观察到的关联。</w:t>
+        <w:t>结果分析使用完整训练曲线、测试集统计和资源记录。失败轨迹按工具选择、结构解析、参数字段、参数值及可验证的执行环节归类，再回查学生到访位置、散度目标和教师支持集。对于无法确认的错误成因，仅报告可观察到的关联。</w:t>
       </w:r>
     </w:p>
     <w:p>
@@ -15558,7 +16318,7 @@
         <w:jc w:val="both"/>
       </w:pPr>
       <w:r>
-        <w:t>方案采用小规模同家族模型与开源工具链。冻结教师参与前向评分，学生通过 LoRA 更新；PyTorch、Transformers、PEFT 和 vLLM[20]分别支持训练、适配与部署测量。正式实验前先用少量单轮样本核对 tokenizer、模板、状态分类和完整词表散度的数值与梯度，再检查 Top-K 累计质量、尾部类别归一化及关键候选的教师概率能否取得。若接口无法返回补入候选的可靠概率，需改用本地教师前向计算或缩小候选方法的适用范围，并如实计入成本。各环节的继续条件取决于实际错误与资源记录。</w:t>
+        <w:t>小规模同家族模型和开源工具链为方案提供了实施基础。冻结教师前向评分，学生通过 LoRA 更新；PyTorch、Transformers、PEFT 和 vLLM[20]分别用于训练、参数适配与部署测量。正式实验前，以少量单轮样本核对 tokenizer、模板、状态分类、完整词表散度的数值与梯度，再检查 Top-K 尾部质量、概率归一化和补入候选的教师概率。若接口不能稳定提供所需概率，将使用本地教师前向计算或缩小方法范围，相关成本如实记录。</w:t>
       </w:r>
     </w:p>
     <w:p>
@@ -16371,7 +17131,7 @@
         <w:jc w:val="both"/>
       </w:pPr>
       <w:r>
-        <w:t>整个研究周期为 2026 年 9 月至 2027 年 5 月。2026 年内完成开题修改、数据与模型兼容性审计及训练管线；2027 年 2 月起依次形成学生状态分层、完整词表散度分析和稀疏反馈诊断的阶段性结果，3 月中期申请前提交可复查的配置与原始记录。随后开展候选方法的同预算比较、消融、部署评测与统计分析，4—5 月完成论文、结题和答辩材料。</w:t>
+        <w:t>研究周期覆盖 2026 年 9 月至 2027 年 5 月。2026 年内完成开题修改、数据与模型兼容性审计及训练管线；2027 年 2 月起依次开展学生状态分层、完整词表散度分析和稀疏反馈诊断，在 3 月中期申请前形成可复查的阶段性记录。之后完成候选方法的同预算比较、消融、部署评测与统计分析，4—5 月集中撰写论文和结题材料。</w:t>
       </w:r>
     </w:p>
     <w:p>
@@ -16437,7 +17197,7 @@
         <w:jc w:val="both"/>
       </w:pPr>
       <w:r>
-        <w:t>5. 通过 vLLM 或等效的可复现测试程序评估最终学生模型，报告适用边界与失败案例，不把尚未运行的对比写成性能结论。</w:t>
+        <w:t>5. 使用 vLLM 或等效的可复现程序评估最终学生模型，说明适用范围并分析失败案例；所有性能结论以实际运行结果为依据。</w:t>
       </w:r>
     </w:p>
     <w:p>
@@ -16456,7 +17216,7 @@
         <w:jc w:val="both"/>
       </w:pPr>
       <w:r>
-        <w:t>预期形成可复现的单轮工具调用 OPD 流程、完整词表散度的行为分析，以及待实验检验的决策感知稀疏反馈方法，提供相应基线、消融、成本统计和失败案例。最终论文将依据实际结果判断方法的价值及适用边界。</w:t>
+        <w:t>预期成果包括可复现的单轮工具调用 OPD 流程、完整词表散度的行为分析，以及决策感知稀疏反馈方案的受控评价。论文将同时呈现基线、消融、资源开销和失败案例，并依据实际结果界定方法的价值与适用条件。</w:t>
       </w:r>
     </w:p>
     <w:p>
@@ -16497,7 +17257,7 @@
         <w:jc w:val="both"/>
       </w:pPr>
       <w:r>
-        <w:t>目前已确定在线策略蒸馏与单轮 Function Calling 的研究范围，并完成相关文献和候选模型资料调研。Qwen3-0.6B 学生、Qwen3-4B 教师及 LoRA 后训练是当前拟采用的组合，具体版本、tokenizer、模板与可用硬件仍须在实验前核定。PyTorch、Transformers、PEFT、Datasets 和 vLLM 等开源工具可支持数据处理、模型训练与部署评测。</w:t>
+        <w:t>目前已明确在线策略蒸馏与单轮 Function Calling 的研究范围，完成相关文献和候选模型资料调研。Qwen3-0.6B 学生、Qwen3-4B 教师与 LoRA 更新是拟用组合；准确版本、tokenizer、消息模板和硬件条件将在实验前核定。PyTorch、Transformers、PEFT、Datasets 与 vLLM 等开源工具可支持数据处理、训练和部署评测。</w:t>
       </w:r>
     </w:p>
     <w:p>
@@ -16522,7 +17282,7 @@
         <w:jc w:val="both"/>
       </w:pPr>
       <w:r>
-        <w:t>软件环境包括 Python、PyTorch、Transformers、PEFT、Datasets 和 vLLM；硬件应支持教师在学生前缀上评分、必要位置的完整词表诊断，以及学生 rollout 与 LoRA 更新。方法实验还需取得补入决策 token 的教师概率，并记录相应计算和反馈量。实验将依据可用显存设置序列长度、批量大小、梯度累积、混合精度和教师输出缓存。</w:t>
+        <w:t>软件环境需要 Python、PyTorch、Transformers、PEFT、Datasets 和 vLLM。硬件需支持教师在学生前缀上评分、部分位置的完整词表诊断，以及学生 rollout 与 LoRA 更新。候选方法还需取得补入 token 的教师概率，并记录额外评分成本。序列长度、批量大小、梯度累积、混合精度和缓存策略将依据可用显存确定。</w:t>
       </w:r>
     </w:p>
     <w:p>
@@ -16999,7 +17759,7 @@
         <w:jc w:val="both"/>
       </w:pPr>
       <w:r>
-        <w:t>研究风险分别对应学生状态识别、散度目标解释和稀疏反馈改进，另需控制教师评分、训练资源及评测环境的限制。表 7-1 列出主要困难与应对措施。</w:t>
+        <w:t>主要风险涉及学生状态的可靠标注、散度差异的解释和稀疏反馈方法的收益；教师评分、训练资源与执行评测条件也会限制实验规模。表 7-1 对应列出检查方式及处理措施。</w:t>
       </w:r>
     </w:p>
     <w:p>
@@ -17302,7 +18062,7 @@
         <w:jc w:val="both"/>
       </w:pPr>
       <w:r>
-        <w:t>实施时先审计数据、模型、tokenizer 和消息模板，用少量单轮样本检查状态标记与调用解析；再在固定轨迹上核对完整词表散度的数值、梯度和异常值；最后统计 Top-K 外质量、关键决策 token 漏选与额外教师评分。各阶段保留输入、mask、支持集、loss、梯度和失败调用。正式比较共享学生起点、训练预算、评测规则及记录格式，训练资源通过短序列试运行、小批量和梯度累积控制。</w:t>
+        <w:t>实施顺序与研究问题保持一致。首先审计数据、模型、tokenizer 和消息模板，用少量单轮样本检查状态标注及调用解析；随后固定轨迹，核对完整词表散度的数值、梯度和有限值；最后测量 Top-K 外质量、关键决策 token 漏选与额外教师评分。各阶段保存输入、mask、支持集、损失、梯度和失败调用。正式比较共享学生起点、预算、评价规则与记录格式，训练资源通过短序列试运行、小批量和梯度累积控制。</w:t>
       </w:r>
     </w:p>
     <w:p>
@@ -17311,7 +18071,7 @@
         <w:jc w:val="both"/>
       </w:pPr>
       <w:r>
-        <w:t>实验日志按状态与数据、目标与梯度、稀疏反馈与资源、部署与评测四类记录问题。评测结果分层报告格式解析、函数选择、参数生成，以及具备可执行环境时的工具执行和端到端结果。若不同散度的表现相近，仍报告其梯度与错误分布；若候选支持集的收益不足以抵消成本，则保留完整诊断和失败案例，不预设改进结论。</w:t>
+        <w:t>实验日志分别记录状态与数据、目标与梯度、稀疏反馈与资源、部署与评测中的问题。结果按格式解析、函数选择、参数生成，以及具备执行环境时的工具执行和端到端表现分层报告。散度效果接近时，继续分析其梯度和错误分布；候选支持集的收益若不足以抵消成本，则如实呈现诊断、消融与失败案例。</w:t>
       </w:r>
     </w:p>
     <w:p>
@@ -17320,7 +18080,7 @@
         <w:jc w:val="both"/>
       </w:pPr>
       <w:r>
-        <w:t>候选方法面临两类关键风险。其一，教师 Top-K 外的总概率可能很小，但仍需检查是否遗漏学生高估的函数入口等决策 token；尾部质量与决策漏选应分别统计。其二，补入候选和按位置分配 K 可能增加教师评分与反馈字节数，即使任务指标改善，也未必优于相同预算下的固定 K 或已有尾部类别方法。本文先用小样本确定问题规模，再以同 K、同反馈量和同训练预算的对照分开评价准确率与成本。若诊断未发现稳定的决策漏选，或收益无法重复，将收缩方法主张并依据真实错误重新确定重点。</w:t>
+        <w:t>候选方法的风险集中在现象强度与成本收益。教师 Top-K 外的概率总量可能较小，因此需单独检查学生高估的函数入口等决策 token 是否漏选；两类指标分别统计。补入候选和按位置分配 K 还可能增加教师评分及反馈字节数。研究先在小样本上确定问题规模，再按相同 K、相同反馈量和相同训练预算比较固定 K、尾部类别与联合方案。若决策漏选缺乏稳定证据，或收益无法重复，将据实际错误收缩方法范围。</w:t>
       </w:r>
     </w:p>
     <w:p>

</xml_diff>

<commit_message>
docs: add unified validation workflow to opening report
</commit_message>
<xml_diff>
--- a/Papers/output/开题报告-基于在线策略蒸馏的大语言模型后训练方法研究.docx
+++ b/Papers/output/开题报告-基于在线策略蒸馏的大语言模型后训练方法研究.docx
@@ -1302,7 +1302,7 @@
         <w:rPr>
           <w:rFonts w:ascii="黑体" w:hAnsi="黑体" w:eastAsia="黑体" w:cs="黑体"/>
         </w:rPr>
-        <w:t>3.4 验证路径与预期研究产出</w:t>
+        <w:t>3.4 统一测试流程与验证路径</w:t>
       </w:r>
       <w:r>
         <w:tab/>
@@ -1361,7 +1361,7 @@
         <w:fldChar w:fldCharType="separate"/>
       </w:r>
       <w:r>
-        <w:t>24</w:t>
+        <w:t>25</w:t>
       </w:r>
       <w:r>
         <w:fldChar w:fldCharType="end"/>
@@ -1405,7 +1405,7 @@
         <w:fldChar w:fldCharType="separate"/>
       </w:r>
       <w:r>
-        <w:t>25</w:t>
+        <w:t>26</w:t>
       </w:r>
       <w:r>
         <w:fldChar w:fldCharType="end"/>
@@ -1449,7 +1449,7 @@
         <w:fldChar w:fldCharType="separate"/>
       </w:r>
       <w:r>
-        <w:t>25</w:t>
+        <w:t>26</w:t>
       </w:r>
       <w:r>
         <w:fldChar w:fldCharType="end"/>
@@ -1493,7 +1493,7 @@
         <w:fldChar w:fldCharType="separate"/>
       </w:r>
       <w:r>
-        <w:t>27</w:t>
+        <w:t>28</w:t>
       </w:r>
       <w:r>
         <w:fldChar w:fldCharType="end"/>
@@ -1537,7 +1537,7 @@
         <w:fldChar w:fldCharType="separate"/>
       </w:r>
       <w:r>
-        <w:t>29</w:t>
+        <w:t>30</w:t>
       </w:r>
       <w:r>
         <w:fldChar w:fldCharType="end"/>
@@ -1610,7 +1610,7 @@
         <w:rPr>
           <w:rFonts w:ascii="黑体" w:hAnsi="黑体" w:eastAsia="黑体" w:cs="黑体"/>
         </w:rPr>
-        <w:t>4.5 评价指标和公平性</w:t>
+        <w:t>4.5 统一测试流程与评价指标</w:t>
       </w:r>
       <w:r>
         <w:tab/>
@@ -1625,7 +1625,7 @@
         <w:fldChar w:fldCharType="separate"/>
       </w:r>
       <w:r>
-        <w:t>36</w:t>
+        <w:t>37</w:t>
       </w:r>
       <w:r>
         <w:fldChar w:fldCharType="end"/>
@@ -1669,7 +1669,7 @@
         <w:fldChar w:fldCharType="separate"/>
       </w:r>
       <w:r>
-        <w:t>40</w:t>
+        <w:t>41</w:t>
       </w:r>
       <w:r>
         <w:fldChar w:fldCharType="end"/>
@@ -1713,7 +1713,7 @@
         <w:fldChar w:fldCharType="separate"/>
       </w:r>
       <w:r>
-        <w:t>41</w:t>
+        <w:t>42</w:t>
       </w:r>
       <w:r>
         <w:fldChar w:fldCharType="end"/>
@@ -1757,7 +1757,7 @@
         <w:fldChar w:fldCharType="separate"/>
       </w:r>
       <w:r>
-        <w:t>41</w:t>
+        <w:t>42</w:t>
       </w:r>
       <w:r>
         <w:fldChar w:fldCharType="end"/>
@@ -1801,7 +1801,7 @@
         <w:fldChar w:fldCharType="separate"/>
       </w:r>
       <w:r>
-        <w:t>43</w:t>
+        <w:t>44</w:t>
       </w:r>
       <w:r>
         <w:fldChar w:fldCharType="end"/>
@@ -1845,7 +1845,7 @@
         <w:fldChar w:fldCharType="separate"/>
       </w:r>
       <w:r>
-        <w:t>44</w:t>
+        <w:t>45</w:t>
       </w:r>
       <w:r>
         <w:fldChar w:fldCharType="end"/>
@@ -1889,7 +1889,7 @@
         <w:fldChar w:fldCharType="separate"/>
       </w:r>
       <w:r>
-        <w:t>44</w:t>
+        <w:t>45</w:t>
       </w:r>
       <w:r>
         <w:fldChar w:fldCharType="end"/>
@@ -1933,7 +1933,7 @@
         <w:fldChar w:fldCharType="separate"/>
       </w:r>
       <w:r>
-        <w:t>44</w:t>
+        <w:t>45</w:t>
       </w:r>
       <w:r>
         <w:fldChar w:fldCharType="end"/>
@@ -1977,7 +1977,7 @@
         <w:fldChar w:fldCharType="separate"/>
       </w:r>
       <w:r>
-        <w:t>45</w:t>
+        <w:t>46</w:t>
       </w:r>
       <w:r>
         <w:fldChar w:fldCharType="end"/>
@@ -2021,7 +2021,7 @@
         <w:fldChar w:fldCharType="separate"/>
       </w:r>
       <w:r>
-        <w:t>46</w:t>
+        <w:t>47</w:t>
       </w:r>
       <w:r>
         <w:fldChar w:fldCharType="end"/>
@@ -2065,7 +2065,7 @@
         <w:fldChar w:fldCharType="separate"/>
       </w:r>
       <w:r>
-        <w:t>48</w:t>
+        <w:t>49</w:t>
       </w:r>
       <w:r>
         <w:fldChar w:fldCharType="end"/>
@@ -2254,7 +2254,7 @@
         <w:jc w:val="both"/>
       </w:pPr>
       <w:r>
-        <w:t>3. 提出决策感知的稀疏反馈候选方案，通过同预算对照与组件消融评价任务效果、稳定性和额外资源成本。</w:t>
+        <w:t>3. 建立贯穿学生轨迹、教师反馈、目标计算、训练更新和工具调用评测的统一测试流程；在此基础上提出决策感知的稀疏反馈候选方案，通过同预算对照与组件消融评价任务效果、稳定性和额外资源成本。</w:t>
       </w:r>
     </w:p>
     <w:p>
@@ -2278,7 +2278,18 @@
           <w:color w:val="000000"/>
           <w:sz w:val="28"/>
         </w:rPr>
-        <w:t>2．国内外在该方向的研究现状及分析</w:t>
+        <w:t>2．国内外在该方向的研究现</w:t>
+      </w:r>
+      <w:bookmarkStart w:id="78" w:name="_GoBack"/>
+      <w:bookmarkEnd w:id="78"/>
+      <w:r>
+        <w:rPr>
+          <w:rFonts w:ascii="黑体" w:hAnsi="黑体" w:eastAsia="黑体" w:cs="黑体"/>
+          <w:b/>
+          <w:color w:val="000000"/>
+          <w:sz w:val="28"/>
+        </w:rPr>
+        <w:t>状及分析</w:t>
       </w:r>
       <w:bookmarkEnd w:id="4"/>
     </w:p>
@@ -4394,7 +4405,7 @@
           <w:color w:val="000000"/>
           <w:sz w:val="24"/>
         </w:rPr>
-        <w:t>3.4 验证路径与预期研究产出</w:t>
+        <w:t>3.4 统一测试流程与验证路径</w:t>
       </w:r>
       <w:bookmarkEnd w:id="20"/>
     </w:p>
@@ -4413,7 +4424,7 @@
         <w:jc w:val="both"/>
       </w:pPr>
       <w:r>
-        <w:t>方法比较共享学生起点、教师、数据划分、生成协议、主要散度和有效训练 token 预算。常规 Top-K、已有尾部类别、单独补入决策候选、单独分配位置 K 与完整方案构成主要对照；各组匹配平均反馈条目数，另行报告教师概率获取成本。完整词表提供信息参照，其他散度和 K1 sampled-token 分别用于机制与低反馈量分析。短程实验先检查信号与行为的联系，再决定正式训练规模。</w:t>
+        <w:t>为使三项研究能够共用证据，本文拟实现统一测试流程。数据接入层保存样本、工具 schema、划分版本和状态标签；轨迹层保存学生前缀、位置掩码及教师在同一前缀上的概率反馈；实验层通过可替换接口接入散度目标与全词表、Top-K、K1 及候选支持集；评测层用固定解析规则汇总函数、参数、结构和可执行任务结果。每条记录关联样本标识、配置、随机种子、模型版本和代码版本，支持相同轨迹上的目标回放与失败追踪。</w:t>
       </w:r>
     </w:p>
     <w:p>
@@ -4422,7 +4433,16 @@
         <w:jc w:val="both"/>
       </w:pPr>
       <w:r>
-        <w:t>预期形成三类可核查的研究材料：学生到访状态与工具调用错误的分层记录，散度目标的梯度和行为分析，以及 Top-K 信息损失与同预算改进的比较。函数、参数和格式指标将与损失、梯度、熵、反馈字节数、教师查询、时间和显存一起报告。最终根据实测结果判断候选方法相对已有稀疏反馈方案的价值。</w:t>
+        <w:t>方法比较共享学生起点、教师、数据划分、生成协议、主要散度和有效训练 token 预算。常规 Top-K、已有尾部类别、单独补入决策候选、单独分配位置 K 与完整方案构成主要对照；各组匹配平均反馈条目数，另行报告教师概率获取成本。完整词表提供信息参照，其他散度和 K1 sampled-token 分别用于机制与低反馈量分析。短程实验先检查信号与行为的联系，再决定正式训练规模。</w:t>
+      </w:r>
+    </w:p>
+    <w:p>
+      <w:pPr>
+        <w:ind w:firstLine="420"/>
+        <w:jc w:val="both"/>
+      </w:pPr>
+      <w:r>
+        <w:t>预期形成四类可核查的研究材料：学生到访状态与工具调用错误的分层记录，散度目标的梯度和行为分析，Top-K 信息损失与同预算改进的比较，以及可复用的统一测试程序和原始实验记录。流程先通过概率归一化、支持集、梯度和有限值检查，再进入短程训练与结构化调用评测；只有上述检查通过，才扩大到多随机种子正式比较。最终根据实测结果判断候选方法相对已有稀疏反馈方案的价值。</w:t>
       </w:r>
     </w:p>
     <w:p>
@@ -4461,7 +4481,7 @@
         <w:jc w:val="both"/>
       </w:pPr>
       <w:r>
-        <w:t>图 1 概括研究问题的递进关系：先确认学生访问的状态，再分析散度目标如何改变更新，最后考察 Top-K 反馈中丢失了哪些信号。第三环节承接前两个环节的诊断结果，聚焦尾部总量、决策候选和反馈预算。尾部类别、采样修正及学生感知支持集均有先行研究[31][32][33][34]；本课题将检验这些思路在单轮工具调用中联合使用的收益与边界。</w:t>
+        <w:t>图 1 概括研究问题的递进关系：先确认学生访问的状态，再分析散度目标如何改变更新，最后考察 Top-K 反馈中丢失了哪些信号。第三环节承接前两个环节的诊断结果，聚焦尾部总量、决策候选和反馈预算。统一测试流程贯穿三个环节，使状态、目标与反馈变化可以在相同样本、轨迹和评价规则下追溯。尾部类别、采样修正及学生感知支持集均有先行研究[31][32][33][34]；本课题将检验这些思路在单轮工具调用中联合使用的收益与边界。</w:t>
       </w:r>
     </w:p>
     <w:p>
@@ -5727,17 +5747,6 @@
       <w:r>
         <w:t>式（4-2）分别容纳状态选择、散度类型和反馈支持集。本文先在完整词表上比较 Forward KL、Reverse KL、JSD 与 skew KL，并从梯度及工具调用行为确定主要目标；Reverse KL 暂作信息参照。稀疏实验在固定目标下比较常规 Top-K、已有尾部类别方法[31]与决策感知候选方案。候选方案通过补入学生高概率的合法决策 token 扩展支持集，余下概率并为尾部类别；位置 K 的分配受反馈预算约束。总体优化问题为：</w:t>
       </w:r>
-      <w:r>
-        <w:rPr>
-          <w:rFonts w:hint="eastAsia"/>
-          <w:lang w:val="en-US" w:eastAsia="zh-CN"/>
-        </w:rPr>
-      </w:r>
-      <w:bookmarkStart w:id="76" w:name="_GoBack"/>
-      <w:bookmarkEnd w:id="76"/>
-      <w:r>
-        <w:t/>
-      </w:r>
     </w:p>
     <w:tbl>
       <w:tblPr>
@@ -12059,13 +12068,16 @@
       </w:r>
       <m:oMath>
         <m:sSubSup>
+          <m:sSubSupPr/>
           <m:e>
             <m:r>
+              <m:rPr/>
               <m:t>V</m:t>
             </m:r>
           </m:e>
           <m:sub>
             <m:r>
+              <m:rPr/>
               <m:t>t</m:t>
             </m:r>
           </m:sub>
@@ -12074,19 +12086,7 @@
               <m:rPr>
                 <m:sty m:val="p"/>
               </m:rPr>
-              <m:t>d</m:t>
-            </m:r>
-            <m:r>
-              <m:rPr>
-                <m:sty m:val="p"/>
-              </m:rPr>
-              <m:t>e</m:t>
-            </m:r>
-            <m:r>
-              <m:rPr>
-                <m:sty m:val="p"/>
-              </m:rPr>
-              <m:t>c</m:t>
+              <m:t>dec</m:t>
             </m:r>
           </m:sup>
         </m:sSubSup>
@@ -12167,13 +12167,16 @@
             <m:oMathPara>
               <m:oMath>
                 <m:sSub>
+                  <m:sSubPr/>
                   <m:e>
                     <m:r>
+                      <m:rPr/>
                       <m:t>C</m:t>
                     </m:r>
                   </m:e>
                   <m:sub>
                     <m:r>
+                      <m:rPr/>
                       <m:t>t</m:t>
                     </m:r>
                   </m:sub>
@@ -12185,6 +12188,7 @@
                   <m:t>=</m:t>
                 </m:r>
                 <m:sSub>
+                  <m:sSubPr/>
                   <m:e>
                     <m:r>
                       <m:rPr>
@@ -12195,13 +12199,16 @@
                   </m:e>
                   <m:sub>
                     <m:sSub>
+                      <m:sSubPr/>
                       <m:e>
                         <m:r>
+                          <m:rPr/>
                           <m:t>b</m:t>
                         </m:r>
                       </m:e>
                       <m:sub>
                         <m:r>
+                          <m:rPr/>
                           <m:t>t</m:t>
                         </m:r>
                       </m:sub>
@@ -12215,13 +12222,16 @@
                   <m:t>(</m:t>
                 </m:r>
                 <m:sSub>
+                  <m:sSubPr/>
                   <m:e>
                     <m:r>
+                      <m:rPr/>
                       <m:t>p</m:t>
                     </m:r>
                   </m:e>
                   <m:sub>
                     <m:r>
+                      <m:rPr/>
                       <m:t>S</m:t>
                     </m:r>
                     <m:r>
@@ -12231,6 +12241,7 @@
                       <m:t>,</m:t>
                     </m:r>
                     <m:r>
+                      <m:rPr/>
                       <m:t>t</m:t>
                     </m:r>
                   </m:sub>
@@ -12242,13 +12253,16 @@
                   <m:t>;</m:t>
                 </m:r>
                 <m:sSubSup>
+                  <m:sSubSupPr/>
                   <m:e>
                     <m:r>
+                      <m:rPr/>
                       <m:t>V</m:t>
                     </m:r>
                   </m:e>
                   <m:sub>
                     <m:r>
+                      <m:rPr/>
                       <m:t>t</m:t>
                     </m:r>
                   </m:sub>
@@ -12257,19 +12271,7 @@
                       <m:rPr>
                         <m:sty m:val="p"/>
                       </m:rPr>
-                      <m:t>d</m:t>
-                    </m:r>
-                    <m:r>
-                      <m:rPr>
-                        <m:sty m:val="p"/>
-                      </m:rPr>
-                      <m:t>e</m:t>
-                    </m:r>
-                    <m:r>
-                      <m:rPr>
-                        <m:sty m:val="p"/>
-                      </m:rPr>
-                      <m:t>c</m:t>
+                      <m:t>dec</m:t>
                     </m:r>
                   </m:sup>
                 </m:sSubSup>
@@ -12277,25 +12279,23 @@
                   <m:rPr>
                     <m:sty m:val="p"/>
                   </m:rPr>
-                  <m:t>)</m:t>
+                  <m:t>),</m:t>
                 </m:r>
                 <m:r>
-                  <m:rPr>
-                    <m:sty m:val="p"/>
-                  </m:rPr>
-                  <m:t>,</m:t>
-                </m:r>
-                <m:r>
+                  <m:rPr/>
                   <m:t>  </m:t>
                 </m:r>
                 <m:sSub>
+                  <m:sSubPr/>
                   <m:e>
                     <m:r>
+                      <m:rPr/>
                       <m:t>A</m:t>
                     </m:r>
                   </m:e>
                   <m:sub>
                     <m:r>
+                      <m:rPr/>
                       <m:t>t</m:t>
                     </m:r>
                   </m:sub>
@@ -12307,20 +12307,25 @@
                   <m:t>=</m:t>
                 </m:r>
                 <m:sSub>
+                  <m:sSubPr/>
                   <m:e>
                     <m:r>
+                      <m:rPr/>
                       <m:t>S</m:t>
                     </m:r>
                   </m:e>
                   <m:sub>
                     <m:sSub>
+                      <m:sSubPr/>
                       <m:e>
                         <m:r>
+                          <m:rPr/>
                           <m:t>K</m:t>
                         </m:r>
                       </m:e>
                       <m:sub>
                         <m:r>
+                          <m:rPr/>
                           <m:t>t</m:t>
                         </m:r>
                       </m:sub>
@@ -12332,6 +12337,7 @@
                       <m:t>,</m:t>
                     </m:r>
                     <m:r>
+                      <m:rPr/>
                       <m:t>t</m:t>
                     </m:r>
                   </m:sub>
@@ -12343,13 +12349,16 @@
                   <m:t>∪</m:t>
                 </m:r>
                 <m:sSub>
+                  <m:sSubPr/>
                   <m:e>
                     <m:r>
+                      <m:rPr/>
                       <m:t>C</m:t>
                     </m:r>
                   </m:e>
                   <m:sub>
                     <m:r>
+                      <m:rPr/>
                       <m:t>t</m:t>
                     </m:r>
                   </m:sub>
@@ -12380,7 +12389,7 @@
               <w:spacing w:before="0" w:after="0"/>
               <w:jc w:val="right"/>
             </w:pPr>
-            <w:bookmarkStart w:id="77" w:name="_RefEq4_41"/>
+            <w:bookmarkStart w:id="50" w:name="_RefEq4_41"/>
             <w:r>
               <w:t>(4-</w:t>
             </w:r>
@@ -12402,7 +12411,7 @@
             <w:r>
               <w:t>)</w:t>
             </w:r>
-            <w:bookmarkEnd w:id="77"/>
+            <w:bookmarkEnd w:id="50"/>
           </w:p>
         </w:tc>
       </w:tr>
@@ -12488,13 +12497,16 @@
             <m:oMathPara>
               <m:oMath>
                 <m:sSubSup>
+                  <m:sSubSupPr/>
                   <m:e>
                     <m:r>
+                      <m:rPr/>
                       <m:t>p</m:t>
                     </m:r>
                   </m:e>
                   <m:sub>
                     <m:r>
+                      <m:rPr/>
                       <m:t>j</m:t>
                     </m:r>
                     <m:r>
@@ -12504,18 +12516,22 @@
                       <m:t>,</m:t>
                     </m:r>
                     <m:r>
+                      <m:rPr/>
                       <m:t>t</m:t>
                     </m:r>
                   </m:sub>
                   <m:sup>
                     <m:sSub>
+                      <m:sSubPr/>
                       <m:e>
                         <m:r>
+                          <m:rPr/>
                           <m:t>A</m:t>
                         </m:r>
                       </m:e>
                       <m:sub>
                         <m:r>
+                          <m:rPr/>
                           <m:t>t</m:t>
                         </m:r>
                       </m:sub>
@@ -12530,10 +12546,7 @@
                 </m:r>
                 <m:d>
                   <m:dPr>
-                    <m:begChr m:val="("/>
                     <m:sepChr m:val=""/>
-                    <m:endChr m:val=")"/>
-                    <m:grow/>
                   </m:dPr>
                   <m:e>
                     <m:r>
@@ -12543,13 +12556,16 @@
                       <m:t>{</m:t>
                     </m:r>
                     <m:sSub>
+                      <m:sSubPr/>
                       <m:e>
                         <m:r>
+                          <m:rPr/>
                           <m:t>p</m:t>
                         </m:r>
                       </m:e>
                       <m:sub>
                         <m:r>
+                          <m:rPr/>
                           <m:t>j</m:t>
                         </m:r>
                         <m:r>
@@ -12559,6 +12575,7 @@
                           <m:t>,</m:t>
                         </m:r>
                         <m:r>
+                          <m:rPr/>
                           <m:t>t</m:t>
                         </m:r>
                       </m:sub>
@@ -12570,6 +12587,7 @@
                       <m:t>(</m:t>
                     </m:r>
                     <m:r>
+                      <m:rPr/>
                       <m:t>v</m:t>
                     </m:r>
                     <m:r>
@@ -12579,6 +12597,7 @@
                       <m:t>)</m:t>
                     </m:r>
                     <m:sSub>
+                      <m:sSubPr/>
                       <m:e>
                         <m:r>
                           <m:rPr>
@@ -12589,6 +12608,7 @@
                       </m:e>
                       <m:sub>
                         <m:r>
+                          <m:rPr/>
                           <m:t>v</m:t>
                         </m:r>
                         <m:r>
@@ -12598,13 +12618,16 @@
                           <m:t>∈</m:t>
                         </m:r>
                         <m:sSub>
+                          <m:sSubPr/>
                           <m:e>
                             <m:r>
+                              <m:rPr/>
                               <m:t>A</m:t>
                             </m:r>
                           </m:e>
                           <m:sub>
                             <m:r>
+                              <m:rPr/>
                               <m:t>t</m:t>
                             </m:r>
                           </m:sub>
@@ -12618,10 +12641,8 @@
                       <m:t>,</m:t>
                     </m:r>
                     <m:r>
-                      <m:t> </m:t>
-                    </m:r>
-                    <m:r>
-                      <m:t>1</m:t>
+                      <m:rPr/>
+                      <m:t> 1</m:t>
                     </m:r>
                     <m:r>
                       <m:rPr>
@@ -12633,11 +12654,11 @@
                       <m:naryPr>
                         <m:chr m:val="∑"/>
                         <m:limLoc m:val="undOvr"/>
-                        <m:subHide m:val="off"/>
-                        <m:supHide m:val="on"/>
+                        <m:supHide m:val="1"/>
                       </m:naryPr>
                       <m:sub>
                         <m:r>
+                          <m:rPr/>
                           <m:t>v</m:t>
                         </m:r>
                         <m:r>
@@ -12647,13 +12668,16 @@
                           <m:t>∈</m:t>
                         </m:r>
                         <m:sSub>
+                          <m:sSubPr/>
                           <m:e>
                             <m:r>
+                              <m:rPr/>
                               <m:t>A</m:t>
                             </m:r>
                           </m:e>
                           <m:sub>
                             <m:r>
+                              <m:rPr/>
                               <m:t>t</m:t>
                             </m:r>
                           </m:sub>
@@ -12661,18 +12685,22 @@
                       </m:sub>
                       <m:sup>
                         <m:r>
+                          <m:rPr/>
                           <m:t>​</m:t>
                         </m:r>
                       </m:sup>
                       <m:e>
                         <m:sSub>
+                          <m:sSubPr/>
                           <m:e>
                             <m:r>
+                              <m:rPr/>
                               <m:t>p</m:t>
                             </m:r>
                           </m:e>
                           <m:sub>
                             <m:r>
+                              <m:rPr/>
                               <m:t>j</m:t>
                             </m:r>
                             <m:r>
@@ -12682,6 +12710,7 @@
                               <m:t>,</m:t>
                             </m:r>
                             <m:r>
+                              <m:rPr/>
                               <m:t>t</m:t>
                             </m:r>
                           </m:sub>
@@ -12695,6 +12724,7 @@
                       <m:t>(</m:t>
                     </m:r>
                     <m:r>
+                      <m:rPr/>
                       <m:t>v</m:t>
                     </m:r>
                     <m:r>
@@ -12712,24 +12742,17 @@
                   <m:t>,</m:t>
                 </m:r>
                 <m:r>
-                  <m:t>  </m:t>
-                </m:r>
-                <m:r>
-                  <m:t>j</m:t>
+                  <m:rPr/>
+                  <m:t>  j</m:t>
                 </m:r>
                 <m:r>
                   <m:rPr>
                     <m:sty m:val="p"/>
                   </m:rPr>
-                  <m:t>∈</m:t>
+                  <m:t>∈{</m:t>
                 </m:r>
                 <m:r>
-                  <m:rPr>
-                    <m:sty m:val="p"/>
-                  </m:rPr>
-                  <m:t>{</m:t>
-                </m:r>
-                <m:r>
+                  <m:rPr/>
                   <m:t>T</m:t>
                 </m:r>
                 <m:r>
@@ -12739,19 +12762,14 @@
                   <m:t>,</m:t>
                 </m:r>
                 <m:r>
+                  <m:rPr/>
                   <m:t>S</m:t>
                 </m:r>
                 <m:r>
                   <m:rPr>
                     <m:sty m:val="p"/>
                   </m:rPr>
-                  <m:t>}</m:t>
-                </m:r>
-                <m:r>
-                  <m:rPr>
-                    <m:sty m:val="p"/>
-                  </m:rPr>
-                  <m:t>.</m:t>
+                  <m:t>}.</m:t>
                 </m:r>
               </m:oMath>
             </m:oMathPara>
@@ -12773,7 +12791,7 @@
               <w:spacing w:before="0" w:after="0"/>
               <w:jc w:val="right"/>
             </w:pPr>
-            <w:bookmarkStart w:id="78" w:name="_RefEq4_42"/>
+            <w:bookmarkStart w:id="51" w:name="_RefEq4_42"/>
             <w:r>
               <w:t>(4-</w:t>
             </w:r>
@@ -12795,7 +12813,7 @@
             <w:r>
               <w:t>)</w:t>
             </w:r>
-            <w:bookmarkEnd w:id="78"/>
+            <w:bookmarkEnd w:id="51"/>
           </w:p>
         </w:tc>
       </w:tr>
@@ -13174,7 +13192,7 @@
               <w:spacing w:before="0" w:after="0"/>
               <w:jc w:val="right"/>
             </w:pPr>
-            <w:bookmarkStart w:id="50" w:name="_RefEq4_29"/>
+            <w:bookmarkStart w:id="52" w:name="_RefEq4_29"/>
             <w:r>
               <w:t>(4-</w:t>
             </w:r>
@@ -13196,7 +13214,7 @@
             <w:r>
               <w:t>)</w:t>
             </w:r>
-            <w:bookmarkEnd w:id="50"/>
+            <w:bookmarkEnd w:id="52"/>
           </w:p>
         </w:tc>
       </w:tr>
@@ -13548,7 +13566,7 @@
         <w:pStyle w:val="3"/>
         <w:jc w:val="left"/>
       </w:pPr>
-      <w:bookmarkStart w:id="51" w:name="_Toc534757053"/>
+      <w:bookmarkStart w:id="53" w:name="_Toc534757053"/>
       <w:r>
         <w:rPr>
           <w:rFonts w:ascii="黑体" w:hAnsi="黑体" w:eastAsia="黑体" w:cs="黑体"/>
@@ -13556,9 +13574,27 @@
           <w:color w:val="000000"/>
           <w:sz w:val="24"/>
         </w:rPr>
-        <w:t>4.5 评价指标和公平性</w:t>
-      </w:r>
-      <w:bookmarkEnd w:id="51"/>
+        <w:t>4.5 统一测试流程与评价指标</w:t>
+      </w:r>
+      <w:bookmarkEnd w:id="53"/>
+    </w:p>
+    <w:p>
+      <w:pPr>
+        <w:ind w:firstLine="420"/>
+        <w:jc w:val="both"/>
+      </w:pPr>
+      <w:r>
+        <w:t>统一测试流程由数据审计、学生轨迹采集、教师反馈、目标计算、训练更新和工具调用评测组成。各阶段通过样本标识和轨迹标识连接，固定模型版本、tokenizer、消息模板、工具 schema、解码设置及评价规则；散度和反馈方案作为可替换模块接入。一次实验输出配置、随机种子、代码版本、环境、原始预测、训练曲线及资源记录，使表 4-2 中的阶段性实验可以共享输入和判定标准。</w:t>
+      </w:r>
+    </w:p>
+    <w:p>
+      <w:pPr>
+        <w:ind w:firstLine="420"/>
+        <w:jc w:val="both"/>
+      </w:pPr>
+      <w:r>
+        <w:t>验证分为三个层次。数值层使用人工可核算的小分布核对归一化、尾部质量、支持集对齐、损失与梯度，并检查 NaN／Inf；流程层以少量单轮样本回放相同学生前缀，核对不同目标仅改变指定变量，复查位置标注与反馈开销；任务层在隔离的测试集上比较函数选择、参数、格式和具备执行条件时的端到端结果。三层输出保留失败样本和原始日志，若观察到收益，可追查它对应的状态、概率变化及额外成本。</w:t>
+      </w:r>
     </w:p>
     <w:p>
       <w:pPr>
@@ -13589,7 +13625,7 @@
         </w:rPr>
         <w:t xml:space="preserve">表 </w:t>
       </w:r>
-      <w:bookmarkStart w:id="52" w:name="_RefTable4_3"/>
+      <w:bookmarkStart w:id="54" w:name="_RefTable4_3"/>
       <w:r>
         <w:rPr>
           <w:rFonts w:ascii="Times New Roman" w:hAnsi="Times New Roman" w:eastAsia="Songti SC"/>
@@ -13632,7 +13668,7 @@
         </w:rPr>
         <w:fldChar w:fldCharType="end"/>
       </w:r>
-      <w:bookmarkEnd w:id="52"/>
+      <w:bookmarkEnd w:id="54"/>
       <w:r>
         <w:rPr>
           <w:rFonts w:ascii="Times New Roman" w:hAnsi="Times New Roman" w:eastAsia="Songti SC"/>
@@ -14197,7 +14233,7 @@
               <w:spacing w:before="0" w:after="0"/>
               <w:jc w:val="right"/>
             </w:pPr>
-            <w:bookmarkStart w:id="53" w:name="_RefEq4_32"/>
+            <w:bookmarkStart w:id="55" w:name="_RefEq4_32"/>
             <w:r>
               <w:t>(4-</w:t>
             </w:r>
@@ -14219,7 +14255,7 @@
             <w:r>
               <w:t>)</w:t>
             </w:r>
-            <w:bookmarkEnd w:id="53"/>
+            <w:bookmarkEnd w:id="55"/>
           </w:p>
         </w:tc>
       </w:tr>
@@ -14513,7 +14549,7 @@
               <w:spacing w:before="0" w:after="0"/>
               <w:jc w:val="right"/>
             </w:pPr>
-            <w:bookmarkStart w:id="54" w:name="_RefEq4_33"/>
+            <w:bookmarkStart w:id="56" w:name="_RefEq4_33"/>
             <w:r>
               <w:t>(4-</w:t>
             </w:r>
@@ -14535,7 +14571,7 @@
             <w:r>
               <w:t>)</w:t>
             </w:r>
-            <w:bookmarkEnd w:id="54"/>
+            <w:bookmarkEnd w:id="56"/>
           </w:p>
         </w:tc>
       </w:tr>
@@ -14856,7 +14892,7 @@
               <w:spacing w:before="0" w:after="0"/>
               <w:jc w:val="right"/>
             </w:pPr>
-            <w:bookmarkStart w:id="55" w:name="_RefEq4_34"/>
+            <w:bookmarkStart w:id="57" w:name="_RefEq4_34"/>
             <w:r>
               <w:t>(4-</w:t>
             </w:r>
@@ -14878,7 +14914,7 @@
             <w:r>
               <w:t>)</w:t>
             </w:r>
-            <w:bookmarkEnd w:id="55"/>
+            <w:bookmarkEnd w:id="57"/>
           </w:p>
         </w:tc>
       </w:tr>
@@ -15205,7 +15241,7 @@
               <w:spacing w:before="0" w:after="0"/>
               <w:jc w:val="right"/>
             </w:pPr>
-            <w:bookmarkStart w:id="56" w:name="_RefEq4_35"/>
+            <w:bookmarkStart w:id="58" w:name="_RefEq4_35"/>
             <w:r>
               <w:t>(4-</w:t>
             </w:r>
@@ -15227,7 +15263,7 @@
             <w:r>
               <w:t>)</w:t>
             </w:r>
-            <w:bookmarkEnd w:id="56"/>
+            <w:bookmarkEnd w:id="58"/>
           </w:p>
         </w:tc>
       </w:tr>
@@ -15466,7 +15502,7 @@
               <w:spacing w:before="0" w:after="0"/>
               <w:jc w:val="right"/>
             </w:pPr>
-            <w:bookmarkStart w:id="57" w:name="_RefEq4_36"/>
+            <w:bookmarkStart w:id="59" w:name="_RefEq4_36"/>
             <w:r>
               <w:t>(4-</w:t>
             </w:r>
@@ -15488,7 +15524,7 @@
             <w:r>
               <w:t>)</w:t>
             </w:r>
-            <w:bookmarkEnd w:id="57"/>
+            <w:bookmarkEnd w:id="59"/>
           </w:p>
         </w:tc>
       </w:tr>
@@ -15676,7 +15712,7 @@
               <w:spacing w:before="0" w:after="0"/>
               <w:jc w:val="right"/>
             </w:pPr>
-            <w:bookmarkStart w:id="58" w:name="_RefEq4_37"/>
+            <w:bookmarkStart w:id="60" w:name="_RefEq4_37"/>
             <w:r>
               <w:t>(4-</w:t>
             </w:r>
@@ -15698,7 +15734,7 @@
             <w:r>
               <w:t>)</w:t>
             </w:r>
-            <w:bookmarkEnd w:id="58"/>
+            <w:bookmarkEnd w:id="60"/>
           </w:p>
         </w:tc>
       </w:tr>
@@ -15849,7 +15885,7 @@
               <w:spacing w:before="0" w:after="0"/>
               <w:jc w:val="right"/>
             </w:pPr>
-            <w:bookmarkStart w:id="59" w:name="_RefEq4_38"/>
+            <w:bookmarkStart w:id="61" w:name="_RefEq4_38"/>
             <w:r>
               <w:t>(4-</w:t>
             </w:r>
@@ -15871,7 +15907,7 @@
             <w:r>
               <w:t>)</w:t>
             </w:r>
-            <w:bookmarkEnd w:id="59"/>
+            <w:bookmarkEnd w:id="61"/>
           </w:p>
         </w:tc>
       </w:tr>
@@ -16051,7 +16087,7 @@
               <w:spacing w:before="0" w:after="0"/>
               <w:jc w:val="right"/>
             </w:pPr>
-            <w:bookmarkStart w:id="60" w:name="_RefEq4_39"/>
+            <w:bookmarkStart w:id="62" w:name="_RefEq4_39"/>
             <w:r>
               <w:t>(4-</w:t>
             </w:r>
@@ -16073,7 +16109,7 @@
             <w:r>
               <w:t>)</w:t>
             </w:r>
-            <w:bookmarkEnd w:id="60"/>
+            <w:bookmarkEnd w:id="62"/>
           </w:p>
         </w:tc>
       </w:tr>
@@ -16259,7 +16295,7 @@
               <w:spacing w:before="0" w:after="0"/>
               <w:jc w:val="right"/>
             </w:pPr>
-            <w:bookmarkStart w:id="61" w:name="_RefEq4_40"/>
+            <w:bookmarkStart w:id="63" w:name="_RefEq4_40"/>
             <w:r>
               <w:t>(4-</w:t>
             </w:r>
@@ -16281,7 +16317,7 @@
             <w:r>
               <w:t>)</w:t>
             </w:r>
-            <w:bookmarkEnd w:id="61"/>
+            <w:bookmarkEnd w:id="63"/>
           </w:p>
         </w:tc>
       </w:tr>
@@ -16300,7 +16336,7 @@
         <w:pStyle w:val="3"/>
         <w:jc w:val="left"/>
       </w:pPr>
-      <w:bookmarkStart w:id="62" w:name="_Toc442727076"/>
+      <w:bookmarkStart w:id="64" w:name="_Toc442727076"/>
       <w:r>
         <w:rPr>
           <w:rFonts w:ascii="黑体" w:hAnsi="黑体" w:eastAsia="黑体" w:cs="黑体"/>
@@ -16310,7 +16346,7 @@
         </w:rPr>
         <w:t>4.6 可行性分析</w:t>
       </w:r>
-      <w:bookmarkEnd w:id="62"/>
+      <w:bookmarkEnd w:id="64"/>
     </w:p>
     <w:p>
       <w:pPr>
@@ -16318,14 +16354,14 @@
         <w:jc w:val="both"/>
       </w:pPr>
       <w:r>
-        <w:t>小规模同家族模型和开源工具链为方案提供了实施基础。冻结教师前向评分，学生通过 LoRA 更新；PyTorch、Transformers、PEFT 和 vLLM[20]分别用于训练、参数适配与部署测量。正式实验前，以少量单轮样本核对 tokenizer、模板、状态分类、完整词表散度的数值与梯度，再检查 Top-K 尾部质量、概率归一化和补入候选的教师概率。若接口不能稳定提供所需概率，将使用本地教师前向计算或缩小方法范围，相关成本如实记录。</w:t>
+        <w:t>小规模同家族模型和开源工具链为方案提供了实施基础。冻结教师前向评分，学生通过 LoRA 更新；PyTorch、Transformers、PEFT 和 vLLM[20]分别用于训练、参数适配与部署测量。统一流程先按数据与轨迹、目标与反馈、训练与评测三个接口分阶段实现，各接口使用固定的小样本和期望结果进行检查。正式实验前，核对 tokenizer、模板、状态分类、完整词表散度的数值与梯度，再检查 Top-K 尾部质量、概率归一化和补入候选的教师概率。若接口不能稳定提供所需概率，将使用本地教师前向计算或缩小方法范围，相关成本如实记录。</w:t>
       </w:r>
     </w:p>
     <w:p>
       <w:pPr>
         <w:pStyle w:val="2"/>
       </w:pPr>
-      <w:bookmarkStart w:id="63" w:name="_Toc2030613124"/>
+      <w:bookmarkStart w:id="65" w:name="_Toc2030613124"/>
       <w:r>
         <w:rPr>
           <w:rFonts w:ascii="黑体" w:hAnsi="黑体" w:eastAsia="黑体" w:cs="黑体"/>
@@ -16335,13 +16371,13 @@
         </w:rPr>
         <w:t>5．进度安排，预期达到的目标</w:t>
       </w:r>
-      <w:bookmarkEnd w:id="63"/>
+      <w:bookmarkEnd w:id="65"/>
     </w:p>
     <w:p>
       <w:pPr>
         <w:pStyle w:val="3"/>
       </w:pPr>
-      <w:bookmarkStart w:id="64" w:name="_Toc704656944"/>
+      <w:bookmarkStart w:id="66" w:name="_Toc704656944"/>
       <w:r>
         <w:rPr>
           <w:rFonts w:ascii="黑体" w:hAnsi="黑体" w:eastAsia="黑体" w:cs="黑体"/>
@@ -16351,7 +16387,7 @@
         </w:rPr>
         <w:t>5.1 进度安排</w:t>
       </w:r>
-      <w:bookmarkEnd w:id="64"/>
+      <w:bookmarkEnd w:id="66"/>
     </w:p>
     <w:p>
       <w:pPr>
@@ -16465,7 +16501,7 @@
         </w:rPr>
         <w:t xml:space="preserve">表 </w:t>
       </w:r>
-      <w:bookmarkStart w:id="65" w:name="_RefTable5_1"/>
+      <w:bookmarkStart w:id="67" w:name="_RefTable5_1"/>
       <w:r>
         <w:rPr>
           <w:rFonts w:ascii="Times New Roman" w:hAnsi="Times New Roman" w:eastAsia="Songti SC"/>
@@ -16508,7 +16544,7 @@
         </w:rPr>
         <w:fldChar w:fldCharType="end"/>
       </w:r>
-      <w:bookmarkEnd w:id="65"/>
+      <w:bookmarkEnd w:id="67"/>
       <w:r>
         <w:rPr>
           <w:rFonts w:ascii="Times New Roman" w:hAnsi="Times New Roman" w:eastAsia="Songti SC"/>
@@ -16790,7 +16826,7 @@
                 <w:b w:val="0"/>
                 <w:sz w:val="17"/>
               </w:rPr>
-              <w:t>实现 LoRA 训练、学生 rollout、教师评分、完整词表散度和 Top-K／K1 反馈接口；建立状态分层、梯度检查与统一评测脚本，用小规模试运行核定模型、精度及资源配置。</w:t>
+              <w:t>实现 LoRA 训练、学生 rollout、教师评分、完整词表散度和 Top-K／K1 反馈接口；建立统一的样本—轨迹记录、同前缀回放、数值与梯度测试、调用解析及分层评测，用小规模试运行核定精度与资源配置。</w:t>
             </w:r>
           </w:p>
         </w:tc>
@@ -16811,7 +16847,7 @@
                 <w:b w:val="0"/>
                 <w:sz w:val="17"/>
               </w:rPr>
-              <w:t>可运行代码、接口测试、试运行记录与固定配置</w:t>
+              <w:t>可运行代码、接口与数值测试、轨迹回放记录、固定配置</w:t>
             </w:r>
           </w:p>
         </w:tc>
@@ -16858,7 +16894,7 @@
                 <w:b w:val="0"/>
                 <w:sz w:val="17"/>
               </w:rPr>
-              <w:t>按相同数据和训练预算，先分析学生到访状态，再比较完整词表散度，随后诊断 Top-K 尾部质量与决策 token 漏选；形成可复查的阶段性结果，2027 年 3 月提交中期申请。</w:t>
+              <w:t>按统一流程与相同数据和训练预算，先分析学生到访状态，再比较完整词表散度，随后诊断 Top-K 尾部质量与决策 token 漏选；保存原始预测、梯度与资源记录，2027 年 3 月提交中期申请。</w:t>
             </w:r>
           </w:p>
         </w:tc>
@@ -16926,7 +16962,7 @@
                 <w:b w:val="0"/>
                 <w:sz w:val="17"/>
               </w:rPr>
-              <w:t>完成决策感知候选方法与固定 K、质量阈值 K、尾部类别基线的同预算比较及组件消融；开展必要的多种子重复、部署评测、成本统计与失败案例分析。</w:t>
+              <w:t>完成候选方法与固定 K、质量阈值 K、尾部类别基线的同预算比较及组件消融；开展多种子重复、同轨迹回放、部署评测、成本统计与失败案例分析。</w:t>
             </w:r>
           </w:p>
         </w:tc>
@@ -17080,7 +17116,7 @@
         </w:rPr>
         <w:t xml:space="preserve">图 </w:t>
       </w:r>
-      <w:bookmarkStart w:id="66" w:name="_RefFigure3"/>
+      <w:bookmarkStart w:id="68" w:name="_RefFigure3"/>
       <w:r>
         <w:rPr>
           <w:rFonts w:ascii="Times New Roman" w:hAnsi="Times New Roman" w:eastAsia="宋体"/>
@@ -17116,7 +17152,7 @@
         </w:rPr>
         <w:fldChar w:fldCharType="end"/>
       </w:r>
-      <w:bookmarkEnd w:id="66"/>
+      <w:bookmarkEnd w:id="68"/>
       <w:r>
         <w:rPr>
           <w:rFonts w:ascii="Times New Roman" w:hAnsi="Times New Roman" w:eastAsia="宋体"/>
@@ -17138,7 +17174,7 @@
       <w:pPr>
         <w:pStyle w:val="3"/>
       </w:pPr>
-      <w:bookmarkStart w:id="67" w:name="_Toc1944428250"/>
+      <w:bookmarkStart w:id="69" w:name="_Toc1944428250"/>
       <w:r>
         <w:rPr>
           <w:rFonts w:ascii="黑体" w:hAnsi="黑体" w:eastAsia="黑体" w:cs="黑体"/>
@@ -17148,7 +17184,7 @@
         </w:rPr>
         <w:t>5.2 预期达到的目标</w:t>
       </w:r>
-      <w:bookmarkEnd w:id="67"/>
+      <w:bookmarkEnd w:id="69"/>
     </w:p>
     <w:p>
       <w:pPr>
@@ -17207,7 +17243,7 @@
         <w:jc w:val="both"/>
       </w:pPr>
       <w:r>
-        <w:t>6. 完成项目文档、实验记录、毕业论文和答辩材料。</w:t>
+        <w:t>6. 交付统一测试程序、配置与原始结果记录，支持三项研究的同轨迹回放、同预算比较和分层错误追踪；完成项目文档、毕业论文和答辩材料。</w:t>
       </w:r>
     </w:p>
     <w:p>
@@ -17216,14 +17252,14 @@
         <w:jc w:val="both"/>
       </w:pPr>
       <w:r>
-        <w:t>预期成果包括可复现的单轮工具调用 OPD 流程、完整词表散度的行为分析，以及决策感知稀疏反馈方案的受控评价。论文将同时呈现基线、消融、资源开销和失败案例，并依据实际结果界定方法的价值与适用条件。</w:t>
+        <w:t>预期成果包括可复现的单轮工具调用 OPD 统一测试流程、完整词表散度的行为分析，以及决策感知稀疏反馈方案的受控评价。系统实现将支持轨迹回放、目标切换、资源计量和结构化调用评测；论文同时呈现基线、消融、资源开销和失败案例，并依据实际结果界定方法的价值与适用条件。</w:t>
       </w:r>
     </w:p>
     <w:p>
       <w:pPr>
         <w:pStyle w:val="2"/>
       </w:pPr>
-      <w:bookmarkStart w:id="68" w:name="_Toc1746941351"/>
+      <w:bookmarkStart w:id="70" w:name="_Toc1746941351"/>
       <w:r>
         <w:rPr>
           <w:rFonts w:ascii="黑体" w:hAnsi="黑体" w:eastAsia="黑体" w:cs="黑体"/>
@@ -17233,13 +17269,13 @@
         </w:rPr>
         <w:t>6．课题已具备和所需的条件、经费</w:t>
       </w:r>
-      <w:bookmarkEnd w:id="68"/>
+      <w:bookmarkEnd w:id="70"/>
     </w:p>
     <w:p>
       <w:pPr>
         <w:pStyle w:val="3"/>
       </w:pPr>
-      <w:bookmarkStart w:id="69" w:name="_Toc446864473"/>
+      <w:bookmarkStart w:id="71" w:name="_Toc446864473"/>
       <w:r>
         <w:rPr>
           <w:rFonts w:ascii="黑体" w:hAnsi="黑体" w:eastAsia="黑体" w:cs="黑体"/>
@@ -17249,7 +17285,7 @@
         </w:rPr>
         <w:t>6.1 已具备条件</w:t>
       </w:r>
-      <w:bookmarkEnd w:id="69"/>
+      <w:bookmarkEnd w:id="71"/>
     </w:p>
     <w:p>
       <w:pPr>
@@ -17264,7 +17300,7 @@
       <w:pPr>
         <w:pStyle w:val="3"/>
       </w:pPr>
-      <w:bookmarkStart w:id="70" w:name="_Toc700884152"/>
+      <w:bookmarkStart w:id="72" w:name="_Toc700884152"/>
       <w:r>
         <w:rPr>
           <w:rFonts w:ascii="黑体" w:hAnsi="黑体" w:eastAsia="黑体" w:cs="黑体"/>
@@ -17274,7 +17310,7 @@
         </w:rPr>
         <w:t>6.2 所需条件</w:t>
       </w:r>
-      <w:bookmarkEnd w:id="70"/>
+      <w:bookmarkEnd w:id="72"/>
     </w:p>
     <w:p>
       <w:pPr>
@@ -17289,7 +17325,7 @@
       <w:pPr>
         <w:pStyle w:val="3"/>
       </w:pPr>
-      <w:bookmarkStart w:id="71" w:name="_Toc812138869"/>
+      <w:bookmarkStart w:id="73" w:name="_Toc812138869"/>
       <w:r>
         <w:rPr>
           <w:rFonts w:ascii="黑体" w:hAnsi="黑体" w:eastAsia="黑体" w:cs="黑体"/>
@@ -17299,7 +17335,7 @@
         </w:rPr>
         <w:t>6.3 经费</w:t>
       </w:r>
-      <w:bookmarkEnd w:id="71"/>
+      <w:bookmarkEnd w:id="73"/>
     </w:p>
     <w:p>
       <w:pPr>
@@ -17313,24 +17349,6 @@
           <w:sz w:val="24"/>
         </w:rPr>
         <w:t>经费主要用于租赁 GPU 算力，支持 Qwen3-4B 教师在线评分、Qwen3-0.6B 学生 rollout、LoRA 训练，以及多组对照与必要的重复实验。预算按计划上限编制，实际支出将依据 GPU 实例类型、有效运行时长和存储用量据实结算。</w:t>
-      </w:r>
-    </w:p>
-    <w:p>
-      <w:pPr>
-        <w:spacing w:before="0" w:after="0" w:line="360" w:lineRule="auto"/>
-        <w:ind w:firstLine="420"/>
-        <w:jc w:val="both"/>
-        <w:rPr>
-          <w:rFonts w:ascii="Times New Roman" w:hAnsi="Times New Roman" w:eastAsia="宋体"/>
-          <w:sz w:val="24"/>
-        </w:rPr>
-      </w:pPr>
-      <w:r>
-        <w:rPr>
-          <w:rFonts w:ascii="Times New Roman" w:hAnsi="Times New Roman" w:eastAsia="宋体"/>
-          <w:sz w:val="24"/>
-        </w:rPr>
-        <w:t>正式训练前先以少量单轮样本核对模板、状态标记和完整词表损失，再统计尾部质量、决策 token 漏选及额外评分成本。诊断成立且数值稳定后扩大实验；统一记录 GPU 型号、有效运行时长和失败重跑原因。</w:t>
       </w:r>
     </w:p>
     <w:p>
@@ -17347,7 +17365,7 @@
         </w:rPr>
         <w:t xml:space="preserve">表 </w:t>
       </w:r>
-      <w:bookmarkStart w:id="72" w:name="_RefTable6_1"/>
+      <w:bookmarkStart w:id="74" w:name="_RefTable6_1"/>
       <w:r>
         <w:rPr>
           <w:rFonts w:ascii="Times New Roman" w:hAnsi="Times New Roman" w:eastAsia="Songti SC"/>
@@ -17390,7 +17408,7 @@
         </w:rPr>
         <w:fldChar w:fldCharType="end"/>
       </w:r>
-      <w:bookmarkEnd w:id="72"/>
+      <w:bookmarkEnd w:id="74"/>
       <w:r>
         <w:rPr>
           <w:rFonts w:ascii="Times New Roman" w:hAnsi="Times New Roman" w:eastAsia="Songti SC"/>
@@ -17741,7 +17759,7 @@
         <w:pStyle w:val="2"/>
         <w:pageBreakBefore/>
       </w:pPr>
-      <w:bookmarkStart w:id="73" w:name="_Toc211910951"/>
+      <w:bookmarkStart w:id="75" w:name="_Toc211910951"/>
       <w:r>
         <w:rPr>
           <w:rFonts w:ascii="黑体" w:hAnsi="黑体" w:eastAsia="黑体" w:cs="黑体"/>
@@ -17751,7 +17769,7 @@
         </w:rPr>
         <w:t>7．研究过程中可能遇到的困难和问题，解决的措施</w:t>
       </w:r>
-      <w:bookmarkEnd w:id="73"/>
+      <w:bookmarkEnd w:id="75"/>
     </w:p>
     <w:p>
       <w:pPr>
@@ -17776,7 +17794,7 @@
         </w:rPr>
         <w:t xml:space="preserve">表 </w:t>
       </w:r>
-      <w:bookmarkStart w:id="74" w:name="_RefTable7_1"/>
+      <w:bookmarkStart w:id="76" w:name="_RefTable7_1"/>
       <w:r>
         <w:rPr>
           <w:rFonts w:ascii="Times New Roman" w:hAnsi="Times New Roman" w:eastAsia="Songti SC"/>
@@ -17819,7 +17837,7 @@
         </w:rPr>
         <w:fldChar w:fldCharType="end"/>
       </w:r>
-      <w:bookmarkEnd w:id="74"/>
+      <w:bookmarkEnd w:id="76"/>
       <w:r>
         <w:rPr>
           <w:rFonts w:ascii="Times New Roman" w:hAnsi="Times New Roman" w:eastAsia="Songti SC"/>
@@ -17855,8 +17873,8 @@
       </w:tblGrid>
       <w:tr>
         <w:trPr>
+          <w:cantSplit/>
           <w:tblHeader/>
-          <w:cantSplit/>
         </w:trPr>
         <w:tc>
           <w:tcPr>
@@ -18055,6 +18073,36 @@
           </w:p>
         </w:tc>
       </w:tr>
+      <w:tr>
+        <w:tc>
+          <w:tcPr>
+            <w:tcW w:type="dxa" w:w="4148"/>
+          </w:tcPr>
+          <w:p>
+            <w:pPr>
+              <w:ind w:firstLine="0"/>
+              <w:jc w:val="left"/>
+            </w:pPr>
+            <w:r>
+              <w:t>不同实验的轨迹、解析规则或结果记录不一致，难以归因和复现</w:t>
+            </w:r>
+          </w:p>
+        </w:tc>
+        <w:tc>
+          <w:tcPr>
+            <w:tcW w:type="dxa" w:w="4148"/>
+          </w:tcPr>
+          <w:p>
+            <w:pPr>
+              <w:ind w:firstLine="0"/>
+              <w:jc w:val="left"/>
+            </w:pPr>
+            <w:r>
+              <w:t>统一样本与轨迹标识、解析器版本和配置；先用固定样本回放核对模块输出，再开展训练比较；保存原始预测、失败样本、环境与代码版本。</w:t>
+            </w:r>
+          </w:p>
+        </w:tc>
+      </w:tr>
     </w:tbl>
     <w:p>
       <w:pPr>
@@ -18087,7 +18135,7 @@
       <w:pPr>
         <w:pStyle w:val="2"/>
       </w:pPr>
-      <w:bookmarkStart w:id="75" w:name="_Toc1059466731"/>
+      <w:bookmarkStart w:id="77" w:name="_Toc1059466731"/>
       <w:r>
         <w:rPr>
           <w:rFonts w:ascii="黑体" w:hAnsi="黑体" w:eastAsia="黑体" w:cs="黑体"/>
@@ -18097,7 +18145,7 @@
         </w:rPr>
         <w:t>8．主要参考文献</w:t>
       </w:r>
-      <w:bookmarkEnd w:id="75"/>
+      <w:bookmarkEnd w:id="77"/>
     </w:p>
     <w:p>
       <w:pPr>

</xml_diff>

<commit_message>
docs: frame opening report around three method-level problems
</commit_message>
<xml_diff>
--- a/Papers/output/开题报告-基于在线策略蒸馏的大语言模型后训练方法研究.docx
+++ b/Papers/output/开题报告-基于在线策略蒸馏的大语言模型后训练方法研究.docx
@@ -1053,7 +1053,7 @@
         <w:fldChar w:fldCharType="separate"/>
       </w:r>
       <w:r>
-        <w:t>16</w:t>
+        <w:t>17</w:t>
       </w:r>
       <w:r>
         <w:fldChar w:fldCharType="end"/>
@@ -1214,7 +1214,7 @@
         <w:rPr>
           <w:rFonts w:ascii="黑体" w:hAnsi="黑体" w:eastAsia="黑体" w:cs="黑体"/>
         </w:rPr>
-        <w:t>3.2 在线策略蒸馏的三个研究切入点</w:t>
+        <w:t>3.2 三项方法级研究问题</w:t>
       </w:r>
       <w:r>
         <w:tab/>
@@ -1581,7 +1581,7 @@
         <w:fldChar w:fldCharType="separate"/>
       </w:r>
       <w:r>
-        <w:t>32</w:t>
+        <w:t>33</w:t>
       </w:r>
       <w:r>
         <w:fldChar w:fldCharType="end"/>
@@ -1625,7 +1625,7 @@
         <w:fldChar w:fldCharType="separate"/>
       </w:r>
       <w:r>
-        <w:t>37</w:t>
+        <w:t>38</w:t>
       </w:r>
       <w:r>
         <w:fldChar w:fldCharType="end"/>
@@ -1669,7 +1669,7 @@
         <w:fldChar w:fldCharType="separate"/>
       </w:r>
       <w:r>
-        <w:t>41</w:t>
+        <w:t>42</w:t>
       </w:r>
       <w:r>
         <w:fldChar w:fldCharType="end"/>
@@ -1713,7 +1713,7 @@
         <w:fldChar w:fldCharType="separate"/>
       </w:r>
       <w:r>
-        <w:t>42</w:t>
+        <w:t>43</w:t>
       </w:r>
       <w:r>
         <w:fldChar w:fldCharType="end"/>
@@ -1757,7 +1757,7 @@
         <w:fldChar w:fldCharType="separate"/>
       </w:r>
       <w:r>
-        <w:t>42</w:t>
+        <w:t>43</w:t>
       </w:r>
       <w:r>
         <w:fldChar w:fldCharType="end"/>
@@ -1801,7 +1801,7 @@
         <w:fldChar w:fldCharType="separate"/>
       </w:r>
       <w:r>
-        <w:t>44</w:t>
+        <w:t>45</w:t>
       </w:r>
       <w:r>
         <w:fldChar w:fldCharType="end"/>
@@ -1845,7 +1845,7 @@
         <w:fldChar w:fldCharType="separate"/>
       </w:r>
       <w:r>
-        <w:t>45</w:t>
+        <w:t>46</w:t>
       </w:r>
       <w:r>
         <w:fldChar w:fldCharType="end"/>
@@ -1889,7 +1889,7 @@
         <w:fldChar w:fldCharType="separate"/>
       </w:r>
       <w:r>
-        <w:t>45</w:t>
+        <w:t>46</w:t>
       </w:r>
       <w:r>
         <w:fldChar w:fldCharType="end"/>
@@ -1933,7 +1933,7 @@
         <w:fldChar w:fldCharType="separate"/>
       </w:r>
       <w:r>
-        <w:t>45</w:t>
+        <w:t>47</w:t>
       </w:r>
       <w:r>
         <w:fldChar w:fldCharType="end"/>
@@ -1977,7 +1977,7 @@
         <w:fldChar w:fldCharType="separate"/>
       </w:r>
       <w:r>
-        <w:t>46</w:t>
+        <w:t>47</w:t>
       </w:r>
       <w:r>
         <w:fldChar w:fldCharType="end"/>
@@ -2021,7 +2021,7 @@
         <w:fldChar w:fldCharType="separate"/>
       </w:r>
       <w:r>
-        <w:t>47</w:t>
+        <w:t>49</w:t>
       </w:r>
       <w:r>
         <w:fldChar w:fldCharType="end"/>
@@ -2065,7 +2065,7 @@
         <w:fldChar w:fldCharType="separate"/>
       </w:r>
       <w:r>
-        <w:t>49</w:t>
+        <w:t>52</w:t>
       </w:r>
       <w:r>
         <w:fldChar w:fldCharType="end"/>
@@ -2234,7 +2234,7 @@
         <w:jc w:val="both"/>
       </w:pPr>
       <w:r>
-        <w:t>1. 建立单轮工具调用的在线策略蒸馏流程，识别学生实际访问的监督位置，形成可复现的轨迹与分层评价记录。</w:t>
+        <w:t>1. 设计工具调用决策状态的监督选择方法，在学生自行生成的轨迹中识别函数选择、参数生成和结构约束位置，依据位置类型及师生分歧分配训练位置预算。</w:t>
       </w:r>
     </w:p>
     <w:p>
@@ -2244,7 +2244,7 @@
         <w:jc w:val="both"/>
       </w:pPr>
       <w:r>
-        <w:t>2. 在相同学生轨迹上研究完整词表散度对梯度、熵和工具调用行为的影响，并测量 Top-K 截断对尾部总量及关键决策 token 的影响。</w:t>
+        <w:t>2. 设计按工具调用位置调节的双向散度目标，使教师认可候选的覆盖与学生错误高概率候选的抑制分别得到处理；在完整词表条件下检验其梯度和调用行为。</w:t>
       </w:r>
     </w:p>
     <w:p>
@@ -2254,7 +2254,7 @@
         <w:jc w:val="both"/>
       </w:pPr>
       <w:r>
-        <w:t>3. 建立贯穿学生轨迹、教师反馈、目标计算、训练更新和工具调用评测的统一测试流程；在此基础上提出决策感知的稀疏反馈候选方案，通过同预算对照与组件消融评价任务效果、稳定性和额外资源成本。</w:t>
+        <w:t>3. 设计决策感知的稀疏教师反馈方法，在有限候选预算下补入被教师 Top-K 漏掉的关键决策 token，并保留剩余概率总量；建立统一测试流程，验证三项方法的任务效果与成本。</w:t>
       </w:r>
     </w:p>
     <w:p>
@@ -4064,7 +4064,7 @@
           <w:rFonts w:ascii="Times New Roman" w:hAnsi="Times New Roman" w:eastAsia="宋体"/>
           <w:sz w:val="24"/>
         </w:rPr>
-        <w:t>广义散度提供了调节覆盖与集中程度的目标族。GKD 比较可配置的散度[7]，DistiLLM 使用 skew KL[9]，稳定化 OPD 则显示目标分布的构造会影响低置信度 token 的梯度[12]。在小模型上，Top-K 归一化、教师概率下界、混合精度计算和序列 mask 还可能改变数值尺度。因此，本课题将同时记录数学定义与具体实现协议。</w:t>
+        <w:t>广义散度与混合目标为调节覆盖和集中程度提供了不同实现。GKD 比较可配置散度[7]，DistiLLM 使用 skew KL[9]，HPD 将 Forward KL 与 Reverse KL 的优势结合[35]。这些工作为本课题提供目标基线；工具调用中的函数选择、参数生成和结构位置具有不同的错误形式，本文据此研究按位置调节的双向目标。Top-K 归一化、教师概率下界、混合精度和序列 mask 可能改变数值尺度，数学定义与实现协议须一并记录。</w:t>
       </w:r>
     </w:p>
     <w:p>
@@ -4254,7 +4254,7 @@
         <w:jc w:val="both"/>
       </w:pPr>
       <w:r>
-        <w:t>现有 OPD 研究形成了三个相互关联的方向。GKD 等方法在学生生成的前缀上获取教师反馈，缓解状态分布偏移[7]；Forward KL、Reverse KL、JSD 和 skew KL 改变不同概率区域的学习权重[7][8][9][12]；完整词表、Top-K 与 sampled-token 反馈则提供不同的信息量与成本选择[11][15][30]。本课题以相同模型、任务和训练预算分别考察三者，逐步定位值得改进的环节。</w:t>
+        <w:t>现有 OPD 方法在学生自生成前缀上获取教师反馈，缓解训练与推理时的状态分布差异[7]。但对单轮工具调用而言，学生轨迹中函数选择、参数生成和结构位置承担不同决策作用，等量使用所有有效 token 可能稀释关键位置的监督。散度研究表明 Forward KL、Reverse KL 及混合目标具有不同的分布偏好[7][8][9][35]；已有混合方法尚需在工具调用的不同状态上确定目标权重及其训练作用。本文据此分别研究决策状态的监督选择和位置条件化的散度目标。</w:t>
       </w:r>
     </w:p>
     <w:p>
@@ -4263,7 +4263,7 @@
         <w:jc w:val="both"/>
       </w:pPr>
       <w:r>
-        <w:t>稀疏反馈暴露出两个具体问题。教师 Top-K 内归一化丢失支持集外的总量信息，已有尾部类别方法能够补偿[31]；按教师累计概率选择候选时，学生高估的工具调用决策 token 仍可能落在支持集外，多教师研究已有相关观察[33]。采样残差修正则提供另一类稀疏估计方案[32][34]。单教师、单轮调用中的问题规模及方法收益尚需测量。本文先确认学生状态与散度目标，再检验尾部总量和决策候选遗漏，最后比较固定反馈预算下的联合选择机制。</w:t>
+        <w:t>第三个方法问题来自教师反馈的稀疏化。Top-K 支持集外的总概率可以用尾部类别保存[31]，但学生高估的工具调用决策 token 仍可能被遗漏[33]；采样残差修正提供了另一种估计途径[32][34]。本课题拟把前两项方法确定的训练位置和散度目标作为基础，设计决策感知的支持集与有限预算分配机制。三项工作分别决定“在哪些位置学、用什么目标学、教师给出哪些概率”，由同一测试流程验证。</w:t>
       </w:r>
     </w:p>
     <w:p>
@@ -4304,7 +4304,7 @@
         <w:jc w:val="both"/>
       </w:pPr>
       <w:r>
-        <w:t>研究依次回答三个问题：教师应在学生的哪些生成状态上提供反馈；不同散度如何影响小模型的更新与调用行为；有限的教师反馈又保留了多少有效信号。围绕单轮 Function Calling，先建立学生轨迹和同前缀评分，再在完整词表上分析散度，最后诊断 Top-K 截断并提出候选改进。前两个问题提供方法设计所需的状态与目标依据，第三个问题进入有限预算下的支持集选择。</w:t>
+        <w:t>本文围绕单轮 Function Calling 提出三个相互衔接的方法问题。首先，学生自生成轨迹中哪些位置值得优先接受教师监督，需要形成可执行的状态选择规则。其次，同一散度目标在函数选择、参数生成和结构位置上的作用可能不同，需要形成按位置调节的优化目标。最后，教师只能返回有限候选概率时，需要设计兼顾关键决策 token 与尾部总质量的反馈表示。三个方法依次确定监督位置、更新方向和反馈内容，统一测试流程提供共同的实现与验证条件。</w:t>
       </w:r>
     </w:p>
     <w:p>
@@ -4319,7 +4319,7 @@
           <w:color w:val="000000"/>
           <w:sz w:val="24"/>
         </w:rPr>
-        <w:t>3.2 在线策略蒸馏的三个研究切入点</w:t>
+        <w:t>3.2 三项方法级研究问题</w:t>
       </w:r>
       <w:bookmarkEnd w:id="18"/>
     </w:p>
@@ -4329,7 +4329,7 @@
         <w:jc w:val="both"/>
       </w:pPr>
       <w:r>
-        <w:t>第一，研究学生状态上的监督。学生自主生成会进入教师示例未覆盖的前缀；OPD 在这些位置获取教师反馈[7]。本文建立单轮工具调用轨迹与冻结教师评分流程，依据消息边界和工具 schema 标注函数入口、函数名、参数键、参数值与结构位置。统一位置掩码后，比较各类位置的错误分布和监督使用情况，为散度与稀疏反馈实验提供可靠的状态基础。</w:t>
+        <w:t>第一项研究设计决策状态感知的监督选择方法。常规 OPD 在学生轨迹的有效位置取得教师反馈[7]，却未直接规定有限更新预算优先投向哪些工具调用决策。本文先用消息边界、工具 schema 和解析规则标出函数入口、函数名、参数键、参数值与结构位置，再用该位置上的师生分歧与类型信息形成优先级，在固定有效训练 token 数下选择监督位置。优先级仅使用训练时可获得的信息；目标函数和反馈粒度暂时固定，以检验位置选择本身对函数、参数和格式错误的影响。</w:t>
       </w:r>
     </w:p>
     <w:p>
@@ -4338,7 +4338,7 @@
         <w:jc w:val="both"/>
       </w:pPr>
       <w:r>
-        <w:t>第二，研究散度目标的学习偏好。Forward KL 重视教师认可的候选，Reverse KL 更关注学生当前容易生成的区域；JSD 与 skew KL 进一步调节两种分布的混合方式[7][8][9][12]。在相同学生前缀、完整词表反馈和训练预算下，本文比较函数选择、过度调用、熵、梯度与训练稳定性，分析概率权重如何作用于工具调用，并据此确定稀疏反馈实验的主要目标。</w:t>
+        <w:t>第二项研究设计位置条件化的双向散度目标。Forward KL 强调教师认可候选的覆盖，Reverse KL 更重视学生当前高概率区域[7][8]；混合两者已有研究基础[35]。本文在完整词表上分别测量教师偏好候选的学生欠覆盖量，以及学生高概率候选相对教师的过估量，据两类信号调节双向散度的权重，并允许函数选择、参数生成和结构位置采用不同的规则阈值。权重规则由训练集诊断并用验证集选择，测试集不参与确定；固定第一项方法的监督位置，与单一散度、全局固定混合及代表性广义散度比较。</w:t>
       </w:r>
     </w:p>
     <w:p>
@@ -4347,7 +4347,7 @@
         <w:jc w:val="both"/>
       </w:pPr>
       <w:r>
-        <w:t>第三，研究有限反馈的信息保真程度。在状态和主要散度方向固定后，比较完整词表、常规 Top-K 与 sampled-token 监督，测量目标偏差和估计波动[30][31][32]。分析重点是 Top-K 外的尾部总概率，以及学生高概率、教师 Top-K 未覆盖的决策 token：前者关系到概率质量约束，后者可能影响函数入口和调用路径[31][33]。若这些遗漏在本任务中产生可测的梯度或行为差异，再进入方法改进。</w:t>
+        <w:t>第三项研究设计有限反馈下的决策感知支持集。教师 Top-K 可能遗漏尾部总质量，也可能漏掉学生高估的函数入口或参数候选[31][33]。本文在教师 Top-K 中补入合法的学生高概率决策 token，对其单独评分，并把其余概率并为尾部类别；不同位置的显式候选名额由前两项研究确定的决策类别和诊断风险分配。该方法改变教师反馈的表示与预算配置，固定监督位置和主要散度目标后，与常规 Top-K、已有尾部类别及同预算选择方法比较。</w:t>
       </w:r>
     </w:p>
     <w:p>
@@ -4415,7 +4415,7 @@
         <w:jc w:val="both"/>
       </w:pPr>
       <w:r>
-        <w:t>验证按研究链条推进。首先检查学生 rollout、教师同前缀评分、位置标注和结构化评测的可靠性；随后在固定轨迹与完整词表反馈下，分析散度对梯度、熵及工具调用行为的影响。主要目标确定后，再在相同前缀上测量不同 K 的尾部质量、关键 token 漏选率及相对完整词表的梯度误差。诊断结果决定候选方法的适用范围。</w:t>
+        <w:t>三个方法分别进行数值检查、受控训练和任务验证。状态方法比较相同更新预算下的均匀位置选择、仅按结构类型选择和决策状态优先选择；散度方法在相同轨迹与完整词表反馈下比较单一目标、全局混合和位置条件化混合；反馈方法固定前两项的设置，测量不同支持集的尾部质量、决策候选覆盖、梯度误差及教师评分成本。每项方法均以结构化调用结果和多随机种子重复实验检验，组件消融只用于解释机制。</w:t>
       </w:r>
     </w:p>
     <w:p>
@@ -4433,7 +4433,7 @@
         <w:jc w:val="both"/>
       </w:pPr>
       <w:r>
-        <w:t>方法比较共享学生起点、教师、数据划分、生成协议、主要散度和有效训练 token 预算。常规 Top-K、已有尾部类别、单独补入决策候选、单独分配位置 K 与完整方案构成主要对照；各组匹配平均反馈条目数，另行报告教师概率获取成本。完整词表提供信息参照，其他散度和 K1 sampled-token 分别用于机制与低反馈量分析。短程实验先检查信号与行为的联系，再决定正式训练规模。</w:t>
+        <w:t>三项方法共享学生起点、冻结教师、数据划分、生成协议和评价规则。状态实验匹配有效训练 token 数与更新步数；散度实验固定状态选择与完整词表反馈；稀疏实验固定状态选择和主要散度，并匹配平均显式候选数。统一流程保存每项方法的输入、规则、参数和原始预测，能够在同一轨迹上回放目标计算，再用独立训练检验端到端效果。若短程实验显示某项机制缺乏信号，将收缩该方法的适用范围。</w:t>
       </w:r>
     </w:p>
     <w:p>
@@ -4442,7 +4442,7 @@
         <w:jc w:val="both"/>
       </w:pPr>
       <w:r>
-        <w:t>预期形成四类可核查的研究材料：学生到访状态与工具调用错误的分层记录，散度目标的梯度和行为分析，Top-K 信息损失与同预算改进的比较，以及可复用的统一测试程序和原始实验记录。流程先通过概率归一化、支持集、梯度和有限值检查，再进入短程训练与结构化调用评测；只有上述检查通过，才扩大到多随机种子正式比较。最终根据实测结果判断候选方法相对已有稀疏反馈方案的价值。</w:t>
+        <w:t>预期形成三项方法及其证据链：决策状态感知的监督选择、位置条件化的双向散度目标、决策感知的稀疏教师反馈。每项分别提交可执行规则、数值与梯度检查、同预算训练结果及分层工具调用分析。统一测试程序保存轨迹、配置、代码版本、失败样本和资源开销；候选方法的收益与适用边界由实测结果决定。</w:t>
       </w:r>
     </w:p>
     <w:p>
@@ -4481,7 +4481,7 @@
         <w:jc w:val="both"/>
       </w:pPr>
       <w:r>
-        <w:t>图 1 概括研究问题的递进关系：先确认学生访问的状态，再分析散度目标如何改变更新，最后考察 Top-K 反馈中丢失了哪些信号。第三环节承接前两个环节的诊断结果，聚焦尾部总量、决策候选和反馈预算。统一测试流程贯穿三个环节，使状态、目标与反馈变化可以在相同样本、轨迹和评价规则下追溯。尾部类别、采样修正及学生感知支持集均有先行研究[31][32][33][34]；本课题将检验这些思路在单轮工具调用中联合使用的收益与边界。</w:t>
+        <w:t>图 1 展示学生状态、散度目标和反馈粒度的递进关系。本文在三个环节分别提出状态选择、位置条件化目标和决策感知支持集，前一方法为后一方法提供位置或目标约束。已有混合散度、尾部类别、采样修正及学生感知支持集工作[35][31][32][33][34]是重要对照；三项候选方法在单轮工具调用中的效果均待实验验证。</w:t>
       </w:r>
     </w:p>
     <w:p>
@@ -4588,7 +4588,7 @@
           <w:rFonts w:ascii="Times New Roman" w:hAnsi="Times New Roman" w:eastAsia="宋体"/>
           <w:sz w:val="21"/>
         </w:rPr>
-        <w:t xml:space="preserve">  在线策略蒸馏的研究切入点与重点改进</w:t>
+        <w:t xml:space="preserve">  在线策略蒸馏的三项研究方法及其关系</w:t>
       </w:r>
     </w:p>
     <w:p>
@@ -4685,7 +4685,7 @@
         <w:jc w:val="both"/>
       </w:pPr>
       <w:r>
-        <w:t>图 2 展示总体技术路线。学生在单轮工具调用中生成轨迹，冻结教师在同一前缀上给出反馈；据此获得可复查的状态和位置。研究先用完整词表比较散度对梯度与调用行为的影响，再固定主要目标，测量 Top-K 的尾部质量与决策 token 漏选。候选方法依据位置风险分配支持集名额，显式补入关键 token，并保留其余概率总量。最终以 LoRA 更新学生，通过分层任务指标和资源记录检验方法。</w:t>
+        <w:t>图 2 展示总体技术路线。学生生成单轮工具调用轨迹后，先根据结构位置与师生分歧选择重点监督状态；在选中状态上，按位置类别组合双向散度，确定学生更新方向；最后在有限教师反馈预算下，构造含决策候选和尾部类别的稀疏支持集。统一测试流程记录轨迹、概率、损失、调用结果和成本，使三项方法可以逐项验证并开展组合实验。</w:t>
       </w:r>
     </w:p>
     <w:p>
@@ -4694,7 +4694,7 @@
         <w:jc w:val="both"/>
       </w:pPr>
       <w:r>
-        <w:t>下面统一记号。输入从数据分布中抽取，学生策略生成响应，冻结教师在相同学生前缀上给出条件分布。二值掩码标记接受监督的位置；师生使用一致的 tokenizer、模板与位置对齐规则。</w:t>
+        <w:t>下面统一记号。输入从数据分布中抽取，学生策略生成响应，冻结教师在相同学生前缀上给出条件分布。监督掩码先标记合法位置，再由状态选择方法在固定训练预算下确定实际参与更新的位置；师生使用一致的 tokenizer、模板与位置对齐规则。</w:t>
       </w:r>
     </w:p>
     <w:p>
@@ -5232,7 +5232,7 @@
         <w:jc w:val="both"/>
       </w:pPr>
       <w:r>
-        <w:t>令上标 g 表示教师反馈方案，包括完整词表、常规 Top-K 及候选支持集。给定监督掩码和散度目标，统一蒸馏目标写为下式。每次更新将离散生成轨迹视为已采样数据，梯度沿学生分布和 LoRA 参数传播。</w:t>
+        <w:t>令上标 g 表示教师反馈方案，包括完整词表、常规 Top-K 及候选支持集。式（4-2）的监督掩码由状态方法给出，单位置散度算子可按位置类别选取双向目标；反馈方案决定算子可见的概率表示。每次更新将离散生成轨迹视为已采样数据，梯度沿学生分布和 LoRA 参数传播。</w:t>
       </w:r>
     </w:p>
     <w:tbl>
@@ -5745,7 +5745,7 @@
         <w:jc w:val="both"/>
       </w:pPr>
       <w:r>
-        <w:t>式（4-2）分别容纳状态选择、散度类型和反馈支持集。本文先在完整词表上比较 Forward KL、Reverse KL、JSD 与 skew KL，并从梯度及工具调用行为确定主要目标；Reverse KL 暂作信息参照。稀疏实验在固定目标下比较常规 Top-K、已有尾部类别方法[31]与决策感知候选方案。候选方案通过补入学生高概率的合法决策 token 扩展支持集，余下概率并为尾部类别；位置 K 的分配受反馈预算约束。总体优化问题为：</w:t>
+        <w:t>式（4-2）为三项方法提供统一目标。先固定散度与完整词表反馈，研究状态选择；再固定监督位置，在完整词表上研究位置条件化的双向散度；最后固定位置和目标，研究稀疏支持集。单一 Forward KL、Reverse KL、JSD、skew KL、全局固定混合及已有尾部类别方法分别作为对照[7][8][9][12][35][31]。总体优化问题为：</w:t>
       </w:r>
     </w:p>
     <w:tbl>
@@ -5995,7 +5995,7 @@
         <w:jc w:val="both"/>
       </w:pPr>
       <w:r>
-        <w:t>实验依次核实学生状态与位置标注、分析完整词表散度、诊断固定主要目标下的稀疏反馈，最后开展同预算方法对照及组件消融。散度实验与支持集实验分别报告，训练配置和原始指标保留到每个对照组，以便追溯调用行为的变化。</w:t>
+        <w:t>方法研究依次完成状态选择、位置条件化目标和稀疏反馈设计；三项方法分别接受受控训练验证，再测试组合使用的效果。每项均保留规则参数、训练配置和原始指标，避免把方法贡献归于单次消融或总分变化。</w:t>
       </w:r>
     </w:p>
     <w:p>
@@ -7458,7 +7458,7 @@
         <w:jc w:val="both"/>
       </w:pPr>
       <w:r>
-        <w:t>教师沿学生已生成的前缀评分，师生 logits 在同一 token 位置对齐，再由各自设定的温度得到条件分布。位置标注依据函数选择、参数键、参数值和结构标记的解析规则完成；无法可靠归类的 token 单列，错误成因留待轨迹分析确认。</w:t>
+        <w:t>教师沿学生已生成的前缀评分，师生 logits 在同一 token 位置对齐，再由各自设定的温度得到条件分布。位置标注依据函数选择、参数键、参数值和结构标记的解析规则完成；无法可靠归类的 token 单列。状态选择方法在有效位置中，依据结构类别及师生分歧设置优先级并选取固定数量的位置；任务真值仅用于训练后分析，不参与优先级计算。</w:t>
       </w:r>
     </w:p>
     <w:tbl>
@@ -7813,7 +7813,7 @@
         <w:jc w:val="both"/>
       </w:pPr>
       <w:r>
-        <w:t>监督位置由消息边界、工具调用区域和序列截断共同确定。掩码筛选 assistant 或 function-call 区域中的有效 token，损失按有效位置数归一化：</w:t>
+        <w:t>消息边界、工具调用区域和序列截断先定义候选监督位置。状态选择方法在候选集合内保留固定预算的位置，并将其掩码设为 1，其余位置为 0；损失仍按实际选中位置数归一化：</w:t>
       </w:r>
     </w:p>
     <w:tbl>
@@ -8688,7 +8688,7 @@
         <w:jc w:val="both"/>
       </w:pPr>
       <w:r>
-        <w:t>表 4-1 列出各环节需固定和记录的变量。所有对照组使用相同输入、生成协议、数据划分和有效位置定义。状态实验改变同预算下使用的位置；散度实验固定轨迹并提供完整词表反馈；稀疏实验进一步固定主要散度。教师反馈额外记录 Top-K 累计概率、尾部质量、决策 token 覆盖情况和实际 K，使结果能够对应具体研究变量。图 3 展示训练与评测流程。</w:t>
+        <w:t>表 4-1 列出各环节需固定和记录的变量。所有对照组使用相同输入、生成协议、数据划分和候选位置定义。状态方法只改变实际参与更新的位置；散度方法固定位置并提供完整词表反馈；稀疏方法进一步固定目标。教师反馈记录 Top-K 累计概率、尾部质量、决策 token 覆盖情况和实际 K；状态选择记录位置类别、优先级与实际掩码，使每项方法都能追溯到具体变量。图 3 展示训练与评测流程。</w:t>
       </w:r>
     </w:p>
     <w:p>
@@ -10269,7 +10269,7 @@
         <w:jc w:val="both"/>
       </w:pPr>
       <w:r>
-        <w:t>完整词表的 Forward KL、Reverse KL、JSD 和 skew KL 用于研究不同概率区域受到的学习权重[7][8][9][12]。在相同学生轨迹、温度和有效位置上，比较各目标的梯度、熵变化、函数误选与过度调用。确定稀疏实验的主要散度后，Top-K 对照保持该目标及其支持集协议一致。</w:t>
+        <w:t>完整词表的 Forward KL、Reverse KL、JSD 和 skew KL 构成目标参照[7][8][9][12]。位置条件化方法先计算教师高概率候选的学生欠覆盖量，以及学生最高概率候选相对教师的过估量；两量均取非负值。两量之和非零时，以欠覆盖量占比作为 Forward KL 权重，余下权重分给 Reverse KL；两量都为零时使用预设中性权重。函数选择、参数生成和结构位置可设置不同的阈值与权重边界，取值范围由验证集确定。权重计算不参与梯度传播，单位置损失由式（4-12）和式（4-13）加权组成；全局固定混合与单一散度是直接对照[35]。稀疏实验沿用确定后的规则及相同位置，避免同时更换目标与支持集。</w:t>
       </w:r>
     </w:p>
     <w:p>
@@ -10278,7 +10278,7 @@
         <w:jc w:val="both"/>
       </w:pPr>
       <w:r>
-        <w:t>表 4-2 按研究顺序组织完整词表散度分析、稀疏反馈诊断、同预算方法比较和组件消融。教师、学生起点、数据划分、生成协议与评价规则在各组保持一致；散度比较固定反馈粒度，方法比较固定主要散度，并统一有效训练 token 数及更新步数。</w:t>
+        <w:t>表 4-2 按三个方法组织受控比较。状态方法固定完整词表目标，检验监督位置规则；散度方法固定位置，检验位置条件化权重；反馈方法固定位置和目标，检验有限支持集。教师、学生起点、数据划分、生成协议与评价规则保持一致，各组统一有效训练 token 数及更新步数；方法组合另设实验，避免混淆单项贡献。</w:t>
       </w:r>
     </w:p>
     <w:p>
@@ -10509,7 +10509,7 @@
                 <w:b w:val="0"/>
                 <w:sz w:val="19"/>
               </w:rPr>
-              <w:t>完整词表散度</w:t>
+              <w:t>状态选择方法</w:t>
             </w:r>
           </w:p>
         </w:tc>
@@ -10530,7 +10530,7 @@
                 <w:b w:val="0"/>
                 <w:sz w:val="19"/>
               </w:rPr>
-              <w:t>同轨迹、同反馈</w:t>
+              <w:t>同模型、同目标、同训练 token 预算</w:t>
             </w:r>
           </w:p>
         </w:tc>
@@ -10551,7 +10551,118 @@
                 <w:b w:val="0"/>
                 <w:sz w:val="19"/>
               </w:rPr>
-              <w:t>FKL、RKL、JSD、skew KL</w:t>
+              <w:t>均匀位置、结构优先、状态感知选择</w:t>
+            </w:r>
+          </w:p>
+        </w:tc>
+        <w:tc>
+          <w:tcPr>
+            <w:tcW w:w="1900" w:type="dxa"/>
+            <w:vAlign w:val="center"/>
+          </w:tcPr>
+          <w:p>
+            <w:pPr>
+              <w:spacing w:before="0" w:after="0" w:line="240" w:lineRule="auto"/>
+              <w:ind w:firstLine="0"/>
+              <w:jc w:val="left"/>
+            </w:pPr>
+            <w:r>
+              <w:rPr>
+                <w:rFonts w:ascii="Times New Roman" w:hAnsi="Times New Roman" w:eastAsia="宋体"/>
+                <w:b w:val="0"/>
+                <w:sz w:val="19"/>
+              </w:rPr>
+              <w:t>位置覆盖、调用错误、成本</w:t>
+            </w:r>
+          </w:p>
+        </w:tc>
+        <w:tc>
+          <w:tcPr>
+            <w:tcW w:w="1456" w:type="dxa"/>
+            <w:vAlign w:val="center"/>
+          </w:tcPr>
+          <w:p>
+            <w:pPr>
+              <w:spacing w:before="0" w:after="0" w:line="240" w:lineRule="auto"/>
+              <w:ind w:firstLine="0"/>
+              <w:jc w:val="left"/>
+            </w:pPr>
+            <w:r>
+              <w:rPr>
+                <w:rFonts w:ascii="Times New Roman" w:hAnsi="Times New Roman" w:eastAsia="宋体"/>
+                <w:b w:val="0"/>
+                <w:sz w:val="19"/>
+              </w:rPr>
+              <w:t>验证监督位置规则</w:t>
+            </w:r>
+          </w:p>
+        </w:tc>
+      </w:tr>
+      <w:tr>
+        <w:trPr>
+          <w:cantSplit/>
+          <w:jc w:val="center"/>
+        </w:trPr>
+        <w:tc>
+          <w:tcPr>
+            <w:tcW w:w="1150" w:type="dxa"/>
+            <w:vAlign w:val="center"/>
+          </w:tcPr>
+          <w:p>
+            <w:pPr>
+              <w:spacing w:before="0" w:after="0" w:line="240" w:lineRule="auto"/>
+              <w:ind w:firstLine="0"/>
+              <w:jc w:val="left"/>
+            </w:pPr>
+            <w:r>
+              <w:rPr>
+                <w:rFonts w:ascii="Times New Roman" w:hAnsi="Times New Roman" w:eastAsia="宋体"/>
+                <w:b w:val="0"/>
+                <w:sz w:val="19"/>
+              </w:rPr>
+              <w:t>条件化散度方法</w:t>
+            </w:r>
+          </w:p>
+        </w:tc>
+        <w:tc>
+          <w:tcPr>
+            <w:tcW w:w="2350" w:type="dxa"/>
+            <w:vAlign w:val="center"/>
+          </w:tcPr>
+          <w:p>
+            <w:pPr>
+              <w:spacing w:before="0" w:after="0" w:line="240" w:lineRule="auto"/>
+              <w:ind w:firstLine="0"/>
+              <w:jc w:val="left"/>
+            </w:pPr>
+            <w:r>
+              <w:rPr>
+                <w:rFonts w:ascii="Times New Roman" w:hAnsi="Times New Roman" w:eastAsia="宋体"/>
+                <w:b w:val="0"/>
+                <w:sz w:val="19"/>
+              </w:rPr>
+              <w:t>同轨迹、完整词表反馈</w:t>
+            </w:r>
+          </w:p>
+        </w:tc>
+        <w:tc>
+          <w:tcPr>
+            <w:tcW w:w="1450" w:type="dxa"/>
+            <w:vAlign w:val="center"/>
+          </w:tcPr>
+          <w:p>
+            <w:pPr>
+              <w:spacing w:before="0" w:after="0" w:line="240" w:lineRule="auto"/>
+              <w:ind w:firstLine="0"/>
+              <w:jc w:val="left"/>
+            </w:pPr>
+            <w:r>
+              <w:rPr>
+                <w:rFonts w:ascii="Times New Roman" w:hAnsi="Times New Roman" w:eastAsia="宋体"/>
+                <w:b w:val="0"/>
+                <w:sz w:val="19"/>
+              </w:rPr>
+              <w:t>FKL、RKL、全局混合、位置条件化混合</w:t>
             </w:r>
           </w:p>
         </w:tc>
@@ -10593,7 +10704,7 @@
                 <w:b w:val="0"/>
                 <w:sz w:val="19"/>
               </w:rPr>
-              <w:t>确定主要目标</w:t>
+              <w:t>验证目标设计</w:t>
             </w:r>
           </w:p>
         </w:tc>
@@ -10620,7 +10731,7 @@
                 <w:b w:val="0"/>
                 <w:sz w:val="19"/>
               </w:rPr>
-              <w:t>稀疏反馈诊断</w:t>
+              <w:t>稀疏反馈方法</w:t>
             </w:r>
           </w:p>
         </w:tc>
@@ -10641,7 +10752,7 @@
                 <w:b w:val="0"/>
                 <w:sz w:val="19"/>
               </w:rPr>
-              <w:t>同轨迹、同损失</w:t>
+              <w:t>同位置、同目标、同反馈预算</w:t>
             </w:r>
           </w:p>
         </w:tc>
@@ -10662,7 +10773,7 @@
                 <w:b w:val="0"/>
                 <w:sz w:val="19"/>
               </w:rPr>
-              <w:t>全词表、Top-K、K1</w:t>
+              <w:t>Top-K、尾部类别、决策支持集</w:t>
             </w:r>
           </w:p>
         </w:tc>
@@ -10683,7 +10794,7 @@
                 <w:b w:val="0"/>
                 <w:sz w:val="19"/>
               </w:rPr>
-              <w:t>尾部与梯度误差</w:t>
+              <w:t>尾部质量、调用结果、教师成本</w:t>
             </w:r>
           </w:p>
         </w:tc>
@@ -10704,7 +10815,7 @@
                 <w:b w:val="0"/>
                 <w:sz w:val="19"/>
               </w:rPr>
-              <w:t>定位遗漏</w:t>
+              <w:t>验证反馈表示</w:t>
             </w:r>
           </w:p>
         </w:tc>
@@ -10731,7 +10842,7 @@
                 <w:b w:val="0"/>
                 <w:sz w:val="19"/>
               </w:rPr>
-              <w:t>同预算方法</w:t>
+              <w:t>方法组合与消融</w:t>
             </w:r>
           </w:p>
         </w:tc>
@@ -10752,7 +10863,7 @@
                 <w:b w:val="0"/>
                 <w:sz w:val="19"/>
               </w:rPr>
-              <w:t>同起点、同预算</w:t>
+              <w:t>同起点、同训练协议</w:t>
             </w:r>
           </w:p>
         </w:tc>
@@ -10773,7 +10884,7 @@
                 <w:b w:val="0"/>
                 <w:sz w:val="19"/>
               </w:rPr>
-              <w:t>固定 K、尾部类别、决策支持集</w:t>
+              <w:t>单项方法、组合、移除组件</w:t>
             </w:r>
           </w:p>
         </w:tc>
@@ -10794,7 +10905,7 @@
                 <w:b w:val="0"/>
                 <w:sz w:val="19"/>
               </w:rPr>
-              <w:t>调用结果与成本</w:t>
+              <w:t>任务、时间、显存、波动</w:t>
             </w:r>
           </w:p>
         </w:tc>
@@ -10815,118 +10926,7 @@
                 <w:b w:val="0"/>
                 <w:sz w:val="19"/>
               </w:rPr>
-              <w:t>检验改进</w:t>
-            </w:r>
-          </w:p>
-        </w:tc>
-      </w:tr>
-      <w:tr>
-        <w:trPr>
-          <w:cantSplit/>
-          <w:jc w:val="center"/>
-        </w:trPr>
-        <w:tc>
-          <w:tcPr>
-            <w:tcW w:w="1150" w:type="dxa"/>
-            <w:vAlign w:val="center"/>
-          </w:tcPr>
-          <w:p>
-            <w:pPr>
-              <w:spacing w:before="0" w:after="0" w:line="240" w:lineRule="auto"/>
-              <w:ind w:firstLine="0"/>
-              <w:jc w:val="left"/>
-            </w:pPr>
-            <w:r>
-              <w:rPr>
-                <w:rFonts w:ascii="Times New Roman" w:hAnsi="Times New Roman" w:eastAsia="宋体"/>
-                <w:b w:val="0"/>
-                <w:sz w:val="19"/>
-              </w:rPr>
-              <w:t>组件消融</w:t>
-            </w:r>
-          </w:p>
-        </w:tc>
-        <w:tc>
-          <w:tcPr>
-            <w:tcW w:w="2350" w:type="dxa"/>
-            <w:vAlign w:val="center"/>
-          </w:tcPr>
-          <w:p>
-            <w:pPr>
-              <w:spacing w:before="0" w:after="0" w:line="240" w:lineRule="auto"/>
-              <w:ind w:firstLine="0"/>
-              <w:jc w:val="left"/>
-            </w:pPr>
-            <w:r>
-              <w:rPr>
-                <w:rFonts w:ascii="Times New Roman" w:hAnsi="Times New Roman" w:eastAsia="宋体"/>
-                <w:b w:val="0"/>
-                <w:sz w:val="19"/>
-              </w:rPr>
-              <w:t>同训练协议</w:t>
-            </w:r>
-          </w:p>
-        </w:tc>
-        <w:tc>
-          <w:tcPr>
-            <w:tcW w:w="1450" w:type="dxa"/>
-            <w:vAlign w:val="center"/>
-          </w:tcPr>
-          <w:p>
-            <w:pPr>
-              <w:spacing w:before="0" w:after="0" w:line="240" w:lineRule="auto"/>
-              <w:ind w:firstLine="0"/>
-              <w:jc w:val="left"/>
-            </w:pPr>
-            <w:r>
-              <w:rPr>
-                <w:rFonts w:ascii="Times New Roman" w:hAnsi="Times New Roman" w:eastAsia="宋体"/>
-                <w:b w:val="0"/>
-                <w:sz w:val="19"/>
-              </w:rPr>
-              <w:t>去尾部类、去补入、去分配</w:t>
-            </w:r>
-          </w:p>
-        </w:tc>
-        <w:tc>
-          <w:tcPr>
-            <w:tcW w:w="1900" w:type="dxa"/>
-            <w:vAlign w:val="center"/>
-          </w:tcPr>
-          <w:p>
-            <w:pPr>
-              <w:spacing w:before="0" w:after="0" w:line="240" w:lineRule="auto"/>
-              <w:ind w:firstLine="0"/>
-              <w:jc w:val="left"/>
-            </w:pPr>
-            <w:r>
-              <w:rPr>
-                <w:rFonts w:ascii="Times New Roman" w:hAnsi="Times New Roman" w:eastAsia="宋体"/>
-                <w:b w:val="0"/>
-                <w:sz w:val="19"/>
-              </w:rPr>
-              <w:t>任务、时间、显存</w:t>
-            </w:r>
-          </w:p>
-        </w:tc>
-        <w:tc>
-          <w:tcPr>
-            <w:tcW w:w="1456" w:type="dxa"/>
-            <w:vAlign w:val="center"/>
-          </w:tcPr>
-          <w:p>
-            <w:pPr>
-              <w:spacing w:before="0" w:after="0" w:line="240" w:lineRule="auto"/>
-              <w:ind w:firstLine="0"/>
-              <w:jc w:val="left"/>
-            </w:pPr>
-            <w:r>
-              <w:rPr>
-                <w:rFonts w:ascii="Times New Roman" w:hAnsi="Times New Roman" w:eastAsia="宋体"/>
-                <w:b w:val="0"/>
-                <w:sz w:val="19"/>
-              </w:rPr>
-              <w:t>判定各组件作用</w:t>
+              <w:t>解释交互与适用边界</w:t>
             </w:r>
           </w:p>
         </w:tc>
@@ -10938,7 +10938,7 @@
         <w:jc w:val="both"/>
       </w:pPr>
       <w:r>
-        <w:t>完整词表实验分析优化偏好；稀疏诊断分别测量尾部总量、决策候选漏选和梯度误差；同预算比较检验扩展支持集的效果；组件消融评估候选补入、尾部类别与位置分配的作用。K1 sampled-token 作为低反馈量边界参照，单独统计估计波动。</w:t>
+        <w:t>状态方法的消融分别移除结构类型和师生分歧信息；散度方法比较单一方向、全局混合和位置条件化权重；反馈方法分别检验决策候选补入、尾部类别与预算分配。完整词表提供反馈上界参照，K1 sampled-token 作为低反馈量边界参照。消融解释方法为何有效，研究主体仍是各方法的规则设计与独立验证。</w:t>
       </w:r>
     </w:p>
     <w:p>
@@ -12422,7 +12422,7 @@
         <w:jc w:val="both"/>
       </w:pPr>
       <w:r>
-        <w:t>式（4-19）的 Top 算子按学生概率选择候选，额外名额依据位置风险分配；名额为零或候选集合为空时，补入集合为空。教师对补入 token 的概率须通过可靠接口或本地前向计算取得。对扩展后的同一支持集，师生各保留显式 token 的原始概率，并将其余概率并入尾部类别：</w:t>
+        <w:t>式（4-19）的 Top 算子按学生概率选择候选，额外名额依据位置风险分配；名额为零或候选集合为空时，补入集合为空。教师对补入 token 的概率须通过可靠接口或本地前向计算取得。稀疏实验沿用已确定的监督位置及散度权重；如权重所需的欠覆盖量无法由当前反馈恢复，应在粗粒度支持集上重新定义可计算的代理量，并与完整词表权重分开报告。对扩展后的同一支持集，师生各保留显式 token 的原始概率，并将其余概率并入尾部类别：</w:t>
       </w:r>
     </w:p>
     <w:tbl>
@@ -13584,7 +13584,7 @@
         <w:jc w:val="both"/>
       </w:pPr>
       <w:r>
-        <w:t>统一测试流程由数据审计、学生轨迹采集、教师反馈、目标计算、训练更新和工具调用评测组成。各阶段通过样本标识和轨迹标识连接，固定模型版本、tokenizer、消息模板、工具 schema、解码设置及评价规则；散度和反馈方案作为可替换模块接入。一次实验输出配置、随机种子、代码版本、环境、原始预测、训练曲线及资源记录，使表 4-2 中的阶段性实验可以共享输入和判定标准。</w:t>
+        <w:t>统一测试流程由数据审计、学生轨迹采集、教师反馈、目标计算、训练更新和工具调用评测组成。三项方法分别接入位置选择、散度目标和反馈表示接口，共享样本与轨迹标识。每次实验固定模型版本、tokenizer、消息模板、工具 schema、解码设置及评价规则，并保存配置、随机种子、代码版本、环境、原始预测、训练曲线和资源记录。</w:t>
       </w:r>
     </w:p>
     <w:p>
@@ -16826,7 +16826,7 @@
                 <w:b w:val="0"/>
                 <w:sz w:val="17"/>
               </w:rPr>
-              <w:t>实现 LoRA 训练、学生 rollout、教师评分、完整词表散度和 Top-K／K1 反馈接口；建立统一的样本—轨迹记录、同前缀回放、数值与梯度测试、调用解析及分层评测，用小规模试运行核定精度与资源配置。</w:t>
+              <w:t>实现统一轨迹、教师反馈、位置选择、双向散度、稀疏支持集和分层评测接口；完成数值与梯度测试、同前缀回放及小规模试运行。</w:t>
             </w:r>
           </w:p>
         </w:tc>
@@ -16847,7 +16847,7 @@
                 <w:b w:val="0"/>
                 <w:sz w:val="17"/>
               </w:rPr>
-              <w:t>可运行代码、接口与数值测试、轨迹回放记录、固定配置</w:t>
+              <w:t>可运行代码、三项方法原型、接口测试与固定配置</w:t>
             </w:r>
           </w:p>
         </w:tc>
@@ -16894,7 +16894,7 @@
                 <w:b w:val="0"/>
                 <w:sz w:val="17"/>
               </w:rPr>
-              <w:t>按统一流程与相同数据和训练预算，先分析学生到访状态，再比较完整词表散度，随后诊断 Top-K 尾部质量与决策 token 漏选；保存原始预测、梯度与资源记录，2027 年 3 月提交中期申请。</w:t>
+              <w:t>在统一数据与预算下依次验证状态选择方法、位置条件化散度目标和 Top-K 尾部及决策漏选现象；保存原始预测、梯度和资源记录，2027 年 3 月提交中期申请。</w:t>
             </w:r>
           </w:p>
         </w:tc>
@@ -16962,7 +16962,7 @@
                 <w:b w:val="0"/>
                 <w:sz w:val="17"/>
               </w:rPr>
-              <w:t>完成候选方法与固定 K、质量阈值 K、尾部类别基线的同预算比较及组件消融；开展多种子重复、同轨迹回放、部署评测、成本统计与失败案例分析。</w:t>
+              <w:t>完成决策感知稀疏反馈方法的同预算比较，补充三项方法的组合、消融、多种子重复、部署评测与失败案例分析。</w:t>
             </w:r>
           </w:p>
         </w:tc>
@@ -17193,7 +17193,7 @@
         <w:jc w:val="both"/>
       </w:pPr>
       <w:r>
-        <w:t>1. 建立以 Qwen3-0.6B 为学生、冻结的 Qwen3-4B 为教师的单轮 Function Calling 在线策略蒸馏流程，形成可复现的学生轨迹、位置标注与分层错误记录。</w:t>
+        <w:t>1. 提出并实现决策状态感知的监督选择方法，在相同有效训练 token 预算下比较位置覆盖、函数选择、参数与格式错误。</w:t>
       </w:r>
     </w:p>
     <w:p>
@@ -17203,7 +17203,7 @@
         <w:jc w:val="both"/>
       </w:pPr>
       <w:r>
-        <w:t>2. 在统一学生轨迹与完整词表反馈下，分析代表性散度目标的梯度、熵和工具调用行为；随后量化 Top-K 的尾部总量损失、关键决策 token 漏选与梯度误差。</w:t>
+        <w:t>2. 提出并实现位置条件化的双向散度目标，在相同学生轨迹和完整词表反馈下比较单一散度、全局混合与按位置调节的目标，分析梯度、熵及调用行为。</w:t>
       </w:r>
     </w:p>
     <w:p>
@@ -17213,7 +17213,7 @@
         <w:jc w:val="both"/>
       </w:pPr>
       <w:r>
-        <w:t>3. 实现并验证决策感知的尾部保真蒸馏候选方案，在相同反馈预算下比较固定 K、质量阈值 K 和组件消融，报告函数调用结果、训练稳定性、教师查询与资源成本。</w:t>
+        <w:t>3. 提出并实现决策感知的稀疏教师反馈方法，在固定位置与目标下比较 Top-K、尾部类别和同预算支持集选择，报告任务效果、目标偏差与教师评分成本。</w:t>
       </w:r>
     </w:p>
     <w:p>
@@ -17252,7 +17252,7 @@
         <w:jc w:val="both"/>
       </w:pPr>
       <w:r>
-        <w:t>预期成果包括可复现的单轮工具调用 OPD 统一测试流程、完整词表散度的行为分析，以及决策感知稀疏反馈方案的受控评价。系统实现将支持轨迹回放、目标切换、资源计量和结构化调用评测；论文同时呈现基线、消融、资源开销和失败案例，并依据实际结果界定方法的价值与适用条件。</w:t>
+        <w:t>预期成果为三项各有明确规则、实现和验证结果的方法研究，以及支撑同轨迹回放、目标切换、资源计量和结构化调用评测的统一测试流程。论文分别呈现状态选择、位置条件化目标和稀疏反馈方法的基线、消融、成本与失败案例；各项方法的价值以实际运行结果为依据。</w:t>
       </w:r>
     </w:p>
     <w:p>
@@ -17777,7 +17777,7 @@
         <w:jc w:val="both"/>
       </w:pPr>
       <w:r>
-        <w:t>主要风险涉及学生状态的可靠标注、散度差异的解释和稀疏反馈方法的收益；教师评分、训练资源与执行评测条件也会限制实验规模。表 7-1 对应列出检查方式及处理措施。</w:t>
+        <w:t>主要风险涉及决策位置的可靠标注与选择、位置条件化散度权重的稳定性、稀疏支持集的收益，以及教师评分和执行评测条件。表 7-1 分别列出检查方式与处理措施。</w:t>
       </w:r>
     </w:p>
     <w:p>
@@ -17955,7 +17955,7 @@
               <w:jc w:val="left"/>
             </w:pPr>
             <w:r>
-              <w:t>学生到访状态和工具调用位置难以可靠标记</w:t>
+              <w:t>决策状态标注或选择规则不稳定</w:t>
             </w:r>
           </w:p>
         </w:tc>
@@ -17969,7 +17969,7 @@
               <w:jc w:val="left"/>
             </w:pPr>
             <w:r>
-              <w:t>以消息边界、schema 和解析规则标记明确位置；无法确认的状态单列，不用推测的首错 token 充当真值。</w:t>
+              <w:t>只用消息边界、schema 和可复查的分歧信号选位置；人工抽查标签，比较均匀与结构优先基线，不以任务真值决定训练位置。</w:t>
             </w:r>
           </w:p>
         </w:tc>
@@ -17988,7 +17988,7 @@
               <w:jc w:val="left"/>
             </w:pPr>
             <w:r>
-              <w:t>散度差异受支持集或数值实现干扰</w:t>
+              <w:t>位置条件化散度权重过拟合或产生异常梯度</w:t>
             </w:r>
           </w:p>
         </w:tc>
@@ -18002,7 +18002,7 @@
               <w:jc w:val="left"/>
             </w:pPr>
             <w:r>
-              <w:t>先在完整词表和同一轨迹上核对目标、梯度及有限值；固定温度、mask 和支持集后再解释行为差异。</w:t>
+              <w:t>先核对完整词表损失与梯度，限制权重范围；仅用训练集诊断和验证集定规则，并与单一散度及全局混合比较。</w:t>
             </w:r>
           </w:p>
         </w:tc>
@@ -18110,7 +18110,7 @@
         <w:jc w:val="both"/>
       </w:pPr>
       <w:r>
-        <w:t>实施顺序与研究问题保持一致。首先审计数据、模型、tokenizer 和消息模板，用少量单轮样本检查状态标注及调用解析；随后固定轨迹，核对完整词表散度的数值、梯度和有限值；最后测量 Top-K 外质量、关键决策 token 漏选与额外教师评分。各阶段保存输入、mask、支持集、损失、梯度和失败调用。正式比较共享学生起点、预算、评价规则与记录格式，训练资源通过短序列试运行、小批量和梯度累积控制。</w:t>
+        <w:t>实施顺序对应三个方法。先用少量单轮样本检查状态类别、调用解析与分歧计算，再在同预算下验证状态选择；随后固定轨迹和完整词表反馈，检查双向散度组合的数值、梯度与权重边界；最后固定位置与目标，测量 Top-K 外质量、关键决策 token 漏选及额外教师评分。各阶段保存输入、掩码、支持集、损失、梯度和失败调用，正式比较共享学生起点、预算、评价规则与记录格式。</w:t>
       </w:r>
     </w:p>
     <w:p>
@@ -18621,6 +18621,20 @@
       </w:pPr>
       <w:r>
         <w:t>Yang P, Xing L, Dai X, et al. ResOPD: Tail Residualization for Sparse On-Policy Distillation[EB/OL]. arXiv:2610.04882, 2026.</w:t>
+      </w:r>
+    </w:p>
+    <w:p>
+      <w:pPr>
+        <w:pStyle w:val="17"/>
+        <w:numPr>
+          <w:ilvl w:val="0"/>
+          <w:numId w:val="1"/>
+        </w:numPr>
+        <w:ind w:firstLine="420"/>
+        <w:jc w:val="both"/>
+      </w:pPr>
+      <w:r>
+        <w:t>Zhu W, Xie R, Wang R, et al. Hybrid Policy Distillation for LLMs[C]//Proceedings of the 43rd International Conference on Machine Learning. PMLR, 2026, 306: 167818-167837.</w:t>
       </w:r>
     </w:p>
     <w:sectPr>

</xml_diff>

<commit_message>
docs: elevate OPD testing system to independent research topic
</commit_message>
<xml_diff>
--- a/Papers/output/开题报告-基于在线策略蒸馏的大语言模型后训练方法研究.docx
+++ b/Papers/output/开题报告-基于在线策略蒸馏的大语言模型后训练方法研究.docx
@@ -833,7 +833,7 @@
         <w:fldChar w:fldCharType="separate"/>
       </w:r>
       <w:r>
-        <w:t>7</w:t>
+        <w:t>8</w:t>
       </w:r>
       <w:r>
         <w:fldChar w:fldCharType="end"/>
@@ -877,7 +877,7 @@
         <w:fldChar w:fldCharType="separate"/>
       </w:r>
       <w:r>
-        <w:t>7</w:t>
+        <w:t>8</w:t>
       </w:r>
       <w:r>
         <w:fldChar w:fldCharType="end"/>
@@ -921,7 +921,7 @@
         <w:fldChar w:fldCharType="separate"/>
       </w:r>
       <w:r>
-        <w:t>10</w:t>
+        <w:t>11</w:t>
       </w:r>
       <w:r>
         <w:fldChar w:fldCharType="end"/>
@@ -1009,7 +1009,7 @@
         <w:fldChar w:fldCharType="separate"/>
       </w:r>
       <w:r>
-        <w:t>15</w:t>
+        <w:t>16</w:t>
       </w:r>
       <w:r>
         <w:fldChar w:fldCharType="end"/>
@@ -1097,7 +1097,7 @@
         <w:fldChar w:fldCharType="separate"/>
       </w:r>
       <w:r>
-        <w:t>19</w:t>
+        <w:t>20</w:t>
       </w:r>
       <w:r>
         <w:fldChar w:fldCharType="end"/>
@@ -1141,7 +1141,7 @@
         <w:fldChar w:fldCharType="separate"/>
       </w:r>
       <w:r>
-        <w:t>20</w:t>
+        <w:t>21</w:t>
       </w:r>
       <w:r>
         <w:fldChar w:fldCharType="end"/>
@@ -1185,7 +1185,7 @@
         <w:fldChar w:fldCharType="separate"/>
       </w:r>
       <w:r>
-        <w:t>20</w:t>
+        <w:t>21</w:t>
       </w:r>
       <w:r>
         <w:fldChar w:fldCharType="end"/>
@@ -1214,7 +1214,7 @@
         <w:rPr>
           <w:rFonts w:ascii="黑体" w:hAnsi="黑体" w:eastAsia="黑体" w:cs="黑体"/>
         </w:rPr>
-        <w:t>3.2 三项方法级研究问题</w:t>
+        <w:t>3.2 三项研究问题</w:t>
       </w:r>
       <w:r>
         <w:tab/>
@@ -1273,7 +1273,7 @@
         <w:fldChar w:fldCharType="separate"/>
       </w:r>
       <w:r>
-        <w:t>22</w:t>
+        <w:t>23</w:t>
       </w:r>
       <w:r>
         <w:fldChar w:fldCharType="end"/>
@@ -1302,7 +1302,7 @@
         <w:rPr>
           <w:rFonts w:ascii="黑体" w:hAnsi="黑体" w:eastAsia="黑体" w:cs="黑体"/>
         </w:rPr>
-        <w:t>3.4 统一测试流程与验证路径</w:t>
+        <w:t>3.4 面向在线策略蒸馏的统一测试系统</w:t>
       </w:r>
       <w:r>
         <w:tab/>
@@ -1317,7 +1317,7 @@
         <w:fldChar w:fldCharType="separate"/>
       </w:r>
       <w:r>
-        <w:t>23</w:t>
+        <w:t>24</w:t>
       </w:r>
       <w:r>
         <w:fldChar w:fldCharType="end"/>
@@ -1346,7 +1346,7 @@
         <w:rPr>
           <w:rFonts w:ascii="黑体" w:hAnsi="黑体" w:eastAsia="黑体" w:cs="黑体"/>
         </w:rPr>
-        <w:t>3.5 本章总结</w:t>
+        <w:t>3.5 四项研究的验证路径</w:t>
       </w:r>
       <w:r>
         <w:tab/>
@@ -1361,7 +1361,51 @@
         <w:fldChar w:fldCharType="separate"/>
       </w:r>
       <w:r>
-        <w:t>25</w:t>
+        <w:t>26</w:t>
+      </w:r>
+      <w:r>
+        <w:fldChar w:fldCharType="end"/>
+      </w:r>
+      <w:r>
+        <w:fldChar w:fldCharType="end"/>
+      </w:r>
+    </w:p>
+    <w:p>
+      <w:pPr>
+        <w:pStyle w:val="8"/>
+        <w:tabs>
+          <w:tab w:val="right" w:leader="dot" w:pos="8306"/>
+        </w:tabs>
+      </w:pPr>
+      <w:r>
+        <w:fldChar w:fldCharType="begin"/>
+      </w:r>
+      <w:r>
+        <w:instrText xml:space="preserve"> HYPERLINK \l _TocOPDSystemSummary </w:instrText>
+      </w:r>
+      <w:r>
+        <w:fldChar w:fldCharType="separate"/>
+      </w:r>
+      <w:r>
+        <w:rPr>
+          <w:rFonts w:ascii="黑体" w:hAnsi="黑体" w:eastAsia="黑体" w:cs="黑体"/>
+        </w:rPr>
+        <w:t>3.6 本章总结</w:t>
+      </w:r>
+      <w:r>
+        <w:tab/>
+      </w:r>
+      <w:r>
+        <w:fldChar w:fldCharType="begin"/>
+      </w:r>
+      <w:r>
+        <w:instrText xml:space="preserve"> PAGEREF _TocOPDSystemSummary \h </w:instrText>
+      </w:r>
+      <w:r>
+        <w:fldChar w:fldCharType="separate"/>
+      </w:r>
+      <w:r>
+        <w:t>27</w:t>
       </w:r>
       <w:r>
         <w:fldChar w:fldCharType="end"/>
@@ -1405,7 +1449,7 @@
         <w:fldChar w:fldCharType="separate"/>
       </w:r>
       <w:r>
-        <w:t>26</w:t>
+        <w:t>28</w:t>
       </w:r>
       <w:r>
         <w:fldChar w:fldCharType="end"/>
@@ -1449,7 +1493,7 @@
         <w:fldChar w:fldCharType="separate"/>
       </w:r>
       <w:r>
-        <w:t>26</w:t>
+        <w:t>28</w:t>
       </w:r>
       <w:r>
         <w:fldChar w:fldCharType="end"/>
@@ -1493,7 +1537,7 @@
         <w:fldChar w:fldCharType="separate"/>
       </w:r>
       <w:r>
-        <w:t>28</w:t>
+        <w:t>30</w:t>
       </w:r>
       <w:r>
         <w:fldChar w:fldCharType="end"/>
@@ -1537,7 +1581,7 @@
         <w:fldChar w:fldCharType="separate"/>
       </w:r>
       <w:r>
-        <w:t>30</w:t>
+        <w:t>32</w:t>
       </w:r>
       <w:r>
         <w:fldChar w:fldCharType="end"/>
@@ -1581,7 +1625,7 @@
         <w:fldChar w:fldCharType="separate"/>
       </w:r>
       <w:r>
-        <w:t>33</w:t>
+        <w:t>35</w:t>
       </w:r>
       <w:r>
         <w:fldChar w:fldCharType="end"/>
@@ -1610,7 +1654,7 @@
         <w:rPr>
           <w:rFonts w:ascii="黑体" w:hAnsi="黑体" w:eastAsia="黑体" w:cs="黑体"/>
         </w:rPr>
-        <w:t>4.5 统一测试流程与评价指标</w:t>
+        <w:t>4.5 统一测试系统的实现与评价指标</w:t>
       </w:r>
       <w:r>
         <w:tab/>
@@ -1625,7 +1669,7 @@
         <w:fldChar w:fldCharType="separate"/>
       </w:r>
       <w:r>
-        <w:t>38</w:t>
+        <w:t>40</w:t>
       </w:r>
       <w:r>
         <w:fldChar w:fldCharType="end"/>
@@ -1669,7 +1713,7 @@
         <w:fldChar w:fldCharType="separate"/>
       </w:r>
       <w:r>
-        <w:t>42</w:t>
+        <w:t>45</w:t>
       </w:r>
       <w:r>
         <w:fldChar w:fldCharType="end"/>
@@ -1713,7 +1757,7 @@
         <w:fldChar w:fldCharType="separate"/>
       </w:r>
       <w:r>
-        <w:t>43</w:t>
+        <w:t>46</w:t>
       </w:r>
       <w:r>
         <w:fldChar w:fldCharType="end"/>
@@ -1757,7 +1801,7 @@
         <w:fldChar w:fldCharType="separate"/>
       </w:r>
       <w:r>
-        <w:t>43</w:t>
+        <w:t>46</w:t>
       </w:r>
       <w:r>
         <w:fldChar w:fldCharType="end"/>
@@ -1801,7 +1845,7 @@
         <w:fldChar w:fldCharType="separate"/>
       </w:r>
       <w:r>
-        <w:t>45</w:t>
+        <w:t>48</w:t>
       </w:r>
       <w:r>
         <w:fldChar w:fldCharType="end"/>
@@ -1845,7 +1889,7 @@
         <w:fldChar w:fldCharType="separate"/>
       </w:r>
       <w:r>
-        <w:t>46</w:t>
+        <w:t>50</w:t>
       </w:r>
       <w:r>
         <w:fldChar w:fldCharType="end"/>
@@ -1889,7 +1933,7 @@
         <w:fldChar w:fldCharType="separate"/>
       </w:r>
       <w:r>
-        <w:t>46</w:t>
+        <w:t>50</w:t>
       </w:r>
       <w:r>
         <w:fldChar w:fldCharType="end"/>
@@ -1933,7 +1977,7 @@
         <w:fldChar w:fldCharType="separate"/>
       </w:r>
       <w:r>
-        <w:t>47</w:t>
+        <w:t>50</w:t>
       </w:r>
       <w:r>
         <w:fldChar w:fldCharType="end"/>
@@ -1977,7 +2021,7 @@
         <w:fldChar w:fldCharType="separate"/>
       </w:r>
       <w:r>
-        <w:t>47</w:t>
+        <w:t>51</w:t>
       </w:r>
       <w:r>
         <w:fldChar w:fldCharType="end"/>
@@ -2021,7 +2065,7 @@
         <w:fldChar w:fldCharType="separate"/>
       </w:r>
       <w:r>
-        <w:t>49</w:t>
+        <w:t>52</w:t>
       </w:r>
       <w:r>
         <w:fldChar w:fldCharType="end"/>
@@ -2065,7 +2109,7 @@
         <w:fldChar w:fldCharType="separate"/>
       </w:r>
       <w:r>
-        <w:t>52</w:t>
+        <w:t>55</w:t>
       </w:r>
       <w:r>
         <w:fldChar w:fldCharType="end"/>
@@ -2254,7 +2298,15 @@
         <w:jc w:val="both"/>
       </w:pPr>
       <w:r>
-        <w:t>3. 设计决策感知的稀疏教师反馈方法，在有限候选预算下补入被教师 Top-K 漏掉的关键决策 token，并保留剩余概率总量；建立统一测试流程，验证三项方法的任务效果与成本。</w:t>
+        <w:t>3. 设计决策感知的稀疏教师反馈方法，在有限候选预算下补入被教师 Top-K 漏掉的关键决策 token，并保留剩余概率总量。</w:t>
+      </w:r>
+    </w:p>
+    <w:p>
+      <w:pPr>
+        <w:pStyle w:val="17"/>
+      </w:pPr>
+      <w:r>
+        <w:t>4. 设计面向在线策略蒸馏的统一测试系统，以可追溯轨迹为核心连接同前缀配对回放与独立闭环训练；在统一任务判定和资源口径下，区分目标计算差异、学生访问状态变化及工具调用错误。</w:t>
       </w:r>
     </w:p>
     <w:p>
@@ -2263,7 +2315,7 @@
         <w:jc w:val="both"/>
       </w:pPr>
       <w:r>
-        <w:t>上述目标形成由分析到改进的研究链条。学生状态实验确定教师监督的落点，散度实验解释概率匹配如何改变更新方向，稀疏反馈实验检验有限预算下保留了多少有效信号。Top-K 候选方案将与完整词表、固定 Top-K 和已有尾部类别方法比较；其价值最终由工具调用表现与成本记录共同判断。</w:t>
+        <w:t>前三项研究依次确定监督位置、更新方向与有限反馈内容。第四项研究建立贯穿三者的测试系统：固定学生前缀时比较目标与梯度，重新训练和生成时考察学生访问状态及任务结果的变化，并记录每一步的资源代价。配对回放的局部差异与闭环实验的总体差异分别解释，不以单项分数代替机制证据。</w:t>
       </w:r>
     </w:p>
     <w:p>
@@ -2278,18 +2330,7 @@
           <w:color w:val="000000"/>
           <w:sz w:val="28"/>
         </w:rPr>
-        <w:t>2．国内外在该方向的研究现</w:t>
-      </w:r>
-      <w:bookmarkStart w:id="78" w:name="_GoBack"/>
-      <w:bookmarkEnd w:id="78"/>
-      <w:r>
-        <w:rPr>
-          <w:rFonts w:ascii="黑体" w:hAnsi="黑体" w:eastAsia="黑体" w:cs="黑体"/>
-          <w:b/>
-          <w:color w:val="000000"/>
-          <w:sz w:val="28"/>
-        </w:rPr>
-        <w:t>状及分析</w:t>
+        <w:t>2．国内外在该方向的研究现状及分析</w:t>
       </w:r>
       <w:bookmarkEnd w:id="4"/>
     </w:p>
@@ -4263,7 +4304,7 @@
         <w:jc w:val="both"/>
       </w:pPr>
       <w:r>
-        <w:t>第三个方法问题来自教师反馈的稀疏化。Top-K 支持集外的总概率可以用尾部类别保存[31]，但学生高估的工具调用决策 token 仍可能被遗漏[33]；采样残差修正提供了另一种估计途径[32][34]。本课题拟把前两项方法确定的训练位置和散度目标作为基础，设计决策感知的支持集与有限预算分配机制。三项工作分别决定“在哪些位置学、用什么目标学、教师给出哪些概率”，由同一测试流程验证。</w:t>
+        <w:t>第三个方法问题来自教师反馈的稀疏化。Top-K 支持集外的总概率可以用尾部类别保存[31]，但学生高估的工具调用决策 token 仍可能被遗漏[33]；采样残差修正提供了另一种估计途径[32][34]。本课题拟把前两项方法确定的训练位置和散度目标作为基础，设计决策感知的支持集与有限预算分配机制。三项方法分别决定“在哪些位置学、用什么目标学、教师给出哪些概率”。BFCL 等任务评测提供结构化调用结果[27]，但最终分数本身不记录蒸馏目标、教师同前缀反馈及学生访问状态的变化。第四个问题在于如何可信地比较它们：不同方法训练后会生成不同轨迹，单一最终准确率难以区分局部目标变化与访问状态变化。本文拟建立统一测试系统，将同前缀配对回放、独立闭环训练、结构化错误追踪和成本核算纳入一套可复查的实验协议。</w:t>
       </w:r>
     </w:p>
     <w:p>
@@ -4304,7 +4345,7 @@
         <w:jc w:val="both"/>
       </w:pPr>
       <w:r>
-        <w:t>本文围绕单轮 Function Calling 提出三个相互衔接的方法问题。首先，学生自生成轨迹中哪些位置值得优先接受教师监督，需要形成可执行的状态选择规则。其次，同一散度目标在函数选择、参数生成和结构位置上的作用可能不同，需要形成按位置调节的优化目标。最后，教师只能返回有限候选概率时，需要设计兼顾关键决策 token 与尾部总质量的反馈表示。三个方法依次确定监督位置、更新方向和反馈内容，统一测试流程提供共同的实现与验证条件。</w:t>
+        <w:t>本文围绕单轮 Function Calling 设置四项相互衔接的研究内容。前三项分别解决监督位置选择、位置条件化的优化目标与有限预算下的教师反馈表示。第四项建设统一测试系统，解决不同训练方法改变学生轨迹后难以公平比较和追查差异的问题。该系统一方面在固定学生前缀上回放方法，隔离位置、目标和反馈表示的局部作用；另一方面通过独立训练与重新生成轨迹评价完整策略效果。毕业论文拟将系统设计与验证独立成章，形成可运行的研究成果。</w:t>
       </w:r>
     </w:p>
     <w:p>
@@ -4319,42 +4360,10 @@
           <w:color w:val="000000"/>
           <w:sz w:val="24"/>
         </w:rPr>
-        <w:t>3.2 三项方法级研究问题</w:t>
-      </w:r>
-      <w:bookmarkEnd w:id="18"/>
-    </w:p>
-    <w:p>
-      <w:pPr>
-        <w:ind w:firstLine="420"/>
-        <w:jc w:val="both"/>
-      </w:pPr>
-      <w:r>
-        <w:t>第一项研究设计决策状态感知的监督选择方法。常规 OPD 在学生轨迹的有效位置取得教师反馈[7]，却未直接规定有限更新预算优先投向哪些工具调用决策。本文先用消息边界、工具 schema 和解析规则标出函数入口、函数名、参数键、参数值与结构位置，再用该位置上的师生分歧与类型信息形成优先级，在固定有效训练 token 数下选择监督位置。优先级仅使用训练时可获得的信息；目标函数和反馈粒度暂时固定，以检验位置选择本身对函数、参数和格式错误的影响。</w:t>
-      </w:r>
-    </w:p>
-    <w:p>
-      <w:pPr>
-        <w:ind w:firstLine="420"/>
-        <w:jc w:val="both"/>
-      </w:pPr>
-      <w:r>
-        <w:t>第二项研究设计位置条件化的双向散度目标。Forward KL 强调教师认可候选的覆盖，Reverse KL 更重视学生当前高概率区域[7][8]；混合两者已有研究基础[35]。本文在完整词表上分别测量教师偏好候选的学生欠覆盖量，以及学生高概率候选相对教师的过估量，据两类信号调节双向散度的权重，并允许函数选择、参数生成和结构位置采用不同的规则阈值。权重规则由训练集诊断并用验证集选择，测试集不参与确定；固定第一项方法的监督位置，与单一散度、全局固定混合及代表性广义散度比较。</w:t>
-      </w:r>
-    </w:p>
-    <w:p>
-      <w:pPr>
-        <w:ind w:firstLine="420"/>
-        <w:jc w:val="both"/>
-      </w:pPr>
-      <w:r>
-        <w:t>第三项研究设计有限反馈下的决策感知支持集。教师 Top-K 可能遗漏尾部总质量，也可能漏掉学生高估的函数入口或参数候选[31][33]。本文在教师 Top-K 中补入合法的学生高概率决策 token，对其单独评分，并把其余概率并为尾部类别；不同位置的显式候选名额由前两项研究确定的决策类别和诊断风险分配。该方法改变教师反馈的表示与预算配置，固定监督位置和主要散度目标后，与常规 Top-K、已有尾部类别及同预算选择方法比较。</w:t>
-      </w:r>
-    </w:p>
-    <w:p>
-      <w:pPr>
-        <w:pStyle w:val="3"/>
-      </w:pPr>
-      <w:bookmarkStart w:id="19" w:name="_Toc712366958"/>
+        <w:t>3.2 三项研究问题</w:t>
+      </w:r>
+      <w:bookmarkStart w:id="78" w:name="_GoBack"/>
+      <w:bookmarkEnd w:id="78"/>
       <w:r>
         <w:rPr>
           <w:rFonts w:ascii="黑体" w:hAnsi="黑体" w:eastAsia="黑体" w:cs="黑体"/>
@@ -4362,9 +4371,8 @@
           <w:color w:val="000000"/>
           <w:sz w:val="24"/>
         </w:rPr>
-        <w:t>3.3 Top-K 稀疏反馈的缺陷与拟改进方法</w:t>
-      </w:r>
-      <w:bookmarkEnd w:id="19"/>
+      </w:r>
+      <w:bookmarkEnd w:id="18"/>
     </w:p>
     <w:p>
       <w:pPr>
@@ -4372,7 +4380,7 @@
         <w:jc w:val="both"/>
       </w:pPr>
       <w:r>
-        <w:t>已有尾部类别方法保留支持集外的概率总量，却难以指出尾部中哪一个 token 影响工具调用；增大教师 Top-K 会提高反馈量，学生高估的关键候选仍可能遗漏[31][33]。本文拟在单轮调用中建立决策感知支持集：先依据 schema 与消息边界识别函数入口、函数名、参数键和结构位置，再从学生高概率的合法决策候选中找出教师 Top-K 漏掉的 token，补入支持集并取得相应教师概率。</w:t>
+        <w:t>第一项研究设计决策状态感知的监督选择方法。常规 OPD 在学生轨迹的有效位置取得教师反馈[7]，却未直接规定有限更新预算优先投向哪些工具调用决策。本文先用消息边界、工具 schema 和解析规则标出函数入口、函数名、参数键、参数值与结构位置，再用该位置上的师生分歧与类型信息形成优先级，在固定有效训练 token 数下选择监督位置。优先级仅使用训练时可获得的信息；目标函数和反馈粒度暂时固定，以检验位置选择本身对函数、参数和格式错误的影响。</w:t>
       </w:r>
     </w:p>
     <w:p>
@@ -4381,7 +4389,7 @@
         <w:jc w:val="both"/>
       </w:pPr>
       <w:r>
-        <w:t>显式候选与一个尾部类别共同形成粗粒度目标。尾部类别沿用已有工作，保存支持集外的师生概率总量[31]；补入的决策 token 接受单独约束，使目标能够区分总体质量偏差与具体调用候选的高估。实验分别移除两项处理，并与已有学生感知支持集方法比较[33]。实现前需确认教师能否返回补入 token 的概率，训练记录则分别统计反馈字节数、额外查询量与教师计算时间。</w:t>
+        <w:t>第二项研究设计位置条件化的双向散度目标。Forward KL 强调教师认可候选的覆盖，Reverse KL 更重视学生当前高概率区域[7][8]；混合两者已有研究基础[35]。本文在完整词表上分别测量教师偏好候选的学生欠覆盖量，以及学生高概率候选相对教师的过估量，据两类信号调节双向散度的权重，并允许函数选择、参数生成和结构位置采用不同的规则阈值。权重规则由训练集诊断并用验证集选择，测试集不参与确定；固定第一项方法的监督位置，与单一散度、全局固定混合及代表性广义散度比较。</w:t>
       </w:r>
     </w:p>
     <w:p>
@@ -4390,14 +4398,14 @@
         <w:jc w:val="both"/>
       </w:pPr>
       <w:r>
-        <w:t>固定反馈预算下，还需确定各位置获得多少候选名额。本文利用训练集诊断子集的尾部质量差、关键 token 漏选率及完整词表梯度误差估计位置风险，在函数入口等位置保留更多显式候选，在风险较低的位置缩小支持集。位置权重、K 上限和阈值由训练集及验证集确定。关键候选补入、尾部总量保留与位置预算分配分别设置对照；联合方案的收益和适用范围由实验决定。</w:t>
+        <w:t>第三项研究设计有限反馈下的决策感知支持集。教师 Top-K 可能遗漏尾部总质量，也可能漏掉学生高估的函数入口或参数候选[31][33]。本文在教师 Top-K 中补入合法的学生高概率决策 token，对其单独评分，并把其余概率并为尾部类别；不同位置的显式候选名额由前两项研究确定的决策类别和诊断风险分配。该方法改变教师反馈的表示与预算配置，固定监督位置和主要散度目标后，与常规 Top-K、已有尾部类别及同预算选择方法比较。</w:t>
       </w:r>
     </w:p>
     <w:p>
       <w:pPr>
         <w:pStyle w:val="3"/>
       </w:pPr>
-      <w:bookmarkStart w:id="20" w:name="_Toc530131081"/>
+      <w:bookmarkStart w:id="19" w:name="_Toc712366958"/>
       <w:r>
         <w:rPr>
           <w:rFonts w:ascii="黑体" w:hAnsi="黑体" w:eastAsia="黑体" w:cs="黑体"/>
@@ -4405,9 +4413,9 @@
           <w:color w:val="000000"/>
           <w:sz w:val="24"/>
         </w:rPr>
-        <w:t>3.4 统一测试流程与验证路径</w:t>
-      </w:r>
-      <w:bookmarkEnd w:id="20"/>
+        <w:t>3.3 Top-K 稀疏反馈的缺陷与拟改进方法</w:t>
+      </w:r>
+      <w:bookmarkEnd w:id="19"/>
     </w:p>
     <w:p>
       <w:pPr>
@@ -4415,7 +4423,7 @@
         <w:jc w:val="both"/>
       </w:pPr>
       <w:r>
-        <w:t>三个方法分别进行数值检查、受控训练和任务验证。状态方法比较相同更新预算下的均匀位置选择、仅按结构类型选择和决策状态优先选择；散度方法在相同轨迹与完整词表反馈下比较单一目标、全局混合和位置条件化混合；反馈方法固定前两项的设置，测量不同支持集的尾部质量、决策候选覆盖、梯度误差及教师评分成本。每项方法均以结构化调用结果和多随机种子重复实验检验，组件消融只用于解释机制。</w:t>
+        <w:t>已有尾部类别方法保留支持集外的概率总量，却难以指出尾部中哪一个 token 影响工具调用；增大教师 Top-K 会提高反馈量，学生高估的关键候选仍可能遗漏[31][33]。本文拟在单轮调用中建立决策感知支持集：先依据 schema 与消息边界识别函数入口、函数名、参数键和结构位置，再从学生高概率的合法决策候选中找出教师 Top-K 漏掉的 token，补入支持集并取得相应教师概率。</w:t>
       </w:r>
     </w:p>
     <w:p>
@@ -4424,7 +4432,7 @@
         <w:jc w:val="both"/>
       </w:pPr>
       <w:r>
-        <w:t>为使三项研究能够共用证据，本文拟实现统一测试流程。数据接入层保存样本、工具 schema、划分版本和状态标签；轨迹层保存学生前缀、位置掩码及教师在同一前缀上的概率反馈；实验层通过可替换接口接入散度目标与全词表、Top-K、K1 及候选支持集；评测层用固定解析规则汇总函数、参数、结构和可执行任务结果。每条记录关联样本标识、配置、随机种子、模型版本和代码版本，支持相同轨迹上的目标回放与失败追踪。</w:t>
+        <w:t>显式候选与一个尾部类别共同形成粗粒度目标。尾部类别沿用已有工作，保存支持集外的师生概率总量[31]；补入的决策 token 接受单独约束，使目标能够区分总体质量偏差与具体调用候选的高估。实验分别移除两项处理，并与已有学生感知支持集方法比较[33]。实现前需确认教师能否返回补入 token 的概率，训练记录则分别统计反馈字节数、额外查询量与教师计算时间。</w:t>
       </w:r>
     </w:p>
     <w:p>
@@ -4433,27 +4441,14 @@
         <w:jc w:val="both"/>
       </w:pPr>
       <w:r>
-        <w:t>三项方法共享学生起点、冻结教师、数据划分、生成协议和评价规则。状态实验匹配有效训练 token 数与更新步数；散度实验固定状态选择与完整词表反馈；稀疏实验固定状态选择和主要散度，并匹配平均显式候选数。统一流程保存每项方法的输入、规则、参数和原始预测，能够在同一轨迹上回放目标计算，再用独立训练检验端到端效果。若短程实验显示某项机制缺乏信号，将收缩该方法的适用范围。</w:t>
-      </w:r>
-    </w:p>
-    <w:p>
-      <w:pPr>
-        <w:ind w:firstLine="420"/>
-        <w:jc w:val="both"/>
-      </w:pPr>
-      <w:r>
-        <w:t>预期形成三项方法及其证据链：决策状态感知的监督选择、位置条件化的双向散度目标、决策感知的稀疏教师反馈。每项分别提交可执行规则、数值与梯度检查、同预算训练结果及分层工具调用分析。统一测试程序保存轨迹、配置、代码版本、失败样本和资源开销；候选方法的收益与适用边界由实测结果决定。</w:t>
+        <w:t>固定反馈预算下，还需确定各位置获得多少候选名额。本文利用训练集诊断子集的尾部质量差、关键 token 漏选率及完整词表梯度误差估计位置风险，在函数入口等位置保留更多显式候选，在风险较低的位置缩小支持集。位置权重、K 上限和阈值由训练集及验证集确定。关键候选补入、尾部总量保留与位置预算分配分别设置对照；联合方案的收益和适用范围由实验决定。</w:t>
       </w:r>
     </w:p>
     <w:p>
       <w:pPr>
         <w:pStyle w:val="3"/>
-        <w:rPr>
-          <w:rFonts w:hint="eastAsia" w:eastAsia="黑体"/>
-          <w:lang w:val="en-US" w:eastAsia="zh-CN"/>
-        </w:rPr>
-      </w:pPr>
-      <w:bookmarkStart w:id="21" w:name="_Toc3426964"/>
+      </w:pPr>
+      <w:bookmarkStart w:id="20" w:name="_Toc530131081"/>
       <w:r>
         <w:rPr>
           <w:rFonts w:ascii="黑体" w:hAnsi="黑体" w:eastAsia="黑体" w:cs="黑体"/>
@@ -4461,7 +4456,63 @@
           <w:color w:val="000000"/>
           <w:sz w:val="24"/>
         </w:rPr>
-        <w:t xml:space="preserve">3.5 </w:t>
+        <w:t>3.4 面向在线策略蒸馏的统一测试系统</w:t>
+      </w:r>
+      <w:bookmarkEnd w:id="20"/>
+    </w:p>
+    <w:p>
+      <w:pPr>
+        <w:ind w:firstLine="420"/>
+        <w:jc w:val="both"/>
+      </w:pPr>
+      <w:r>
+        <w:t>第四项研究面向在线策略蒸馏中的比较失真问题。不同方法改变学生参数后，学生到访的前缀也随之变化；若只比较最终调用正确率，训练目标的局部作用、轨迹分布变化和评测规则差异会混在一起。本文拟建立以轨迹为基本实验对象的统一测试系统，对学生前缀、教师反馈、更新位置、概率支持集、损失与结构化调用结果作一致记录，并提供固定前缀回放和闭环训练两条验证路径。</w:t>
+      </w:r>
+    </w:p>
+    <w:p>
+      <w:pPr>
+        <w:ind w:firstLine="420"/>
+        <w:jc w:val="both"/>
+      </w:pPr>
+      <w:r>
+        <w:t>系统由数据契约、轨迹记录、配对回放、闭环训练和结构化评测五部分构成。数据契约固定样本、工具 schema、划分版本与合法调用规则；轨迹记录把学生前缀、位置标签、教师概率、显式支持集及尾部质量关联到同一标识；配对回放在相同前缀与教师反馈上切换位置规则、目标和反馈表示，输出逐位置损失与梯度；闭环路径从相同学生起点独立训练，并重新生成调用轨迹；评测模块按固定解析和匹配规则统计函数、参数、结构及可执行任务结果。每次运行还保存配置、随机种子、模型与代码版本、环境和资源计量。</w:t>
+      </w:r>
+    </w:p>
+    <w:p>
+      <w:pPr>
+        <w:ind w:firstLine="420"/>
+        <w:jc w:val="both"/>
+      </w:pPr>
+      <w:r>
+        <w:t>系统的关键设计是双路径对照与可追溯归因。配对回放固定样本、前缀和教师分布，只允许被研究的规则变化，用于定位目标值、梯度方向及候选覆盖差异；闭环训练固定初始模型、数据划分和有效训练预算，允许方法改变后续访问状态，用于评价实际调用表现。两条路径结果不能直接相减来声称因果贡献，而应联合分析具体状态、错误类型和成本，判断局部变化能否在闭环中稳定出现。系统还检查回放的一致性、单变量替换的隔离性、解析器的标准答案以及日志字段的完整性。</w:t>
+      </w:r>
+    </w:p>
+    <w:p>
+      <w:pPr>
+        <w:ind w:firstLine="420"/>
+        <w:jc w:val="both"/>
+      </w:pPr>
+      <w:r>
+        <w:t>本项研究的系统级拟创新点，是针对 OPD 中训练目标与访问状态同时变化的特点，把同前缀局部比较和独立闭环验证组织为可追溯的双路径协议，并把工具调用错误与分项资源开销关联到原始轨迹。统一测试系统拟交付可重放轨迹格式、三类方法的可替换接口、闭环训练与任务评测程序、错误追踪和分项资源报表。与只汇总最终分数的实验脚本相比，它能够在相同前缀上定位损失与梯度差异，再观察这些差异是否在新的学生轨迹和调用结果中保留。系统本身通过重复回放、规则隔离、评价一致性与运行开销检查验证；这一设计及其适用边界将作为独立研究内容写入论文。</w:t>
+      </w:r>
+    </w:p>
+    <w:p>
+      <w:pPr>
+        <w:pStyle w:val="3"/>
+        <w:rPr>
+          <w:rFonts w:hint="eastAsia" w:eastAsia="黑体"/>
+          <w:lang w:val="en-US" w:eastAsia="zh-CN"/>
+        </w:rPr>
+      </w:pPr>
+      <w:bookmarkStart w:id="21" w:name="_Toc3426964"/>
+      <w:r>
+        <w:rPr>
+          <w:rFonts w:ascii="黑体" w:hAnsi="黑体" w:eastAsia="黑体" w:cs="黑体"/>
+          <w:b/>
+          <w:color w:val="000000"/>
+          <w:sz w:val="24"/>
+        </w:rPr>
+        <w:t>3.5 四项研究的验证路径</w:t>
       </w:r>
       <w:r>
         <w:rPr>
@@ -4471,9 +4522,42 @@
           <w:sz w:val="24"/>
           <w:lang w:val="en-US" w:eastAsia="zh-CN"/>
         </w:rPr>
-        <w:t>本章总结</w:t>
       </w:r>
       <w:bookmarkEnd w:id="21"/>
+    </w:p>
+    <w:p>
+      <w:pPr/>
+      <w:r>
+        <w:t>前三项方法分别接受数值检查、受控训练与任务验证。状态选择比较同等有效训练 token 预算下的均匀位置、结构优先和决策状态优先规则；散度目标在同轨迹完整词表条件下比较单一目标、全局混合与位置条件化混合；稀疏反馈固定已确定的位置和主要目标，比较常规 Top-K、已有尾部类别、学生感知支持集与拟议方法。组件移除实验用于解释各规则的作用，最终指标仍由独立测试集上的结构化调用结果和成本决定。</w:t>
+      </w:r>
+    </w:p>
+    <w:p>
+      <w:pPr/>
+      <w:r>
+        <w:t>统一测试系统另有独立验收标准：相同轨迹与配置重复回放时，损失、梯度和解析结果应在规定数值容差内一致；只替换一个规则时，其余样本、前缀、教师分布及预算字段应保持不变；人工构造的函数误选、参数遗漏、格式错误和无工具调用样本应被正确分类。闭环实验至少采用多个随机种子，分别报告任务效果、访问状态分布及学生生成、教师前向、学生更新的时间和显存。系统无法提供可靠同前缀教师概率或执行环境时，应明确缩小可比较范围。</w:t>
+      </w:r>
+    </w:p>
+    <w:p>
+      <w:pPr/>
+      <w:r>
+        <w:t>四项研究的关系是方法设计与系统验证相互支撑。前三项给系统提供可替换的研究对象，系统则给每项方法提供从局部数值机制到真实学生轨迹的证据链。论文对系统的贡献将落在测试协议、轨迹表示、双路径比较和错误追踪的实现与实测有效性上；其通用程度取决于后续模型、任务和资源条件的验证结果。</w:t>
+      </w:r>
+    </w:p>
+    <w:p>
+      <w:pPr>
+        <w:pStyle w:val="3"/>
+      </w:pPr>
+      <w:bookmarkStart w:id="79" w:name="_TocOPDSystemSummary"/>
+      <w:r>
+        <w:rPr>
+          <w:rFonts w:ascii="黑体" w:hAnsi="黑体" w:eastAsia="黑体" w:cs="黑体"/>
+          <w:b/>
+          <w:color w:val="000000"/>
+          <w:sz w:val="24"/>
+        </w:rPr>
+        <w:t>3.6 本章总结</w:t>
+      </w:r>
+      <w:bookmarkEnd w:id="79"/>
     </w:p>
     <w:p>
       <w:pPr>
@@ -4481,7 +4565,7 @@
         <w:jc w:val="both"/>
       </w:pPr>
       <w:r>
-        <w:t>图 1 展示学生状态、散度目标和反馈粒度的递进关系。本文在三个环节分别提出状态选择、位置条件化目标和决策感知支持集，前一方法为后一方法提供位置或目标约束。已有混合散度、尾部类别、采样修正及学生感知支持集工作[35][31][32][33][34]是重要对照；三项候选方法在单轮工具调用中的效果均待实验验证。</w:t>
+        <w:t>图 1 展示三项蒸馏方法与统一测试系统的关系。状态选择、位置条件化目标和决策感知支持集依次确定训练位置、更新方向与有限反馈内容；系统围绕固定前缀回放和独立闭环实验提供共同证据。已有混合散度、尾部类别、采样修正及学生感知支持集工作[35][31][32][33][34]是方法对照。四项研究均属于拟实施方案，方法效果与系统适用范围待实验验证。</w:t>
       </w:r>
     </w:p>
     <w:p>
@@ -4588,7 +4672,7 @@
           <w:rFonts w:ascii="Times New Roman" w:hAnsi="Times New Roman" w:eastAsia="宋体"/>
           <w:sz w:val="21"/>
         </w:rPr>
-        <w:t xml:space="preserve">  在线策略蒸馏的三项研究方法及其关系</w:t>
+        <w:t xml:space="preserve">  三项蒸馏方法与统一测试系统的关系</w:t>
       </w:r>
     </w:p>
     <w:p>
@@ -4685,7 +4769,7 @@
         <w:jc w:val="both"/>
       </w:pPr>
       <w:r>
-        <w:t>图 2 展示总体技术路线。学生生成单轮工具调用轨迹后，先根据结构位置与师生分歧选择重点监督状态；在选中状态上，按位置类别组合双向散度，确定学生更新方向；最后在有限教师反馈预算下，构造含决策候选和尾部类别的稀疏支持集。统一测试流程记录轨迹、概率、损失、调用结果和成本，使三项方法可以逐项验证并开展组合实验。</w:t>
+        <w:t>图 2 展示总体技术路线。前三项方法分别选择监督位置、确定更新方向并构造有限反馈支持集；第四项研究以统一测试系统承接三种方法，在固定学生前缀上配对回放目标计算，再从相同模型起点独立训练和重新生成。系统用一致的调用解析、错误分类及分项资源记录连接局部机制与闭环结果。</w:t>
       </w:r>
     </w:p>
     <w:p>
@@ -10821,6 +10905,58 @@
         </w:tc>
       </w:tr>
       <w:tr>
+        <w:tc>
+          <w:tcPr>
+            <w:tcW w:type="dxa" w:w="1150"/>
+          </w:tcPr>
+          <w:p>
+            <w:r>
+              <w:t>统一测试系统</w:t>
+            </w:r>
+          </w:p>
+        </w:tc>
+        <w:tc>
+          <w:tcPr>
+            <w:tcW w:type="dxa" w:w="2350"/>
+          </w:tcPr>
+          <w:p>
+            <w:r>
+              <w:t>同轨迹配对、同起点闭环</w:t>
+            </w:r>
+          </w:p>
+        </w:tc>
+        <w:tc>
+          <w:tcPr>
+            <w:tcW w:type="dxa" w:w="1450"/>
+          </w:tcPr>
+          <w:p>
+            <w:r>
+              <w:t>回放、解析、计量协议</w:t>
+            </w:r>
+          </w:p>
+        </w:tc>
+        <w:tc>
+          <w:tcPr>
+            <w:tcW w:type="dxa" w:w="1900"/>
+          </w:tcPr>
+          <w:p>
+            <w:r>
+              <w:t>一致性、错误追踪、系统开销</w:t>
+            </w:r>
+          </w:p>
+        </w:tc>
+        <w:tc>
+          <w:tcPr>
+            <w:tcW w:type="dxa" w:w="1456"/>
+          </w:tcPr>
+          <w:p>
+            <w:r>
+              <w:t>验证系统可信度</w:t>
+            </w:r>
+          </w:p>
+        </w:tc>
+      </w:tr>
+      <w:tr>
         <w:trPr>
           <w:cantSplit/>
           <w:jc w:val="center"/>
@@ -13574,7 +13710,7 @@
           <w:color w:val="000000"/>
           <w:sz w:val="24"/>
         </w:rPr>
-        <w:t>4.5 统一测试流程与评价指标</w:t>
+        <w:t>4.5 统一测试系统的实现与评价指标</w:t>
       </w:r>
       <w:bookmarkEnd w:id="53"/>
     </w:p>
@@ -13584,7 +13720,7 @@
         <w:jc w:val="both"/>
       </w:pPr>
       <w:r>
-        <w:t>统一测试流程由数据审计、学生轨迹采集、教师反馈、目标计算、训练更新和工具调用评测组成。三项方法分别接入位置选择、散度目标和反馈表示接口，共享样本与轨迹标识。每次实验固定模型版本、tokenizer、消息模板、工具 schema、解码设置及评价规则，并保存配置、随机种子、代码版本、环境、原始预测、训练曲线和资源记录。</w:t>
+        <w:t>统一测试系统以事件化轨迹记录连接数据审计、学生生成、同前缀教师反馈、目标计算、训练更新及调用评测。每条记录包含样本与工具 schema 标识、学生前缀和位置类别、教师与学生概率的来源、显式候选及尾部质量、目标配置、损失和梯度摘要、原始调用与解析结果。模型版本、tokenizer、消息模板、解码配置、随机种子、代码版本和环境与轨迹绑定，使任一图表可以追溯到原始记录。位置选择、散度目标、反馈表示与任务判定使用独立接口，接口间通过已验证的数据契约传递，而非在训练脚本中暗含条件分支。</w:t>
       </w:r>
     </w:p>
     <w:p>
@@ -13593,7 +13729,7 @@
         <w:jc w:val="both"/>
       </w:pPr>
       <w:r>
-        <w:t>验证分为三个层次。数值层使用人工可核算的小分布核对归一化、尾部质量、支持集对齐、损失与梯度，并检查 NaN／Inf；流程层以少量单轮样本回放相同学生前缀，核对不同目标仅改变指定变量，复查位置标注与反馈开销；任务层在隔离的测试集上比较函数选择、参数、格式和具备执行条件时的端到端结果。三层输出保留失败样本和原始日志，若观察到收益，可追查它对应的状态、概率变化及额外成本。</w:t>
+        <w:t>系统实施两条相互校验的实验路径。同前缀配对回放冻结轨迹、教师概率和样本顺序，只改变一个方法规则，比较有效位置、目标值、梯度及反馈量；该路径用于分析局部机制，不代表训练后的最终表现。闭环路径从同一学生检查点独立训练，按固定生成协议重新采样轨迹，在隔离测试集上评价工具调用。系统同时报告学生生成、教师前向、学生反向传播、反馈传输或存储的开销；对共享教师缓存与额外候选评分单独记账，防止把反馈稀疏误写成教师计算必然减少。</w:t>
       </w:r>
     </w:p>
     <w:p>
@@ -13602,7 +13738,7 @@
         <w:jc w:val="both"/>
       </w:pPr>
       <w:r>
-        <w:t>评价指标对应三个研究问题：状态覆盖与错误分布、完整词表散度的梯度和调用行为，以及稀疏支持集的尾部质量、决策 token 漏选与反馈成本。方法的实际价值还需由任务正确性、训练稳定性和资源消耗共同判断，指标汇总见表 4-3。</w:t>
+        <w:t>系统本身以回放一致性、单变量替换隔离性、轨迹字段完整率、标准答案解析正确率和额外运行开销作为验收指标。方法评价对应前三项研究问题：状态覆盖与错误分布、完整词表散度的梯度和调用行为、稀疏支持集的尾部质量与决策候选覆盖。任务与训练指标见表 4-3，系统验收指标另行保存；局部回放与闭环任务结果出现分歧时，沿状态、支持集和错误类别追踪原因，不把二者差值直接解释为某方法的因果效应。</w:t>
       </w:r>
     </w:p>
     <w:p>
@@ -13857,6 +13993,28 @@
             </w:pPr>
             <w:r>
               <w:t>吞吐、首 token 延迟、完整响应延迟和端到端任务成功率</w:t>
+            </w:r>
+          </w:p>
+        </w:tc>
+      </w:tr>
+      <w:tr>
+        <w:tc>
+          <w:tcPr>
+            <w:tcW w:type="dxa" w:w="4148"/>
+          </w:tcPr>
+          <w:p>
+            <w:r>
+              <w:t>统一测试系统</w:t>
+            </w:r>
+          </w:p>
+        </w:tc>
+        <w:tc>
+          <w:tcPr>
+            <w:tcW w:type="dxa" w:w="4148"/>
+          </w:tcPr>
+          <w:p>
+            <w:r>
+              <w:t>同前缀回放一致性、单变量隔离性、轨迹字段完整率、调用解析正确率、额外运行开销</w:t>
             </w:r>
           </w:p>
         </w:tc>
@@ -16354,7 +16512,7 @@
         <w:jc w:val="both"/>
       </w:pPr>
       <w:r>
-        <w:t>小规模同家族模型和开源工具链为方案提供了实施基础。冻结教师前向评分，学生通过 LoRA 更新；PyTorch、Transformers、PEFT 和 vLLM[20]分别用于训练、参数适配与部署测量。统一流程先按数据与轨迹、目标与反馈、训练与评测三个接口分阶段实现，各接口使用固定的小样本和期望结果进行检查。正式实验前，核对 tokenizer、模板、状态分类、完整词表散度的数值与梯度，再检查 Top-K 尾部质量、概率归一化和补入候选的教师概率。若接口不能稳定提供所需概率，将使用本地教师前向计算或缩小方法范围，相关成本如实记录。</w:t>
+        <w:t>小规模同家族模型和开源工具链为方案提供了实施基础。冻结教师前向评分，学生通过 LoRA 更新；PyTorch、Transformers、PEFT 和 vLLM[20]分别用于训练、参数适配与部署测量。统一测试系统先完成数据契约、轨迹格式与解析器，再接入回放引擎和闭环训练；每个接口使用固定小样本、人工可核算分布和标准答案检查。只有同前缀评分、日志完整性及位置标注通过后，才开展方法比较。若教师接口不能提供可靠的补入候选概率，则使用本地教师前向或收缩可比较范围，并报告额外成本。</w:t>
       </w:r>
     </w:p>
     <w:p>
@@ -16815,18 +16973,8 @@
             <w:vAlign w:val="center"/>
           </w:tcPr>
           <w:p>
-            <w:pPr>
-              <w:spacing w:before="0" w:after="0" w:line="240" w:lineRule="auto"/>
-              <w:ind w:firstLine="0"/>
-              <w:jc w:val="center"/>
-            </w:pPr>
-            <w:r>
-              <w:rPr>
-                <w:rFonts w:ascii="Times New Roman" w:hAnsi="Times New Roman" w:eastAsia="宋体"/>
-                <w:b w:val="0"/>
-                <w:sz w:val="17"/>
-              </w:rPr>
-              <w:t>实现统一轨迹、教师反馈、位置选择、双向散度、稀疏支持集和分层评测接口；完成数值与梯度测试、同前缀回放及小规模试运行。</w:t>
+            <w:r>
+              <w:t>先实现轨迹数据契约、同前缀回放、结构化解析和分项资源记录，再接入状态选择、双向散度、稀疏支持集与闭环训练；完成数值、梯度和回放一致性测试。</w:t>
             </w:r>
           </w:p>
         </w:tc>
@@ -16836,18 +16984,8 @@
             <w:vAlign w:val="center"/>
           </w:tcPr>
           <w:p>
-            <w:pPr>
-              <w:spacing w:before="0" w:after="0" w:line="240" w:lineRule="auto"/>
-              <w:ind w:firstLine="0"/>
-              <w:jc w:val="center"/>
-            </w:pPr>
-            <w:r>
-              <w:rPr>
-                <w:rFonts w:ascii="Times New Roman" w:hAnsi="Times New Roman" w:eastAsia="宋体"/>
-                <w:b w:val="0"/>
-                <w:sz w:val="17"/>
-              </w:rPr>
-              <w:t>可运行代码、三项方法原型、接口测试与固定配置</w:t>
+            <w:r>
+              <w:t>统一测试系统原型、三项方法原型、接口与回放测试</w:t>
             </w:r>
           </w:p>
         </w:tc>
@@ -16951,18 +17089,8 @@
             <w:vAlign w:val="center"/>
           </w:tcPr>
           <w:p>
-            <w:pPr>
-              <w:spacing w:before="0" w:after="0" w:line="240" w:lineRule="auto"/>
-              <w:ind w:firstLine="0"/>
-              <w:jc w:val="center"/>
-            </w:pPr>
-            <w:r>
-              <w:rPr>
-                <w:rFonts w:ascii="Times New Roman" w:hAnsi="Times New Roman" w:eastAsia="宋体"/>
-                <w:b w:val="0"/>
-                <w:sz w:val="17"/>
-              </w:rPr>
-              <w:t>完成决策感知稀疏反馈方法的同预算比较，补充三项方法的组合、消融、多种子重复、部署评测与失败案例分析。</w:t>
+            <w:r>
+              <w:t>完成系统双路径验证、决策感知稀疏反馈的同预算比较，以及三项方法的组合、消融、多种子重复、部署评测与失败追踪。</w:t>
             </w:r>
           </w:p>
         </w:tc>
@@ -16972,18 +17100,8 @@
             <w:vAlign w:val="center"/>
           </w:tcPr>
           <w:p>
-            <w:pPr>
-              <w:spacing w:before="0" w:after="0" w:line="240" w:lineRule="auto"/>
-              <w:ind w:firstLine="0"/>
-              <w:jc w:val="center"/>
-            </w:pPr>
-            <w:r>
-              <w:rPr>
-                <w:rFonts w:ascii="Times New Roman" w:hAnsi="Times New Roman" w:eastAsia="宋体"/>
-                <w:b w:val="0"/>
-                <w:sz w:val="17"/>
-              </w:rPr>
-              <w:t>原始结果、统计表、误差分类、对比图与复现记录</w:t>
+            <w:r>
+              <w:t>系统验收记录、原始结果、统计表、错误追踪与复现材料</w:t>
             </w:r>
           </w:p>
         </w:tc>
@@ -17040,18 +17158,8 @@
             <w:vAlign w:val="center"/>
           </w:tcPr>
           <w:p>
-            <w:pPr>
-              <w:spacing w:before="0" w:after="0" w:line="240" w:lineRule="auto"/>
-              <w:ind w:firstLine="0"/>
-              <w:jc w:val="center"/>
-            </w:pPr>
-            <w:r>
-              <w:rPr>
-                <w:rFonts w:ascii="Times New Roman" w:hAnsi="Times New Roman" w:eastAsia="宋体"/>
-                <w:b w:val="0"/>
-                <w:sz w:val="17"/>
-              </w:rPr>
-              <w:t>论文定稿、三项研究的证据链、复现说明、结题材料与答辩材料</w:t>
+            <w:r>
+              <w:t>论文定稿、三项方法证据链、统一测试系统章节、结题与答辩材料</w:t>
             </w:r>
           </w:p>
         </w:tc>
@@ -17167,7 +17275,7 @@
         <w:jc w:val="both"/>
       </w:pPr>
       <w:r>
-        <w:t>研究周期覆盖 2026 年 9 月至 2027 年 5 月。2026 年内完成开题修改、数据与模型兼容性审计及训练管线；2027 年 2 月起依次开展学生状态分层、完整词表散度分析和稀疏反馈诊断，在 3 月中期申请前形成可复查的阶段性记录。之后完成候选方法的同预算比较、消融、部署评测与统计分析，4—5 月集中撰写论文和结题材料。</w:t>
+        <w:t>研究周期覆盖 2026 年 9 月至 2027 年 5 月。2026 年内完成开题修改、数据与模型兼容性审计，建立轨迹格式、同前缀回放和解析器的系统原型。2027 年 2 月起依次开展学生状态、完整词表散度及稀疏反馈诊断，在 3 月中期申请前形成可复查的阶段性记录。3—4 月完成系统双路径一致性测试、三项方法的同预算比较、组合与多种子分析；4—5 月撰写包含统一测试系统独立章节的论文和结题材料。</w:t>
       </w:r>
     </w:p>
     <w:p>
@@ -17223,7 +17331,7 @@
         <w:jc w:val="both"/>
       </w:pPr>
       <w:r>
-        <w:t>4. 同时记录损失、梯度、熵、残余概率质量、反馈字节数、教师前向时间、训练显存和任务表现，分析效果与资源开销之间的关系。</w:t>
+        <w:t>4. 实现并验证统一测试系统，形成可重放轨迹、配对回放引擎、闭环训练与结构化调用评测、错误追踪和分项资源报表；检验回放一致性、规则隔离、评价正确性与系统开销。</w:t>
       </w:r>
     </w:p>
     <w:p>
@@ -17233,7 +17341,7 @@
         <w:jc w:val="both"/>
       </w:pPr>
       <w:r>
-        <w:t>5. 使用 vLLM 或等效的可复现程序评估最终学生模型，说明适用范围并分析失败案例；所有性能结论以实际运行结果为依据。</w:t>
+        <w:t>5. 统一记录损失、梯度、熵、残余概率质量、反馈字节数、教师前向时间、训练显存和任务表现，分析效果与资源开销之间的关系。</w:t>
       </w:r>
     </w:p>
     <w:p>
@@ -17243,7 +17351,7 @@
         <w:jc w:val="both"/>
       </w:pPr>
       <w:r>
-        <w:t>6. 交付统一测试程序、配置与原始结果记录，支持三项研究的同轨迹回放、同预算比较和分层错误追踪；完成项目文档、毕业论文和答辩材料。</w:t>
+        <w:t>6. 使用 vLLM 或等效可复现程序评估最终学生模型，说明适用范围并分析失败案例；完成项目文档、毕业论文和答辩材料，所有性能结论以实际运行结果为依据。</w:t>
       </w:r>
     </w:p>
     <w:p>
@@ -17252,7 +17360,7 @@
         <w:jc w:val="both"/>
       </w:pPr>
       <w:r>
-        <w:t>预期成果为三项各有明确规则、实现和验证结果的方法研究，以及支撑同轨迹回放、目标切换、资源计量和结构化调用评测的统一测试流程。论文分别呈现状态选择、位置条件化目标和稀疏反馈方法的基线、消融、成本与失败案例；各项方法的价值以实际运行结果为依据。</w:t>
+        <w:t>预期成果为三项蒸馏方法和一项系统研究。三项方法各有可执行规则、实现与受控实验；统一测试系统形成轨迹记录、配对回放、闭环评测和错误追踪的完整实现。论文分别呈现方法的机制、结果与适用边界，并独立讨论系统设计、验证结果及额外开销。各项价值以实际运行结果为依据。</w:t>
       </w:r>
     </w:p>
     <w:p>
@@ -17777,7 +17885,7 @@
         <w:jc w:val="both"/>
       </w:pPr>
       <w:r>
-        <w:t>主要风险涉及决策位置的可靠标注与选择、位置条件化散度权重的稳定性、稀疏支持集的收益，以及教师评分和执行评测条件。表 7-1 分别列出检查方式与处理措施。</w:t>
+        <w:t>主要风险涉及决策位置的可靠标注、位置条件化目标的稳定性、稀疏支持集的收益，以及统一测试系统的轨迹对齐和回放可信度。表 7-1 分别列出检查方式与处理措施。</w:t>
       </w:r>
     </w:p>
     <w:p>
@@ -18076,29 +18184,21 @@
       <w:tr>
         <w:tc>
           <w:tcPr>
-            <w:tcW w:type="dxa" w:w="4148"/>
-          </w:tcPr>
-          <w:p>
-            <w:pPr>
-              <w:ind w:firstLine="0"/>
-              <w:jc w:val="left"/>
-            </w:pPr>
-            <w:r>
-              <w:t>不同实验的轨迹、解析规则或结果记录不一致，难以归因和复现</w:t>
-            </w:r>
-          </w:p>
-        </w:tc>
-        <w:tc>
-          <w:tcPr>
-            <w:tcW w:type="dxa" w:w="4148"/>
-          </w:tcPr>
-          <w:p>
-            <w:pPr>
-              <w:ind w:firstLine="0"/>
-              <w:jc w:val="left"/>
-            </w:pPr>
-            <w:r>
-              <w:t>统一样本与轨迹标识、解析器版本和配置；先用固定样本回放核对模块输出，再开展训练比较；保存原始预测、失败样本、环境与代码版本。</w:t>
+            <w:tcW w:w="4148" w:type="dxa"/>
+          </w:tcPr>
+          <w:p>
+            <w:r>
+              <w:t>配对回放与闭环训练的轨迹、解析和成本口径不一致，导致比较失真</w:t>
+            </w:r>
+          </w:p>
+        </w:tc>
+        <w:tc>
+          <w:tcPr>
+            <w:tcW w:w="4148" w:type="dxa"/>
+          </w:tcPr>
+          <w:p>
+            <w:r>
+              <w:t>统一样本与轨迹标识、解析器版本和配置；用固定样本验证回放一致性与单变量隔离，闭环实验固定起点和预算；保存原始预测、失败样本、环境与代码版本，并单独计量系统开销。</w:t>
             </w:r>
           </w:p>
         </w:tc>
@@ -18110,7 +18210,7 @@
         <w:jc w:val="both"/>
       </w:pPr>
       <w:r>
-        <w:t>实施顺序对应三个方法。先用少量单轮样本检查状态类别、调用解析与分歧计算，再在同预算下验证状态选择；随后固定轨迹和完整词表反馈，检查双向散度组合的数值、梯度与权重边界；最后固定位置与目标，测量 Top-K 外质量、关键决策 token 漏选及额外教师评分。各阶段保存输入、掩码、支持集、损失、梯度和失败调用，正式比较共享学生起点、预算、评价规则与记录格式。</w:t>
+        <w:t>实施时先建立统一测试系统的最小闭环：人工小样本、固定学生前缀、教师同前缀评分、调用解析和轨迹记录。通过回放一致性及规则隔离检查后，再依次接入状态选择、双向散度和稀疏反馈方法。各阶段保存输入、位置掩码、支持集、损失、梯度和失败调用；闭环实验共享学生起点、训练预算与评价规则，同时允许各方法产生自身轨迹。</w:t>
       </w:r>
     </w:p>
     <w:p>

</xml_diff>

<commit_message>
docs: consolidate OPD proposal into three research problems
</commit_message>
<xml_diff>
--- a/Papers/output/开题报告-基于在线策略蒸馏的大语言模型后训练方法研究.docx
+++ b/Papers/output/开题报告-基于在线策略蒸馏的大语言模型后训练方法研究.docx
@@ -833,7 +833,7 @@
         <w:fldChar w:fldCharType="separate"/>
       </w:r>
       <w:r>
-        <w:t>8</w:t>
+        <w:t>7</w:t>
       </w:r>
       <w:r>
         <w:fldChar w:fldCharType="end"/>
@@ -877,7 +877,7 @@
         <w:fldChar w:fldCharType="separate"/>
       </w:r>
       <w:r>
-        <w:t>8</w:t>
+        <w:t>7</w:t>
       </w:r>
       <w:r>
         <w:fldChar w:fldCharType="end"/>
@@ -921,7 +921,7 @@
         <w:fldChar w:fldCharType="separate"/>
       </w:r>
       <w:r>
-        <w:t>11</w:t>
+        <w:t>10</w:t>
       </w:r>
       <w:r>
         <w:fldChar w:fldCharType="end"/>
@@ -1009,7 +1009,7 @@
         <w:fldChar w:fldCharType="separate"/>
       </w:r>
       <w:r>
-        <w:t>16</w:t>
+        <w:t>15</w:t>
       </w:r>
       <w:r>
         <w:fldChar w:fldCharType="end"/>
@@ -1097,7 +1097,7 @@
         <w:fldChar w:fldCharType="separate"/>
       </w:r>
       <w:r>
-        <w:t>20</w:t>
+        <w:t>19</w:t>
       </w:r>
       <w:r>
         <w:fldChar w:fldCharType="end"/>
@@ -1141,7 +1141,7 @@
         <w:fldChar w:fldCharType="separate"/>
       </w:r>
       <w:r>
-        <w:t>21</w:t>
+        <w:t>20</w:t>
       </w:r>
       <w:r>
         <w:fldChar w:fldCharType="end"/>
@@ -1185,7 +1185,7 @@
         <w:fldChar w:fldCharType="separate"/>
       </w:r>
       <w:r>
-        <w:t>21</w:t>
+        <w:t>20</w:t>
       </w:r>
       <w:r>
         <w:fldChar w:fldCharType="end"/>
@@ -1346,7 +1346,7 @@
         <w:rPr>
           <w:rFonts w:ascii="黑体" w:hAnsi="黑体" w:eastAsia="黑体" w:cs="黑体"/>
         </w:rPr>
-        <w:t>3.5 四项研究的验证路径</w:t>
+        <w:t>3.5 三项研究的验证路径</w:t>
       </w:r>
       <w:r>
         <w:tab/>
@@ -1889,7 +1889,7 @@
         <w:fldChar w:fldCharType="separate"/>
       </w:r>
       <w:r>
-        <w:t>50</w:t>
+        <w:t>49</w:t>
       </w:r>
       <w:r>
         <w:fldChar w:fldCharType="end"/>
@@ -1933,7 +1933,7 @@
         <w:fldChar w:fldCharType="separate"/>
       </w:r>
       <w:r>
-        <w:t>50</w:t>
+        <w:t>49</w:t>
       </w:r>
       <w:r>
         <w:fldChar w:fldCharType="end"/>
@@ -2021,7 +2021,7 @@
         <w:fldChar w:fldCharType="separate"/>
       </w:r>
       <w:r>
-        <w:t>51</w:t>
+        <w:t>50</w:t>
       </w:r>
       <w:r>
         <w:fldChar w:fldCharType="end"/>
@@ -2278,7 +2278,7 @@
         <w:jc w:val="both"/>
       </w:pPr>
       <w:r>
-        <w:t>1. 设计工具调用决策状态的监督选择方法，在学生自行生成的轨迹中识别函数选择、参数生成和结构约束位置，依据位置类型及师生分歧分配训练位置预算。</w:t>
+        <w:t>1. 研究工具调用决策状态上的联合蒸馏方法：依据位置类型和师生分歧选择重点监督位置，并在这些位置按教师候选欠覆盖与学生错误候选过估程度调节双向散度，使训练预算和更新方向共同服务于关键调用决策。</w:t>
       </w:r>
     </w:p>
     <w:p>
@@ -2288,7 +2288,7 @@
         <w:jc w:val="both"/>
       </w:pPr>
       <w:r>
-        <w:t>2. 设计按工具调用位置调节的双向散度目标，使教师认可候选的覆盖与学生错误高概率候选的抑制分别得到处理；在完整词表条件下检验其梯度和调用行为。</w:t>
+        <w:t>2. 研究有限教师反馈下的决策感知稀疏蒸馏方法，在 Top-K 支持集中补入漏选的关键决策 token，保留其余尾部概率总量，并按位置风险分配显式候选预算。</w:t>
       </w:r>
     </w:p>
     <w:p>
@@ -2298,15 +2298,7 @@
         <w:jc w:val="both"/>
       </w:pPr>
       <w:r>
-        <w:t>3. 设计决策感知的稀疏教师反馈方法，在有限候选预算下补入被教师 Top-K 漏掉的关键决策 token，并保留剩余概率总量。</w:t>
-      </w:r>
-    </w:p>
-    <w:p>
-      <w:pPr>
-        <w:pStyle w:val="17"/>
-      </w:pPr>
-      <w:r>
-        <w:t>4. 设计面向在线策略蒸馏的统一测试系统，以可追溯轨迹为核心连接同前缀配对回放与独立闭环训练；在统一任务判定和资源口径下，区分目标计算差异、学生访问状态变化及工具调用错误。</w:t>
+        <w:t>3. 建设在线策略蒸馏的统一测试系统，以可重放轨迹连接同前缀配对回放与独立闭环训练，形成结构化调用错误追踪、同预算比较及分项资源计量的可复查协议。</w:t>
       </w:r>
     </w:p>
     <w:p>
@@ -2315,7 +2307,7 @@
         <w:jc w:val="both"/>
       </w:pPr>
       <w:r>
-        <w:t>前三项研究依次确定监督位置、更新方向与有限反馈内容。第四项研究建立贯穿三者的测试系统：固定学生前缀时比较目标与梯度，重新训练和生成时考察学生访问状态及任务结果的变化，并记录每一步的资源代价。配对回放的局部差异与闭环实验的总体差异分别解释，不以单项分数代替机制证据。</w:t>
+        <w:t>三项研究沿“决策状态与目标联合设计—有限反馈改进—系统化验证”展开。第一项方法同时决定关键位置及相应更新方向，第二项在有限教师反馈下保留决策信号，第三项分别测量固定前缀上的局部机制和重新训练后的调用表现。三项均须给出可执行规则、受控比较与适用边界。</w:t>
       </w:r>
     </w:p>
     <w:p>
@@ -4295,7 +4287,7 @@
         <w:jc w:val="both"/>
       </w:pPr>
       <w:r>
-        <w:t>现有 OPD 方法在学生自生成前缀上获取教师反馈，缓解训练与推理时的状态分布差异[7]。但对单轮工具调用而言，学生轨迹中函数选择、参数生成和结构位置承担不同决策作用，等量使用所有有效 token 可能稀释关键位置的监督。散度研究表明 Forward KL、Reverse KL 及混合目标具有不同的分布偏好[7][8][9][35]；已有混合方法尚需在工具调用的不同状态上确定目标权重及其训练作用。本文据此分别研究决策状态的监督选择和位置条件化的散度目标。</w:t>
+        <w:t>现有 OPD 方法在学生自生成前缀上获取教师反馈，缓解训练与推理时的状态分布差异[7]。单轮工具调用中的函数选择、参数生成和结构位置承担不同决策作用，等量监督可能稀释关键位置的信号。Forward KL、Reverse KL 与混合目标具有不同的分布偏好[7][8][9][35]；如果监督位置与散度目标分别确定，就难以针对某类调用错误同时决定“在哪里更新”和“沿什么方向更新”。第一项研究因此拟建立决策状态感知的联合规则，在固定有效训练 token 预算下协同选择监督位置与双向散度权重。</w:t>
       </w:r>
     </w:p>
     <w:p>
@@ -4304,7 +4296,7 @@
         <w:jc w:val="both"/>
       </w:pPr>
       <w:r>
-        <w:t>第三个方法问题来自教师反馈的稀疏化。Top-K 支持集外的总概率可以用尾部类别保存[31]，但学生高估的工具调用决策 token 仍可能被遗漏[33]；采样残差修正提供了另一种估计途径[32][34]。本课题拟把前两项方法确定的训练位置和散度目标作为基础，设计决策感知的支持集与有限预算分配机制。三项方法分别决定“在哪些位置学、用什么目标学、教师给出哪些概率”。BFCL 等任务评测提供结构化调用结果[27]，但最终分数本身不记录蒸馏目标、教师同前缀反馈及学生访问状态的变化。第四个问题在于如何可信地比较它们：不同方法训练后会生成不同轨迹，单一最终准确率难以区分局部目标变化与访问状态变化。本文拟建立统一测试系统，将同前缀配对回放、独立闭环训练、结构化错误追踪和成本核算纳入一套可复查的实验协议。</w:t>
+        <w:t>第二项研究面向有限教师反馈。Top-K 支持集外的总概率可用尾部类别保存[31]，但学生高估的工具调用决策 token 仍可能被遗漏[33]；采样残差修正提供另一种估计途径[32][34]。本课题拟在第一项方法确定的决策位置和目标上，设计兼顾关键候选、尾部总质量与反馈预算的稀疏表示。第三项研究面向评价可信度：BFCL 等基准提供结构化调用结果[27]，却不记录蒸馏目标、同前缀教师反馈和学生访问状态的变化。统一测试系统将配对回放、独立闭环训练、错误追踪与成本核算连接为可复查的协议。</w:t>
       </w:r>
     </w:p>
     <w:p>
@@ -4345,7 +4337,7 @@
         <w:jc w:val="both"/>
       </w:pPr>
       <w:r>
-        <w:t>本文围绕单轮 Function Calling 设置四项相互衔接的研究内容。前三项分别解决监督位置选择、位置条件化的优化目标与有限预算下的教师反馈表示。第四项建设统一测试系统，解决不同训练方法改变学生轨迹后难以公平比较和追查差异的问题。该系统一方面在固定学生前缀上回放方法，隔离位置、目标和反馈表示的局部作用；另一方面通过独立训练与重新生成轨迹评价完整策略效果。毕业论文拟将系统设计与验证独立成章，形成可运行的研究成果。</w:t>
+        <w:t>本文围绕单轮 Function Calling 设置三个有独立成果的研究问题。第一项把决策状态选择与位置条件化散度合为一种联合蒸馏方法：在有限更新预算下决定哪些位置接受监督，并按这些位置的分布失配调节更新方向。第二项研究有限教师反馈的决策感知支持集，解决关键 token 漏选与尾部总质量丢失。第三项建设统一测试系统，以同前缀配对回放分析局部机制，以独立闭环训练评价真实学生轨迹，并追查调用错误与资源代价。毕业论文拟分别围绕联合方法、稀疏方法和测试系统组织研究章节。</w:t>
       </w:r>
     </w:p>
     <w:p>
@@ -4380,7 +4372,7 @@
         <w:jc w:val="both"/>
       </w:pPr>
       <w:r>
-        <w:t>第一项研究设计决策状态感知的监督选择方法。常规 OPD 在学生轨迹的有效位置取得教师反馈[7]，却未直接规定有限更新预算优先投向哪些工具调用决策。本文先用消息边界、工具 schema 和解析规则标出函数入口、函数名、参数键、参数值与结构位置，再用该位置上的师生分歧与类型信息形成优先级，在固定有效训练 token 数下选择监督位置。优先级仅使用训练时可获得的信息；目标函数和反馈粒度暂时固定，以检验位置选择本身对函数、参数和格式错误的影响。</w:t>
+        <w:t>第一项研究设计决策状态与散度目标联合调节的方法。常规 OPD 在学生轨迹的有效位置获取教师反馈[7]，但有限更新预算应优先投向何处，以及这些位置采用何种分布匹配目标，需要一起确定。本文依据消息边界、工具 schema 和解析规则标出函数入口、函数名、参数键值与结构位置；再用训练时可获得的位置类别和师生分歧形成监督优先级。在入选位置上，分别测量教师认可候选的学生欠覆盖和学生高概率候选相对教师的过估程度，据此调节 Forward KL 与 Reverse KL 的权重[7][8][35]。监督优先级与散度权重共享同一组位置类别和分布失配信号，使位置预算与目标权重构成一套联合规则。位置阈值和权重边界由训练集诊断及验证集选择，测试集不参与设定。联合规则输出监督掩码和对应散度权重，在固定有效训练 token 数下训练；均匀位置、单独位置选择、单独目标调节及全局固定混合作为对照，用于判断联合设计是否带来稳定收益。</w:t>
       </w:r>
     </w:p>
     <w:p>
@@ -4389,7 +4381,7 @@
         <w:jc w:val="both"/>
       </w:pPr>
       <w:r>
-        <w:t>第二项研究设计位置条件化的双向散度目标。Forward KL 强调教师认可候选的覆盖，Reverse KL 更重视学生当前高概率区域[7][8]；混合两者已有研究基础[35]。本文在完整词表上分别测量教师偏好候选的学生欠覆盖量，以及学生高概率候选相对教师的过估量，据两类信号调节双向散度的权重，并允许函数选择、参数生成和结构位置采用不同的规则阈值。权重规则由训练集诊断并用验证集选择，测试集不参与确定；固定第一项方法的监督位置，与单一散度、全局固定混合及代表性广义散度比较。</w:t>
+        <w:t>第二项研究设计有限反馈下的决策感知稀疏蒸馏方法。教师 Top-K 可能遗漏尾部总质量，也可能漏掉学生高估的函数入口或参数候选[31][33]。本文在教师 Top-K 中补入合法的学生高概率决策 token，对其单独评分，并将其余概率并为尾部类别；显式候选名额按第一项方法识别的决策位置与诊断风险分配。该方法改变教师反馈的表示与预算配置，在固定第一项联合方法的监督掩码及散度规则后，与常规 Top-K、已有尾部类别、学生感知支持集和同预算选择方法比较。</w:t>
       </w:r>
     </w:p>
     <w:p>
@@ -4398,7 +4390,7 @@
         <w:jc w:val="both"/>
       </w:pPr>
       <w:r>
-        <w:t>第三项研究设计有限反馈下的决策感知支持集。教师 Top-K 可能遗漏尾部总质量，也可能漏掉学生高估的函数入口或参数候选[31][33]。本文在教师 Top-K 中补入合法的学生高概率决策 token，对其单独评分，并把其余概率并为尾部类别；不同位置的显式候选名额由前两项研究确定的决策类别和诊断风险分配。该方法改变教师反馈的表示与预算配置，固定监督位置和主要散度目标后，与常规 Top-K、已有尾部类别及同预算选择方法比较。</w:t>
+        <w:t>第三项研究设计面向在线策略蒸馏的统一测试系统。学生参数改变后，生成前缀也会改变，仅凭最终调用准确率难以分清局部目标作用与访问状态变化。本文建立统一轨迹格式、同前缀教师评分、配对回放和独立闭环训练两条路径，以固定解析规则统计函数、参数和结构错误，并分项记录教师评分、学生生成与训练开销。系统自身接受回放一致性、单变量隔离、解析正确性和运行开销检查；方法实验则用同一协议追溯原始轨迹与任务结果。</w:t>
       </w:r>
     </w:p>
     <w:p>
@@ -4423,7 +4415,7 @@
         <w:jc w:val="both"/>
       </w:pPr>
       <w:r>
-        <w:t>已有尾部类别方法保留支持集外的概率总量，却难以指出尾部中哪一个 token 影响工具调用；增大教师 Top-K 会提高反馈量，学生高估的关键候选仍可能遗漏[31][33]。本文拟在单轮调用中建立决策感知支持集：先依据 schema 与消息边界识别函数入口、函数名、参数键和结构位置，再从学生高概率的合法决策候选中找出教师 Top-K 漏掉的 token，补入支持集并取得相应教师概率。</w:t>
+        <w:t>已有尾部类别方法保留支持集外的概率总量，却难以指出尾部中哪一个 token 影响工具调用；增大教师 Top-K 会提高反馈量，学生高估的关键候选仍可能遗漏[31][33]。第二项研究拟在单轮调用中建立决策感知支持集：沿用第一项联合方法确定的决策位置，从学生高概率的合法候选中找出教师 Top-K 漏掉的 token，补入支持集并取得相应教师概率。</w:t>
       </w:r>
     </w:p>
     <w:p>
@@ -4466,7 +4458,7 @@
         <w:jc w:val="both"/>
       </w:pPr>
       <w:r>
-        <w:t>第四项研究面向在线策略蒸馏中的比较失真问题。不同方法改变学生参数后，学生到访的前缀也随之变化；若只比较最终调用正确率，训练目标的局部作用、轨迹分布变化和评测规则差异会混在一起。本文拟建立以轨迹为基本实验对象的统一测试系统，对学生前缀、教师反馈、更新位置、概率支持集、损失与结构化调用结果作一致记录，并提供固定前缀回放和闭环训练两条验证路径。</w:t>
+        <w:t>第三项研究面向在线策略蒸馏中的比较失真问题。不同方法改变学生参数后，学生到访的前缀也随之变化；仅比较最终调用正确率，会把训练目标的局部作用、轨迹分布变化与评测规则差异混在一起。本文拟建立以轨迹为基本实验对象的统一测试系统，对学生前缀、教师反馈、更新位置、概率支持集、损失和结构化调用结果作一致记录，并提供固定前缀回放与闭环训练两条验证路径。</w:t>
       </w:r>
     </w:p>
     <w:p>
@@ -4493,7 +4485,7 @@
         <w:jc w:val="both"/>
       </w:pPr>
       <w:r>
-        <w:t>本项研究的系统级拟创新点，是针对 OPD 中训练目标与访问状态同时变化的特点，把同前缀局部比较和独立闭环验证组织为可追溯的双路径协议，并把工具调用错误与分项资源开销关联到原始轨迹。统一测试系统拟交付可重放轨迹格式、三类方法的可替换接口、闭环训练与任务评测程序、错误追踪和分项资源报表。与只汇总最终分数的实验脚本相比，它能够在相同前缀上定位损失与梯度差异，再观察这些差异是否在新的学生轨迹和调用结果中保留。系统本身通过重复回放、规则隔离、评价一致性与运行开销检查验证；这一设计及其适用边界将作为独立研究内容写入论文。</w:t>
+        <w:t>本项研究的系统级拟创新点，是针对 OPD 中训练目标与访问状态同时变化的特点，把同前缀局部比较和独立闭环验证组织为可追溯的双路径协议，并把工具调用错误与分项资源开销关联到原始轨迹。统一测试系统拟交付可重放轨迹格式、两类蒸馏方法的可替换接口、闭环训练与任务评测程序、错误追踪和分项资源报表。系统通过重复回放、规则隔离、评价一致性与运行开销检查验证；其适用边界将在论文中独立讨论。</w:t>
       </w:r>
     </w:p>
     <w:p>
@@ -4512,7 +4504,7 @@
           <w:color w:val="000000"/>
           <w:sz w:val="24"/>
         </w:rPr>
-        <w:t>3.5 四项研究的验证路径</w:t>
+        <w:t>3.5 三项研究的验证路径</w:t>
       </w:r>
       <w:r>
         <w:rPr>
@@ -4528,7 +4520,7 @@
     <w:p>
       <w:pPr/>
       <w:r>
-        <w:t>前三项方法分别接受数值检查、受控训练与任务验证。状态选择比较同等有效训练 token 预算下的均匀位置、结构优先和决策状态优先规则；散度目标在同轨迹完整词表条件下比较单一目标、全局混合与位置条件化混合；稀疏反馈固定已确定的位置和主要目标，比较常规 Top-K、已有尾部类别、学生感知支持集与拟议方法。组件移除实验用于解释各规则的作用，最终指标仍由独立测试集上的结构化调用结果和成本决定。</w:t>
+        <w:t>第一项联合方法在完整词表反馈下逐步检验监督位置、散度权重及其联合作用：同等有效训练 token 预算下比较均匀位置、结构优先和分歧优先规则；在相同轨迹上比较单一散度、全局混合与位置条件化目标；最后比较单独改动与联合规则。第二项稀疏方法固定第一项的掩码和目标，比较常规 Top-K、尾部类别、学生感知支持集与拟议方法，并分别移除候选补入、尾部类别和位置预算分配。组件消融解释各项规则，最终效果由独立测试集上的结构化调用结果与资源成本判断。</w:t>
       </w:r>
     </w:p>
     <w:p>
@@ -4540,7 +4532,7 @@
     <w:p>
       <w:pPr/>
       <w:r>
-        <w:t>四项研究的关系是方法设计与系统验证相互支撑。前三项给系统提供可替换的研究对象，系统则给每项方法提供从局部数值机制到真实学生轨迹的证据链。论文对系统的贡献将落在测试协议、轨迹表示、双路径比较和错误追踪的实现与实测有效性上；其通用程度取决于后续模型、任务和资源条件的验证结果。</w:t>
+        <w:t>三项研究形成可检验的工作链：联合方法确定关键位置和更新方向，稀疏方法在有限教师反馈下保留所需信号，统一测试系统连接局部数值机制与真实学生轨迹。论文对系统的贡献落在测试协议、轨迹表示、双路径比较及错误追踪的实现和实测有效性上；方法和系统的适用范围均由后续模型、任务及资源条件下的实验决定。</w:t>
       </w:r>
     </w:p>
     <w:p>
@@ -4565,7 +4557,7 @@
         <w:jc w:val="both"/>
       </w:pPr>
       <w:r>
-        <w:t>图 1 展示三项蒸馏方法与统一测试系统的关系。状态选择、位置条件化目标和决策感知支持集依次确定训练位置、更新方向与有限反馈内容；系统围绕固定前缀回放和独立闭环实验提供共同证据。已有混合散度、尾部类别、采样修正及学生感知支持集工作[35][31][32][33][34]是方法对照。四项研究均属于拟实施方案，方法效果与系统适用范围待实验验证。</w:t>
+        <w:t>图 1 展示三项研究问题的递进关系：第一项联合决定监督位置与散度权重，第二项在既定目标下设计有限反馈，第三项以配对回放和闭环训练验证前两项并追查错误与成本。已有混合散度、尾部类别、采样修正和学生感知支持集工作[35][31][32][33][34]构成重要对照；三项方案均待实验验证。</w:t>
       </w:r>
     </w:p>
     <w:p>
@@ -4672,7 +4664,7 @@
           <w:rFonts w:ascii="Times New Roman" w:hAnsi="Times New Roman" w:eastAsia="宋体"/>
           <w:sz w:val="21"/>
         </w:rPr>
-        <w:t xml:space="preserve">  三项蒸馏方法与统一测试系统的关系</w:t>
+        <w:t xml:space="preserve">  三项研究问题及其递进关系</w:t>
       </w:r>
     </w:p>
     <w:p>
@@ -4769,7 +4761,7 @@
         <w:jc w:val="both"/>
       </w:pPr>
       <w:r>
-        <w:t>图 2 展示总体技术路线。前三项方法分别选择监督位置、确定更新方向并构造有限反馈支持集；第四项研究以统一测试系统承接三种方法，在固定学生前缀上配对回放目标计算，再从相同模型起点独立训练和重新生成。系统用一致的调用解析、错误分类及分项资源记录连接局部机制与闭环结果。</w:t>
+        <w:t>图 2 展示总体技术路线。学生生成单轮工具调用轨迹后，第一项方法联合确定重点监督位置与相应散度权重；第二项方法在有限教师反馈预算下构造含关键候选及尾部类别的支持集；第三项研究以统一测试系统承接两类方法，在固定前缀上配对回放，再从相同模型起点独立训练和重新生成。系统用一致的调用解析、错误分类及分项资源记录连接局部机制与闭环结果。</w:t>
       </w:r>
     </w:p>
     <w:p>
@@ -5316,7 +5308,7 @@
         <w:jc w:val="both"/>
       </w:pPr>
       <w:r>
-        <w:t>令上标 g 表示教师反馈方案，包括完整词表、常规 Top-K 及候选支持集。式（4-2）的监督掩码由状态方法给出，单位置散度算子可按位置类别选取双向目标；反馈方案决定算子可见的概率表示。每次更新将离散生成轨迹视为已采样数据，梯度沿学生分布和 LoRA 参数传播。</w:t>
+        <w:t>令上标 g 表示教师反馈方案，包括完整词表、常规 Top-K 及候选支持集。式（4-2）的监督掩码和位置条件化散度权重由第一项联合方法在同一学生状态上确定；第二项方法决定算子可见的概率支持集。每次更新将离散生成轨迹视为已采样数据，梯度沿学生分布和 LoRA 参数传播。</w:t>
       </w:r>
     </w:p>
     <w:tbl>
@@ -5829,7 +5821,7 @@
         <w:jc w:val="both"/>
       </w:pPr>
       <w:r>
-        <w:t>式（4-2）为三项方法提供统一目标。先固定散度与完整词表反馈，研究状态选择；再固定监督位置，在完整词表上研究位置条件化的双向散度；最后固定位置和目标，研究稀疏支持集。单一 Forward KL、Reverse KL、JSD、skew KL、全局固定混合及已有尾部类别方法分别作为对照[7][8][9][12][35][31]。总体优化问题为：</w:t>
+        <w:t>式（4-2）为两项蒸馏方法提供共同目标。第一项联合调节监督掩码与位置条件化散度权重，在完整词表反馈下检验二者的协同作用；第二项固定这一联合规则，改进教师概率的有限支持集表示。单一 Forward KL、Reverse KL、JSD、skew KL、全局固定混合及已有尾部类别方法分别作为对照[7][8][9][12][35][31]。总体优化问题为：</w:t>
       </w:r>
     </w:p>
     <w:tbl>
@@ -6079,7 +6071,7 @@
         <w:jc w:val="both"/>
       </w:pPr>
       <w:r>
-        <w:t>方法研究依次完成状态选择、位置条件化目标和稀疏反馈设计；三项方法分别接受受控训练验证，再测试组合使用的效果。每项均保留规则参数、训练配置和原始指标，避免把方法贡献归于单次消融或总分变化。</w:t>
+        <w:t>方法研究先完成决策状态与散度目标的联合设计，再研究有限反馈表示。两项方法分别接受受控训练验证，并在同一系统中检验组合使用的效果；第三项系统研究独立验证回放、闭环评测、错误追踪和资源计量的可靠性。各项均保留规则参数、训练配置与原始指标。</w:t>
       </w:r>
     </w:p>
     <w:p>
@@ -7542,7 +7534,7 @@
         <w:jc w:val="both"/>
       </w:pPr>
       <w:r>
-        <w:t>教师沿学生已生成的前缀评分，师生 logits 在同一 token 位置对齐，再由各自设定的温度得到条件分布。位置标注依据函数选择、参数键、参数值和结构标记的解析规则完成；无法可靠归类的 token 单列。状态选择方法在有效位置中，依据结构类别及师生分歧设置优先级并选取固定数量的位置；任务真值仅用于训练后分析，不参与优先级计算。</w:t>
+        <w:t>教师沿学生已生成的前缀评分，师生 logits 在同一 token 位置对齐，再由各自设定的温度得到条件分布。位置标注依据函数选择、参数键、参数值和结构标记的解析规则完成；无法可靠归类的 token 单列。联合方法的位置选择环节在有效位置中，依据结构类别及师生分歧设置优先级并选取固定数量的位置；任务真值仅用于训练后分析，不参与优先级计算。</w:t>
       </w:r>
     </w:p>
     <w:tbl>
@@ -7897,7 +7889,7 @@
         <w:jc w:val="both"/>
       </w:pPr>
       <w:r>
-        <w:t>消息边界、工具调用区域和序列截断先定义候选监督位置。状态选择方法在候选集合内保留固定预算的位置，并将其掩码设为 1，其余位置为 0；损失仍按实际选中位置数归一化：</w:t>
+        <w:t>消息边界、工具调用区域和序列截断先定义候选监督位置。联合方法在候选集合内保留固定预算的位置，并将其掩码设为 1，其余位置为 0；损失仍按实际选中位置数归一化：</w:t>
       </w:r>
     </w:p>
     <w:tbl>
@@ -8772,7 +8764,7 @@
         <w:jc w:val="both"/>
       </w:pPr>
       <w:r>
-        <w:t>表 4-1 列出各环节需固定和记录的变量。所有对照组使用相同输入、生成协议、数据划分和候选位置定义。状态方法只改变实际参与更新的位置；散度方法固定位置并提供完整词表反馈；稀疏方法进一步固定目标。教师反馈记录 Top-K 累计概率、尾部质量、决策 token 覆盖情况和实际 K；状态选择记录位置类别、优先级与实际掩码，使每项方法都能追溯到具体变量。图 3 展示训练与评测流程。</w:t>
+        <w:t>表 4-1 列出各环节需固定和记录的变量。所有对照组共享输入、生成协议、数据划分和候选位置定义。第一项联合方法同时输出实际监督掩码及位置条件化散度权重；其消融分别只改变位置或目标。第二项稀疏方法固定这一联合规则并改变教师反馈表示。教师反馈记录 Top-K 累计概率、尾部质量、决策 token 覆盖和实际 K；联合方法记录位置类别、优先级、掩码与散度权重。图 3 展示训练与评测流程。</w:t>
       </w:r>
     </w:p>
     <w:p>
@@ -10362,7 +10354,7 @@
         <w:jc w:val="both"/>
       </w:pPr>
       <w:r>
-        <w:t>表 4-2 按三个方法组织受控比较。状态方法固定完整词表目标，检验监督位置规则；散度方法固定位置，检验位置条件化权重；反馈方法固定位置和目标，检验有限支持集。教师、学生起点、数据划分、生成协议与评价规则保持一致，各组统一有效训练 token 数及更新步数；方法组合另设实验，避免混淆单项贡献。</w:t>
+        <w:t>表 4-2 按三个研究问题组织受控比较。联合方法在完整词表反馈下检验监督位置与位置条件化散度的协同作用；稀疏方法固定联合规则，检验有限支持集；统一测试系统分别验证配对回放与闭环训练的可靠性。教师、学生起点、数据划分、生成协议及评价规则保持一致，训练组统一有效训练 token 数和更新步数。</w:t>
       </w:r>
     </w:p>
     <w:p>
@@ -10583,17 +10575,13 @@
           </w:tcPr>
           <w:p>
             <w:pPr>
-              <w:spacing w:before="0" w:after="0" w:line="240" w:lineRule="auto"/>
-              <w:ind w:firstLine="0"/>
               <w:jc w:val="left"/>
             </w:pPr>
             <w:r>
               <w:rPr>
-                <w:rFonts w:ascii="Times New Roman" w:hAnsi="Times New Roman" w:eastAsia="宋体"/>
-                <w:b w:val="0"/>
                 <w:sz w:val="19"/>
               </w:rPr>
-              <w:t>状态选择方法</w:t>
+              <w:t>联合蒸馏方法</w:t>
             </w:r>
           </w:p>
         </w:tc>
@@ -10604,17 +10592,13 @@
           </w:tcPr>
           <w:p>
             <w:pPr>
-              <w:spacing w:before="0" w:after="0" w:line="240" w:lineRule="auto"/>
-              <w:ind w:firstLine="0"/>
               <w:jc w:val="left"/>
             </w:pPr>
             <w:r>
               <w:rPr>
-                <w:rFonts w:ascii="Times New Roman" w:hAnsi="Times New Roman" w:eastAsia="宋体"/>
-                <w:b w:val="0"/>
                 <w:sz w:val="19"/>
               </w:rPr>
-              <w:t>同模型、同目标、同训练 token 预算</w:t>
+              <w:t>同模型、完整反馈、同预算</w:t>
             </w:r>
           </w:p>
         </w:tc>
@@ -10625,17 +10609,13 @@
           </w:tcPr>
           <w:p>
             <w:pPr>
-              <w:spacing w:before="0" w:after="0" w:line="240" w:lineRule="auto"/>
-              <w:ind w:firstLine="0"/>
               <w:jc w:val="left"/>
             </w:pPr>
             <w:r>
               <w:rPr>
-                <w:rFonts w:ascii="Times New Roman" w:hAnsi="Times New Roman" w:eastAsia="宋体"/>
-                <w:b w:val="0"/>
                 <w:sz w:val="19"/>
               </w:rPr>
-              <w:t>均匀位置、结构优先、状态感知选择</w:t>
+              <w:t>位置规则与散度权重</w:t>
             </w:r>
           </w:p>
         </w:tc>
@@ -10646,17 +10626,13 @@
           </w:tcPr>
           <w:p>
             <w:pPr>
-              <w:spacing w:before="0" w:after="0" w:line="240" w:lineRule="auto"/>
-              <w:ind w:firstLine="0"/>
               <w:jc w:val="left"/>
             </w:pPr>
             <w:r>
               <w:rPr>
-                <w:rFonts w:ascii="Times New Roman" w:hAnsi="Times New Roman" w:eastAsia="宋体"/>
-                <w:b w:val="0"/>
                 <w:sz w:val="19"/>
               </w:rPr>
-              <w:t>位置覆盖、调用错误、成本</w:t>
+              <w:t>梯度、调用结果、成本</w:t>
             </w:r>
           </w:p>
         </w:tc>
@@ -10667,17 +10643,13 @@
           </w:tcPr>
           <w:p>
             <w:pPr>
-              <w:spacing w:before="0" w:after="0" w:line="240" w:lineRule="auto"/>
-              <w:ind w:firstLine="0"/>
               <w:jc w:val="left"/>
             </w:pPr>
             <w:r>
               <w:rPr>
-                <w:rFonts w:ascii="Times New Roman" w:hAnsi="Times New Roman" w:eastAsia="宋体"/>
-                <w:b w:val="0"/>
                 <w:sz w:val="19"/>
               </w:rPr>
-              <w:t>验证监督位置规则</w:t>
+              <w:t>验证协同设计</w:t>
             </w:r>
           </w:p>
         </w:tc>
@@ -10704,7 +10676,7 @@
                 <w:b w:val="0"/>
                 <w:sz w:val="19"/>
               </w:rPr>
-              <w:t>条件化散度方法</w:t>
+              <w:t>稀疏反馈方法</w:t>
             </w:r>
           </w:p>
         </w:tc>
@@ -10725,7 +10697,7 @@
                 <w:b w:val="0"/>
                 <w:sz w:val="19"/>
               </w:rPr>
-              <w:t>同轨迹、完整词表反馈</w:t>
+              <w:t>同位置、同目标、同反馈预算</w:t>
             </w:r>
           </w:p>
         </w:tc>
@@ -10746,7 +10718,7 @@
                 <w:b w:val="0"/>
                 <w:sz w:val="19"/>
               </w:rPr>
-              <w:t>FKL、RKL、全局混合、位置条件化混合</w:t>
+              <w:t>Top-K、尾部类别、决策支持集</w:t>
             </w:r>
           </w:p>
         </w:tc>
@@ -10767,7 +10739,7 @@
                 <w:b w:val="0"/>
                 <w:sz w:val="19"/>
               </w:rPr>
-              <w:t>梯度、熵、调用结果</w:t>
+              <w:t>尾部质量、调用结果、教师成本</w:t>
             </w:r>
           </w:p>
         </w:tc>
@@ -10788,7 +10760,89 @@
                 <w:b w:val="0"/>
                 <w:sz w:val="19"/>
               </w:rPr>
-              <w:t>验证目标设计</w:t>
+              <w:t>验证反馈表示</w:t>
+            </w:r>
+          </w:p>
+        </w:tc>
+      </w:tr>
+      <w:tr>
+        <w:tc>
+          <w:tcPr>
+            <w:tcW w:type="dxa" w:w="1150"/>
+          </w:tcPr>
+          <w:p>
+            <w:pPr>
+              <w:jc w:val="left"/>
+            </w:pPr>
+            <w:r>
+              <w:rPr>
+                <w:sz w:val="19"/>
+              </w:rPr>
+              <w:t>统一测试系统</w:t>
+            </w:r>
+          </w:p>
+        </w:tc>
+        <w:tc>
+          <w:tcPr>
+            <w:tcW w:type="dxa" w:w="2350"/>
+          </w:tcPr>
+          <w:p>
+            <w:pPr>
+              <w:jc w:val="left"/>
+            </w:pPr>
+            <w:r>
+              <w:rPr>
+                <w:sz w:val="19"/>
+              </w:rPr>
+              <w:t>同轨迹配对、同起点闭环</w:t>
+            </w:r>
+          </w:p>
+        </w:tc>
+        <w:tc>
+          <w:tcPr>
+            <w:tcW w:type="dxa" w:w="1450"/>
+          </w:tcPr>
+          <w:p>
+            <w:pPr>
+              <w:jc w:val="left"/>
+            </w:pPr>
+            <w:r>
+              <w:rPr>
+                <w:sz w:val="19"/>
+              </w:rPr>
+              <w:t>回放、解析、计量协议</w:t>
+            </w:r>
+          </w:p>
+        </w:tc>
+        <w:tc>
+          <w:tcPr>
+            <w:tcW w:type="dxa" w:w="1900"/>
+          </w:tcPr>
+          <w:p>
+            <w:pPr>
+              <w:jc w:val="left"/>
+            </w:pPr>
+            <w:r>
+              <w:rPr>
+                <w:sz w:val="19"/>
+              </w:rPr>
+              <w:t>一致性、错误追踪、系统开销</w:t>
+            </w:r>
+          </w:p>
+        </w:tc>
+        <w:tc>
+          <w:tcPr>
+            <w:tcW w:type="dxa" w:w="1456"/>
+          </w:tcPr>
+          <w:p>
+            <w:pPr>
+              <w:jc w:val="left"/>
+            </w:pPr>
+            <w:r>
+              <w:rPr>
+                <w:sz w:val="19"/>
+              </w:rPr>
+              <w:t>验证系统可信度</w:t>
             </w:r>
           </w:p>
         </w:tc>
@@ -10815,169 +10869,6 @@
                 <w:b w:val="0"/>
                 <w:sz w:val="19"/>
               </w:rPr>
-              <w:t>稀疏反馈方法</w:t>
-            </w:r>
-          </w:p>
-        </w:tc>
-        <w:tc>
-          <w:tcPr>
-            <w:tcW w:w="2350" w:type="dxa"/>
-            <w:vAlign w:val="center"/>
-          </w:tcPr>
-          <w:p>
-            <w:pPr>
-              <w:spacing w:before="0" w:after="0" w:line="240" w:lineRule="auto"/>
-              <w:ind w:firstLine="0"/>
-              <w:jc w:val="left"/>
-            </w:pPr>
-            <w:r>
-              <w:rPr>
-                <w:rFonts w:ascii="Times New Roman" w:hAnsi="Times New Roman" w:eastAsia="宋体"/>
-                <w:b w:val="0"/>
-                <w:sz w:val="19"/>
-              </w:rPr>
-              <w:t>同位置、同目标、同反馈预算</w:t>
-            </w:r>
-          </w:p>
-        </w:tc>
-        <w:tc>
-          <w:tcPr>
-            <w:tcW w:w="1450" w:type="dxa"/>
-            <w:vAlign w:val="center"/>
-          </w:tcPr>
-          <w:p>
-            <w:pPr>
-              <w:spacing w:before="0" w:after="0" w:line="240" w:lineRule="auto"/>
-              <w:ind w:firstLine="0"/>
-              <w:jc w:val="left"/>
-            </w:pPr>
-            <w:r>
-              <w:rPr>
-                <w:rFonts w:ascii="Times New Roman" w:hAnsi="Times New Roman" w:eastAsia="宋体"/>
-                <w:b w:val="0"/>
-                <w:sz w:val="19"/>
-              </w:rPr>
-              <w:t>Top-K、尾部类别、决策支持集</w:t>
-            </w:r>
-          </w:p>
-        </w:tc>
-        <w:tc>
-          <w:tcPr>
-            <w:tcW w:w="1900" w:type="dxa"/>
-            <w:vAlign w:val="center"/>
-          </w:tcPr>
-          <w:p>
-            <w:pPr>
-              <w:spacing w:before="0" w:after="0" w:line="240" w:lineRule="auto"/>
-              <w:ind w:firstLine="0"/>
-              <w:jc w:val="left"/>
-            </w:pPr>
-            <w:r>
-              <w:rPr>
-                <w:rFonts w:ascii="Times New Roman" w:hAnsi="Times New Roman" w:eastAsia="宋体"/>
-                <w:b w:val="0"/>
-                <w:sz w:val="19"/>
-              </w:rPr>
-              <w:t>尾部质量、调用结果、教师成本</w:t>
-            </w:r>
-          </w:p>
-        </w:tc>
-        <w:tc>
-          <w:tcPr>
-            <w:tcW w:w="1456" w:type="dxa"/>
-            <w:vAlign w:val="center"/>
-          </w:tcPr>
-          <w:p>
-            <w:pPr>
-              <w:spacing w:before="0" w:after="0" w:line="240" w:lineRule="auto"/>
-              <w:ind w:firstLine="0"/>
-              <w:jc w:val="left"/>
-            </w:pPr>
-            <w:r>
-              <w:rPr>
-                <w:rFonts w:ascii="Times New Roman" w:hAnsi="Times New Roman" w:eastAsia="宋体"/>
-                <w:b w:val="0"/>
-                <w:sz w:val="19"/>
-              </w:rPr>
-              <w:t>验证反馈表示</w:t>
-            </w:r>
-          </w:p>
-        </w:tc>
-      </w:tr>
-      <w:tr>
-        <w:tc>
-          <w:tcPr>
-            <w:tcW w:type="dxa" w:w="1150"/>
-          </w:tcPr>
-          <w:p>
-            <w:r>
-              <w:t>统一测试系统</w:t>
-            </w:r>
-          </w:p>
-        </w:tc>
-        <w:tc>
-          <w:tcPr>
-            <w:tcW w:type="dxa" w:w="2350"/>
-          </w:tcPr>
-          <w:p>
-            <w:r>
-              <w:t>同轨迹配对、同起点闭环</w:t>
-            </w:r>
-          </w:p>
-        </w:tc>
-        <w:tc>
-          <w:tcPr>
-            <w:tcW w:type="dxa" w:w="1450"/>
-          </w:tcPr>
-          <w:p>
-            <w:r>
-              <w:t>回放、解析、计量协议</w:t>
-            </w:r>
-          </w:p>
-        </w:tc>
-        <w:tc>
-          <w:tcPr>
-            <w:tcW w:type="dxa" w:w="1900"/>
-          </w:tcPr>
-          <w:p>
-            <w:r>
-              <w:t>一致性、错误追踪、系统开销</w:t>
-            </w:r>
-          </w:p>
-        </w:tc>
-        <w:tc>
-          <w:tcPr>
-            <w:tcW w:type="dxa" w:w="1456"/>
-          </w:tcPr>
-          <w:p>
-            <w:r>
-              <w:t>验证系统可信度</w:t>
-            </w:r>
-          </w:p>
-        </w:tc>
-      </w:tr>
-      <w:tr>
-        <w:trPr>
-          <w:cantSplit/>
-          <w:jc w:val="center"/>
-        </w:trPr>
-        <w:tc>
-          <w:tcPr>
-            <w:tcW w:w="1150" w:type="dxa"/>
-            <w:vAlign w:val="center"/>
-          </w:tcPr>
-          <w:p>
-            <w:pPr>
-              <w:spacing w:before="0" w:after="0" w:line="240" w:lineRule="auto"/>
-              <w:ind w:firstLine="0"/>
-              <w:jc w:val="left"/>
-            </w:pPr>
-            <w:r>
-              <w:rPr>
-                <w:rFonts w:ascii="Times New Roman" w:hAnsi="Times New Roman" w:eastAsia="宋体"/>
-                <w:b w:val="0"/>
-                <w:sz w:val="19"/>
-              </w:rPr>
               <w:t>方法组合与消融</w:t>
             </w:r>
           </w:p>
@@ -11010,17 +10901,13 @@
           </w:tcPr>
           <w:p>
             <w:pPr>
-              <w:spacing w:before="0" w:after="0" w:line="240" w:lineRule="auto"/>
-              <w:ind w:firstLine="0"/>
               <w:jc w:val="left"/>
             </w:pPr>
             <w:r>
               <w:rPr>
-                <w:rFonts w:ascii="Times New Roman" w:hAnsi="Times New Roman" w:eastAsia="宋体"/>
-                <w:b w:val="0"/>
                 <w:sz w:val="19"/>
               </w:rPr>
-              <w:t>单项方法、组合、移除组件</w:t>
+              <w:t>联合方法、稀疏方法、组合与移除组件</w:t>
             </w:r>
           </w:p>
         </w:tc>
@@ -11074,7 +10961,7 @@
         <w:jc w:val="both"/>
       </w:pPr>
       <w:r>
-        <w:t>状态方法的消融分别移除结构类型和师生分歧信息；散度方法比较单一方向、全局混合和位置条件化权重；反馈方法分别检验决策候选补入、尾部类别与预算分配。完整词表提供反馈上界参照，K1 sampled-token 作为低反馈量边界参照。消融解释方法为何有效，研究主体仍是各方法的规则设计与独立验证。</w:t>
+        <w:t>联合方法的消融分别移除结构类型、师生分歧与位置条件化权重，并比较“只选位置”“只调目标”和二者同时作用；稀疏方法分别检验决策候选补入、尾部类别与预算分配。完整词表提供反馈上界参照，K1 sampled-token 作为低反馈量边界参照。消融用于解释方法机制，研究主体仍是两项方法及测试系统的设计和验证。</w:t>
       </w:r>
     </w:p>
     <w:p>
@@ -13738,7 +13625,7 @@
         <w:jc w:val="both"/>
       </w:pPr>
       <w:r>
-        <w:t>系统本身以回放一致性、单变量替换隔离性、轨迹字段完整率、标准答案解析正确率和额外运行开销作为验收指标。方法评价对应前三项研究问题：状态覆盖与错误分布、完整词表散度的梯度和调用行为、稀疏支持集的尾部质量与决策候选覆盖。任务与训练指标见表 4-3，系统验收指标另行保存；局部回放与闭环任务结果出现分歧时，沿状态、支持集和错误类别追踪原因，不把二者差值直接解释为某方法的因果效应。</w:t>
+        <w:t>系统本身以回放一致性、单变量替换隔离性、轨迹字段完整率、标准答案解析正确率和额外运行开销作为验收指标。方法评价对应前两项研究：联合方法的位置覆盖、散度梯度及工具调用错误，稀疏方法的尾部质量、决策候选覆盖与教师成本。任务和训练指标见表 4-3，系统验收指标另行保存；局部回放与闭环任务结果出现分歧时，沿状态、支持集和错误类别追踪原因，不把二者差值直接解释为某方法的因果效应。</w:t>
       </w:r>
     </w:p>
     <w:p>
@@ -16741,6 +16628,7 @@
         <w:trPr>
           <w:tblHeader/>
           <w:jc w:val="center"/>
+          <w:cantSplit/>
         </w:trPr>
         <w:tc>
           <w:tcPr>
@@ -16809,6 +16697,7 @@
       <w:tr>
         <w:trPr>
           <w:jc w:val="center"/>
+          <w:cantSplit/>
         </w:trPr>
         <w:tc>
           <w:tcPr>
@@ -16877,6 +16766,7 @@
       <w:tr>
         <w:trPr>
           <w:jc w:val="center"/>
+          <w:cantSplit/>
         </w:trPr>
         <w:tc>
           <w:tcPr>
@@ -16945,6 +16835,7 @@
       <w:tr>
         <w:trPr>
           <w:jc w:val="center"/>
+          <w:cantSplit/>
         </w:trPr>
         <w:tc>
           <w:tcPr>
@@ -16973,8 +16864,15 @@
             <w:vAlign w:val="center"/>
           </w:tcPr>
           <w:p>
-            <w:r>
-              <w:t>先实现轨迹数据契约、同前缀回放、结构化解析和分项资源记录，再接入状态选择、双向散度、稀疏支持集与闭环训练；完成数值、梯度和回放一致性测试。</w:t>
+            <w:pPr>
+              <w:spacing w:line="240" w:lineRule="auto"/>
+              <w:jc w:val="center"/>
+            </w:pPr>
+            <w:r>
+              <w:rPr>
+                <w:sz w:val="17"/>
+              </w:rPr>
+              <w:t>先实现轨迹数据契约、同前缀回放、结构化解析与分项资源记录，再接入决策状态—散度联合规则、稀疏支持集及闭环训练；完成数值、梯度与回放一致性测试。</w:t>
             </w:r>
           </w:p>
         </w:tc>
@@ -16984,8 +16882,15 @@
             <w:vAlign w:val="center"/>
           </w:tcPr>
           <w:p>
-            <w:r>
-              <w:t>统一测试系统原型、三项方法原型、接口与回放测试</w:t>
+            <w:pPr>
+              <w:spacing w:line="240" w:lineRule="auto"/>
+              <w:jc w:val="center"/>
+            </w:pPr>
+            <w:r>
+              <w:rPr>
+                <w:sz w:val="17"/>
+              </w:rPr>
+              <w:t>统一测试系统原型、两项方法原型、接口与回放测试</w:t>
             </w:r>
           </w:p>
         </w:tc>
@@ -16993,6 +16898,7 @@
       <w:tr>
         <w:trPr>
           <w:jc w:val="center"/>
+          <w:cantSplit/>
         </w:trPr>
         <w:tc>
           <w:tcPr>
@@ -17022,17 +16928,14 @@
           </w:tcPr>
           <w:p>
             <w:pPr>
-              <w:spacing w:before="0" w:after="0" w:line="240" w:lineRule="auto"/>
-              <w:ind w:firstLine="0"/>
+              <w:spacing w:line="240" w:lineRule="auto"/>
               <w:jc w:val="center"/>
             </w:pPr>
             <w:r>
               <w:rPr>
-                <w:rFonts w:ascii="Times New Roman" w:hAnsi="Times New Roman" w:eastAsia="宋体"/>
-                <w:b w:val="0"/>
                 <w:sz w:val="17"/>
               </w:rPr>
-              <w:t>在统一数据与预算下依次验证状态选择方法、位置条件化散度目标和 Top-K 尾部及决策漏选现象；保存原始预测、梯度和资源记录，2027 年 3 月提交中期申请。</w:t>
+              <w:t>在完整词表反馈下检验决策位置与散度权重的联合方法；诊断 Top-K 尾部质量和关键候选漏选，保存原始轨迹、梯度与资源记录，2027 年 3 月提交中期申请。</w:t>
             </w:r>
           </w:p>
         </w:tc>
@@ -17061,6 +16964,7 @@
       <w:tr>
         <w:trPr>
           <w:jc w:val="center"/>
+          <w:cantSplit/>
         </w:trPr>
         <w:tc>
           <w:tcPr>
@@ -17089,8 +16993,15 @@
             <w:vAlign w:val="center"/>
           </w:tcPr>
           <w:p>
-            <w:r>
-              <w:t>完成系统双路径验证、决策感知稀疏反馈的同预算比较，以及三项方法的组合、消融、多种子重复、部署评测与失败追踪。</w:t>
+            <w:pPr>
+              <w:spacing w:line="240" w:lineRule="auto"/>
+              <w:jc w:val="center"/>
+            </w:pPr>
+            <w:r>
+              <w:rPr>
+                <w:sz w:val="17"/>
+              </w:rPr>
+              <w:t>完成决策感知稀疏反馈的同预算比较、两项方法的组合与消融，以及统一测试系统的双路径验收、多种子训练、部署评测和错误追踪。</w:t>
             </w:r>
           </w:p>
         </w:tc>
@@ -17100,8 +17011,15 @@
             <w:vAlign w:val="center"/>
           </w:tcPr>
           <w:p>
-            <w:r>
-              <w:t>系统验收记录、原始结果、统计表、错误追踪与复现材料</w:t>
+            <w:pPr>
+              <w:spacing w:line="240" w:lineRule="auto"/>
+              <w:jc w:val="center"/>
+            </w:pPr>
+            <w:r>
+              <w:rPr>
+                <w:sz w:val="17"/>
+              </w:rPr>
+              <w:t>系统验收记录、两项方法结果、统计表、错误追踪与复现材料</w:t>
             </w:r>
           </w:p>
         </w:tc>
@@ -17109,6 +17027,7 @@
       <w:tr>
         <w:trPr>
           <w:jc w:val="center"/>
+          <w:cantSplit/>
         </w:trPr>
         <w:tc>
           <w:tcPr>
@@ -17158,8 +17077,15 @@
             <w:vAlign w:val="center"/>
           </w:tcPr>
           <w:p>
-            <w:r>
-              <w:t>论文定稿、三项方法证据链、统一测试系统章节、结题与答辩材料</w:t>
+            <w:pPr>
+              <w:spacing w:line="240" w:lineRule="auto"/>
+              <w:jc w:val="center"/>
+            </w:pPr>
+            <w:r>
+              <w:rPr>
+                <w:sz w:val="17"/>
+              </w:rPr>
+              <w:t>论文定稿、三个研究问题的证据链、结题与答辩材料</w:t>
             </w:r>
           </w:p>
         </w:tc>
@@ -17275,7 +17201,7 @@
         <w:jc w:val="both"/>
       </w:pPr>
       <w:r>
-        <w:t>研究周期覆盖 2026 年 9 月至 2027 年 5 月。2026 年内完成开题修改、数据与模型兼容性审计，建立轨迹格式、同前缀回放和解析器的系统原型。2027 年 2 月起依次开展学生状态、完整词表散度及稀疏反馈诊断，在 3 月中期申请前形成可复查的阶段性记录。3—4 月完成系统双路径一致性测试、三项方法的同预算比较、组合与多种子分析；4—5 月撰写包含统一测试系统独立章节的论文和结题材料。</w:t>
+        <w:t>研究周期覆盖 2026 年 9 月至 2027 年 5 月。2026 年内完成开题修改、数据与模型兼容性审计，建立轨迹格式、同前缀回放和解析器的系统原型。2027 年 2 月起依次开展学生状态、完整词表散度及稀疏反馈诊断，在 3 月中期申请前形成可复查的阶段性记录。3—4 月完成系统双路径一致性测试、两项方法的同预算比较、组合与多种子分析；4—5 月撰写包含统一测试系统独立章节的论文和结题材料。</w:t>
       </w:r>
     </w:p>
     <w:p>
@@ -17301,7 +17227,7 @@
         <w:jc w:val="both"/>
       </w:pPr>
       <w:r>
-        <w:t>1. 提出并实现决策状态感知的监督选择方法，在相同有效训练 token 预算下比较位置覆盖、函数选择、参数与格式错误。</w:t>
+        <w:t>1. 提出并实现决策状态与散度目标联合调节的方法，在固定有效训练 token 预算下同时选择重点位置和双向散度权重；比较单独位置选择、单独目标调节与联合规则的梯度、稳定性和工具调用表现。</w:t>
       </w:r>
     </w:p>
     <w:p>
@@ -17311,7 +17237,7 @@
         <w:jc w:val="both"/>
       </w:pPr>
       <w:r>
-        <w:t>2. 提出并实现位置条件化的双向散度目标，在相同学生轨迹和完整词表反馈下比较单一散度、全局混合与按位置调节的目标，分析梯度、熵及调用行为。</w:t>
+        <w:t>2. 提出并实现决策感知的稀疏教师反馈方法，在固定联合规则下比较 Top-K、尾部类别、学生感知支持集与同预算候选补入，报告尾部质量、任务效果和额外教师评分成本。</w:t>
       </w:r>
     </w:p>
     <w:p>
@@ -17321,7 +17247,7 @@
         <w:jc w:val="both"/>
       </w:pPr>
       <w:r>
-        <w:t>3. 提出并实现决策感知的稀疏教师反馈方法，在固定位置与目标下比较 Top-K、尾部类别和同预算支持集选择，报告任务效果、目标偏差与教师评分成本。</w:t>
+        <w:t>3. 实现并验证统一测试系统，形成可重放轨迹、同前缀配对回放、独立闭环训练、结构化调用评测、错误追踪和分项资源报表；检验回放一致性、规则隔离、评价正确性与系统开销。</w:t>
       </w:r>
     </w:p>
     <w:p>
@@ -17331,7 +17257,7 @@
         <w:jc w:val="both"/>
       </w:pPr>
       <w:r>
-        <w:t>4. 实现并验证统一测试系统，形成可重放轨迹、配对回放引擎、闭环训练与结构化调用评测、错误追踪和分项资源报表；检验回放一致性、规则隔离、评价正确性与系统开销。</w:t>
+        <w:t>4. 统一记录损失、梯度、熵、残余概率质量、反馈字节数、教师前向时间、训练显存和任务表现，分析效果与资源开销之间的关系。</w:t>
       </w:r>
     </w:p>
     <w:p>
@@ -17341,7 +17267,7 @@
         <w:jc w:val="both"/>
       </w:pPr>
       <w:r>
-        <w:t>5. 统一记录损失、梯度、熵、残余概率质量、反馈字节数、教师前向时间、训练显存和任务表现，分析效果与资源开销之间的关系。</w:t>
+        <w:t>5. 使用 vLLM 或等效可复现程序评估最终学生模型，说明适用范围并分析失败案例；所有性能结论以实际运行结果为依据。</w:t>
       </w:r>
     </w:p>
     <w:p>
@@ -17351,7 +17277,7 @@
         <w:jc w:val="both"/>
       </w:pPr>
       <w:r>
-        <w:t>6. 使用 vLLM 或等效可复现程序评估最终学生模型，说明适用范围并分析失败案例；完成项目文档、毕业论文和答辩材料，所有性能结论以实际运行结果为依据。</w:t>
+        <w:t>6. 整理两项蒸馏方法和统一测试系统的实现、配置与原始记录，完成项目文档、毕业论文和答辩材料。</w:t>
       </w:r>
     </w:p>
     <w:p>
@@ -17360,7 +17286,7 @@
         <w:jc w:val="both"/>
       </w:pPr>
       <w:r>
-        <w:t>预期成果为三项蒸馏方法和一项系统研究。三项方法各有可执行规则、实现与受控实验；统一测试系统形成轨迹记录、配对回放、闭环评测和错误追踪的完整实现。论文分别呈现方法的机制、结果与适用边界，并独立讨论系统设计、验证结果及额外开销。各项价值以实际运行结果为依据。</w:t>
+        <w:t>预期成果为两项方法研究和一项系统研究。联合方法形成监督位置与散度权重的协同规则，稀疏方法形成决策候选与尾部质量的有限反馈表示；统一测试系统提供配对回放、闭环评测和错误追踪。论文按三个研究问题分别讨论方法机制、任务效果、系统可信度与资源开销，各项价值以实际运行结果为依据。</w:t>
       </w:r>
     </w:p>
     <w:p>
@@ -18210,7 +18136,7 @@
         <w:jc w:val="both"/>
       </w:pPr>
       <w:r>
-        <w:t>实施时先建立统一测试系统的最小闭环：人工小样本、固定学生前缀、教师同前缀评分、调用解析和轨迹记录。通过回放一致性及规则隔离检查后，再依次接入状态选择、双向散度和稀疏反馈方法。各阶段保存输入、位置掩码、支持集、损失、梯度和失败调用；闭环实验共享学生起点、训练预算与评价规则，同时允许各方法产生自身轨迹。</w:t>
+        <w:t>实施时先建立统一测试系统的最小闭环：人工小样本、固定学生前缀、教师同前缀评分、调用解析和轨迹记录。通过回放一致性与规则隔离检查后，接入决策状态与散度目标的联合方法，再接入稀疏反馈方法。各阶段保存输入、位置掩码、权重、支持集、损失、梯度和失败调用；闭环实验共享学生起点、训练预算与评价规则，同时允许各方法产生自身轨迹。</w:t>
       </w:r>
     </w:p>
     <w:p>

</xml_diff>